<commit_message>
Set tracked-change author to A.A. Shevtsov
Co-Authored-By: Claude Sonnet 5.5 <noreply@anthropic.com>
Claude-Session: https://claude.ai/code/session_01UR1NZjK59cEf7XcfQ71PDe
</commit_message>
<xml_diff>
--- a/RegRes2670014Shevtsov_reviewed.docx
+++ b/RegRes2670014Shevtsov_reviewed.docx
@@ -47,7 +47,7 @@
           <w:szCs w:val="26"/>
         </w:rPr>
       </w:pPr>
-      <w:del w:id="902" w:author="Claude" w:date="2026-10-17T12:00:00Z">
+      <w:del w:id="902" w:author="А.А. Шевцов" w:date="2026-10-17T12:00:00Z">
         <w:r>
           <w:rPr>
             <w:rFonts w:ascii="Times New Roman" w:hAnsi="Times New Roman"/>
@@ -59,7 +59,7 @@
           <w:delText xml:space="preserve">Spatial Development of Voronezh and its Near Suburban Areas in the Post-Soviet Period</w:delText>
         </w:r>
       </w:del>
-      <w:ins w:id="903" w:author="Claude" w:date="2026-10-17T12:00:00Z">
+      <w:ins w:id="903" w:author="А.А. Шевцов" w:date="2026-10-17T12:00:00Z">
         <w:r>
           <w:rPr>
             <w:rFonts w:ascii="Times New Roman" w:hAnsi="Times New Roman"/>
@@ -185,7 +185,7 @@
         </w:rPr>
         <w:t>a</w:t>
       </w:r>
-      <w:del w:id="904" w:author="Claude" w:date="2026-10-17T12:00:00Z">
+      <w:del w:id="904" w:author="А.А. Шевцов" w:date="2026-10-17T12:00:00Z">
         <w:r>
           <w:rPr>
             <w:rFonts w:ascii="Times New Roman" w:hAnsi="Times New Roman"/>
@@ -355,7 +355,7 @@
         </w:rPr>
         <w:t xml:space="preserve">This article examines the spatial transformation of Voronezh and its suburbs from 1992 to 2025. The aim of the work is to identify spatial and temporal patterns in the transformation of built-up areas in the context of the transition to a market-based development model. The methodology is based on combining the analysis of the dynamics of the physical boundaries of development with localized economic indicators: the cadastral value of land and the density of consumer activity (based on data from the Federal Tax Service). The nonlinear nature of the expansion has been established, in which four stages are distinguished: from the transition period of spontaneous growth (1992–2000) to the phase of slowing expansion and the formation of a framework of suburban shopping centers (2000–2010), followed by a stage of “explosive expansion” in the context of increasing availability of credit (2010–2020) and the current stage of stabilization of growth rates and morphological consolidation (2020–2025). A persistent spatial asymmetry was identified: more than 58% of the total increase was recorded in the northern and eastern sectors. It has been established that the development of the </w:t>
       </w:r>
-      <w:del w:id="907" w:author="Claude" w:date="2026-10-17T12:00:00Z">
+      <w:del w:id="907" w:author="А.А. Шевцов" w:date="2026-10-17T12:00:00Z">
         <w:r>
           <w:rPr>
             <w:rFonts w:ascii="Times New Roman" w:hAnsi="Times New Roman"/>
@@ -363,7 +363,7 @@
           <w:delText xml:space="preserve">suburban area</w:delText>
         </w:r>
       </w:del>
-      <w:ins w:id="908" w:author="Claude" w:date="2026-10-17T12:00:00Z">
+      <w:ins w:id="908" w:author="А.А. Шевцов" w:date="2026-10-17T12:00:00Z">
         <w:r>
           <w:rPr>
             <w:rFonts w:ascii="Times New Roman" w:hAnsi="Times New Roman"/>
@@ -377,7 +377,7 @@
         </w:rPr>
         <w:t xml:space="preserve"> is driven by the </w:t>
       </w:r>
-      <w:del w:id="905" w:author="Claude" w:date="2026-10-17T12:00:00Z">
+      <w:del w:id="905" w:author="А.А. Шевцов" w:date="2026-10-17T12:00:00Z">
         <w:r>
           <w:rPr>
             <w:rFonts w:ascii="Times New Roman" w:hAnsi="Times New Roman"/>
@@ -385,7 +385,7 @@
           <w:delText xml:space="preserve">"growth machine," driven</w:delText>
         </w:r>
       </w:del>
-      <w:ins w:id="906" w:author="Claude" w:date="2026-10-17T12:00:00Z">
+      <w:ins w:id="906" w:author="А.А. Шевцов" w:date="2026-10-17T12:00:00Z">
         <w:r>
           <w:rPr>
             <w:rFonts w:ascii="Times New Roman" w:hAnsi="Times New Roman"/>
@@ -399,7 +399,7 @@
         </w:rPr>
         <w:t xml:space="preserve"> by a fivefold difference in land prices between the </w:t>
       </w:r>
-      <w:del w:id="909" w:author="Claude" w:date="2026-10-17T12:00:00Z">
+      <w:del w:id="909" w:author="А.А. Шевцов" w:date="2026-10-17T12:00:00Z">
         <w:r>
           <w:rPr>
             <w:rFonts w:ascii="Times New Roman" w:hAnsi="Times New Roman"/>
@@ -407,7 +407,7 @@
           <w:delText xml:space="preserve">city's outskirts and the suburban area.</w:delText>
         </w:r>
       </w:del>
-      <w:ins w:id="910" w:author="Claude" w:date="2026-10-17T12:00:00Z">
+      <w:ins w:id="910" w:author="А.А. Шевцов" w:date="2026-10-17T12:00:00Z">
         <w:r>
           <w:rPr>
             <w:rFonts w:ascii="Times New Roman" w:hAnsi="Times New Roman"/>
@@ -421,7 +421,7 @@
         </w:rPr>
         <w:t xml:space="preserve"> This led to spatial fragmentation and the formation of a functionally </w:t>
       </w:r>
-      <w:del w:id="911" w:author="Claude" w:date="2026-10-17T12:00:00Z">
+      <w:del w:id="911" w:author="А.А. Шевцов" w:date="2026-10-17T12:00:00Z">
         <w:r>
           <w:rPr>
             <w:rFonts w:ascii="Times New Roman" w:hAnsi="Times New Roman"/>
@@ -429,7 +429,7 @@
           <w:delText xml:space="preserve">disunited</w:delText>
         </w:r>
       </w:del>
-      <w:ins w:id="912" w:author="Claude" w:date="2026-10-17T12:00:00Z">
+      <w:ins w:id="912" w:author="А.А. Шевцов" w:date="2026-10-17T12:00:00Z">
         <w:r>
           <w:rPr>
             <w:rFonts w:ascii="Times New Roman" w:hAnsi="Times New Roman"/>
@@ -443,7 +443,7 @@
         </w:rPr>
         <w:t xml:space="preserve"> spatial structure, which is confirmed by a twofold drop in the density of consumer activity in new development zones. The results of the study indicate a deformation of the classical model of W. Alonso: </w:t>
       </w:r>
-      <w:del w:id="915" w:author="Claude" w:date="2026-10-17T12:00:00Z">
+      <w:del w:id="915" w:author="А.А. Шевцов" w:date="2026-10-17T12:00:00Z">
         <w:r>
           <w:rPr>
             <w:rFonts w:ascii="Times New Roman" w:hAnsi="Times New Roman"/>
@@ -451,7 +451,7 @@
           <w:delText xml:space="preserve">The</w:delText>
         </w:r>
       </w:del>
-      <w:ins w:id="916" w:author="Claude" w:date="2026-10-17T12:00:00Z">
+      <w:ins w:id="916" w:author="А.А. Шевцов" w:date="2026-10-17T12:00:00Z">
         <w:r>
           <w:rPr>
             <w:rFonts w:ascii="Times New Roman" w:hAnsi="Times New Roman"/>
@@ -499,7 +499,7 @@
         </w:rPr>
         <w:t xml:space="preserve"> Post-Soviet urban transformation, </w:t>
       </w:r>
-      <w:ins w:id="917" w:author="Claude" w:date="2026-10-17T12:00:00Z">
+      <w:ins w:id="917" w:author="А.А. Шевцов" w:date="2026-10-17T12:00:00Z">
         <w:r>
           <w:rPr>
             <w:rFonts w:ascii="Times New Roman" w:hAnsi="Times New Roman"/>
@@ -513,7 +513,7 @@
         </w:rPr>
         <w:t xml:space="preserve">development, </w:t>
       </w:r>
-      <w:del w:id="1154" w:author="Claude" w:date="2026-10-17T12:00:00Z">
+      <w:del w:id="1154" w:author="А.А. Шевцов" w:date="2026-10-17T12:00:00Z">
         <w:r>
           <w:rPr>
             <w:rFonts w:ascii="Times New Roman" w:hAnsi="Times New Roman"/>
@@ -521,7 +521,7 @@
           <w:delText xml:space="preserve">"</w:delText>
         </w:r>
       </w:del>
-      <w:ins w:id="1155" w:author="Claude" w:date="2026-10-17T12:00:00Z">
+      <w:ins w:id="1155" w:author="А.А. Шевцов" w:date="2026-10-17T12:00:00Z">
         <w:r>
           <w:rPr>
             <w:rFonts w:ascii="Times New Roman" w:hAnsi="Times New Roman"/>
@@ -535,7 +535,7 @@
         </w:rPr>
         <w:t xml:space="preserve">growth machine</w:t>
       </w:r>
-      <w:del w:id="1152" w:author="Claude" w:date="2026-10-17T12:00:00Z">
+      <w:del w:id="1152" w:author="А.А. Шевцов" w:date="2026-10-17T12:00:00Z">
         <w:r>
           <w:rPr>
             <w:rFonts w:ascii="Times New Roman" w:hAnsi="Times New Roman"/>
@@ -543,7 +543,7 @@
           <w:delText xml:space="preserve">"</w:delText>
         </w:r>
       </w:del>
-      <w:ins w:id="1153" w:author="Claude" w:date="2026-10-17T12:00:00Z">
+      <w:ins w:id="1153" w:author="А.А. Шевцов" w:date="2026-10-17T12:00:00Z">
         <w:r>
           <w:rPr>
             <w:rFonts w:ascii="Times New Roman" w:hAnsi="Times New Roman"/>
@@ -557,7 +557,7 @@
         </w:rPr>
         <w:t xml:space="preserve">, suburban </w:t>
       </w:r>
-      <w:del w:id="918" w:author="Claude" w:date="2026-10-17T12:00:00Z">
+      <w:del w:id="918" w:author="А.А. Шевцов" w:date="2026-10-17T12:00:00Z">
         <w:r>
           <w:rPr>
             <w:rFonts w:ascii="Times New Roman" w:hAnsi="Times New Roman"/>
@@ -565,7 +565,7 @@
           <w:delText xml:space="preserve">area, urban morphology,</w:delText>
         </w:r>
       </w:del>
-      <w:ins w:id="919" w:author="Claude" w:date="2026-10-17T12:00:00Z">
+      <w:ins w:id="919" w:author="А.А. Шевцов" w:date="2026-10-17T12:00:00Z">
         <w:r>
           <w:rPr>
             <w:rFonts w:ascii="Times New Roman" w:hAnsi="Times New Roman"/>
@@ -638,7 +638,7 @@
         </w:rPr>
         <w:t xml:space="preserve">In recent decades, the spatial development of Russia's largest cities has been closely linked to the development of the real estate market and the transformation of land and property relations. The extensive growth of </w:t>
       </w:r>
-      <w:del w:id="920" w:author="Claude" w:date="2026-10-17T12:00:00Z">
+      <w:del w:id="920" w:author="А.А. Шевцов" w:date="2026-10-17T12:00:00Z">
         <w:r>
           <w:rPr>
             <w:rFonts w:ascii="Times New Roman" w:hAnsi="Times New Roman"/>
@@ -647,7 +647,7 @@
           <w:delText xml:space="preserve">development in suburban areas</w:delText>
         </w:r>
       </w:del>
-      <w:ins w:id="921" w:author="Claude" w:date="2026-10-17T12:00:00Z">
+      <w:ins w:id="921" w:author="А.А. Шевцов" w:date="2026-10-17T12:00:00Z">
         <w:r>
           <w:rPr>
             <w:rFonts w:ascii="Times New Roman" w:hAnsi="Times New Roman"/>
@@ -663,7 +663,7 @@
         </w:rPr>
         <w:t xml:space="preserve"> is largely becoming a spatial reflection of developers' investment strategies and changing consumer preferences. In this regard, the study of territorial expansion requires a shift from simply </w:t>
       </w:r>
-      <w:del w:id="922" w:author="Claude" w:date="2026-10-17T12:00:00Z">
+      <w:del w:id="922" w:author="А.А. Шевцов" w:date="2026-10-17T12:00:00Z">
         <w:r>
           <w:rPr>
             <w:rFonts w:ascii="Times New Roman" w:hAnsi="Times New Roman"/>
@@ -672,7 +672,7 @@
           <w:delText xml:space="preserve">fixing</w:delText>
         </w:r>
       </w:del>
-      <w:ins w:id="923" w:author="Claude" w:date="2026-10-17T12:00:00Z">
+      <w:ins w:id="923" w:author="А.А. Шевцов" w:date="2026-10-17T12:00:00Z">
         <w:r>
           <w:rPr>
             <w:rFonts w:ascii="Times New Roman" w:hAnsi="Times New Roman"/>
@@ -706,7 +706,7 @@
         </w:rPr>
         <w:t xml:space="preserve">For modern science, identifying the factors that determine the spatial unevenness of the development of urban systems remains a pressing problem. Traditional concepts of urban economics are confronting new realities: the development of suburban commercial infrastructure and the digitalization of the service sector, which are </w:t>
       </w:r>
-      <w:del w:id="924" w:author="Claude" w:date="2026-10-17T12:00:00Z">
+      <w:del w:id="924" w:author="А.А. Шевцов" w:date="2026-10-17T12:00:00Z">
         <w:r>
           <w:rPr>
             <w:rFonts w:ascii="Times New Roman" w:hAnsi="Times New Roman"/>
@@ -715,7 +715,7 @@
           <w:delText xml:space="preserve">offsetting</w:delText>
         </w:r>
       </w:del>
-      <w:ins w:id="925" w:author="Claude" w:date="2026-10-17T12:00:00Z">
+      <w:ins w:id="925" w:author="А.А. Шевцов" w:date="2026-10-17T12:00:00Z">
         <w:r>
           <w:rPr>
             <w:rFonts w:ascii="Times New Roman" w:hAnsi="Times New Roman"/>
@@ -765,7 +765,7 @@
         </w:rPr>
         <w:t xml:space="preserve"> a combination of active physical growth of </w:t>
       </w:r>
-      <w:del w:id="926" w:author="Claude" w:date="2026-10-17T12:00:00Z">
+      <w:del w:id="926" w:author="А.А. Шевцов" w:date="2026-10-17T12:00:00Z">
         <w:r>
           <w:rPr>
             <w:rFonts w:ascii="Times New Roman" w:hAnsi="Times New Roman"/>
@@ -774,7 +774,7 @@
           <w:delText xml:space="preserve">development</w:delText>
         </w:r>
       </w:del>
-      <w:ins w:id="927" w:author="Claude" w:date="2026-10-17T12:00:00Z">
+      <w:ins w:id="927" w:author="А.А. Шевцов" w:date="2026-10-17T12:00:00Z">
         <w:r>
           <w:rPr>
             <w:rFonts w:ascii="Times New Roman" w:hAnsi="Times New Roman"/>
@@ -790,7 +790,7 @@
         </w:rPr>
         <w:t xml:space="preserve"> over the past three decades and the change in the legal boundaries of the city in 2011. This allows us to trace how administrative decisions </w:t>
       </w:r>
-      <w:del w:id="928" w:author="Claude" w:date="2026-10-17T12:00:00Z">
+      <w:del w:id="928" w:author="А.А. Шевцов" w:date="2026-10-17T12:00:00Z">
         <w:r>
           <w:rPr>
             <w:rFonts w:ascii="Times New Roman" w:hAnsi="Times New Roman"/>
@@ -799,7 +799,7 @@
           <w:delText xml:space="preserve">overlap with</w:delText>
         </w:r>
       </w:del>
-      <w:ins w:id="929" w:author="Claude" w:date="2026-10-17T12:00:00Z">
+      <w:ins w:id="929" w:author="А.А. Шевцов" w:date="2026-10-17T12:00:00Z">
         <w:r>
           <w:rPr>
             <w:rFonts w:ascii="Times New Roman" w:hAnsi="Times New Roman"/>
@@ -835,7 +835,7 @@
         </w:rPr>
         <w:t xml:space="preserve">The territorial growth of Voronezh is understood as the entire set of new built-up areas both on the outskirts of existing development and in the area of the </w:t>
       </w:r>
-      <w:del w:id="1024" w:author="Claude" w:date="2026-10-17T12:00:00Z">
+      <w:del w:id="1024" w:author="А.А. Шевцов" w:date="2026-10-17T12:00:00Z">
         <w:r>
           <w:rPr>
             <w:rFonts w:ascii="Times New Roman" w:hAnsi="Times New Roman"/>
@@ -845,7 +845,7 @@
           <w:delText xml:space="preserve">near</w:delText>
         </w:r>
       </w:del>
-      <w:ins w:id="1025" w:author="Claude" w:date="2026-10-17T12:00:00Z">
+      <w:ins w:id="1025" w:author="А.А. Шевцов" w:date="2026-10-17T12:00:00Z">
         <w:r>
           <w:rPr>
             <w:rFonts w:ascii="Times New Roman" w:hAnsi="Times New Roman"/>
@@ -962,7 +962,7 @@
         </w:rPr>
         <w:t xml:space="preserve">The theoretical basis for studying the territorial growth of cities is laid in classical models of urban morphology and land use economics. </w:t>
       </w:r>
-      <w:del w:id="930" w:author="Claude" w:date="2026-10-17T12:00:00Z">
+      <w:del w:id="930" w:author="А.А. Шевцов" w:date="2026-10-17T12:00:00Z">
         <w:r>
           <w:rPr>
             <w:rFonts w:ascii="Times New Roman" w:hAnsi="Times New Roman"/>
@@ -972,7 +972,7 @@
           <w:delText xml:space="preserve">E. Burgess (1925), using the fundamental model of concentric zones, first described</w:delText>
         </w:r>
       </w:del>
-      <w:ins w:id="931" w:author="Claude" w:date="2026-10-17T12:00:00Z">
+      <w:ins w:id="931" w:author="А.А. Шевцов" w:date="2026-10-17T12:00:00Z">
         <w:r>
           <w:rPr>
             <w:rFonts w:ascii="Times New Roman" w:hAnsi="Times New Roman"/>
@@ -990,7 +990,7 @@
         </w:rPr>
         <w:t xml:space="preserve"> the process of centrifugal expansion as a successive displacement of functions from the city core to its periphery. The mathematical confirmation of these patterns was the model proposed by C. Clark (1951), which explains the exponential decrease in population density with distance from the </w:t>
       </w:r>
-      <w:del w:id="932" w:author="Claude" w:date="2026-10-17T12:00:00Z">
+      <w:del w:id="932" w:author="А.А. Шевцов" w:date="2026-10-17T12:00:00Z">
         <w:r>
           <w:rPr>
             <w:rFonts w:ascii="Times New Roman" w:hAnsi="Times New Roman"/>
@@ -1000,7 +1000,7 @@
           <w:delText xml:space="preserve">center, which</w:delText>
         </w:r>
       </w:del>
-      <w:ins w:id="933" w:author="Claude" w:date="2026-10-17T12:00:00Z">
+      <w:ins w:id="933" w:author="А.А. Шевцов" w:date="2026-10-17T12:00:00Z">
         <w:r>
           <w:rPr>
             <w:rFonts w:ascii="Times New Roman" w:hAnsi="Times New Roman"/>
@@ -1038,7 +1038,7 @@
         </w:rPr>
         <w:t xml:space="preserve">As transportation systems became more complex, the logic for accommodating new growth required clarification. W. </w:t>
       </w:r>
-      <w:del w:id="934" w:author="Claude" w:date="2026-10-17T12:00:00Z">
+      <w:del w:id="934" w:author="А.А. Шевцов" w:date="2026-10-17T12:00:00Z">
         <w:r>
           <w:rPr>
             <w:rFonts w:ascii="Times New Roman" w:hAnsi="Times New Roman"/>
@@ -1056,7 +1056,7 @@
         </w:rPr>
         <w:t xml:space="preserve">Hansen (1959) supplemented these ideas with the concept of the “development potential” of a territory, </w:t>
       </w:r>
-      <w:del w:id="935" w:author="Claude" w:date="2026-10-17T12:00:00Z">
+      <w:del w:id="935" w:author="А.А. Шевцов" w:date="2026-10-17T12:00:00Z">
         <w:r>
           <w:rPr>
             <w:rFonts w:ascii="Times New Roman" w:hAnsi="Times New Roman"/>
@@ -1066,7 +1066,7 @@
           <w:delText xml:space="preserve">believing</w:delText>
         </w:r>
       </w:del>
-      <w:ins w:id="936" w:author="Claude" w:date="2026-10-17T12:00:00Z">
+      <w:ins w:id="936" w:author="А.А. Шевцов" w:date="2026-10-17T12:00:00Z">
         <w:r>
           <w:rPr>
             <w:rFonts w:ascii="Times New Roman" w:hAnsi="Times New Roman"/>
@@ -1084,7 +1084,7 @@
         </w:rPr>
         <w:t xml:space="preserve"> that the localization of new development is determined not so much by proximity to the geometric center as by the level of transport accessibility. The economic justification for this process was given in the theory of land rent by W. Alonso, who postulates a trade-off between land value and transport costs </w:t>
       </w:r>
-      <w:del w:id="937" w:author="Claude" w:date="2026-10-17T12:00:00Z">
+      <w:del w:id="937" w:author="А.А. Шевцов" w:date="2026-10-17T12:00:00Z">
         <w:r>
           <w:rPr>
             <w:rFonts w:ascii="Times New Roman" w:hAnsi="Times New Roman"/>
@@ -1094,7 +1094,7 @@
           <w:delText xml:space="preserve">(Angel et al., 2012)</w:delText>
         </w:r>
       </w:del>
-      <w:ins w:id="938" w:author="Claude" w:date="2026-10-17T12:00:00Z">
+      <w:ins w:id="938" w:author="А.А. Шевцов" w:date="2026-10-17T12:00:00Z">
         <w:r>
           <w:rPr>
             <w:rFonts w:ascii="Times New Roman" w:hAnsi="Times New Roman"/>
@@ -1112,7 +1112,7 @@
         </w:rPr>
         <w:t xml:space="preserve">. The development of this approach was the theory of the “rent gap” of N. Smith, according to which the driver of territorial development is the disparity between the current capitalized rent of land and its potential price at its most efficient use (Smith, 1987). It is this gap in asset values on the periphery of the city that creates the economic incentive for </w:t>
       </w:r>
-      <w:del w:id="939" w:author="Claude" w:date="2026-10-17T12:00:00Z">
+      <w:del w:id="939" w:author="А.А. Шевцов" w:date="2026-10-17T12:00:00Z">
         <w:r>
           <w:rPr>
             <w:rFonts w:ascii="Times New Roman" w:hAnsi="Times New Roman"/>
@@ -1122,7 +1122,7 @@
           <w:delText xml:space="preserve">capital to expand out of</w:delText>
         </w:r>
       </w:del>
-      <w:ins w:id="940" w:author="Claude" w:date="2026-10-17T12:00:00Z">
+      <w:ins w:id="940" w:author="А.А. Шевцов" w:date="2026-10-17T12:00:00Z">
         <w:r>
           <w:rPr>
             <w:rFonts w:ascii="Times New Roman" w:hAnsi="Times New Roman"/>
@@ -1160,7 +1160,7 @@
         </w:rPr>
         <w:t xml:space="preserve">The spatial logic of location selection is directly embodied in the specific mechanisms of urban expansion. Angel et al. (2012) identified three basic types of territorial growth: infilling, edge growth, and </w:t>
       </w:r>
-      <w:del w:id="941" w:author="Claude" w:date="2026-10-17T12:00:00Z">
+      <w:del w:id="941" w:author="А.А. Шевцов" w:date="2026-10-17T12:00:00Z">
         <w:r>
           <w:rPr>
             <w:rFonts w:ascii="Times New Roman" w:hAnsi="Times New Roman"/>
@@ -1170,7 +1170,7 @@
           <w:delText xml:space="preserve">leaffrog</w:delText>
         </w:r>
       </w:del>
-      <w:ins w:id="942" w:author="Claude" w:date="2026-10-17T12:00:00Z">
+      <w:ins w:id="942" w:author="А.А. Шевцов" w:date="2026-10-17T12:00:00Z">
         <w:r>
           <w:rPr>
             <w:rFonts w:ascii="Times New Roman" w:hAnsi="Times New Roman"/>
@@ -1188,7 +1188,7 @@
         </w:rPr>
         <w:t xml:space="preserve"> development. Camagni et al. (2002) added linear development along transport routes and large-scale </w:t>
       </w:r>
-      <w:del w:id="943" w:author="Claude" w:date="2026-10-17T12:00:00Z">
+      <w:del w:id="943" w:author="А.А. Шевцов" w:date="2026-10-17T12:00:00Z">
         <w:r>
           <w:rPr>
             <w:rFonts w:ascii="Times New Roman" w:hAnsi="Times New Roman"/>
@@ -1198,7 +1198,7 @@
           <w:delText xml:space="preserve">development</w:delText>
         </w:r>
       </w:del>
-      <w:ins w:id="944" w:author="Claude" w:date="2026-10-17T12:00:00Z">
+      <w:ins w:id="944" w:author="А.А. Шевцов" w:date="2026-10-17T12:00:00Z">
         <w:r>
           <w:rPr>
             <w:rFonts w:ascii="Times New Roman" w:hAnsi="Times New Roman"/>
@@ -1216,7 +1216,7 @@
         </w:rPr>
         <w:t xml:space="preserve"> to this list. These mechanisms allow us to determine the nature of the physical growth of the city: if </w:t>
       </w:r>
-      <w:del w:id="945" w:author="Claude" w:date="2026-10-17T12:00:00Z">
+      <w:del w:id="945" w:author="А.А. Шевцов" w:date="2026-10-17T12:00:00Z">
         <w:r>
           <w:rPr>
             <w:rFonts w:ascii="Times New Roman" w:hAnsi="Times New Roman"/>
@@ -1226,7 +1226,7 @@
           <w:delText xml:space="preserve">marginal</w:delText>
         </w:r>
       </w:del>
-      <w:ins w:id="946" w:author="Claude" w:date="2026-10-17T12:00:00Z">
+      <w:ins w:id="946" w:author="А.А. Шевцов" w:date="2026-10-17T12:00:00Z">
         <w:r>
           <w:rPr>
             <w:rFonts w:ascii="Times New Roman" w:hAnsi="Times New Roman"/>
@@ -1244,7 +1244,7 @@
         </w:rPr>
         <w:t xml:space="preserve"> growth indicates the expansion (spread of territory) of the city, then </w:t>
       </w:r>
-      <w:del w:id="947" w:author="Claude" w:date="2026-10-17T12:00:00Z">
+      <w:del w:id="947" w:author="А.А. Шевцов" w:date="2026-10-17T12:00:00Z">
         <w:r>
           <w:rPr>
             <w:rFonts w:ascii="Times New Roman" w:hAnsi="Times New Roman"/>
@@ -1254,7 +1254,7 @@
           <w:delText xml:space="preserve">spasmodic</w:delText>
         </w:r>
       </w:del>
-      <w:ins w:id="948" w:author="Claude" w:date="2026-10-17T12:00:00Z">
+      <w:ins w:id="948" w:author="А.А. Шевцов" w:date="2026-10-17T12:00:00Z">
         <w:r>
           <w:rPr>
             <w:rFonts w:ascii="Times New Roman" w:hAnsi="Times New Roman"/>
@@ -1301,7 +1301,7 @@
         <w:lastRenderedPageBreak/>
         <w:t xml:space="preserve">the urban environment. In Russian geography, the conceptualization of these processes is presented in the works of A.G. Makhrova and O.Yu. </w:t>
       </w:r>
-      <w:del w:id="949" w:author="Claude" w:date="2026-10-17T12:00:00Z">
+      <w:del w:id="949" w:author="А.А. Шевцов" w:date="2026-10-17T12:00:00Z">
         <w:r>
           <w:rPr>
             <w:rFonts w:ascii="Times New Roman" w:hAnsi="Times New Roman"/>
@@ -1311,7 +1311,7 @@
           <w:delText xml:space="preserve">Golubchikova</w:delText>
         </w:r>
       </w:del>
-      <w:ins w:id="950" w:author="Claude" w:date="2026-10-17T12:00:00Z">
+      <w:ins w:id="950" w:author="А.А. Шевцов" w:date="2026-10-17T12:00:00Z">
         <w:r>
           <w:rPr>
             <w:rFonts w:ascii="Times New Roman" w:hAnsi="Times New Roman"/>
@@ -1349,7 +1349,7 @@
         </w:rPr>
         <w:t xml:space="preserve">The applicability of these models to the analysis of Russian space requires taking into account the specifics of the post-socialist transition, during which market incentives were superimposed on a unique planning legacy. A fundamental contribution to the understanding of this process was made by the works of T.G. Nefedova, A.I. </w:t>
       </w:r>
-      <w:del w:id="951" w:author="Claude" w:date="2026-10-17T12:00:00Z">
+      <w:del w:id="951" w:author="А.А. Шевцов" w:date="2026-10-17T12:00:00Z">
         <w:r>
           <w:rPr>
             <w:rFonts w:ascii="Times New Roman" w:hAnsi="Times New Roman"/>
@@ -1359,7 +1359,7 @@
           <w:delText xml:space="preserve">Treyvisha</w:delText>
         </w:r>
       </w:del>
-      <w:ins w:id="952" w:author="Claude" w:date="2026-10-17T12:00:00Z">
+      <w:ins w:id="952" w:author="А.А. Шевцов" w:date="2026-10-17T12:00:00Z">
         <w:r>
           <w:rPr>
             <w:rFonts w:ascii="Times New Roman" w:hAnsi="Times New Roman"/>
@@ -1377,7 +1377,7 @@
         </w:rPr>
         <w:t xml:space="preserve"> and A.G. Makhrova (</w:t>
       </w:r>
-      <w:del w:id="953" w:author="Claude" w:date="2026-10-17T12:00:00Z">
+      <w:del w:id="953" w:author="А.А. Шевцов" w:date="2026-10-17T12:00:00Z">
         <w:r>
           <w:rPr>
             <w:rFonts w:ascii="Times New Roman" w:hAnsi="Times New Roman"/>
@@ -1387,7 +1387,7 @@
           <w:delText xml:space="preserve">Mahrova</w:delText>
         </w:r>
       </w:del>
-      <w:ins w:id="954" w:author="Claude" w:date="2026-10-17T12:00:00Z">
+      <w:ins w:id="954" w:author="А.А. Шевцов" w:date="2026-10-17T12:00:00Z">
         <w:r>
           <w:rPr>
             <w:rFonts w:ascii="Times New Roman" w:hAnsi="Times New Roman"/>
@@ -1425,7 +1425,7 @@
         </w:rPr>
         <w:t xml:space="preserve">A </w:t>
       </w:r>
-      <w:del w:id="959" w:author="Claude" w:date="2026-10-17T12:00:00Z">
+      <w:del w:id="959" w:author="А.А. Шевцов" w:date="2026-10-17T12:00:00Z">
         <w:r>
           <w:rPr>
             <w:rFonts w:ascii="Times New Roman" w:hAnsi="Times New Roman"/>
@@ -1435,7 +1435,7 @@
           <w:delText xml:space="preserve">generalisation</w:delText>
         </w:r>
       </w:del>
-      <w:ins w:id="960" w:author="Claude" w:date="2026-10-17T12:00:00Z">
+      <w:ins w:id="960" w:author="А.А. Шевцов" w:date="2026-10-17T12:00:00Z">
         <w:r>
           <w:rPr>
             <w:rFonts w:ascii="Times New Roman" w:hAnsi="Times New Roman"/>
@@ -1453,7 +1453,7 @@
         </w:rPr>
         <w:t xml:space="preserve"> of the post-socialist experience shows that, unlike Western countries, where </w:t>
       </w:r>
-      <w:del w:id="961" w:author="Claude" w:date="2026-10-17T12:00:00Z">
+      <w:del w:id="961" w:author="А.А. Шевцов" w:date="2026-10-17T12:00:00Z">
         <w:r>
           <w:rPr>
             <w:rFonts w:ascii="Times New Roman" w:hAnsi="Times New Roman"/>
@@ -1463,7 +1463,7 @@
           <w:delText xml:space="preserve">expansion</w:delText>
         </w:r>
       </w:del>
-      <w:ins w:id="962" w:author="Claude" w:date="2026-10-17T12:00:00Z">
+      <w:ins w:id="962" w:author="А.А. Шевцов" w:date="2026-10-17T12:00:00Z">
         <w:r>
           <w:rPr>
             <w:rFonts w:ascii="Times New Roman" w:hAnsi="Times New Roman"/>
@@ -1481,7 +1481,7 @@
         </w:rPr>
         <w:t xml:space="preserve"> is often constrained by institutional frameworks, in Russia and other Eastern European countries it has taken the form of “catch-up </w:t>
       </w:r>
-      <w:del w:id="963" w:author="Claude" w:date="2026-10-17T12:00:00Z">
+      <w:del w:id="963" w:author="А.А. Шевцов" w:date="2026-10-17T12:00:00Z">
         <w:r>
           <w:rPr>
             <w:rFonts w:ascii="Times New Roman" w:hAnsi="Times New Roman"/>
@@ -1491,7 +1491,7 @@
           <w:delText xml:space="preserve">suburbanisation</w:delText>
         </w:r>
       </w:del>
-      <w:ins w:id="964" w:author="Claude" w:date="2026-10-17T12:00:00Z">
+      <w:ins w:id="964" w:author="А.А. Шевцов" w:date="2026-10-17T12:00:00Z">
         <w:r>
           <w:rPr>
             <w:rFonts w:ascii="Times New Roman" w:hAnsi="Times New Roman"/>
@@ -1509,7 +1509,7 @@
         </w:rPr>
         <w:t xml:space="preserve">” with pronounced fragmentation of the environment (Gerten et al., 2022). Recent studies highlight that the characteristics of the territorial growth of Russian cities </w:t>
       </w:r>
-      <w:del w:id="965" w:author="Claude" w:date="2026-10-17T12:00:00Z">
+      <w:del w:id="965" w:author="А.А. Шевцов" w:date="2026-10-17T12:00:00Z">
         <w:r>
           <w:rPr>
             <w:rFonts w:ascii="Times New Roman" w:hAnsi="Times New Roman"/>
@@ -1519,7 +1519,7 @@
           <w:delText xml:space="preserve">are</w:delText>
         </w:r>
       </w:del>
-      <w:ins w:id="966" w:author="Claude" w:date="2026-10-17T12:00:00Z">
+      <w:ins w:id="966" w:author="А.А. Шевцов" w:date="2026-10-17T12:00:00Z">
         <w:r>
           <w:rPr>
             <w:rFonts w:ascii="Times New Roman" w:hAnsi="Times New Roman"/>
@@ -1557,7 +1557,7 @@
         </w:rPr>
         <w:t xml:space="preserve">The current stage of this transformation is characterized by a qualitative shift in the logic of suburban development: spontaneous dacha development is being replaced by the targeted expansion of developers, forming new development morphotypes. In </w:t>
       </w:r>
-      <w:del w:id="967" w:author="Claude" w:date="2026-10-17T12:00:00Z">
+      <w:del w:id="967" w:author="А.А. Шевцов" w:date="2026-10-17T12:00:00Z">
         <w:r>
           <w:rPr>
             <w:rFonts w:ascii="Times New Roman" w:hAnsi="Times New Roman"/>
@@ -1567,7 +1567,7 @@
           <w:delText xml:space="preserve">progress </w:delText>
         </w:r>
       </w:del>
-      <w:del w:id="968" w:author="Claude" w:date="2026-10-17T12:00:00Z">
+      <w:del w:id="968" w:author="А.А. Шевцов" w:date="2026-10-17T12:00:00Z">
         <w:r>
           <w:rPr>
             <w:rFonts w:ascii="Times New Roman" w:hAnsi="Times New Roman"/>
@@ -1576,7 +1576,7 @@
           <w:delText xml:space="preserve">R.A. Dokhova and N.A. Sinitsyna (2020) </w:delText>
         </w:r>
       </w:del>
-      <w:del w:id="969" w:author="Claude" w:date="2026-10-17T12:00:00Z">
+      <w:del w:id="969" w:author="А.А. Шевцов" w:date="2026-10-17T12:00:00Z">
         <w:r>
           <w:rPr>
             <w:rFonts w:ascii="Times New Roman" w:hAnsi="Times New Roman"/>
@@ -1586,7 +1586,7 @@
           <w:delText xml:space="preserve">Using Belgorod as an example, it is shown</w:delText>
         </w:r>
       </w:del>
-      <w:ins w:id="970" w:author="Claude" w:date="2026-10-17T12:00:00Z">
+      <w:ins w:id="970" w:author="А.А. Шевцов" w:date="2026-10-17T12:00:00Z">
         <w:r>
           <w:rPr>
             <w:rFonts w:ascii="Times New Roman" w:hAnsi="Times New Roman"/>
@@ -1604,7 +1604,7 @@
         </w:rPr>
         <w:t xml:space="preserve"> that under conditions of land capitalization, new development morphotypes are being formed that differ from traditional dacha communities. The authors argue that the configuration of these areas is directly dependent on the institutional conditions and strategies of local developers, which </w:t>
       </w:r>
-      <w:del w:id="971" w:author="Claude" w:date="2026-10-17T12:00:00Z">
+      <w:del w:id="971" w:author="А.А. Шевцов" w:date="2026-10-17T12:00:00Z">
         <w:r>
           <w:rPr>
             <w:rFonts w:ascii="Times New Roman" w:hAnsi="Times New Roman"/>
@@ -1614,7 +1614,7 @@
           <w:delText xml:space="preserve">effectively</w:delText>
         </w:r>
       </w:del>
-      <w:ins w:id="972" w:author="Claude" w:date="2026-10-17T12:00:00Z">
+      <w:ins w:id="972" w:author="А.А. Шевцов" w:date="2026-10-17T12:00:00Z">
         <w:r>
           <w:rPr>
             <w:rFonts w:ascii="Times New Roman" w:hAnsi="Times New Roman"/>
@@ -1632,7 +1632,7 @@
         </w:rPr>
         <w:t xml:space="preserve"> marks a transition to an “entrepreneurial” model of development in urban outskirts and </w:t>
       </w:r>
-      <w:del w:id="1026" w:author="Claude" w:date="2026-10-17T12:00:00Z">
+      <w:del w:id="1026" w:author="А.А. Шевцов" w:date="2026-10-17T12:00:00Z">
         <w:r>
           <w:rPr>
             <w:rFonts w:ascii="Times New Roman" w:hAnsi="Times New Roman"/>
@@ -1642,7 +1642,7 @@
           <w:delText xml:space="preserve">near</w:delText>
         </w:r>
       </w:del>
-      <w:ins w:id="1027" w:author="Claude" w:date="2026-10-17T12:00:00Z">
+      <w:ins w:id="1027" w:author="А.А. Шевцов" w:date="2026-10-17T12:00:00Z">
         <w:r>
           <w:rPr>
             <w:rFonts w:ascii="Times New Roman" w:hAnsi="Times New Roman"/>
@@ -1680,7 +1680,7 @@
         </w:rPr>
         <w:t xml:space="preserve">A systematization of scenarios for the territorial development of Russian cities based on the vector of transformation of their planning structure is presented in the report of the National Research University Higher School of Economics </w:t>
       </w:r>
-      <w:del w:id="1158" w:author="Claude" w:date="2026-10-17T12:00:00Z">
+      <w:del w:id="1158" w:author="А.А. Шевцов" w:date="2026-10-17T12:00:00Z">
         <w:r>
           <w:rPr>
             <w:rFonts w:ascii="Times New Roman" w:hAnsi="Times New Roman"/>
@@ -1690,7 +1690,7 @@
           <w:delText xml:space="preserve">"</w:delText>
         </w:r>
       </w:del>
-      <w:ins w:id="1159" w:author="Claude" w:date="2026-10-17T12:00:00Z">
+      <w:ins w:id="1159" w:author="А.А. Шевцов" w:date="2026-10-17T12:00:00Z">
         <w:r>
           <w:rPr>
             <w:rFonts w:ascii="Times New Roman" w:hAnsi="Times New Roman"/>
@@ -1708,7 +1708,7 @@
         </w:rPr>
         <w:t xml:space="preserve">Planning </w:t>
       </w:r>
-      <w:del w:id="973" w:author="Claude" w:date="2026-10-17T12:00:00Z">
+      <w:del w:id="973" w:author="А.А. Шевцов" w:date="2026-10-17T12:00:00Z">
         <w:r>
           <w:rPr>
             <w:rFonts w:ascii="Times New Roman" w:hAnsi="Times New Roman"/>
@@ -1718,7 +1718,7 @@
           <w:delText xml:space="preserve">for Expansion</w:delText>
         </w:r>
       </w:del>
-      <w:ins w:id="974" w:author="Claude" w:date="2026-10-17T12:00:00Z">
+      <w:ins w:id="974" w:author="А.А. Шевцов" w:date="2026-10-17T12:00:00Z">
         <w:r>
           <w:rPr>
             <w:rFonts w:ascii="Times New Roman" w:hAnsi="Times New Roman"/>
@@ -1728,7 +1728,7 @@
           <w:t xml:space="preserve">Sprawl</w:t>
         </w:r>
       </w:ins>
-      <w:del w:id="1156" w:author="Claude" w:date="2026-10-17T12:00:00Z">
+      <w:del w:id="1156" w:author="А.А. Шевцов" w:date="2026-10-17T12:00:00Z">
         <w:r>
           <w:rPr>
             <w:rFonts w:ascii="Times New Roman" w:hAnsi="Times New Roman"/>
@@ -1738,7 +1738,7 @@
           <w:delText xml:space="preserve">"</w:delText>
         </w:r>
       </w:del>
-      <w:ins w:id="1157" w:author="Claude" w:date="2026-10-17T12:00:00Z">
+      <w:ins w:id="1157" w:author="А.А. Шевцов" w:date="2026-10-17T12:00:00Z">
         <w:r>
           <w:rPr>
             <w:rFonts w:ascii="Times New Roman" w:hAnsi="Times New Roman"/>
@@ -1756,7 +1756,7 @@
         </w:rPr>
         <w:t xml:space="preserve"> (Golovin et al., 2021). Based on </w:t>
       </w:r>
-      <w:del w:id="975" w:author="Claude" w:date="2026-10-17T12:00:00Z">
+      <w:del w:id="975" w:author="А.А. Шевцов" w:date="2026-10-17T12:00:00Z">
         <w:r>
           <w:rPr>
             <w:rFonts w:ascii="Times New Roman" w:hAnsi="Times New Roman"/>
@@ -1766,7 +1766,7 @@
           <w:delText xml:space="preserve">the mathematical model of density gradients K. Clark,</w:delText>
         </w:r>
       </w:del>
-      <w:ins w:id="976" w:author="Claude" w:date="2026-10-17T12:00:00Z">
+      <w:ins w:id="976" w:author="А.А. Шевцов" w:date="2026-10-17T12:00:00Z">
         <w:r>
           <w:rPr>
             <w:rFonts w:ascii="Times New Roman" w:hAnsi="Times New Roman"/>
@@ -1803,7 +1803,7 @@
         </w:rPr>
         <w:t>- </w:t>
       </w:r>
-      <w:del w:id="1162" w:author="Claude" w:date="2026-10-17T12:00:00Z">
+      <w:del w:id="1162" w:author="А.А. Шевцов" w:date="2026-10-17T12:00:00Z">
         <w:r>
           <w:rPr>
             <w:rFonts w:ascii="Times New Roman" w:hAnsi="Times New Roman"/>
@@ -1813,7 +1813,7 @@
           <w:delText xml:space="preserve">"</w:delText>
         </w:r>
       </w:del>
-      <w:ins w:id="1163" w:author="Claude" w:date="2026-10-17T12:00:00Z">
+      <w:ins w:id="1163" w:author="А.А. Шевцов" w:date="2026-10-17T12:00:00Z">
         <w:r>
           <w:rPr>
             <w:rFonts w:ascii="Times New Roman" w:hAnsi="Times New Roman"/>
@@ -1823,7 +1823,7 @@
           <w:t xml:space="preserve">“</w:t>
         </w:r>
       </w:ins>
-      <w:del w:id="977" w:author="Claude" w:date="2026-10-17T12:00:00Z">
+      <w:del w:id="977" w:author="А.А. Шевцов" w:date="2026-10-17T12:00:00Z">
         <w:r>
           <w:rPr>
             <w:rFonts w:ascii="Times New Roman" w:hAnsi="Times New Roman"/>
@@ -1833,7 +1833,7 @@
           <w:delText xml:space="preserve">sprouting</w:delText>
         </w:r>
       </w:del>
-      <w:ins w:id="978" w:author="Claude" w:date="2026-10-17T12:00:00Z">
+      <w:ins w:id="978" w:author="А.А. Шевцов" w:date="2026-10-17T12:00:00Z">
         <w:r>
           <w:rPr>
             <w:rFonts w:ascii="Times New Roman" w:hAnsi="Times New Roman"/>
@@ -1843,7 +1843,7 @@
           <w:t xml:space="preserve">sprawl</w:t>
         </w:r>
       </w:ins>
-      <w:del w:id="1160" w:author="Claude" w:date="2026-10-17T12:00:00Z">
+      <w:del w:id="1160" w:author="А.А. Шевцов" w:date="2026-10-17T12:00:00Z">
         <w:r>
           <w:rPr>
             <w:rFonts w:ascii="Times New Roman" w:hAnsi="Times New Roman"/>
@@ -1853,7 +1853,7 @@
           <w:delText xml:space="preserve">"</w:delText>
         </w:r>
       </w:del>
-      <w:ins w:id="1161" w:author="Claude" w:date="2026-10-17T12:00:00Z">
+      <w:ins w:id="1161" w:author="А.А. Шевцов" w:date="2026-10-17T12:00:00Z">
         <w:r>
           <w:rPr>
             <w:rFonts w:ascii="Times New Roman" w:hAnsi="Times New Roman"/>
@@ -1890,7 +1890,7 @@
         </w:rPr>
         <w:t>- </w:t>
       </w:r>
-      <w:del w:id="1166" w:author="Claude" w:date="2026-10-17T12:00:00Z">
+      <w:del w:id="1166" w:author="А.А. Шевцов" w:date="2026-10-17T12:00:00Z">
         <w:r>
           <w:rPr>
             <w:rFonts w:ascii="Times New Roman" w:hAnsi="Times New Roman"/>
@@ -1900,7 +1900,7 @@
           <w:delText xml:space="preserve">"</w:delText>
         </w:r>
       </w:del>
-      <w:ins w:id="1167" w:author="Claude" w:date="2026-10-17T12:00:00Z">
+      <w:ins w:id="1167" w:author="А.А. Шевцов" w:date="2026-10-17T12:00:00Z">
         <w:r>
           <w:rPr>
             <w:rFonts w:ascii="Times New Roman" w:hAnsi="Times New Roman"/>
@@ -1918,7 +1918,7 @@
         </w:rPr>
         <w:t xml:space="preserve">growth</w:t>
       </w:r>
-      <w:del w:id="1164" w:author="Claude" w:date="2026-10-17T12:00:00Z">
+      <w:del w:id="1164" w:author="А.А. Шевцов" w:date="2026-10-17T12:00:00Z">
         <w:r>
           <w:rPr>
             <w:rFonts w:ascii="Times New Roman" w:hAnsi="Times New Roman"/>
@@ -1928,7 +1928,7 @@
           <w:delText xml:space="preserve">"</w:delText>
         </w:r>
       </w:del>
-      <w:ins w:id="1165" w:author="Claude" w:date="2026-10-17T12:00:00Z">
+      <w:ins w:id="1165" w:author="А.А. Шевцов" w:date="2026-10-17T12:00:00Z">
         <w:r>
           <w:rPr>
             <w:rFonts w:ascii="Times New Roman" w:hAnsi="Times New Roman"/>
@@ -1965,7 +1965,7 @@
         </w:rPr>
         <w:t>- </w:t>
       </w:r>
-      <w:del w:id="1170" w:author="Claude" w:date="2026-10-17T12:00:00Z">
+      <w:del w:id="1170" w:author="А.А. Шевцов" w:date="2026-10-17T12:00:00Z">
         <w:r>
           <w:rPr>
             <w:rFonts w:ascii="Times New Roman" w:hAnsi="Times New Roman"/>
@@ -1975,7 +1975,7 @@
           <w:delText xml:space="preserve">"</w:delText>
         </w:r>
       </w:del>
-      <w:ins w:id="1171" w:author="Claude" w:date="2026-10-17T12:00:00Z">
+      <w:ins w:id="1171" w:author="А.А. Шевцов" w:date="2026-10-17T12:00:00Z">
         <w:r>
           <w:rPr>
             <w:rFonts w:ascii="Times New Roman" w:hAnsi="Times New Roman"/>
@@ -1993,7 +1993,7 @@
         </w:rPr>
         <w:t xml:space="preserve">adaptation</w:t>
       </w:r>
-      <w:del w:id="1168" w:author="Claude" w:date="2026-10-17T12:00:00Z">
+      <w:del w:id="1168" w:author="А.А. Шевцов" w:date="2026-10-17T12:00:00Z">
         <w:r>
           <w:rPr>
             <w:rFonts w:ascii="Times New Roman" w:hAnsi="Times New Roman"/>
@@ -2003,7 +2003,7 @@
           <w:delText xml:space="preserve">"</w:delText>
         </w:r>
       </w:del>
-      <w:ins w:id="1169" w:author="Claude" w:date="2026-10-17T12:00:00Z">
+      <w:ins w:id="1169" w:author="А.А. Шевцов" w:date="2026-10-17T12:00:00Z">
         <w:r>
           <w:rPr>
             <w:rFonts w:ascii="Times New Roman" w:hAnsi="Times New Roman"/>
@@ -2041,7 +2041,7 @@
         </w:rPr>
         <w:t xml:space="preserve">The theoretical significance of this classification lies in identifying the gap between planning principles and actual morphological processes. The authors argue that the majority of Russia's largest centers are characterized by a </w:t>
       </w:r>
-      <w:del w:id="1174" w:author="Claude" w:date="2026-10-17T12:00:00Z">
+      <w:del w:id="1174" w:author="А.А. Шевцов" w:date="2026-10-17T12:00:00Z">
         <w:r>
           <w:rPr>
             <w:rFonts w:ascii="Times New Roman" w:hAnsi="Times New Roman"/>
@@ -2051,7 +2051,7 @@
           <w:delText xml:space="preserve">"</w:delText>
         </w:r>
       </w:del>
-      <w:ins w:id="1175" w:author="Claude" w:date="2026-10-17T12:00:00Z">
+      <w:ins w:id="1175" w:author="А.А. Шевцов" w:date="2026-10-17T12:00:00Z">
         <w:r>
           <w:rPr>
             <w:rFonts w:ascii="Times New Roman" w:hAnsi="Times New Roman"/>
@@ -2061,7 +2061,7 @@
           <w:t xml:space="preserve">“</w:t>
         </w:r>
       </w:ins>
-      <w:del w:id="979" w:author="Claude" w:date="2026-10-17T12:00:00Z">
+      <w:del w:id="979" w:author="А.А. Шевцов" w:date="2026-10-17T12:00:00Z">
         <w:r>
           <w:rPr>
             <w:rFonts w:ascii="Times New Roman" w:hAnsi="Times New Roman"/>
@@ -2071,7 +2071,7 @@
           <w:delText xml:space="preserve">sprouting</w:delText>
         </w:r>
       </w:del>
-      <w:ins w:id="980" w:author="Claude" w:date="2026-10-17T12:00:00Z">
+      <w:ins w:id="980" w:author="А.А. Шевцов" w:date="2026-10-17T12:00:00Z">
         <w:r>
           <w:rPr>
             <w:rFonts w:ascii="Times New Roman" w:hAnsi="Times New Roman"/>
@@ -2081,7 +2081,7 @@
           <w:t xml:space="preserve">sprawl</w:t>
         </w:r>
       </w:ins>
-      <w:del w:id="1172" w:author="Claude" w:date="2026-10-17T12:00:00Z">
+      <w:del w:id="1172" w:author="А.А. Шевцов" w:date="2026-10-17T12:00:00Z">
         <w:r>
           <w:rPr>
             <w:rFonts w:ascii="Times New Roman" w:hAnsi="Times New Roman"/>
@@ -2091,7 +2091,7 @@
           <w:delText xml:space="preserve">"</w:delText>
         </w:r>
       </w:del>
-      <w:ins w:id="1173" w:author="Claude" w:date="2026-10-17T12:00:00Z">
+      <w:ins w:id="1173" w:author="А.А. Шевцов" w:date="2026-10-17T12:00:00Z">
         <w:r>
           <w:rPr>
             <w:rFonts w:ascii="Times New Roman" w:hAnsi="Times New Roman"/>
@@ -2129,7 +2129,7 @@
         </w:rPr>
         <w:t xml:space="preserve">A quantitative assessment of the scale of territorial expansion of Russian cities is widely presented in modern empirical works (in particular, in the studies of I.P. </w:t>
       </w:r>
-      <w:del w:id="981" w:author="Claude" w:date="2026-10-17T12:00:00Z">
+      <w:del w:id="981" w:author="А.А. Шевцов" w:date="2026-10-17T12:00:00Z">
         <w:r>
           <w:rPr>
             <w:rFonts w:ascii="Times New Roman" w:hAnsi="Times New Roman"/>
@@ -2139,7 +2139,7 @@
           <w:delText xml:space="preserve">Smirnova and P.S. Lebedeva</w:delText>
         </w:r>
       </w:del>
-      <w:ins w:id="982" w:author="Claude" w:date="2026-10-17T12:00:00Z">
+      <w:ins w:id="982" w:author="А.А. Шевцов" w:date="2026-10-17T12:00:00Z">
         <w:r>
           <w:rPr>
             <w:rFonts w:ascii="Times New Roman" w:hAnsi="Times New Roman"/>
@@ -2157,7 +2157,7 @@
         </w:rPr>
         <w:t xml:space="preserve"> (2023), as well as S.S. </w:t>
       </w:r>
-      <w:del w:id="983" w:author="Claude" w:date="2026-10-17T12:00:00Z">
+      <w:del w:id="983" w:author="А.А. Шевцов" w:date="2026-10-17T12:00:00Z">
         <w:r>
           <w:rPr>
             <w:rFonts w:ascii="Times New Roman" w:hAnsi="Times New Roman"/>
@@ -2167,7 +2167,7 @@
           <w:delText xml:space="preserve">Lachininsky and others.</w:delText>
         </w:r>
       </w:del>
-      <w:ins w:id="984" w:author="Claude" w:date="2026-10-17T12:00:00Z">
+      <w:ins w:id="984" w:author="А.А. Шевцов" w:date="2026-10-17T12:00:00Z">
         <w:r>
           <w:rPr>
             <w:rFonts w:ascii="Times New Roman" w:hAnsi="Times New Roman"/>
@@ -2185,7 +2185,7 @@
         </w:rPr>
         <w:t xml:space="preserve"> (2023)). However, by focusing primarily on the spatial parameters of growth and the fixation of physical boundaries of development, such approaches leave the economic drivers of these processes </w:t>
       </w:r>
-      <w:del w:id="985" w:author="Claude" w:date="2026-10-17T12:00:00Z">
+      <w:del w:id="985" w:author="А.А. Шевцов" w:date="2026-10-17T12:00:00Z">
         <w:r>
           <w:rPr>
             <w:rFonts w:ascii="Times New Roman" w:hAnsi="Times New Roman"/>
@@ -2195,7 +2195,7 @@
           <w:delText xml:space="preserve">undisclosed</w:delText>
         </w:r>
       </w:del>
-      <w:ins w:id="986" w:author="Claude" w:date="2026-10-17T12:00:00Z">
+      <w:ins w:id="986" w:author="А.А. Шевцов" w:date="2026-10-17T12:00:00Z">
         <w:r>
           <w:rPr>
             <w:rFonts w:ascii="Times New Roman" w:hAnsi="Times New Roman"/>
@@ -2264,7 +2264,7 @@
         </w:rPr>
         <w:t xml:space="preserve">The work is based on the combination of an analysis of the spatial dynamics of the built-up area of Voronezh and its suburbs with an assessment of the socio-economic characteristics of newly developed territories. The work algorithm included three stages: 1) retrospective reconstruction of the physical boundaries of the built-up area for </w:t>
       </w:r>
-      <w:del w:id="987" w:author="Claude" w:date="2026-10-17T12:00:00Z">
+      <w:del w:id="987" w:author="А.А. Шевцов" w:date="2026-10-17T12:00:00Z">
         <w:r>
           <w:rPr>
             <w:rFonts w:ascii="Times New Roman" w:hAnsi="Times New Roman"/>
@@ -2273,7 +2273,7 @@
           <w:delText xml:space="preserve">individual specified</w:delText>
         </w:r>
       </w:del>
-      <w:ins w:id="988" w:author="Claude" w:date="2026-10-17T12:00:00Z">
+      <w:ins w:id="988" w:author="А.А. Шевцов" w:date="2026-10-17T12:00:00Z">
         <w:r>
           <w:rPr>
             <w:rFonts w:ascii="Times New Roman" w:hAnsi="Times New Roman"/>
@@ -2307,7 +2307,7 @@
         </w:rPr>
         <w:t xml:space="preserve">The spatial scope of the study is limited to a radius of 30 km from the city center. This scale makes it possible to fully include the zone of the most intensive morphological and functional transformations in the suburban belt. The timeframe of the work covers the period 1992–2025. To identify spatial and temporal patterns, development dynamics were recorded at </w:t>
       </w:r>
-      <w:del w:id="991" w:author="Claude" w:date="2026-10-17T12:00:00Z">
+      <w:del w:id="991" w:author="А.А. Шевцов" w:date="2026-10-17T12:00:00Z">
         <w:r>
           <w:rPr>
             <w:rFonts w:ascii="Times New Roman" w:hAnsi="Times New Roman"/>
@@ -2316,7 +2316,7 @@
           <w:delText xml:space="preserve">reference points</w:delText>
         </w:r>
       </w:del>
-      <w:ins w:id="992" w:author="Claude" w:date="2026-10-17T12:00:00Z">
+      <w:ins w:id="992" w:author="А.А. Шевцов" w:date="2026-10-17T12:00:00Z">
         <w:r>
           <w:rPr>
             <w:rFonts w:ascii="Times New Roman" w:hAnsi="Times New Roman"/>
@@ -2332,7 +2332,7 @@
         </w:rPr>
         <w:t xml:space="preserve"> (1992, 2000, 2010, 2020). The use of </w:t>
       </w:r>
-      <w:del w:id="989" w:author="Claude" w:date="2026-10-17T12:00:00Z">
+      <w:del w:id="989" w:author="А.А. Шевцов" w:date="2026-10-17T12:00:00Z">
         <w:r>
           <w:rPr>
             <w:rFonts w:ascii="Times New Roman" w:hAnsi="Times New Roman"/>
@@ -2341,7 +2341,7 @@
           <w:delText xml:space="preserve">ten-day</w:delText>
         </w:r>
       </w:del>
-      <w:ins w:id="990" w:author="Claude" w:date="2026-10-17T12:00:00Z">
+      <w:ins w:id="990" w:author="А.А. Шевцов" w:date="2026-10-17T12:00:00Z">
         <w:r>
           <w:rPr>
             <w:rFonts w:ascii="Times New Roman" w:hAnsi="Times New Roman"/>
@@ -2435,7 +2435,7 @@
         </w:rPr>
         <w:t xml:space="preserve">– open project </w:t>
       </w:r>
-      <w:del w:id="1178" w:author="Claude" w:date="2026-10-17T12:00:00Z">
+      <w:del w:id="1178" w:author="А.А. Шевцов" w:date="2026-10-17T12:00:00Z">
         <w:r>
           <w:rPr>
             <w:rFonts w:ascii="Times New Roman" w:hAnsi="Times New Roman"/>
@@ -2444,7 +2444,7 @@
           <w:delText xml:space="preserve">"</w:delText>
         </w:r>
       </w:del>
-      <w:ins w:id="1179" w:author="Claude" w:date="2026-10-17T12:00:00Z">
+      <w:ins w:id="1179" w:author="А.А. Шевцов" w:date="2026-10-17T12:00:00Z">
         <w:r>
           <w:rPr>
             <w:rFonts w:ascii="Times New Roman" w:hAnsi="Times New Roman"/>
@@ -2460,7 +2460,7 @@
         </w:rPr>
         <w:t xml:space="preserve">How old is this house</w:t>
       </w:r>
-      <w:del w:id="1176" w:author="Claude" w:date="2026-10-17T12:00:00Z">
+      <w:del w:id="1176" w:author="А.А. Шевцов" w:date="2026-10-17T12:00:00Z">
         <w:r>
           <w:rPr>
             <w:rFonts w:ascii="Times New Roman" w:hAnsi="Times New Roman"/>
@@ -2469,7 +2469,7 @@
           <w:delText xml:space="preserve">"</w:delText>
         </w:r>
       </w:del>
-      <w:ins w:id="1177" w:author="Claude" w:date="2026-10-17T12:00:00Z">
+      <w:ins w:id="1177" w:author="А.А. Шевцов" w:date="2026-10-17T12:00:00Z">
         <w:r>
           <w:rPr>
             <w:rFonts w:ascii="Times New Roman" w:hAnsi="Times New Roman"/>
@@ -2526,7 +2526,7 @@
         </w:rPr>
         <w:t xml:space="preserve"> – development </w:t>
       </w:r>
-      <w:del w:id="995" w:author="Claude" w:date="2026-10-17T12:00:00Z">
+      <w:del w:id="995" w:author="А.А. Шевцов" w:date="2026-10-17T12:00:00Z">
         <w:r>
           <w:rPr>
             <w:rFonts w:ascii="Times New Roman" w:hAnsi="Times New Roman"/>
@@ -2535,7 +2535,7 @@
           <w:delText xml:space="preserve">sites not covered by</w:delText>
         </w:r>
       </w:del>
-      <w:ins w:id="996" w:author="Claude" w:date="2026-10-17T12:00:00Z">
+      <w:ins w:id="996" w:author="А.А. Шевцов" w:date="2026-10-17T12:00:00Z">
         <w:r>
           <w:rPr>
             <w:rFonts w:ascii="Times New Roman" w:hAnsi="Times New Roman"/>
@@ -2603,7 +2603,7 @@
         </w:rPr>
         <w:t xml:space="preserve">The sources were prioritized based on their degree of reliability: the highest priority is given to data from the Unified State Register of Real Estate </w:t>
       </w:r>
-      <w:del w:id="993" w:author="Claude" w:date="2026-10-17T12:00:00Z">
+      <w:del w:id="993" w:author="А.А. Шевцов" w:date="2026-10-17T12:00:00Z">
         <w:r>
           <w:rPr>
             <w:rFonts w:ascii="Times New Roman" w:hAnsi="Times New Roman"/>
@@ -2612,7 +2612,7 @@
           <w:delText xml:space="preserve">(EGRN)</w:delText>
         </w:r>
       </w:del>
-      <w:ins w:id="994" w:author="Claude" w:date="2026-10-17T12:00:00Z">
+      <w:ins w:id="994" w:author="А.А. Шевцов" w:date="2026-10-17T12:00:00Z">
         <w:r>
           <w:rPr>
             <w:rFonts w:ascii="Times New Roman" w:hAnsi="Times New Roman"/>
@@ -2656,7 +2656,7 @@
         </w:rPr>
         <w:t xml:space="preserve">The process of transition from individual buildings to continuous development areas involved a number of operations. A 200-meter </w:t>
       </w:r>
-      <w:del w:id="997" w:author="Claude" w:date="2026-10-17T12:00:00Z">
+      <w:del w:id="997" w:author="А.А. Шевцов" w:date="2026-10-17T12:00:00Z">
         <w:r>
           <w:rPr>
             <w:rFonts w:ascii="Times New Roman" w:hAnsi="Times New Roman"/>
@@ -2666,7 +2666,7 @@
           <w:delText xml:space="preserve">coverage zone</w:delText>
         </w:r>
       </w:del>
-      <w:ins w:id="998" w:author="Claude" w:date="2026-10-17T12:00:00Z">
+      <w:ins w:id="998" w:author="А.А. Шевцов" w:date="2026-10-17T12:00:00Z">
         <w:r>
           <w:rPr>
             <w:rFonts w:ascii="Times New Roman" w:hAnsi="Times New Roman"/>
@@ -2684,7 +2684,7 @@
         </w:rPr>
         <w:t xml:space="preserve"> was created around each building. When such </w:t>
       </w:r>
-      <w:del w:id="999" w:author="Claude" w:date="2026-10-17T12:00:00Z">
+      <w:del w:id="999" w:author="А.А. Шевцов" w:date="2026-10-17T12:00:00Z">
         <w:r>
           <w:rPr>
             <w:rFonts w:ascii="Times New Roman" w:hAnsi="Times New Roman"/>
@@ -2694,7 +2694,7 @@
           <w:delText xml:space="preserve">zones</w:delText>
         </w:r>
       </w:del>
-      <w:ins w:id="1000" w:author="Claude" w:date="2026-10-17T12:00:00Z">
+      <w:ins w:id="1000" w:author="А.А. Шевцов" w:date="2026-10-17T12:00:00Z">
         <w:r>
           <w:rPr>
             <w:rFonts w:ascii="Times New Roman" w:hAnsi="Times New Roman"/>
@@ -2712,7 +2712,7 @@
         </w:rPr>
         <w:t xml:space="preserve"> intersected, the buildings were grouped into single large areas. The chosen distance made it possible to include sparse development within the boundaries of the areas, while avoiding the false merging of territories that are distant from each other. </w:t>
       </w:r>
-      <w:del w:id="1001" w:author="Claude" w:date="2026-10-17T12:00:00Z">
+      <w:del w:id="1001" w:author="А.А. Шевцов" w:date="2026-10-17T12:00:00Z">
         <w:r>
           <w:rPr>
             <w:rFonts w:ascii="Times New Roman" w:hAnsi="Times New Roman"/>
@@ -2722,7 +2722,7 @@
           <w:delText xml:space="preserve">Empty spaces</w:delText>
         </w:r>
       </w:del>
-      <w:ins w:id="1002" w:author="Claude" w:date="2026-10-17T12:00:00Z">
+      <w:ins w:id="1002" w:author="А.А. Шевцов" w:date="2026-10-17T12:00:00Z">
         <w:r>
           <w:rPr>
             <w:rFonts w:ascii="Times New Roman" w:hAnsi="Times New Roman"/>
@@ -2920,7 +2920,7 @@
         </w:rPr>
         <w:t xml:space="preserve">– Density of consumer activity (relative units/ha) – the “density” of revenue processed through cash register equipment located on the territory, calculated per 1 ha. Calculated using the areal interpolation method based on data from the </w:t>
       </w:r>
-      <w:del w:id="1003" w:author="Claude" w:date="2026-10-17T12:00:00Z">
+      <w:del w:id="1003" w:author="А.А. Шевцов" w:date="2026-10-17T12:00:00Z">
         <w:r>
           <w:rPr>
             <w:rFonts w:ascii="Times New Roman" w:hAnsi="Times New Roman"/>
@@ -2930,7 +2930,7 @@
           <w:delText xml:space="preserve">Geocheki</w:delText>
         </w:r>
       </w:del>
-      <w:ins w:id="1004" w:author="Claude" w:date="2026-10-17T12:00:00Z">
+      <w:ins w:id="1004" w:author="А.А. Шевцов" w:date="2026-10-17T12:00:00Z">
         <w:r>
           <w:rPr>
             <w:rFonts w:ascii="Times New Roman" w:hAnsi="Times New Roman"/>
@@ -2985,7 +2985,7 @@
         </w:rPr>
         <w:t xml:space="preserve">– Density of fixed assets of enterprises (rubles/ha) – the total value of fixed assets of companies located in the polygon, calculated per 1 ha. Calculated based on a database of company financial statements aggregated by the </w:t>
       </w:r>
-      <w:del w:id="1182" w:author="Claude" w:date="2026-10-17T12:00:00Z">
+      <w:del w:id="1182" w:author="А.А. Шевцов" w:date="2026-10-17T12:00:00Z">
         <w:r>
           <w:rPr>
             <w:rFonts w:ascii="Times New Roman" w:hAnsi="Times New Roman"/>
@@ -2995,7 +2995,7 @@
           <w:delText xml:space="preserve">"</w:delText>
         </w:r>
       </w:del>
-      <w:ins w:id="1183" w:author="Claude" w:date="2026-10-17T12:00:00Z">
+      <w:ins w:id="1183" w:author="А.А. Шевцов" w:date="2026-10-17T12:00:00Z">
         <w:r>
           <w:rPr>
             <w:rFonts w:ascii="Times New Roman" w:hAnsi="Times New Roman"/>
@@ -3013,7 +3013,7 @@
         </w:rPr>
         <w:t xml:space="preserve">To Be Precise</w:t>
       </w:r>
-      <w:del w:id="1180" w:author="Claude" w:date="2026-10-17T12:00:00Z">
+      <w:del w:id="1180" w:author="А.А. Шевцов" w:date="2026-10-17T12:00:00Z">
         <w:r>
           <w:rPr>
             <w:rFonts w:ascii="Times New Roman" w:hAnsi="Times New Roman"/>
@@ -3023,7 +3023,7 @@
           <w:delText xml:space="preserve">"</w:delText>
         </w:r>
       </w:del>
-      <w:ins w:id="1181" w:author="Claude" w:date="2026-10-17T12:00:00Z">
+      <w:ins w:id="1181" w:author="А.А. Шевцов" w:date="2026-10-17T12:00:00Z">
         <w:r>
           <w:rPr>
             <w:rFonts w:ascii="Times New Roman" w:hAnsi="Times New Roman"/>
@@ -3121,7 +3121,7 @@
         </w:rPr>
         <w:t xml:space="preserve">– Distance from the center of Voronezh: calculation of the average distance from the city center to the centers of new </w:t>
       </w:r>
-      <w:del w:id="1009" w:author="Claude" w:date="2026-10-17T12:00:00Z">
+      <w:del w:id="1009" w:author="А.А. Шевцов" w:date="2026-10-17T12:00:00Z">
         <w:r>
           <w:rPr>
             <w:rFonts w:ascii="Times New Roman" w:hAnsi="Times New Roman"/>
@@ -3131,7 +3131,7 @@
           <w:delText xml:space="preserve">landfills</w:delText>
         </w:r>
       </w:del>
-      <w:ins w:id="1010" w:author="Claude" w:date="2026-10-17T12:00:00Z">
+      <w:ins w:id="1010" w:author="А.А. Шевцов" w:date="2026-10-17T12:00:00Z">
         <w:r>
           <w:rPr>
             <w:rFonts w:ascii="Times New Roman" w:hAnsi="Times New Roman"/>
@@ -3170,7 +3170,7 @@
         </w:rPr>
         <w:t xml:space="preserve">– Specific cadastral value of land plots located in the polygon (rubles/m²): based on Rosreestr data (2025) to measure the </w:t>
       </w:r>
-      <w:ins w:id="1013" w:author="Claude" w:date="2026-10-17T12:00:00Z">
+      <w:ins w:id="1013" w:author="А.А. Шевцов" w:date="2026-10-17T12:00:00Z">
         <w:r>
           <w:rPr>
             <w:rFonts w:ascii="Times New Roman" w:hAnsi="Times New Roman"/>
@@ -3209,7 +3209,7 @@
         </w:rPr>
         <w:t xml:space="preserve">A significant limitation of the proposed approach is the need to operate with the indicator of the surface area of buildings, which is significantly inferior in morphological significance to the number of </w:t>
       </w:r>
-      <w:del w:id="1016" w:author="Claude" w:date="2026-10-17T12:00:00Z">
+      <w:del w:id="1016" w:author="А.А. Шевцов" w:date="2026-10-17T12:00:00Z">
         <w:r>
           <w:rPr>
             <w:rFonts w:ascii="Times New Roman" w:hAnsi="Times New Roman"/>
@@ -3219,7 +3219,7 @@
           <w:delText xml:space="preserve">storeys</w:delText>
         </w:r>
       </w:del>
-      <w:ins w:id="1017" w:author="Claude" w:date="2026-10-17T12:00:00Z">
+      <w:ins w:id="1017" w:author="А.А. Шевцов" w:date="2026-10-17T12:00:00Z">
         <w:r>
           <w:rPr>
             <w:rFonts w:ascii="Times New Roman" w:hAnsi="Times New Roman"/>
@@ -3237,7 +3237,7 @@
         </w:rPr>
         <w:t xml:space="preserve"> and the </w:t>
       </w:r>
-      <w:del w:id="1014" w:author="Claude" w:date="2026-10-17T12:00:00Z">
+      <w:del w:id="1014" w:author="А.А. Шевцов" w:date="2026-10-17T12:00:00Z">
         <w:r>
           <w:rPr>
             <w:rFonts w:ascii="Times New Roman" w:hAnsi="Times New Roman"/>
@@ -3247,7 +3247,7 @@
           <w:delText xml:space="preserve">development coefficient</w:delText>
         </w:r>
       </w:del>
-      <w:ins w:id="1015" w:author="Claude" w:date="2026-10-17T12:00:00Z">
+      <w:ins w:id="1015" w:author="А.А. Шевцов" w:date="2026-10-17T12:00:00Z">
         <w:r>
           <w:rPr>
             <w:rFonts w:ascii="Times New Roman" w:hAnsi="Times New Roman"/>
@@ -3265,7 +3265,7 @@
         </w:rPr>
         <w:t xml:space="preserve">. Data on the number of floors </w:t>
       </w:r>
-      <w:del w:id="1018" w:author="Claude" w:date="2026-10-17T12:00:00Z">
+      <w:del w:id="1018" w:author="А.А. Шевцов" w:date="2026-10-17T12:00:00Z">
         <w:r>
           <w:rPr>
             <w:rFonts w:ascii="Times New Roman" w:hAnsi="Times New Roman"/>
@@ -3275,7 +3275,7 @@
           <w:delText xml:space="preserve">is</w:delText>
         </w:r>
       </w:del>
-      <w:ins w:id="1019" w:author="Claude" w:date="2026-10-17T12:00:00Z">
+      <w:ins w:id="1019" w:author="А.А. Шевцов" w:date="2026-10-17T12:00:00Z">
         <w:r>
           <w:rPr>
             <w:rFonts w:ascii="Times New Roman" w:hAnsi="Times New Roman"/>
@@ -3293,7 +3293,7 @@
         </w:rPr>
         <w:t xml:space="preserve"> often not publicly available and </w:t>
       </w:r>
-      <w:del w:id="1020" w:author="Claude" w:date="2026-10-17T12:00:00Z">
+      <w:del w:id="1020" w:author="А.А. Шевцов" w:date="2026-10-17T12:00:00Z">
         <w:r>
           <w:rPr>
             <w:rFonts w:ascii="Times New Roman" w:hAnsi="Times New Roman"/>
@@ -3303,7 +3303,7 @@
           <w:delText xml:space="preserve">is</w:delText>
         </w:r>
       </w:del>
-      <w:ins w:id="1021" w:author="Claude" w:date="2026-10-17T12:00:00Z">
+      <w:ins w:id="1021" w:author="А.А. Шевцов" w:date="2026-10-17T12:00:00Z">
         <w:r>
           <w:rPr>
             <w:rFonts w:ascii="Times New Roman" w:hAnsi="Times New Roman"/>
@@ -3342,7 +3342,7 @@
         </w:rPr>
         <w:t xml:space="preserve">All spatial operations and calculations of indicators were performed in the QGIS </w:t>
       </w:r>
-      <w:del w:id="1022" w:author="Claude" w:date="2026-10-17T12:00:00Z">
+      <w:del w:id="1022" w:author="А.А. Шевцов" w:date="2026-10-17T12:00:00Z">
         <w:r>
           <w:rPr>
             <w:rFonts w:ascii="Times New Roman" w:hAnsi="Times New Roman"/>
@@ -3352,7 +3352,7 @@
           <w:delText xml:space="preserve">program</w:delText>
         </w:r>
       </w:del>
-      <w:ins w:id="1023" w:author="Claude" w:date="2026-10-17T12:00:00Z">
+      <w:ins w:id="1023" w:author="А.А. Шевцов" w:date="2026-10-17T12:00:00Z">
         <w:r>
           <w:rPr>
             <w:rFonts w:ascii="Times New Roman" w:hAnsi="Times New Roman"/>
@@ -3423,7 +3423,7 @@
         </w:rPr>
         <w:t xml:space="preserve">An analysis of the territorial growth of Voronezh and its suburban area and changes in their morphology for the period 1992–2025 allows us to identify a profound structural reorganization of the spatial system under study. By the beginning of the post-Soviet period, the development retained a compact planning structure: the area of the “physical city” was 28.8 thousand hectares, which was comparable to the total area of suburban settlements (31.2 thousand hectares) with an extremely low proportion of dispersed development (3.5 thousand hectares). By 2025, the situation had radically transformed: while the area of the “physical city” had grown by 42% (to 41.1 thousand hectares), the area of settlements in the </w:t>
       </w:r>
-      <w:del w:id="1028" w:author="Claude" w:date="2026-10-17T12:00:00Z">
+      <w:del w:id="1028" w:author="А.А. Шевцов" w:date="2026-10-17T12:00:00Z">
         <w:r>
           <w:rPr>
             <w:rFonts w:ascii="Times New Roman" w:hAnsi="Times New Roman"/>
@@ -3433,7 +3433,7 @@
           <w:delText xml:space="preserve">near</w:delText>
         </w:r>
       </w:del>
-      <w:ins w:id="1029" w:author="Claude" w:date="2026-10-17T12:00:00Z">
+      <w:ins w:id="1029" w:author="А.А. Шевцов" w:date="2026-10-17T12:00:00Z">
         <w:r>
           <w:rPr>
             <w:rFonts w:ascii="Times New Roman" w:hAnsi="Times New Roman"/>
@@ -3451,7 +3451,7 @@
         </w:rPr>
         <w:t xml:space="preserve"> suburbs had doubled, reaching 62.2 thousand hectares, and the area of dispersed development areas had increased more than 3.5 times (to 12.3 thousand hectares). As a result, the share of the “physical city” in the overall structure of the study area decreased from 45% to 35% </w:t>
       </w:r>
-      <w:del w:id="1034" w:author="Claude" w:date="2026-10-17T12:00:00Z">
+      <w:del w:id="1034" w:author="А.А. Шевцов" w:date="2026-10-17T12:00:00Z">
         <w:r>
           <w:rPr>
             <w:rFonts w:ascii="Times New Roman" w:hAnsi="Times New Roman"/>
@@ -3461,7 +3461,7 @@
           <w:delText xml:space="preserve">due to the accelerated pace</w:delText>
         </w:r>
       </w:del>
-      <w:ins w:id="1035" w:author="Claude" w:date="2026-10-17T12:00:00Z">
+      <w:ins w:id="1035" w:author="А.А. Шевцов" w:date="2026-10-17T12:00:00Z">
         <w:r>
           <w:rPr>
             <w:rFonts w:ascii="Times New Roman" w:hAnsi="Times New Roman"/>
@@ -3499,7 +3499,7 @@
         </w:rPr>
         <w:t xml:space="preserve">This significant structural shift resulted from the prevalence of discrete methods of urban expansion over traditional </w:t>
       </w:r>
-      <w:del w:id="1036" w:author="Claude" w:date="2026-10-17T12:00:00Z">
+      <w:del w:id="1036" w:author="А.А. Шевцов" w:date="2026-10-17T12:00:00Z">
         <w:r>
           <w:rPr>
             <w:rFonts w:ascii="Times New Roman" w:hAnsi="Times New Roman"/>
@@ -3509,7 +3509,7 @@
           <w:delText xml:space="preserve">regional</w:delText>
         </w:r>
       </w:del>
-      <w:ins w:id="1037" w:author="Claude" w:date="2026-10-17T12:00:00Z">
+      <w:ins w:id="1037" w:author="А.А. Шевцов" w:date="2026-10-17T12:00:00Z">
         <w:r>
           <w:rPr>
             <w:rFonts w:ascii="Times New Roman" w:hAnsi="Times New Roman"/>
@@ -3556,7 +3556,7 @@
         </w:rPr>
         <w:t xml:space="preserve">This trend is largely driven by economic incentives. The most expensive land plots for new development with a specific cost of </w:t>
       </w:r>
-      <w:del w:id="1040" w:author="Claude" w:date="2026-10-17T12:00:00Z">
+      <w:del w:id="1040" w:author="А.А. Шевцов" w:date="2026-10-17T12:00:00Z">
         <w:r>
           <w:rPr>
             <w:rFonts w:ascii="Times New Roman" w:hAnsi="Times New Roman"/>
@@ -3566,7 +3566,7 @@
           <w:delText xml:space="preserve">1892 rubles/m</w:delText>
         </w:r>
       </w:del>
-      <w:del w:id="1041" w:author="Claude" w:date="2026-10-17T12:00:00Z">
+      <w:del w:id="1041" w:author="А.А. Шевцов" w:date="2026-10-17T12:00:00Z">
         <w:r>
           <w:rPr>
             <w:rFonts w:ascii="Times New Roman" w:hAnsi="Times New Roman"/>
@@ -3577,7 +3577,7 @@
           <w:delText xml:space="preserve">2</w:delText>
         </w:r>
       </w:del>
-      <w:ins w:id="1042" w:author="Claude" w:date="2026-10-17T12:00:00Z">
+      <w:ins w:id="1042" w:author="А.А. Шевцов" w:date="2026-10-17T12:00:00Z">
         <w:r>
           <w:rPr>
             <w:rFonts w:ascii="Times New Roman" w:hAnsi="Times New Roman"/>
@@ -3595,7 +3595,7 @@
         </w:rPr>
         <w:t xml:space="preserve"> were developed as a result of the </w:t>
       </w:r>
-      <w:del w:id="1038" w:author="Claude" w:date="2026-10-17T12:00:00Z">
+      <w:del w:id="1038" w:author="А.А. Шевцов" w:date="2026-10-17T12:00:00Z">
         <w:r>
           <w:rPr>
             <w:rFonts w:ascii="Times New Roman" w:hAnsi="Times New Roman"/>
@@ -3605,7 +3605,7 @@
           <w:delText xml:space="preserve">regional</w:delText>
         </w:r>
       </w:del>
-      <w:ins w:id="1039" w:author="Claude" w:date="2026-10-17T12:00:00Z">
+      <w:ins w:id="1039" w:author="А.А. Шевцов" w:date="2026-10-17T12:00:00Z">
         <w:r>
           <w:rPr>
             <w:rFonts w:ascii="Times New Roman" w:hAnsi="Times New Roman"/>
@@ -3623,7 +3623,7 @@
         </w:rPr>
         <w:t xml:space="preserve"> growth of the “physical city”. The high cost of land in these areas, due to their proximity to urban utility networks and transport hubs, dictates the need to implement high-density, </w:t>
       </w:r>
-      <w:del w:id="1045" w:author="Claude" w:date="2026-10-17T12:00:00Z">
+      <w:del w:id="1045" w:author="А.А. Шевцов" w:date="2026-10-17T12:00:00Z">
         <w:r>
           <w:rPr>
             <w:rFonts w:ascii="Times New Roman" w:hAnsi="Times New Roman"/>
@@ -3633,7 +3633,7 @@
           <w:delText xml:space="preserve">multi-story</w:delText>
         </w:r>
       </w:del>
-      <w:ins w:id="1046" w:author="Claude" w:date="2026-10-17T12:00:00Z">
+      <w:ins w:id="1046" w:author="А.А. Шевцов" w:date="2026-10-17T12:00:00Z">
         <w:r>
           <w:rPr>
             <w:rFonts w:ascii="Times New Roman" w:hAnsi="Times New Roman"/>
@@ -3651,7 +3651,7 @@
         </w:rPr>
         <w:t xml:space="preserve"> residential development projects. On the contrary, the mechanism of isolated growth, which dominates the growth structure, is realized on land plots remote from the city with an average price of 409 rubles/m². This is due to the phenomenon of the “rent gap” described by N. Smith (1987). The fivefold price disparity between the outskirts of the </w:t>
       </w:r>
-      <w:del w:id="1186" w:author="Claude" w:date="2026-10-17T12:00:00Z">
+      <w:del w:id="1186" w:author="А.А. Шевцов" w:date="2026-10-17T12:00:00Z">
         <w:r>
           <w:rPr>
             <w:rFonts w:ascii="Times New Roman" w:hAnsi="Times New Roman"/>
@@ -3661,7 +3661,7 @@
           <w:delText xml:space="preserve">"</w:delText>
         </w:r>
       </w:del>
-      <w:ins w:id="1187" w:author="Claude" w:date="2026-10-17T12:00:00Z">
+      <w:ins w:id="1187" w:author="А.А. Шевцов" w:date="2026-10-17T12:00:00Z">
         <w:r>
           <w:rPr>
             <w:rFonts w:ascii="Times New Roman" w:hAnsi="Times New Roman"/>
@@ -3679,7 +3679,7 @@
         </w:rPr>
         <w:t xml:space="preserve">physical city</w:t>
       </w:r>
-      <w:del w:id="1184" w:author="Claude" w:date="2026-10-17T12:00:00Z">
+      <w:del w:id="1184" w:author="А.А. Шевцов" w:date="2026-10-17T12:00:00Z">
         <w:r>
           <w:rPr>
             <w:rFonts w:ascii="Times New Roman" w:hAnsi="Times New Roman"/>
@@ -3689,7 +3689,7 @@
           <w:delText xml:space="preserve">"</w:delText>
         </w:r>
       </w:del>
-      <w:ins w:id="1185" w:author="Claude" w:date="2026-10-17T12:00:00Z">
+      <w:ins w:id="1185" w:author="А.А. Шевцов" w:date="2026-10-17T12:00:00Z">
         <w:r>
           <w:rPr>
             <w:rFonts w:ascii="Times New Roman" w:hAnsi="Times New Roman"/>
@@ -3707,7 +3707,7 @@
         </w:rPr>
         <w:t xml:space="preserve"> and remote areas creates conditions for extracting maximum rent with minimal obligations on the part of developers to </w:t>
       </w:r>
-      <w:del w:id="1043" w:author="Claude" w:date="2026-10-17T12:00:00Z">
+      <w:del w:id="1043" w:author="А.А. Шевцов" w:date="2026-10-17T12:00:00Z">
         <w:r>
           <w:rPr>
             <w:rFonts w:ascii="Times New Roman" w:hAnsi="Times New Roman"/>
@@ -3717,7 +3717,7 @@
           <w:delText xml:space="preserve">develop</w:delText>
         </w:r>
       </w:del>
-      <w:ins w:id="1044" w:author="Claude" w:date="2026-10-17T12:00:00Z">
+      <w:ins w:id="1044" w:author="А.А. Шевцов" w:date="2026-10-17T12:00:00Z">
         <w:r>
           <w:rPr>
             <w:rFonts w:ascii="Times New Roman" w:hAnsi="Times New Roman"/>
@@ -3755,7 +3755,7 @@
         </w:rPr>
         <w:t xml:space="preserve">Thus, </w:t>
       </w:r>
-      <w:del w:id="1047" w:author="Claude" w:date="2026-10-17T12:00:00Z">
+      <w:del w:id="1047" w:author="А.А. Шевцов" w:date="2026-10-17T12:00:00Z">
         <w:r>
           <w:rPr>
             <w:rFonts w:ascii="Times New Roman" w:hAnsi="Times New Roman"/>
@@ -3765,7 +3765,7 @@
           <w:delText xml:space="preserve">development</w:delText>
         </w:r>
       </w:del>
-      <w:ins w:id="1048" w:author="Claude" w:date="2026-10-17T12:00:00Z">
+      <w:ins w:id="1048" w:author="А.А. Шевцов" w:date="2026-10-17T12:00:00Z">
         <w:r>
           <w:rPr>
             <w:rFonts w:ascii="Times New Roman" w:hAnsi="Times New Roman"/>
@@ -3783,7 +3783,7 @@
         </w:rPr>
         <w:t xml:space="preserve"> activity is shifting to the area of the cheapest land. A comparison of the current valuation (2025) of plots depending on the time of their development reveals a steady downward trend: the average specific </w:t>
       </w:r>
-      <w:del w:id="1049" w:author="Claude" w:date="2026-10-17T12:00:00Z">
+      <w:del w:id="1049" w:author="А.А. Шевцов" w:date="2026-10-17T12:00:00Z">
         <w:r>
           <w:rPr>
             <w:rFonts w:ascii="Times New Roman" w:hAnsi="Times New Roman"/>
@@ -3793,7 +3793,7 @@
           <w:delText xml:space="preserve">value</w:delText>
         </w:r>
       </w:del>
-      <w:ins w:id="1050" w:author="Claude" w:date="2026-10-17T12:00:00Z">
+      <w:ins w:id="1050" w:author="А.А. Шевцов" w:date="2026-10-17T12:00:00Z">
         <w:r>
           <w:rPr>
             <w:rFonts w:ascii="Times New Roman" w:hAnsi="Times New Roman"/>
@@ -3851,7 +3851,7 @@
         </w:rPr>
         <w:t xml:space="preserve">Low-rise developments were formed primarily in areas that, as of 2025, retain their minimum cadastral value. Although such objects appeared in almost all sectors of the suburban area, their greatest concentration was recorded in the northern and eastern directions. The current price level (an average of 495 rubles/m²) suggests that it was the </w:t>
       </w:r>
-      <w:del w:id="1053" w:author="Claude" w:date="2026-10-17T12:00:00Z">
+      <w:del w:id="1053" w:author="А.А. Шевцов" w:date="2026-10-17T12:00:00Z">
         <w:r>
           <w:rPr>
             <w:rFonts w:ascii="Times New Roman" w:hAnsi="Times New Roman"/>
@@ -3861,7 +3861,7 @@
           <w:delText xml:space="preserve">availability</w:delText>
         </w:r>
       </w:del>
-      <w:ins w:id="1054" w:author="Claude" w:date="2026-10-17T12:00:00Z">
+      <w:ins w:id="1054" w:author="А.А. Шевцов" w:date="2026-10-17T12:00:00Z">
         <w:r>
           <w:rPr>
             <w:rFonts w:ascii="Times New Roman" w:hAnsi="Times New Roman"/>
@@ -3879,7 +3879,7 @@
         </w:rPr>
         <w:t xml:space="preserve"> of land assets that was the leading incentive for their development. According to this logic, transport distance from the center of Voronezh did not become an obstacle to construction, which was in apparent contradiction with classical models: the price factor turned out to be more significant than the distance factor. The leading motive for the development of such territories remained the population’s desire for suburbanization (</w:t>
       </w:r>
-      <w:del w:id="955" w:author="Claude" w:date="2026-10-17T12:00:00Z">
+      <w:del w:id="955" w:author="А.А. Шевцов" w:date="2026-10-17T12:00:00Z">
         <w:r>
           <w:rPr>
             <w:rFonts w:ascii="Times New Roman" w:hAnsi="Times New Roman"/>
@@ -3889,7 +3889,7 @@
           <w:delText xml:space="preserve">Mahrova</w:delText>
         </w:r>
       </w:del>
-      <w:ins w:id="956" w:author="Claude" w:date="2026-10-17T12:00:00Z">
+      <w:ins w:id="956" w:author="А.А. Шевцов" w:date="2026-10-17T12:00:00Z">
         <w:r>
           <w:rPr>
             <w:rFonts w:ascii="Times New Roman" w:hAnsi="Times New Roman"/>
@@ -3927,7 +3927,7 @@
         </w:rPr>
         <w:t xml:space="preserve">In contrast to the low-rise sector, </w:t>
       </w:r>
-      <w:del w:id="1055" w:author="Claude" w:date="2026-10-17T12:00:00Z">
+      <w:del w:id="1055" w:author="А.А. Шевцов" w:date="2026-10-17T12:00:00Z">
         <w:r>
           <w:rPr>
             <w:rFonts w:ascii="Times New Roman" w:hAnsi="Times New Roman"/>
@@ -3937,7 +3937,7 @@
           <w:delText xml:space="preserve">high-rise</w:delText>
         </w:r>
       </w:del>
-      <w:ins w:id="1056" w:author="Claude" w:date="2026-10-17T12:00:00Z">
+      <w:ins w:id="1056" w:author="А.А. Шевцов" w:date="2026-10-17T12:00:00Z">
         <w:r>
           <w:rPr>
             <w:rFonts w:ascii="Times New Roman" w:hAnsi="Times New Roman"/>
@@ -3955,7 +3955,7 @@
         </w:rPr>
         <w:t xml:space="preserve"> residential development exhibits a high degree of spatial concentration, localizing primarily on the outskirts of Voronezh and the largest suburban settlements. The high cost of such land </w:t>
       </w:r>
-      <w:del w:id="1057" w:author="Claude" w:date="2026-10-17T12:00:00Z">
+      <w:del w:id="1057" w:author="А.А. Шевцов" w:date="2026-10-17T12:00:00Z">
         <w:r>
           <w:rPr>
             <w:rFonts w:ascii="Times New Roman" w:hAnsi="Times New Roman"/>
@@ -3965,7 +3965,7 @@
           <w:delText xml:space="preserve">(RUB 1,638/m²)</w:delText>
         </w:r>
       </w:del>
-      <w:ins w:id="1058" w:author="Claude" w:date="2026-10-17T12:00:00Z">
+      <w:ins w:id="1058" w:author="А.А. Шевцов" w:date="2026-10-17T12:00:00Z">
         <w:r>
           <w:rPr>
             <w:rFonts w:ascii="Times New Roman" w:hAnsi="Times New Roman"/>
@@ -4016,7 +4016,7 @@
         </w:rPr>
         <w:t xml:space="preserve"> – large suburban shopping centers and hypermarkets located on main highways at the entrance to the city. Of the 80.9 hectares of commercial hub territories, 53.9 hectares appeared in the period 2000–2010, 25 hectares in the following decade, and only 2 hectares since 2020. Thus, between 2000 and 2020, a “belt of suburban shopping centers” was formed, closing the exits from Voronezh. The emergence of this framework provided suburban residents with access to modern services and reduced their </w:t>
       </w:r>
-      <w:del w:id="1059" w:author="Claude" w:date="2026-10-17T12:00:00Z">
+      <w:del w:id="1059" w:author="А.А. Шевцов" w:date="2026-10-17T12:00:00Z">
         <w:r>
           <w:rPr>
             <w:rFonts w:ascii="Times New Roman" w:hAnsi="Times New Roman"/>
@@ -4025,7 +4025,7 @@
           <w:delText xml:space="preserve">daily</w:delText>
         </w:r>
       </w:del>
-      <w:ins w:id="1060" w:author="Claude" w:date="2026-10-17T12:00:00Z">
+      <w:ins w:id="1060" w:author="А.А. Шевцов" w:date="2026-10-17T12:00:00Z">
         <w:r>
           <w:rPr>
             <w:rFonts w:ascii="Times New Roman" w:hAnsi="Times New Roman"/>
@@ -4041,7 +4041,7 @@
         </w:rPr>
         <w:t xml:space="preserve"> dependence on the </w:t>
       </w:r>
-      <w:del w:id="1190" w:author="Claude" w:date="2026-10-17T12:00:00Z">
+      <w:del w:id="1190" w:author="А.А. Шевцов" w:date="2026-10-17T12:00:00Z">
         <w:r>
           <w:rPr>
             <w:rFonts w:ascii="Times New Roman" w:hAnsi="Times New Roman"/>
@@ -4050,7 +4050,7 @@
           <w:delText xml:space="preserve">"</w:delText>
         </w:r>
       </w:del>
-      <w:ins w:id="1191" w:author="Claude" w:date="2026-10-17T12:00:00Z">
+      <w:ins w:id="1191" w:author="А.А. Шевцов" w:date="2026-10-17T12:00:00Z">
         <w:r>
           <w:rPr>
             <w:rFonts w:ascii="Times New Roman" w:hAnsi="Times New Roman"/>
@@ -4066,7 +4066,7 @@
         </w:rPr>
         <w:t xml:space="preserve">physical city.</w:t>
       </w:r>
-      <w:del w:id="1188" w:author="Claude" w:date="2026-10-17T12:00:00Z">
+      <w:del w:id="1188" w:author="А.А. Шевцов" w:date="2026-10-17T12:00:00Z">
         <w:r>
           <w:rPr>
             <w:rFonts w:ascii="Times New Roman" w:hAnsi="Times New Roman"/>
@@ -4075,7 +4075,7 @@
           <w:delText xml:space="preserve">"</w:delText>
         </w:r>
       </w:del>
-      <w:ins w:id="1189" w:author="Claude" w:date="2026-10-17T12:00:00Z">
+      <w:ins w:id="1189" w:author="А.А. Шевцов" w:date="2026-10-17T12:00:00Z">
         <w:r>
           <w:rPr>
             <w:rFonts w:ascii="Times New Roman" w:hAnsi="Times New Roman"/>
@@ -4120,7 +4120,7 @@
         <w:lastRenderedPageBreak/>
         <w:t xml:space="preserve">total area of new industrial zones amounted to 977 hectares, with more than half of this volume (566.7 hectares) formed between 2010 and 2020. The largest increase during this decade was recorded in the eastern and northern sectors, as well as on the southeastern periphery. Unlike residential development, this process was supported by the creation of specialized infrastructure sites (in particular, the Maslovsky Industrial Park and the </w:t>
       </w:r>
-      <w:del w:id="1061" w:author="Claude" w:date="2026-10-17T12:00:00Z">
+      <w:del w:id="1061" w:author="А.А. Шевцов" w:date="2026-10-17T12:00:00Z">
         <w:r>
           <w:rPr>
             <w:rFonts w:ascii="Times New Roman" w:hAnsi="Times New Roman"/>
@@ -4130,7 +4130,7 @@
           <w:delText xml:space="preserve">Center Special Economic Zone for Industrial Production</w:delText>
         </w:r>
       </w:del>
-      <w:ins w:id="1062" w:author="Claude" w:date="2026-10-17T12:00:00Z">
+      <w:ins w:id="1062" w:author="А.А. Шевцов" w:date="2026-10-17T12:00:00Z">
         <w:r>
           <w:rPr>
             <w:rFonts w:ascii="Times New Roman" w:hAnsi="Times New Roman"/>
@@ -4188,7 +4188,7 @@
         </w:rPr>
         <w:t xml:space="preserve">The combination of these factors shows that territorial growth is determined primarily by the economic benefits of land development. This transformation corresponds to the logic of “urban entrepreneurship” (</w:t>
       </w:r>
-      <w:del w:id="957" w:author="Claude" w:date="2026-10-17T12:00:00Z">
+      <w:del w:id="957" w:author="А.А. Шевцов" w:date="2026-10-17T12:00:00Z">
         <w:r>
           <w:rPr>
             <w:rFonts w:ascii="Times New Roman" w:hAnsi="Times New Roman"/>
@@ -4198,7 +4198,7 @@
           <w:delText xml:space="preserve">Mahrova</w:delText>
         </w:r>
       </w:del>
-      <w:ins w:id="958" w:author="Claude" w:date="2026-10-17T12:00:00Z">
+      <w:ins w:id="958" w:author="А.А. Шевцов" w:date="2026-10-17T12:00:00Z">
         <w:r>
           <w:rPr>
             <w:rFonts w:ascii="Times New Roman" w:hAnsi="Times New Roman"/>
@@ -4245,7 +4245,7 @@
           <w:sz w:val="24"/>
         </w:rPr>
       </w:pPr>
-      <w:del w:id="1063" w:author="Claude" w:date="2026-10-17T12:00:00Z">
+      <w:del w:id="1063" w:author="А.А. Шевцов" w:date="2026-10-17T12:00:00Z">
         <w:r>
           <w:rPr>
             <w:rFonts w:ascii="Times New Roman" w:hAnsi="Times New Roman"/>
@@ -4256,7 +4256,7 @@
           <w:delText xml:space="preserve">First</w:delText>
         </w:r>
       </w:del>
-      <w:ins w:id="1064" w:author="Claude" w:date="2026-10-17T12:00:00Z">
+      <w:ins w:id="1064" w:author="А.А. Шевцов" w:date="2026-10-17T12:00:00Z">
         <w:r>
           <w:rPr>
             <w:rFonts w:ascii="Times New Roman" w:hAnsi="Times New Roman"/>
@@ -4283,7 +4283,7 @@
         </w:rPr>
         <w:t xml:space="preserve"> was of a transitional nature, when spatial development was determined by spontaneous market processes, which manifested itself in the absence of a dominant vector of development, when growth was distributed relatively evenly, without being concentrated in certain sectors. The rate of physical growth of the territory was 588 hectares/year. The expansion of development was carried out almost exclusively for the residential function, with the average distance of new </w:t>
       </w:r>
-      <w:del w:id="1011" w:author="Claude" w:date="2026-10-17T12:00:00Z">
+      <w:del w:id="1011" w:author="А.А. Шевцов" w:date="2026-10-17T12:00:00Z">
         <w:r>
           <w:rPr>
             <w:rFonts w:ascii="Times New Roman" w:hAnsi="Times New Roman"/>
@@ -4292,7 +4292,7 @@
           <w:delText xml:space="preserve">landfills</w:delText>
         </w:r>
       </w:del>
-      <w:ins w:id="1012" w:author="Claude" w:date="2026-10-17T12:00:00Z">
+      <w:ins w:id="1012" w:author="А.А. Шевцов" w:date="2026-10-17T12:00:00Z">
         <w:r>
           <w:rPr>
             <w:rFonts w:ascii="Times New Roman" w:hAnsi="Times New Roman"/>
@@ -4308,7 +4308,7 @@
         </w:rPr>
         <w:t xml:space="preserve"> from the center being approximately 16 km. At the same time, the area of the </w:t>
       </w:r>
-      <w:del w:id="1030" w:author="Claude" w:date="2026-10-17T12:00:00Z">
+      <w:del w:id="1030" w:author="А.А. Шевцов" w:date="2026-10-17T12:00:00Z">
         <w:r>
           <w:rPr>
             <w:rFonts w:ascii="Times New Roman" w:hAnsi="Times New Roman"/>
@@ -4317,7 +4317,7 @@
           <w:delText xml:space="preserve">near</w:delText>
         </w:r>
       </w:del>
-      <w:ins w:id="1031" w:author="Claude" w:date="2026-10-17T12:00:00Z">
+      <w:ins w:id="1031" w:author="А.А. Шевцов" w:date="2026-10-17T12:00:00Z">
         <w:r>
           <w:rPr>
             <w:rFonts w:ascii="Times New Roman" w:hAnsi="Times New Roman"/>
@@ -4333,7 +4333,7 @@
         </w:rPr>
         <w:t xml:space="preserve"> suburbs was transformed primarily due to the chaotic spread of low-rise buildings (dacha communities and gardening non-profit partnerships). The share of new industrial areas in the structure of territorial growth at this stage was only 2% (119 hectares), and no new areas for commercial use were recorded. This is connected both with the crisis phenomena in the Russian economy in the </w:t>
       </w:r>
-      <w:del w:id="1065" w:author="Claude" w:date="2026-10-17T12:00:00Z">
+      <w:del w:id="1065" w:author="А.А. Шевцов" w:date="2026-10-17T12:00:00Z">
         <w:r>
           <w:rPr>
             <w:rFonts w:ascii="Times New Roman" w:hAnsi="Times New Roman"/>
@@ -4342,7 +4342,7 @@
           <w:delText xml:space="preserve">nineties</w:delText>
         </w:r>
       </w:del>
-      <w:ins w:id="1066" w:author="Claude" w:date="2026-10-17T12:00:00Z">
+      <w:ins w:id="1066" w:author="А.А. Шевцов" w:date="2026-10-17T12:00:00Z">
         <w:r>
           <w:rPr>
             <w:rFonts w:ascii="Times New Roman" w:hAnsi="Times New Roman"/>
@@ -4371,7 +4371,7 @@
           <w:highlight w:val="red"/>
         </w:rPr>
       </w:pPr>
-      <w:del w:id="1067" w:author="Claude" w:date="2026-10-17T12:00:00Z">
+      <w:del w:id="1067" w:author="А.А. Шевцов" w:date="2026-10-17T12:00:00Z">
         <w:r>
           <w:rPr>
             <w:rFonts w:ascii="Times New Roman" w:hAnsi="Times New Roman"/>
@@ -4383,7 +4383,7 @@
           <w:delText xml:space="preserve">Second</w:delText>
         </w:r>
       </w:del>
-      <w:ins w:id="1068" w:author="Claude" w:date="2026-10-17T12:00:00Z">
+      <w:ins w:id="1068" w:author="А.А. Шевцов" w:date="2026-10-17T12:00:00Z">
         <w:r>
           <w:rPr>
             <w:rFonts w:ascii="Times New Roman" w:hAnsi="Times New Roman"/>
@@ -4445,7 +4445,7 @@
           <w:sz w:val="24"/>
         </w:rPr>
       </w:pPr>
-      <w:del w:id="1069" w:author="Claude" w:date="2026-10-17T12:00:00Z">
+      <w:del w:id="1069" w:author="А.А. Шевцов" w:date="2026-10-17T12:00:00Z">
         <w:r>
           <w:rPr>
             <w:rFonts w:ascii="Times New Roman" w:hAnsi="Times New Roman"/>
@@ -4457,7 +4457,7 @@
           <w:delText xml:space="preserve">Third</w:delText>
         </w:r>
       </w:del>
-      <w:ins w:id="1070" w:author="Claude" w:date="2026-10-17T12:00:00Z">
+      <w:ins w:id="1070" w:author="А.А. Шевцов" w:date="2026-10-17T12:00:00Z">
         <w:r>
           <w:rPr>
             <w:rFonts w:ascii="Times New Roman" w:hAnsi="Times New Roman"/>
@@ -4487,7 +4487,7 @@
         </w:rPr>
         <w:t xml:space="preserve"> became a phase of “explosive expansion” (720 ha/year). Its beginning was marked by the administrative reform of 2011, as a result of which 22 settlements were included in Voronezh. Despite the fact that the bulk of new territorial reserves was concentrated in the southern sector (the Shilovo, Maslovka, and Nikolskoye microdistricts), </w:t>
       </w:r>
-      <w:del w:id="1071" w:author="Claude" w:date="2026-10-17T12:00:00Z">
+      <w:del w:id="1071" w:author="А.А. Шевцов" w:date="2026-10-17T12:00:00Z">
         <w:r>
           <w:rPr>
             <w:rFonts w:ascii="Times New Roman" w:hAnsi="Times New Roman"/>
@@ -4497,7 +4497,7 @@
           <w:delText xml:space="preserve">real development</w:delText>
         </w:r>
       </w:del>
-      <w:ins w:id="1072" w:author="Claude" w:date="2026-10-17T12:00:00Z">
+      <w:ins w:id="1072" w:author="А.А. Шевцов" w:date="2026-10-17T12:00:00Z">
         <w:r>
           <w:rPr>
             <w:rFonts w:ascii="Times New Roman" w:hAnsi="Times New Roman"/>
@@ -4515,7 +4515,7 @@
         </w:rPr>
         <w:t xml:space="preserve"> activity consolidated the northern and eastern development vectors in the area of Voronezh's </w:t>
       </w:r>
-      <w:del w:id="1032" w:author="Claude" w:date="2026-10-17T12:00:00Z">
+      <w:del w:id="1032" w:author="А.А. Шевцов" w:date="2026-10-17T12:00:00Z">
         <w:r>
           <w:rPr>
             <w:rFonts w:ascii="Times New Roman" w:hAnsi="Times New Roman"/>
@@ -4525,7 +4525,7 @@
           <w:delText xml:space="preserve">near</w:delText>
         </w:r>
       </w:del>
-      <w:ins w:id="1033" w:author="Claude" w:date="2026-10-17T12:00:00Z">
+      <w:ins w:id="1033" w:author="А.А. Шевцов" w:date="2026-10-17T12:00:00Z">
         <w:r>
           <w:rPr>
             <w:rFonts w:ascii="Times New Roman" w:hAnsi="Times New Roman"/>
@@ -4572,7 +4572,7 @@
         <w:lastRenderedPageBreak/>
         <w:t xml:space="preserve">2025, the average specific </w:t>
       </w:r>
-      <w:del w:id="1051" w:author="Claude" w:date="2026-10-17T12:00:00Z">
+      <w:del w:id="1051" w:author="А.А. Шевцов" w:date="2026-10-17T12:00:00Z">
         <w:r>
           <w:rPr>
             <w:rFonts w:ascii="Times New Roman" w:hAnsi="Times New Roman"/>
@@ -4582,7 +4582,7 @@
           <w:delText xml:space="preserve">value</w:delText>
         </w:r>
       </w:del>
-      <w:ins w:id="1052" w:author="Claude" w:date="2026-10-17T12:00:00Z">
+      <w:ins w:id="1052" w:author="А.А. Шевцов" w:date="2026-10-17T12:00:00Z">
         <w:r>
           <w:rPr>
             <w:rFonts w:ascii="Times New Roman" w:hAnsi="Times New Roman"/>
@@ -4631,7 +4631,7 @@
           <w:sz w:val="24"/>
         </w:rPr>
       </w:pPr>
-      <w:del w:id="1073" w:author="Claude" w:date="2026-10-17T12:00:00Z">
+      <w:del w:id="1073" w:author="А.А. Шевцов" w:date="2026-10-17T12:00:00Z">
         <w:r>
           <w:rPr>
             <w:rFonts w:ascii="Times New Roman" w:hAnsi="Times New Roman"/>
@@ -4642,7 +4642,7 @@
           <w:delText xml:space="preserve">Fourth stage (2020–2025)</w:delText>
         </w:r>
       </w:del>
-      <w:ins w:id="1074" w:author="Claude" w:date="2026-10-17T12:00:00Z">
+      <w:ins w:id="1074" w:author="А.А. Шевцов" w:date="2026-10-17T12:00:00Z">
         <w:r>
           <w:rPr>
             <w:rFonts w:ascii="Times New Roman" w:hAnsi="Times New Roman"/>
@@ -4678,7 +4678,7 @@
         </w:rPr>
         <w:t xml:space="preserve">The functional structure of the new development retains the absolute dominance of housing: in total, more than 2,280 hectares are allocated to </w:t>
       </w:r>
-      <w:del w:id="1075" w:author="Claude" w:date="2026-10-17T12:00:00Z">
+      <w:del w:id="1075" w:author="А.А. Шевцов" w:date="2026-10-17T12:00:00Z">
         <w:r>
           <w:rPr>
             <w:rFonts w:ascii="Times New Roman" w:hAnsi="Times New Roman"/>
@@ -4687,7 +4687,7 @@
           <w:delText xml:space="preserve">high-rise</w:delText>
         </w:r>
       </w:del>
-      <w:ins w:id="1076" w:author="Claude" w:date="2026-10-17T12:00:00Z">
+      <w:ins w:id="1076" w:author="А.А. Шевцов" w:date="2026-10-17T12:00:00Z">
         <w:r>
           <w:rPr>
             <w:rFonts w:ascii="Times New Roman" w:hAnsi="Times New Roman"/>
@@ -4721,7 +4721,7 @@
         </w:rPr>
         <w:t xml:space="preserve">The spatial transformation of Voronezh and its immediate surroundings in the post-Soviet period resulted in a large-scale increase in built-up areas, creating a morphologically sparse and functionally disjointed suburban environment. A characteristic feature of this process is the </w:t>
       </w:r>
-      <w:del w:id="1077" w:author="Claude" w:date="2026-10-17T12:00:00Z">
+      <w:del w:id="1077" w:author="А.А. Шевцов" w:date="2026-10-17T12:00:00Z">
         <w:r>
           <w:rPr>
             <w:rFonts w:ascii="Times New Roman" w:hAnsi="Times New Roman"/>
@@ -4730,7 +4730,7 @@
           <w:delText xml:space="preserve">focal</w:delText>
         </w:r>
       </w:del>
-      <w:ins w:id="1078" w:author="Claude" w:date="2026-10-17T12:00:00Z">
+      <w:ins w:id="1078" w:author="А.А. Шевцов" w:date="2026-10-17T12:00:00Z">
         <w:r>
           <w:rPr>
             <w:rFonts w:ascii="Times New Roman" w:hAnsi="Times New Roman"/>
@@ -4746,7 +4746,7 @@
         </w:rPr>
         <w:t xml:space="preserve"> nature of territorial development: new residential areas, large-scale retail and industrial sites are developing as isolated planning units, without forming a coherent urban fabric. The pronounced asymmetry in favor of the northern and eastern sectors (58% </w:t>
       </w:r>
-      <w:ins w:id="1079" w:author="Claude" w:date="2026-10-17T12:00:00Z">
+      <w:ins w:id="1079" w:author="А.А. Шевцов" w:date="2026-10-17T12:00:00Z">
         <w:r>
           <w:rPr>
             <w:rFonts w:ascii="Times New Roman" w:hAnsi="Times New Roman"/>
@@ -4795,7 +4795,7 @@
         </w:rPr>
         <w:t xml:space="preserve">This strategy fits perfectly into the logic of classical rent models, but with important adjustments for modern conditions. Developers maximize profits by developing suburban areas where land has a minimum cadastral value. However, in the case of Voronezh, a qualitative transformation of the traditional factor of remoteness is observed. Thus, if in classical models the increase in transport costs with distance from the center acts as a </w:t>
       </w:r>
-      <w:del w:id="1080" w:author="Claude" w:date="2026-10-17T12:00:00Z">
+      <w:del w:id="1080" w:author="А.А. Шевцов" w:date="2026-10-17T12:00:00Z">
         <w:r>
           <w:rPr>
             <w:rFonts w:ascii="Times New Roman" w:hAnsi="Times New Roman"/>
@@ -4804,7 +4804,7 @@
           <w:delText xml:space="preserve">severe limitation</w:delText>
         </w:r>
       </w:del>
-      <w:ins w:id="1081" w:author="Claude" w:date="2026-10-17T12:00:00Z">
+      <w:ins w:id="1081" w:author="А.А. Шевцов" w:date="2026-10-17T12:00:00Z">
         <w:r>
           <w:rPr>
             <w:rFonts w:ascii="Times New Roman" w:hAnsi="Times New Roman"/>
@@ -4880,7 +4880,7 @@
         </w:rPr>
         <w:t xml:space="preserve">The combination of extensive expansion of boundaries with a sharp decrease in the functional density of the environment confirms the implementation of the </w:t>
       </w:r>
-      <w:del w:id="1082" w:author="Claude" w:date="2026-10-17T12:00:00Z">
+      <w:del w:id="1082" w:author="А.А. Шевцов" w:date="2026-10-17T12:00:00Z">
         <w:r>
           <w:rPr>
             <w:rFonts w:ascii="Times New Roman" w:hAnsi="Times New Roman"/>
@@ -4889,7 +4889,7 @@
           <w:delText xml:space="preserve">“growth”</w:delText>
         </w:r>
       </w:del>
-      <w:ins w:id="1083" w:author="Claude" w:date="2026-10-17T12:00:00Z">
+      <w:ins w:id="1083" w:author="А.А. Шевцов" w:date="2026-10-17T12:00:00Z">
         <w:r>
           <w:rPr>
             <w:rFonts w:ascii="Times New Roman" w:hAnsi="Times New Roman"/>
@@ -4956,7 +4956,7 @@
         </w:rPr>
         <w:t xml:space="preserve">1. The spatial evolution of Voronezh and its suburban area in the period 1992–2025 was expressed in a large-scale increase in built-up areas. This process is characterized by the predominant development of discrete, spatially isolated areas, which has led to significant fragmentation of the morphological structure of the suburbs. The observed dynamics of physical expansion of borders allows us to interpret this process as the implementation of the </w:t>
       </w:r>
-      <w:del w:id="1084" w:author="Claude" w:date="2026-10-17T12:00:00Z">
+      <w:del w:id="1084" w:author="А.А. Шевцов" w:date="2026-10-17T12:00:00Z">
         <w:r>
           <w:rPr>
             <w:rFonts w:ascii="Times New Roman" w:hAnsi="Times New Roman"/>
@@ -4966,7 +4966,7 @@
           <w:delText xml:space="preserve">“growth”</w:delText>
         </w:r>
       </w:del>
-      <w:ins w:id="1085" w:author="Claude" w:date="2026-10-17T12:00:00Z">
+      <w:ins w:id="1085" w:author="А.А. Шевцов" w:date="2026-10-17T12:00:00Z">
         <w:r>
           <w:rPr>
             <w:rFonts w:ascii="Times New Roman" w:hAnsi="Times New Roman"/>
@@ -5004,7 +5004,7 @@
         </w:rPr>
         <w:t xml:space="preserve">2. The dynamics of development of built-up areas in the suburban zone has a pronounced non-linear nature of space development. In the post-Soviet evolution of development, four stages are distinguished, each of which is characterized by a change in the pace and logic of area growth. The transition from the stage of spontaneous development (1992–2000) to the phase of formation of a belt of suburban shopping centers (2000–2010) marked a qualitative shift: the emergence of new infrastructure support at the main entrances to the city. The subsequent phase of “explosive expansion” (2010–2020) was a period of maximum physical expansion of built-up areas, exhausting the potential of the most accessible sites. The current stage (2020–2025) indicates a transition to morphological consolidation of territories. This process is conditioned by the completion of the formation of the functional framework of suburban retail and a change in the structure of development mechanisms: the growth in the share of suburban </w:t>
       </w:r>
-      <w:del w:id="1086" w:author="Claude" w:date="2026-10-17T12:00:00Z">
+      <w:del w:id="1086" w:author="А.А. Шевцов" w:date="2026-10-17T12:00:00Z">
         <w:r>
           <w:rPr>
             <w:rFonts w:ascii="Times New Roman" w:hAnsi="Times New Roman"/>
@@ -5014,7 +5014,7 @@
           <w:delText xml:space="preserve">growth over</w:delText>
         </w:r>
       </w:del>
-      <w:ins w:id="1087" w:author="Claude" w:date="2026-10-17T12:00:00Z">
+      <w:ins w:id="1087" w:author="А.А. Шевцов" w:date="2026-10-17T12:00:00Z">
         <w:r>
           <w:rPr>
             <w:rFonts w:ascii="Times New Roman" w:hAnsi="Times New Roman"/>
@@ -5052,7 +5052,7 @@
         </w:rPr>
         <w:t xml:space="preserve">3. Physical expansion of territories is realized primarily through decentralized mechanisms: isolated growth and expansion of suburban settlements account for a total of 88% of the total area of new development. The functional structure of this increase is absolutely dominated by low-rise residential buildings (about 80% of the area). At the same time, multi-apartment complexes, large retail facilities, and industrial and logistics zones are developing as local, spatially isolated sites. This isolated nature of the emergence of commercial and industrial facilities hinders their morphological integration with residential development and leads to the formation of a functionally </w:t>
       </w:r>
-      <w:del w:id="913" w:author="Claude" w:date="2026-10-17T12:00:00Z">
+      <w:del w:id="913" w:author="А.А. Шевцов" w:date="2026-10-17T12:00:00Z">
         <w:r>
           <w:rPr>
             <w:rFonts w:ascii="Times New Roman" w:hAnsi="Times New Roman"/>
@@ -5062,7 +5062,7 @@
           <w:delText xml:space="preserve">disunited</w:delText>
         </w:r>
       </w:del>
-      <w:ins w:id="914" w:author="Claude" w:date="2026-10-17T12:00:00Z">
+      <w:ins w:id="914" w:author="А.А. Шевцов" w:date="2026-10-17T12:00:00Z">
         <w:r>
           <w:rPr>
             <w:rFonts w:ascii="Times New Roman" w:hAnsi="Times New Roman"/>
@@ -5101,7 +5101,7 @@
         <w:lastRenderedPageBreak/>
         <w:t xml:space="preserve">4. An important economic incentive for the transformation of suburban areas is the mechanism for maximizing land rent. The recorded 5-fold gap between the cadastral value of land plots within the boundaries of continuous development and in areas of new development (as of 2025) confirms the priority of the land price factor when choosing expansion directions. Under these conditions, a deformation of the classical </w:t>
       </w:r>
-      <w:del w:id="1088" w:author="Claude" w:date="2026-10-17T12:00:00Z">
+      <w:del w:id="1088" w:author="А.А. Шевцов" w:date="2026-10-17T12:00:00Z">
         <w:r>
           <w:rPr>
             <w:rFonts w:ascii="Times New Roman" w:hAnsi="Times New Roman"/>
@@ -5111,7 +5111,7 @@
           <w:delText xml:space="preserve">U. model is observed. Alonso: The</w:delText>
         </w:r>
       </w:del>
-      <w:ins w:id="1089" w:author="Claude" w:date="2026-10-17T12:00:00Z">
+      <w:ins w:id="1089" w:author="А.А. Шевцов" w:date="2026-10-17T12:00:00Z">
         <w:r>
           <w:rPr>
             <w:rFonts w:ascii="Times New Roman" w:hAnsi="Times New Roman"/>
@@ -5129,7 +5129,7 @@
         </w:rPr>
         <w:t xml:space="preserve"> factor of transport distance is no longer a </w:t>
       </w:r>
-      <w:del w:id="1092" w:author="Claude" w:date="2026-10-17T12:00:00Z">
+      <w:del w:id="1092" w:author="А.А. Шевцов" w:date="2026-10-17T12:00:00Z">
         <w:r>
           <w:rPr>
             <w:rFonts w:ascii="Times New Roman" w:hAnsi="Times New Roman"/>
@@ -5139,7 +5139,7 @@
           <w:delText xml:space="preserve">strict limitation</w:delText>
         </w:r>
       </w:del>
-      <w:ins w:id="1093" w:author="Claude" w:date="2026-10-17T12:00:00Z">
+      <w:ins w:id="1093" w:author="А.А. Шевцов" w:date="2026-10-17T12:00:00Z">
         <w:r>
           <w:rPr>
             <w:rFonts w:ascii="Times New Roman" w:hAnsi="Times New Roman"/>
@@ -5157,7 +5157,7 @@
         </w:rPr>
         <w:t xml:space="preserve">. This is confirmed by the increase in the average distance of new </w:t>
       </w:r>
-      <w:del w:id="1090" w:author="Claude" w:date="2026-10-17T12:00:00Z">
+      <w:del w:id="1090" w:author="А.А. Шевцов" w:date="2026-10-17T12:00:00Z">
         <w:r>
           <w:rPr>
             <w:rFonts w:ascii="Times New Roman" w:hAnsi="Times New Roman"/>
@@ -5167,7 +5167,7 @@
           <w:delText xml:space="preserve">properties</w:delText>
         </w:r>
       </w:del>
-      <w:ins w:id="1091" w:author="Claude" w:date="2026-10-17T12:00:00Z">
+      <w:ins w:id="1091" w:author="А.А. Шевцов" w:date="2026-10-17T12:00:00Z">
         <w:r>
           <w:rPr>
             <w:rFonts w:ascii="Times New Roman" w:hAnsi="Times New Roman"/>
@@ -5324,7 +5324,7 @@
         </w:rPr>
         <w:t xml:space="preserve">Characteristics of spatial-genetic types (mechanisms) of territorial growth, </w:t>
       </w:r>
-      <w:del w:id="1094" w:author="Claude" w:date="2026-10-17T12:00:00Z">
+      <w:del w:id="1094" w:author="А.А. Шевцов" w:date="2026-10-17T12:00:00Z">
         <w:r>
           <w:rPr>
             <w:rFonts w:ascii="Times New Roman" w:hAnsi="Times New Roman"/>
@@ -5334,7 +5334,7 @@
           <w:delText xml:space="preserve">1992-2025</w:delText>
         </w:r>
       </w:del>
-      <w:ins w:id="1095" w:author="Claude" w:date="2026-10-17T12:00:00Z">
+      <w:ins w:id="1095" w:author="А.А. Шевцов" w:date="2026-10-17T12:00:00Z">
         <w:r>
           <w:rPr>
             <w:rFonts w:ascii="Times New Roman" w:hAnsi="Times New Roman"/>
@@ -5455,7 +5455,7 @@
                 <w:sz w:val="24"/>
               </w:rPr>
             </w:pPr>
-            <w:del w:id="1096" w:author="Claude" w:date="2026-10-17T12:00:00Z">
+            <w:del w:id="1096" w:author="А.А. Шевцов" w:date="2026-10-17T12:00:00Z">
               <w:r>
                 <w:rPr>
                   <w:rFonts w:ascii="Times New Roman" w:hAnsi="Times New Roman"/>
@@ -5463,7 +5463,7 @@
                 <w:delText xml:space="preserve">Regional</w:delText>
               </w:r>
             </w:del>
-            <w:ins w:id="1097" w:author="Claude" w:date="2026-10-17T12:00:00Z">
+            <w:ins w:id="1097" w:author="А.А. Шевцов" w:date="2026-10-17T12:00:00Z">
               <w:r>
                 <w:rPr>
                   <w:rFonts w:ascii="Times New Roman" w:hAnsi="Times New Roman"/>
@@ -5691,7 +5691,7 @@
         </w:rPr>
         <w:t xml:space="preserve"> the </w:t>
       </w:r>
-      <w:del w:id="1106" w:author="Claude" w:date="2026-10-17T12:00:00Z">
+      <w:del w:id="1106" w:author="А.А. Шевцов" w:date="2026-10-17T12:00:00Z">
         <w:r>
           <w:rPr>
             <w:rFonts w:ascii="Times New Roman" w:hAnsi="Times New Roman"/>
@@ -5700,7 +5700,7 @@
           <w:delText xml:space="preserve">author's calculations based on:</w:delText>
         </w:r>
       </w:del>
-      <w:ins w:id="1107" w:author="Claude" w:date="2026-10-17T12:00:00Z">
+      <w:ins w:id="1107" w:author="А.А. Шевцов" w:date="2026-10-17T12:00:00Z">
         <w:r>
           <w:rPr>
             <w:rFonts w:ascii="Times New Roman" w:hAnsi="Times New Roman"/>
@@ -5737,7 +5737,7 @@
         </w:rPr>
         <w:t xml:space="preserve">; date of access: </w:t>
       </w:r>
-      <w:del w:id="1112" w:author="Claude" w:date="2026-10-17T12:00:00Z">
+      <w:del w:id="1112" w:author="А.А. Шевцов" w:date="2026-10-17T12:00:00Z">
         <w:r>
           <w:rPr>
             <w:rFonts w:ascii="Times New Roman" w:hAnsi="Times New Roman"/>
@@ -5745,7 +5745,7 @@
           <w:delText xml:space="preserve">03/02/2026</w:delText>
         </w:r>
       </w:del>
-      <w:ins w:id="1113" w:author="Claude" w:date="2026-10-17T12:00:00Z">
+      <w:ins w:id="1113" w:author="А.А. Шевцов" w:date="2026-10-17T12:00:00Z">
         <w:r>
           <w:rPr>
             <w:rFonts w:ascii="Times New Roman" w:hAnsi="Times New Roman"/>
@@ -5774,7 +5774,7 @@
         </w:rPr>
         <w:t xml:space="preserve">; date of access: 02.03.2026), OpenStreetMap project (https://www.openstreetmap.org; </w:t>
       </w:r>
-      <w:del w:id="1118" w:author="Claude" w:date="2026-10-17T12:00:00Z">
+      <w:del w:id="1118" w:author="А.А. Шевцов" w:date="2026-10-17T12:00:00Z">
         <w:r>
           <w:rPr>
             <w:rFonts w:ascii="Times New Roman" w:hAnsi="Times New Roman"/>
@@ -5782,7 +5782,7 @@
           <w:delText xml:space="preserve">access date:</w:delText>
         </w:r>
       </w:del>
-      <w:ins w:id="1119" w:author="Claude" w:date="2026-10-17T12:00:00Z">
+      <w:ins w:id="1119" w:author="А.А. Шевцов" w:date="2026-10-17T12:00:00Z">
         <w:r>
           <w:rPr>
             <w:rFonts w:ascii="Times New Roman" w:hAnsi="Times New Roman"/>
@@ -6150,7 +6150,7 @@
                 <w:szCs w:val="21"/>
               </w:rPr>
             </w:pPr>
-            <w:del w:id="1100" w:author="Claude" w:date="2026-10-17T12:00:00Z">
+            <w:del w:id="1100" w:author="А.А. Шевцов" w:date="2026-10-17T12:00:00Z">
               <w:r>
                 <w:rPr>
                   <w:rFonts w:ascii="Times New Roman" w:hAnsi="Times New Roman"/>
@@ -6160,7 +6160,7 @@
                 <w:delText xml:space="preserve">2 </w:delText>
               </w:r>
             </w:del>
-            <w:ins w:id="1101" w:author="Claude" w:date="2026-10-17T12:00:00Z">
+            <w:ins w:id="1101" w:author="А.А. Шевцов" w:date="2026-10-17T12:00:00Z">
               <w:r>
                 <w:rPr>
                   <w:rFonts w:ascii="Times New Roman" w:hAnsi="Times New Roman"/>
@@ -6383,7 +6383,7 @@
                 <w:szCs w:val="21"/>
               </w:rPr>
             </w:pPr>
-            <w:del w:id="1102" w:author="Claude" w:date="2026-10-17T12:00:00Z">
+            <w:del w:id="1102" w:author="А.А. Шевцов" w:date="2026-10-17T12:00:00Z">
               <w:r>
                 <w:rPr>
                   <w:rFonts w:ascii="Times New Roman" w:hAnsi="Times New Roman"/>
@@ -6393,7 +6393,7 @@
                 <w:delText xml:space="preserve">Multi-storey building</w:delText>
               </w:r>
             </w:del>
-            <w:ins w:id="1103" w:author="Claude" w:date="2026-10-17T12:00:00Z">
+            <w:ins w:id="1103" w:author="А.А. Шевцов" w:date="2026-10-17T12:00:00Z">
               <w:r>
                 <w:rPr>
                   <w:rFonts w:ascii="Times New Roman" w:hAnsi="Times New Roman"/>
@@ -6698,7 +6698,7 @@
         </w:rPr>
         <w:t xml:space="preserve"> the </w:t>
       </w:r>
-      <w:del w:id="1108" w:author="Claude" w:date="2026-10-17T12:00:00Z">
+      <w:del w:id="1108" w:author="А.А. Шевцов" w:date="2026-10-17T12:00:00Z">
         <w:r>
           <w:rPr>
             <w:rFonts w:ascii="Times New Roman" w:hAnsi="Times New Roman"/>
@@ -6707,7 +6707,7 @@
           <w:delText xml:space="preserve">author's calculations based on:</w:delText>
         </w:r>
       </w:del>
-      <w:ins w:id="1109" w:author="Claude" w:date="2026-10-17T12:00:00Z">
+      <w:ins w:id="1109" w:author="А.А. Шевцов" w:date="2026-10-17T12:00:00Z">
         <w:r>
           <w:rPr>
             <w:rFonts w:ascii="Times New Roman" w:hAnsi="Times New Roman"/>
@@ -6744,7 +6744,7 @@
         </w:rPr>
         <w:t xml:space="preserve">; date of access: </w:t>
       </w:r>
-      <w:del w:id="1114" w:author="Claude" w:date="2026-10-17T12:00:00Z">
+      <w:del w:id="1114" w:author="А.А. Шевцов" w:date="2026-10-17T12:00:00Z">
         <w:r>
           <w:rPr>
             <w:rFonts w:ascii="Times New Roman" w:hAnsi="Times New Roman"/>
@@ -6752,7 +6752,7 @@
           <w:delText xml:space="preserve">03/02/2026</w:delText>
         </w:r>
       </w:del>
-      <w:ins w:id="1115" w:author="Claude" w:date="2026-10-17T12:00:00Z">
+      <w:ins w:id="1115" w:author="А.А. Шевцов" w:date="2026-10-17T12:00:00Z">
         <w:r>
           <w:rPr>
             <w:rFonts w:ascii="Times New Roman" w:hAnsi="Times New Roman"/>
@@ -6781,7 +6781,7 @@
         </w:rPr>
         <w:t xml:space="preserve">; date of access: 02.03.2026), OpenStreetMap project (https://www.openstreetmap.org; </w:t>
       </w:r>
-      <w:del w:id="1120" w:author="Claude" w:date="2026-10-17T12:00:00Z">
+      <w:del w:id="1120" w:author="А.А. Шевцов" w:date="2026-10-17T12:00:00Z">
         <w:r>
           <w:rPr>
             <w:rFonts w:ascii="Times New Roman" w:hAnsi="Times New Roman"/>
@@ -6789,7 +6789,7 @@
           <w:delText xml:space="preserve">access date:</w:delText>
         </w:r>
       </w:del>
-      <w:ins w:id="1121" w:author="Claude" w:date="2026-10-17T12:00:00Z">
+      <w:ins w:id="1121" w:author="А.А. Шевцов" w:date="2026-10-17T12:00:00Z">
         <w:r>
           <w:rPr>
             <w:rFonts w:ascii="Times New Roman" w:hAnsi="Times New Roman"/>
@@ -6818,7 +6818,7 @@
         </w:rPr>
         <w:t xml:space="preserve">; date of access: 02.03.2026), the </w:t>
       </w:r>
-      <w:del w:id="1005" w:author="Claude" w:date="2026-10-17T12:00:00Z">
+      <w:del w:id="1005" w:author="А.А. Шевцов" w:date="2026-10-17T12:00:00Z">
         <w:r>
           <w:rPr>
             <w:rFonts w:ascii="Times New Roman" w:hAnsi="Times New Roman"/>
@@ -6826,7 +6826,7 @@
           <w:delText xml:space="preserve">Geocheque</w:delText>
         </w:r>
       </w:del>
-      <w:ins w:id="1006" w:author="Claude" w:date="2026-10-17T12:00:00Z">
+      <w:ins w:id="1006" w:author="А.А. Шевцов" w:date="2026-10-17T12:00:00Z">
         <w:r>
           <w:rPr>
             <w:rFonts w:ascii="Times New Roman" w:hAnsi="Times New Roman"/>
@@ -7651,7 +7651,7 @@
         </w:rPr>
         <w:t xml:space="preserve"> the </w:t>
       </w:r>
-      <w:del w:id="1110" w:author="Claude" w:date="2026-10-17T12:00:00Z">
+      <w:del w:id="1110" w:author="А.А. Шевцов" w:date="2026-10-17T12:00:00Z">
         <w:r>
           <w:rPr>
             <w:rFonts w:ascii="Times New Roman" w:hAnsi="Times New Roman"/>
@@ -7660,7 +7660,7 @@
           <w:delText xml:space="preserve">author's calculations based on:</w:delText>
         </w:r>
       </w:del>
-      <w:ins w:id="1111" w:author="Claude" w:date="2026-10-17T12:00:00Z">
+      <w:ins w:id="1111" w:author="А.А. Шевцов" w:date="2026-10-17T12:00:00Z">
         <w:r>
           <w:rPr>
             <w:rFonts w:ascii="Times New Roman" w:hAnsi="Times New Roman"/>
@@ -7697,7 +7697,7 @@
         </w:rPr>
         <w:t xml:space="preserve">; date of access: </w:t>
       </w:r>
-      <w:del w:id="1116" w:author="Claude" w:date="2026-10-17T12:00:00Z">
+      <w:del w:id="1116" w:author="А.А. Шевцов" w:date="2026-10-17T12:00:00Z">
         <w:r>
           <w:rPr>
             <w:rFonts w:ascii="Times New Roman" w:hAnsi="Times New Roman"/>
@@ -7705,7 +7705,7 @@
           <w:delText xml:space="preserve">03/02/2026</w:delText>
         </w:r>
       </w:del>
-      <w:ins w:id="1117" w:author="Claude" w:date="2026-10-17T12:00:00Z">
+      <w:ins w:id="1117" w:author="А.А. Шевцов" w:date="2026-10-17T12:00:00Z">
         <w:r>
           <w:rPr>
             <w:rFonts w:ascii="Times New Roman" w:hAnsi="Times New Roman"/>
@@ -7734,7 +7734,7 @@
         </w:rPr>
         <w:t xml:space="preserve">; date of access: 02.03.2026), OpenStreetMap project (https://www.openstreetmap.org; </w:t>
       </w:r>
-      <w:del w:id="1122" w:author="Claude" w:date="2026-10-17T12:00:00Z">
+      <w:del w:id="1122" w:author="А.А. Шевцов" w:date="2026-10-17T12:00:00Z">
         <w:r>
           <w:rPr>
             <w:rFonts w:ascii="Times New Roman" w:hAnsi="Times New Roman"/>
@@ -7742,7 +7742,7 @@
           <w:delText xml:space="preserve">access date:</w:delText>
         </w:r>
       </w:del>
-      <w:ins w:id="1123" w:author="Claude" w:date="2026-10-17T12:00:00Z">
+      <w:ins w:id="1123" w:author="А.А. Шевцов" w:date="2026-10-17T12:00:00Z">
         <w:r>
           <w:rPr>
             <w:rFonts w:ascii="Times New Roman" w:hAnsi="Times New Roman"/>
@@ -7771,7 +7771,7 @@
         </w:rPr>
         <w:t xml:space="preserve">; date of access: 02.03.2026), the </w:t>
       </w:r>
-      <w:del w:id="1007" w:author="Claude" w:date="2026-10-17T12:00:00Z">
+      <w:del w:id="1007" w:author="А.А. Шевцов" w:date="2026-10-17T12:00:00Z">
         <w:r>
           <w:rPr>
             <w:rFonts w:ascii="Times New Roman" w:hAnsi="Times New Roman"/>
@@ -7779,7 +7779,7 @@
           <w:delText xml:space="preserve">Geocheque</w:delText>
         </w:r>
       </w:del>
-      <w:ins w:id="1008" w:author="Claude" w:date="2026-10-17T12:00:00Z">
+      <w:ins w:id="1008" w:author="А.А. Шевцов" w:date="2026-10-17T12:00:00Z">
         <w:r>
           <w:rPr>
             <w:rFonts w:ascii="Times New Roman" w:hAnsi="Times New Roman"/>
@@ -7929,7 +7929,7 @@
         </w:rPr>
         <w:t xml:space="preserve">Unified State Register of Real Estate (Rosreestr), the </w:t>
       </w:r>
-      <w:del w:id="1194" w:author="Claude" w:date="2026-10-17T12:00:00Z">
+      <w:del w:id="1194" w:author="А.А. Шевцов" w:date="2026-10-17T12:00:00Z">
         <w:r>
           <w:rPr>
             <w:rFonts w:ascii="Times New Roman" w:hAnsi="Times New Roman"/>
@@ -7937,7 +7937,7 @@
           <w:delText xml:space="preserve">"</w:delText>
         </w:r>
       </w:del>
-      <w:ins w:id="1195" w:author="Claude" w:date="2026-10-17T12:00:00Z">
+      <w:ins w:id="1195" w:author="А.А. Шевцов" w:date="2026-10-17T12:00:00Z">
         <w:r>
           <w:rPr>
             <w:rFonts w:ascii="Times New Roman" w:hAnsi="Times New Roman"/>
@@ -7951,7 +7951,7 @@
         </w:rPr>
         <w:t xml:space="preserve">How old is this house</w:t>
       </w:r>
-      <w:del w:id="1192" w:author="Claude" w:date="2026-10-17T12:00:00Z">
+      <w:del w:id="1192" w:author="А.А. Шевцов" w:date="2026-10-17T12:00:00Z">
         <w:r>
           <w:rPr>
             <w:rFonts w:ascii="Times New Roman" w:hAnsi="Times New Roman"/>
@@ -7959,7 +7959,7 @@
           <w:delText xml:space="preserve">"</w:delText>
         </w:r>
       </w:del>
-      <w:ins w:id="1193" w:author="Claude" w:date="2026-10-17T12:00:00Z">
+      <w:ins w:id="1193" w:author="А.А. Шевцов" w:date="2026-10-17T12:00:00Z">
         <w:r>
           <w:rPr>
             <w:rFonts w:ascii="Times New Roman" w:hAnsi="Times New Roman"/>
@@ -8025,7 +8025,7 @@
           <w:rFonts w:ascii="Times New Roman" w:hAnsi="Times New Roman" w:cs="Times New Roman"/>
         </w:rPr>
       </w:pPr>
-      <w:del w:id="1098" w:author="Claude" w:date="2026-10-17T12:00:00Z">
+      <w:del w:id="1098" w:author="А.А. Шевцов" w:date="2026-10-17T12:00:00Z">
         <w:r>
           <w:rPr>
             <w:rFonts w:ascii="Times New Roman" w:hAnsi="Times New Roman"/>
@@ -8033,7 +8033,7 @@
           <w:delText xml:space="preserve">Regional</w:delText>
         </w:r>
       </w:del>
-      <w:ins w:id="1099" w:author="Claude" w:date="2026-10-17T12:00:00Z">
+      <w:ins w:id="1099" w:author="А.А. Шевцов" w:date="2026-10-17T12:00:00Z">
         <w:r>
           <w:rPr>
             <w:rFonts w:ascii="Times New Roman" w:hAnsi="Times New Roman"/>
@@ -8179,7 +8179,7 @@
         </w:rPr>
         <w:t xml:space="preserve">M-4 </w:t>
       </w:r>
-      <w:del w:id="1198" w:author="Claude" w:date="2026-10-17T12:00:00Z">
+      <w:del w:id="1198" w:author="А.А. Шевцов" w:date="2026-10-17T12:00:00Z">
         <w:r>
           <w:rPr>
             <w:rFonts w:ascii="Times New Roman" w:hAnsi="Times New Roman"/>
@@ -8187,7 +8187,7 @@
           <w:delText xml:space="preserve">"</w:delText>
         </w:r>
       </w:del>
-      <w:ins w:id="1199" w:author="Claude" w:date="2026-10-17T12:00:00Z">
+      <w:ins w:id="1199" w:author="А.А. Шевцов" w:date="2026-10-17T12:00:00Z">
         <w:r>
           <w:rPr>
             <w:rFonts w:ascii="Times New Roman" w:hAnsi="Times New Roman"/>
@@ -8201,7 +8201,7 @@
         </w:rPr>
         <w:t xml:space="preserve">Don</w:t>
       </w:r>
-      <w:del w:id="1196" w:author="Claude" w:date="2026-10-17T12:00:00Z">
+      <w:del w:id="1196" w:author="А.А. Шевцов" w:date="2026-10-17T12:00:00Z">
         <w:r>
           <w:rPr>
             <w:rFonts w:ascii="Times New Roman" w:hAnsi="Times New Roman"/>
@@ -8209,7 +8209,7 @@
           <w:delText xml:space="preserve">"</w:delText>
         </w:r>
       </w:del>
-      <w:ins w:id="1197" w:author="Claude" w:date="2026-10-17T12:00:00Z">
+      <w:ins w:id="1197" w:author="А.А. Шевцов" w:date="2026-10-17T12:00:00Z">
         <w:r>
           <w:rPr>
             <w:rFonts w:ascii="Times New Roman" w:hAnsi="Times New Roman"/>
@@ -8301,7 +8301,7 @@
           <w:rFonts w:ascii="Times New Roman" w:hAnsi="Times New Roman" w:cs="Times New Roman"/>
         </w:rPr>
       </w:pPr>
-      <w:del w:id="1128" w:author="Claude" w:date="2026-10-17T12:00:00Z">
+      <w:del w:id="1128" w:author="А.А. Шевцов" w:date="2026-10-17T12:00:00Z">
         <w:r>
           <w:rPr>
             <w:rFonts w:ascii="Times New Roman" w:hAnsi="Times New Roman"/>
@@ -8309,7 +8309,7 @@
           <w:delText xml:space="preserve">C</w:delText>
         </w:r>
       </w:del>
-      <w:ins w:id="1129" w:author="Claude" w:date="2026-10-17T12:00:00Z">
+      <w:ins w:id="1129" w:author="А.А. Шевцов" w:date="2026-10-17T12:00:00Z">
         <w:r>
           <w:rPr>
             <w:rFonts w:ascii="Times New Roman" w:hAnsi="Times New Roman"/>
@@ -8327,7 +8327,7 @@
           <w:rFonts w:ascii="Times New Roman" w:hAnsi="Times New Roman" w:cs="Times New Roman"/>
         </w:rPr>
       </w:pPr>
-      <w:del w:id="1132" w:author="Claude" w:date="2026-10-17T12:00:00Z">
+      <w:del w:id="1132" w:author="А.А. Шевцов" w:date="2026-10-17T12:00:00Z">
         <w:r>
           <w:rPr>
             <w:rFonts w:ascii="Times New Roman" w:hAnsi="Times New Roman"/>
@@ -8335,7 +8335,7 @@
           <w:delText xml:space="preserve">SV</w:delText>
         </w:r>
       </w:del>
-      <w:ins w:id="1133" w:author="Claude" w:date="2026-10-17T12:00:00Z">
+      <w:ins w:id="1133" w:author="А.А. Шевцов" w:date="2026-10-17T12:00:00Z">
         <w:r>
           <w:rPr>
             <w:rFonts w:ascii="Times New Roman" w:hAnsi="Times New Roman"/>
@@ -8353,7 +8353,7 @@
           <w:rFonts w:ascii="Times New Roman" w:hAnsi="Times New Roman" w:cs="Times New Roman"/>
         </w:rPr>
       </w:pPr>
-      <w:del w:id="1136" w:author="Claude" w:date="2026-10-17T12:00:00Z">
+      <w:del w:id="1136" w:author="А.А. Шевцов" w:date="2026-10-17T12:00:00Z">
         <w:r>
           <w:rPr>
             <w:rFonts w:ascii="Times New Roman" w:hAnsi="Times New Roman"/>
@@ -8361,7 +8361,7 @@
           <w:delText xml:space="preserve">B</w:delText>
         </w:r>
       </w:del>
-      <w:ins w:id="1137" w:author="Claude" w:date="2026-10-17T12:00:00Z">
+      <w:ins w:id="1137" w:author="А.А. Шевцов" w:date="2026-10-17T12:00:00Z">
         <w:r>
           <w:rPr>
             <w:rFonts w:ascii="Times New Roman" w:hAnsi="Times New Roman"/>
@@ -8396,7 +8396,7 @@
           <w:rFonts w:ascii="Times New Roman" w:hAnsi="Times New Roman" w:cs="Times New Roman"/>
         </w:rPr>
       </w:pPr>
-      <w:del w:id="1140" w:author="Claude" w:date="2026-10-17T12:00:00Z">
+      <w:del w:id="1140" w:author="А.А. Шевцов" w:date="2026-10-17T12:00:00Z">
         <w:r>
           <w:rPr>
             <w:rFonts w:ascii="Times New Roman" w:hAnsi="Times New Roman"/>
@@ -8404,7 +8404,7 @@
           <w:delText xml:space="preserve">Yu</w:delText>
         </w:r>
       </w:del>
-      <w:ins w:id="1141" w:author="Claude" w:date="2026-10-17T12:00:00Z">
+      <w:ins w:id="1141" w:author="А.А. Шевцов" w:date="2026-10-17T12:00:00Z">
         <w:r>
           <w:rPr>
             <w:rFonts w:ascii="Times New Roman" w:hAnsi="Times New Roman"/>
@@ -8438,7 +8438,7 @@
           <w:rFonts w:ascii="Times New Roman" w:hAnsi="Times New Roman" w:cs="Times New Roman"/>
         </w:rPr>
       </w:pPr>
-      <w:del w:id="1144" w:author="Claude" w:date="2026-10-17T12:00:00Z">
+      <w:del w:id="1144" w:author="А.А. Шевцов" w:date="2026-10-17T12:00:00Z">
         <w:r>
           <w:rPr>
             <w:rFonts w:ascii="Times New Roman" w:hAnsi="Times New Roman"/>
@@ -8446,7 +8446,7 @@
           <w:delText xml:space="preserve">Z</w:delText>
         </w:r>
       </w:del>
-      <w:ins w:id="1145" w:author="Claude" w:date="2026-10-17T12:00:00Z">
+      <w:ins w:id="1145" w:author="А.А. Шевцов" w:date="2026-10-17T12:00:00Z">
         <w:r>
           <w:rPr>
             <w:rFonts w:ascii="Times New Roman" w:hAnsi="Times New Roman"/>
@@ -8464,7 +8464,7 @@
           <w:rFonts w:ascii="Times New Roman" w:hAnsi="Times New Roman" w:cs="Times New Roman"/>
         </w:rPr>
       </w:pPr>
-      <w:del w:id="1148" w:author="Claude" w:date="2026-10-17T12:00:00Z">
+      <w:del w:id="1148" w:author="А.А. Шевцов" w:date="2026-10-17T12:00:00Z">
         <w:r>
           <w:rPr>
             <w:rFonts w:ascii="Times New Roman" w:hAnsi="Times New Roman"/>
@@ -8472,7 +8472,7 @@
           <w:delText xml:space="preserve">SZ</w:delText>
         </w:r>
       </w:del>
-      <w:ins w:id="1149" w:author="Claude" w:date="2026-10-17T12:00:00Z">
+      <w:ins w:id="1149" w:author="А.А. Шевцов" w:date="2026-10-17T12:00:00Z">
         <w:r>
           <w:rPr>
             <w:rFonts w:ascii="Times New Roman" w:hAnsi="Times New Roman"/>
@@ -8505,7 +8505,7 @@
         </w:rPr>
         <w:t xml:space="preserve">Morphotypes of development </w:t>
       </w:r>
-      <w:del w:id="1124" w:author="Claude" w:date="2026-10-17T12:00:00Z">
+      <w:del w:id="1124" w:author="А.А. Шевцов" w:date="2026-10-17T12:00:00Z">
         <w:r>
           <w:rPr>
             <w:rFonts w:ascii="Times New Roman" w:hAnsi="Times New Roman"/>
@@ -8514,7 +8514,7 @@
           <w:delText xml:space="preserve">in the Voronezh region and its</w:delText>
         </w:r>
       </w:del>
-      <w:ins w:id="1125" w:author="Claude" w:date="2026-10-17T12:00:00Z">
+      <w:ins w:id="1125" w:author="А.А. Шевцов" w:date="2026-10-17T12:00:00Z">
         <w:r>
           <w:rPr>
             <w:rFonts w:ascii="Times New Roman" w:hAnsi="Times New Roman"/>
@@ -8577,7 +8577,7 @@
         </w:rPr>
         <w:t xml:space="preserve">Unified State Register of Real Estate (Rosreestr), the </w:t>
       </w:r>
-      <w:del w:id="1202" w:author="Claude" w:date="2026-10-17T12:00:00Z">
+      <w:del w:id="1202" w:author="А.А. Шевцов" w:date="2026-10-17T12:00:00Z">
         <w:r>
           <w:rPr>
             <w:rFonts w:ascii="Times New Roman" w:hAnsi="Times New Roman"/>
@@ -8585,7 +8585,7 @@
           <w:delText xml:space="preserve">"</w:delText>
         </w:r>
       </w:del>
-      <w:ins w:id="1203" w:author="Claude" w:date="2026-10-17T12:00:00Z">
+      <w:ins w:id="1203" w:author="А.А. Шевцов" w:date="2026-10-17T12:00:00Z">
         <w:r>
           <w:rPr>
             <w:rFonts w:ascii="Times New Roman" w:hAnsi="Times New Roman"/>
@@ -8599,7 +8599,7 @@
         </w:rPr>
         <w:t xml:space="preserve">How old is this house</w:t>
       </w:r>
-      <w:del w:id="1200" w:author="Claude" w:date="2026-10-17T12:00:00Z">
+      <w:del w:id="1200" w:author="А.А. Шевцов" w:date="2026-10-17T12:00:00Z">
         <w:r>
           <w:rPr>
             <w:rFonts w:ascii="Times New Roman" w:hAnsi="Times New Roman"/>
@@ -8607,7 +8607,7 @@
           <w:delText xml:space="preserve">"</w:delText>
         </w:r>
       </w:del>
-      <w:ins w:id="1201" w:author="Claude" w:date="2026-10-17T12:00:00Z">
+      <w:ins w:id="1201" w:author="А.А. Шевцов" w:date="2026-10-17T12:00:00Z">
         <w:r>
           <w:rPr>
             <w:rFonts w:ascii="Times New Roman" w:hAnsi="Times New Roman"/>
@@ -8663,7 +8663,7 @@
         </w:rPr>
         <w:t xml:space="preserve">Morphotypes of development </w:t>
       </w:r>
-      <w:del w:id="1126" w:author="Claude" w:date="2026-10-17T12:00:00Z">
+      <w:del w:id="1126" w:author="А.А. Шевцов" w:date="2026-10-17T12:00:00Z">
         <w:r>
           <w:rPr>
             <w:rFonts w:ascii="Times New Roman" w:hAnsi="Times New Roman"/>
@@ -8671,7 +8671,7 @@
           <w:delText xml:space="preserve">1992–2005</w:delText>
         </w:r>
       </w:del>
-      <w:ins w:id="1127" w:author="Claude" w:date="2026-10-17T12:00:00Z">
+      <w:ins w:id="1127" w:author="А.А. Шевцов" w:date="2026-10-17T12:00:00Z">
         <w:r>
           <w:rPr>
             <w:rFonts w:ascii="Times New Roman" w:hAnsi="Times New Roman"/>
@@ -8689,7 +8689,7 @@
           <w:rFonts w:ascii="Times New Roman" w:hAnsi="Times New Roman" w:cs="Times New Roman"/>
         </w:rPr>
       </w:pPr>
-      <w:del w:id="1104" w:author="Claude" w:date="2026-10-17T12:00:00Z">
+      <w:del w:id="1104" w:author="А.А. Шевцов" w:date="2026-10-17T12:00:00Z">
         <w:r>
           <w:rPr>
             <w:rFonts w:ascii="Times New Roman" w:hAnsi="Times New Roman"/>
@@ -8697,7 +8697,7 @@
           <w:delText xml:space="preserve">Multi-storey</w:delText>
         </w:r>
       </w:del>
-      <w:ins w:id="1105" w:author="Claude" w:date="2026-10-17T12:00:00Z">
+      <w:ins w:id="1105" w:author="А.А. Шевцов" w:date="2026-10-17T12:00:00Z">
         <w:r>
           <w:rPr>
             <w:rFonts w:ascii="Times New Roman" w:hAnsi="Times New Roman"/>
@@ -8869,7 +8869,7 @@
         </w:rPr>
         <w:t xml:space="preserve">M-4 </w:t>
       </w:r>
-      <w:del w:id="1206" w:author="Claude" w:date="2026-10-17T12:00:00Z">
+      <w:del w:id="1206" w:author="А.А. Шевцов" w:date="2026-10-17T12:00:00Z">
         <w:r>
           <w:rPr>
             <w:rFonts w:ascii="Times New Roman" w:hAnsi="Times New Roman"/>
@@ -8877,7 +8877,7 @@
           <w:delText xml:space="preserve">"</w:delText>
         </w:r>
       </w:del>
-      <w:ins w:id="1207" w:author="Claude" w:date="2026-10-17T12:00:00Z">
+      <w:ins w:id="1207" w:author="А.А. Шевцов" w:date="2026-10-17T12:00:00Z">
         <w:r>
           <w:rPr>
             <w:rFonts w:ascii="Times New Roman" w:hAnsi="Times New Roman"/>
@@ -8891,7 +8891,7 @@
         </w:rPr>
         <w:t xml:space="preserve">Don</w:t>
       </w:r>
-      <w:del w:id="1204" w:author="Claude" w:date="2026-10-17T12:00:00Z">
+      <w:del w:id="1204" w:author="А.А. Шевцов" w:date="2026-10-17T12:00:00Z">
         <w:r>
           <w:rPr>
             <w:rFonts w:ascii="Times New Roman" w:hAnsi="Times New Roman"/>
@@ -8899,7 +8899,7 @@
           <w:delText xml:space="preserve">"</w:delText>
         </w:r>
       </w:del>
-      <w:ins w:id="1205" w:author="Claude" w:date="2026-10-17T12:00:00Z">
+      <w:ins w:id="1205" w:author="А.А. Шевцов" w:date="2026-10-17T12:00:00Z">
         <w:r>
           <w:rPr>
             <w:rFonts w:ascii="Times New Roman" w:hAnsi="Times New Roman"/>
@@ -8991,7 +8991,7 @@
           <w:rFonts w:ascii="Times New Roman" w:hAnsi="Times New Roman" w:cs="Times New Roman"/>
         </w:rPr>
       </w:pPr>
-      <w:del w:id="1130" w:author="Claude" w:date="2026-10-17T12:00:00Z">
+      <w:del w:id="1130" w:author="А.А. Шевцов" w:date="2026-10-17T12:00:00Z">
         <w:r>
           <w:rPr>
             <w:rFonts w:ascii="Times New Roman" w:hAnsi="Times New Roman"/>
@@ -8999,7 +8999,7 @@
           <w:delText xml:space="preserve">C</w:delText>
         </w:r>
       </w:del>
-      <w:ins w:id="1131" w:author="Claude" w:date="2026-10-17T12:00:00Z">
+      <w:ins w:id="1131" w:author="А.А. Шевцов" w:date="2026-10-17T12:00:00Z">
         <w:r>
           <w:rPr>
             <w:rFonts w:ascii="Times New Roman" w:hAnsi="Times New Roman"/>
@@ -9017,7 +9017,7 @@
           <w:rFonts w:ascii="Times New Roman" w:hAnsi="Times New Roman" w:cs="Times New Roman"/>
         </w:rPr>
       </w:pPr>
-      <w:del w:id="1134" w:author="Claude" w:date="2026-10-17T12:00:00Z">
+      <w:del w:id="1134" w:author="А.А. Шевцов" w:date="2026-10-17T12:00:00Z">
         <w:r>
           <w:rPr>
             <w:rFonts w:ascii="Times New Roman" w:hAnsi="Times New Roman"/>
@@ -9025,7 +9025,7 @@
           <w:delText xml:space="preserve">SV</w:delText>
         </w:r>
       </w:del>
-      <w:ins w:id="1135" w:author="Claude" w:date="2026-10-17T12:00:00Z">
+      <w:ins w:id="1135" w:author="А.А. Шевцов" w:date="2026-10-17T12:00:00Z">
         <w:r>
           <w:rPr>
             <w:rFonts w:ascii="Times New Roman" w:hAnsi="Times New Roman"/>
@@ -9043,7 +9043,7 @@
           <w:rFonts w:ascii="Times New Roman" w:hAnsi="Times New Roman" w:cs="Times New Roman"/>
         </w:rPr>
       </w:pPr>
-      <w:del w:id="1138" w:author="Claude" w:date="2026-10-17T12:00:00Z">
+      <w:del w:id="1138" w:author="А.А. Шевцов" w:date="2026-10-17T12:00:00Z">
         <w:r>
           <w:rPr>
             <w:rFonts w:ascii="Times New Roman" w:hAnsi="Times New Roman"/>
@@ -9051,7 +9051,7 @@
           <w:delText xml:space="preserve">IN</w:delText>
         </w:r>
       </w:del>
-      <w:ins w:id="1139" w:author="Claude" w:date="2026-10-17T12:00:00Z">
+      <w:ins w:id="1139" w:author="А.А. Шевцов" w:date="2026-10-17T12:00:00Z">
         <w:r>
           <w:rPr>
             <w:rFonts w:ascii="Times New Roman" w:hAnsi="Times New Roman"/>
@@ -9085,7 +9085,7 @@
           <w:rFonts w:ascii="Times New Roman" w:hAnsi="Times New Roman" w:cs="Times New Roman"/>
         </w:rPr>
       </w:pPr>
-      <w:del w:id="1142" w:author="Claude" w:date="2026-10-17T12:00:00Z">
+      <w:del w:id="1142" w:author="А.А. Шевцов" w:date="2026-10-17T12:00:00Z">
         <w:r>
           <w:rPr>
             <w:rFonts w:ascii="Times New Roman" w:hAnsi="Times New Roman"/>
@@ -9093,7 +9093,7 @@
           <w:delText xml:space="preserve">Yu</w:delText>
         </w:r>
       </w:del>
-      <w:ins w:id="1143" w:author="Claude" w:date="2026-10-17T12:00:00Z">
+      <w:ins w:id="1143" w:author="А.А. Шевцов" w:date="2026-10-17T12:00:00Z">
         <w:r>
           <w:rPr>
             <w:rFonts w:ascii="Times New Roman" w:hAnsi="Times New Roman"/>
@@ -9127,7 +9127,7 @@
           <w:rFonts w:ascii="Times New Roman" w:hAnsi="Times New Roman" w:cs="Times New Roman"/>
         </w:rPr>
       </w:pPr>
-      <w:del w:id="1146" w:author="Claude" w:date="2026-10-17T12:00:00Z">
+      <w:del w:id="1146" w:author="А.А. Шевцов" w:date="2026-10-17T12:00:00Z">
         <w:r>
           <w:rPr>
             <w:rFonts w:ascii="Times New Roman" w:hAnsi="Times New Roman"/>
@@ -9135,7 +9135,7 @@
           <w:delText xml:space="preserve">Z</w:delText>
         </w:r>
       </w:del>
-      <w:ins w:id="1147" w:author="Claude" w:date="2026-10-17T12:00:00Z">
+      <w:ins w:id="1147" w:author="А.А. Шевцов" w:date="2026-10-17T12:00:00Z">
         <w:r>
           <w:rPr>
             <w:rFonts w:ascii="Times New Roman" w:hAnsi="Times New Roman"/>
@@ -9153,7 +9153,7 @@
           <w:rFonts w:ascii="Times New Roman" w:hAnsi="Times New Roman" w:cs="Times New Roman"/>
         </w:rPr>
       </w:pPr>
-      <w:del w:id="1150" w:author="Claude" w:date="2026-10-17T12:00:00Z">
+      <w:del w:id="1150" w:author="А.А. Шевцов" w:date="2026-10-17T12:00:00Z">
         <w:r>
           <w:rPr>
             <w:rFonts w:ascii="Times New Roman" w:hAnsi="Times New Roman"/>
@@ -9161,7 +9161,7 @@
           <w:delText xml:space="preserve">SZ</w:delText>
         </w:r>
       </w:del>
-      <w:ins w:id="1151" w:author="Claude" w:date="2026-10-17T12:00:00Z">
+      <w:ins w:id="1151" w:author="А.А. Шевцов" w:date="2026-10-17T12:00:00Z">
         <w:r>
           <w:rPr>
             <w:rFonts w:ascii="Times New Roman" w:hAnsi="Times New Roman"/>
@@ -9223,7 +9223,7 @@
         </w:rPr>
         <w:t xml:space="preserve">Unified State Register of Real Estate (Rosreestr), the </w:t>
       </w:r>
-      <w:del w:id="1210" w:author="Claude" w:date="2026-10-17T12:00:00Z">
+      <w:del w:id="1210" w:author="А.А. Шевцов" w:date="2026-10-17T12:00:00Z">
         <w:r>
           <w:rPr>
             <w:rFonts w:ascii="Times New Roman" w:hAnsi="Times New Roman"/>
@@ -9231,7 +9231,7 @@
           <w:delText xml:space="preserve">"</w:delText>
         </w:r>
       </w:del>
-      <w:ins w:id="1211" w:author="Claude" w:date="2026-10-17T12:00:00Z">
+      <w:ins w:id="1211" w:author="А.А. Шевцов" w:date="2026-10-17T12:00:00Z">
         <w:r>
           <w:rPr>
             <w:rFonts w:ascii="Times New Roman" w:hAnsi="Times New Roman"/>
@@ -9245,7 +9245,7 @@
         </w:rPr>
         <w:t xml:space="preserve">How old is this house</w:t>
       </w:r>
-      <w:del w:id="1208" w:author="Claude" w:date="2026-10-17T12:00:00Z">
+      <w:del w:id="1208" w:author="А.А. Шевцов" w:date="2026-10-17T12:00:00Z">
         <w:r>
           <w:rPr>
             <w:rFonts w:ascii="Times New Roman" w:hAnsi="Times New Roman"/>
@@ -9253,7 +9253,7 @@
           <w:delText xml:space="preserve">"</w:delText>
         </w:r>
       </w:del>
-      <w:ins w:id="1209" w:author="Claude" w:date="2026-10-17T12:00:00Z">
+      <w:ins w:id="1209" w:author="А.А. Шевцов" w:date="2026-10-17T12:00:00Z">
         <w:r>
           <w:rPr>
             <w:rFonts w:ascii="Times New Roman" w:hAnsi="Times New Roman"/>
@@ -9325,7 +9325,7 @@
         </w:rPr>
         <w:t xml:space="preserve">incl. </w:t>
       </w:r>
-      <w:del w:id="1214" w:author="Claude" w:date="2026-10-17T12:00:00Z">
+      <w:del w:id="1214" w:author="А.А. Шевцов" w:date="2026-10-17T12:00:00Z">
         <w:r>
           <w:rPr>
             <w:rFonts w:ascii="Times New Roman" w:hAnsi="Times New Roman"/>
@@ -9333,7 +9333,7 @@
           <w:delText xml:space="preserve">"</w:delText>
         </w:r>
       </w:del>
-      <w:ins w:id="1215" w:author="Claude" w:date="2026-10-17T12:00:00Z">
+      <w:ins w:id="1215" w:author="А.А. Шевцов" w:date="2026-10-17T12:00:00Z">
         <w:r>
           <w:rPr>
             <w:rFonts w:ascii="Times New Roman" w:hAnsi="Times New Roman"/>
@@ -9347,7 +9347,7 @@
         </w:rPr>
         <w:t xml:space="preserve">physical city</w:t>
       </w:r>
-      <w:del w:id="1212" w:author="Claude" w:date="2026-10-17T12:00:00Z">
+      <w:del w:id="1212" w:author="А.А. Шевцов" w:date="2026-10-17T12:00:00Z">
         <w:r>
           <w:rPr>
             <w:rFonts w:ascii="Times New Roman" w:hAnsi="Times New Roman"/>
@@ -9355,7 +9355,7 @@
           <w:delText xml:space="preserve">"</w:delText>
         </w:r>
       </w:del>
-      <w:ins w:id="1213" w:author="Claude" w:date="2026-10-17T12:00:00Z">
+      <w:ins w:id="1213" w:author="А.А. Шевцов" w:date="2026-10-17T12:00:00Z">
         <w:r>
           <w:rPr>
             <w:rFonts w:ascii="Times New Roman" w:hAnsi="Times New Roman"/>
@@ -9503,7 +9503,7 @@
         </w:rPr>
         <w:t xml:space="preserve"> Spatial data portal National Spatial Data System. https://nspd.gov.ru (date </w:t>
       </w:r>
-      <w:del w:id="904" w:author="Claude" w:date="2026-10-17T12:00:00Z">
+      <w:del w:id="904" w:author="А.А. Шевцов" w:date="2026-10-17T12:00:00Z">
         <w:r>
           <w:rPr>
             <w:rFonts w:ascii="Times New Roman" w:hAnsi="Times New Roman"/>
@@ -9511,7 +9511,7 @@
           <w:delText xml:space="preserve">accessed:</w:delText>
         </w:r>
       </w:del>
-      <w:ins w:id="905" w:author="Claude" w:date="2026-10-17T12:00:00Z">
+      <w:ins w:id="905" w:author="А.А. Шевцов" w:date="2026-10-17T12:00:00Z">
         <w:r>
           <w:rPr>
             <w:rFonts w:ascii="Times New Roman" w:hAnsi="Times New Roman"/>
@@ -9549,7 +9549,7 @@
         </w:rPr>
         <w:t xml:space="preserve">Kontikimaps. </w:t>
       </w:r>
-      <w:del w:id="918" w:author="Claude" w:date="2026-10-17T12:00:00Z">
+      <w:del w:id="918" w:author="А.А. Шевцов" w:date="2026-10-17T12:00:00Z">
         <w:r>
           <w:rPr>
             <w:rFonts w:ascii="Times New Roman" w:hAnsi="Times New Roman"/>
@@ -9557,7 +9557,7 @@
           <w:delText xml:space="preserve">"</w:delText>
         </w:r>
       </w:del>
-      <w:ins w:id="919" w:author="Claude" w:date="2026-10-17T12:00:00Z">
+      <w:ins w:id="919" w:author="А.А. Шевцов" w:date="2026-10-17T12:00:00Z">
         <w:r>
           <w:rPr>
             <w:rFonts w:ascii="Times New Roman" w:hAnsi="Times New Roman"/>
@@ -9571,7 +9571,7 @@
         </w:rPr>
         <w:t xml:space="preserve">How Old is This House.</w:t>
       </w:r>
-      <w:del w:id="916" w:author="Claude" w:date="2026-10-17T12:00:00Z">
+      <w:del w:id="916" w:author="А.А. Шевцов" w:date="2026-10-17T12:00:00Z">
         <w:r>
           <w:rPr>
             <w:rFonts w:ascii="Times New Roman" w:hAnsi="Times New Roman"/>
@@ -9579,7 +9579,7 @@
           <w:delText xml:space="preserve">"</w:delText>
         </w:r>
       </w:del>
-      <w:ins w:id="917" w:author="Claude" w:date="2026-10-17T12:00:00Z">
+      <w:ins w:id="917" w:author="А.А. Шевцов" w:date="2026-10-17T12:00:00Z">
         <w:r>
           <w:rPr>
             <w:rFonts w:ascii="Times New Roman" w:hAnsi="Times New Roman"/>
@@ -9593,7 +9593,7 @@
         </w:rPr>
         <w:t xml:space="preserve"> https://kontikimaps.ru/hoith </w:t>
       </w:r>
-      <w:del w:id="908" w:author="Claude" w:date="2026-10-17T12:00:00Z">
+      <w:del w:id="908" w:author="А.А. Шевцов" w:date="2026-10-17T12:00:00Z">
         <w:r>
           <w:rPr>
             <w:rFonts w:ascii="Times New Roman" w:hAnsi="Times New Roman"/>
@@ -9601,7 +9601,7 @@
           <w:delText xml:space="preserve">(accessed:</w:delText>
         </w:r>
       </w:del>
-      <w:ins w:id="909" w:author="Claude" w:date="2026-10-17T12:00:00Z">
+      <w:ins w:id="909" w:author="А.А. Шевцов" w:date="2026-10-17T12:00:00Z">
         <w:r>
           <w:rPr>
             <w:rFonts w:ascii="Times New Roman" w:hAnsi="Times New Roman"/>
@@ -9639,7 +9639,7 @@
         </w:rPr>
         <w:t xml:space="preserve">OpenStreetMap. https://www.openstreetmap.org (date </w:t>
       </w:r>
-      <w:del w:id="906" w:author="Claude" w:date="2026-10-17T12:00:00Z">
+      <w:del w:id="906" w:author="А.А. Шевцов" w:date="2026-10-17T12:00:00Z">
         <w:r>
           <w:rPr>
             <w:rFonts w:ascii="Times New Roman" w:hAnsi="Times New Roman"/>
@@ -9647,7 +9647,7 @@
           <w:delText xml:space="preserve">accessed:</w:delText>
         </w:r>
       </w:del>
-      <w:ins w:id="907" w:author="Claude" w:date="2026-10-17T12:00:00Z">
+      <w:ins w:id="907" w:author="А.А. Шевцов" w:date="2026-10-17T12:00:00Z">
         <w:r>
           <w:rPr>
             <w:rFonts w:ascii="Times New Roman" w:hAnsi="Times New Roman"/>
@@ -9685,7 +9685,7 @@
         </w:rPr>
         <w:t xml:space="preserve">Earth Explorer. https://earthexplorernasa.gov/ </w:t>
       </w:r>
-      <w:del w:id="910" w:author="Claude" w:date="2026-10-17T12:00:00Z">
+      <w:del w:id="910" w:author="А.А. Шевцов" w:date="2026-10-17T12:00:00Z">
         <w:r>
           <w:rPr>
             <w:rFonts w:ascii="Times New Roman" w:hAnsi="Times New Roman"/>
@@ -9693,7 +9693,7 @@
           <w:delText xml:space="preserve">(accessed:</w:delText>
         </w:r>
       </w:del>
-      <w:ins w:id="911" w:author="Claude" w:date="2026-10-17T12:00:00Z">
+      <w:ins w:id="911" w:author="А.А. Шевцов" w:date="2026-10-17T12:00:00Z">
         <w:r>
           <w:rPr>
             <w:rFonts w:ascii="Times New Roman" w:hAnsi="Times New Roman"/>
@@ -9725,7 +9725,7 @@
       <w:r>
         <w:t xml:space="preserve"> </w:t>
       </w:r>
-      <w:del w:id="902" w:author="Claude" w:date="2026-10-17T12:00:00Z">
+      <w:del w:id="902" w:author="А.А. Шевцов" w:date="2026-10-17T12:00:00Z">
         <w:r>
           <w:rPr>
             <w:rFonts w:ascii="Times New Roman" w:hAnsi="Times New Roman"/>
@@ -9733,7 +9733,7 @@
           <w:delText xml:space="preserve">Geocheki</w:delText>
         </w:r>
       </w:del>
-      <w:ins w:id="903" w:author="Claude" w:date="2026-10-17T12:00:00Z">
+      <w:ins w:id="903" w:author="А.А. Шевцов" w:date="2026-10-17T12:00:00Z">
         <w:r>
           <w:rPr>
             <w:rFonts w:ascii="Times New Roman" w:hAnsi="Times New Roman"/>
@@ -9769,7 +9769,7 @@
         </w:rPr>
         <w:t xml:space="preserve"> </w:t>
       </w:r>
-      <w:del w:id="922" w:author="Claude" w:date="2026-10-17T12:00:00Z">
+      <w:del w:id="922" w:author="А.А. Шевцов" w:date="2026-10-17T12:00:00Z">
         <w:r>
           <w:rPr>
             <w:rFonts w:ascii="Times New Roman" w:hAnsi="Times New Roman"/>
@@ -9777,7 +9777,7 @@
           <w:delText xml:space="preserve">"</w:delText>
         </w:r>
       </w:del>
-      <w:ins w:id="923" w:author="Claude" w:date="2026-10-17T12:00:00Z">
+      <w:ins w:id="923" w:author="А.А. Шевцов" w:date="2026-10-17T12:00:00Z">
         <w:r>
           <w:rPr>
             <w:rFonts w:ascii="Times New Roman" w:hAnsi="Times New Roman"/>
@@ -9791,7 +9791,7 @@
         </w:rPr>
         <w:t xml:space="preserve">To </w:t>
       </w:r>
-      <w:del w:id="914" w:author="Claude" w:date="2026-10-17T12:00:00Z">
+      <w:del w:id="914" w:author="А.А. Шевцов" w:date="2026-10-17T12:00:00Z">
         <w:r>
           <w:rPr>
             <w:rFonts w:ascii="Times New Roman" w:hAnsi="Times New Roman"/>
@@ -9799,7 +9799,7 @@
           <w:delText xml:space="preserve">be precise</w:delText>
         </w:r>
       </w:del>
-      <w:ins w:id="915" w:author="Claude" w:date="2026-10-17T12:00:00Z">
+      <w:ins w:id="915" w:author="А.А. Шевцов" w:date="2026-10-17T12:00:00Z">
         <w:r>
           <w:rPr>
             <w:rFonts w:ascii="Times New Roman" w:hAnsi="Times New Roman"/>
@@ -9813,7 +9813,7 @@
         </w:rPr>
         <w:t xml:space="preserve">.</w:t>
       </w:r>
-      <w:del w:id="920" w:author="Claude" w:date="2026-10-17T12:00:00Z">
+      <w:del w:id="920" w:author="А.А. Шевцов" w:date="2026-10-17T12:00:00Z">
         <w:r>
           <w:rPr>
             <w:rFonts w:ascii="Times New Roman" w:hAnsi="Times New Roman"/>
@@ -9821,7 +9821,7 @@
           <w:delText xml:space="preserve">"</w:delText>
         </w:r>
       </w:del>
-      <w:ins w:id="921" w:author="Claude" w:date="2026-10-17T12:00:00Z">
+      <w:ins w:id="921" w:author="А.А. Шевцов" w:date="2026-10-17T12:00:00Z">
         <w:r>
           <w:rPr>
             <w:rFonts w:ascii="Times New Roman" w:hAnsi="Times New Roman"/>
@@ -9838,7 +9838,7 @@
         </w:rPr>
         <w:t xml:space="preserve">Russian Financial Reporting Database. https://tochno.st/datasets/rfsd </w:t>
       </w:r>
-      <w:del w:id="912" w:author="Claude" w:date="2026-10-17T12:00:00Z">
+      <w:del w:id="912" w:author="А.А. Шевцов" w:date="2026-10-17T12:00:00Z">
         <w:r>
           <w:rPr>
             <w:rFonts w:ascii="Times New Roman" w:hAnsi="Times New Roman"/>
@@ -9846,7 +9846,7 @@
           <w:delText xml:space="preserve">(accessed:</w:delText>
         </w:r>
       </w:del>
-      <w:ins w:id="913" w:author="Claude" w:date="2026-10-17T12:00:00Z">
+      <w:ins w:id="913" w:author="А.А. Шевцов" w:date="2026-10-17T12:00:00Z">
         <w:r>
           <w:rPr>
             <w:rFonts w:ascii="Times New Roman" w:hAnsi="Times New Roman"/>

</xml_diff>

<commit_message>
Fix Earth Explorer URL
Co-Authored-By: Claude Sonnet 5.5 <noreply@anthropic.com>
Claude-Session: https://claude.ai/code/session_01UR1NZjK59cEf7XcfQ71PDe
</commit_message>
<xml_diff>
--- a/RegRes2670014Shevtsov_reviewed.docx
+++ b/RegRes2670014Shevtsov_reviewed.docx
@@ -513,7 +513,7 @@
         </w:rPr>
         <w:t xml:space="preserve">development, </w:t>
       </w:r>
-      <w:del w:id="1154" w:author="А.А. Шевцов" w:date="2026-10-17T12:00:00Z">
+      <w:del w:id="1160" w:author="А.А. Шевцов" w:date="2026-10-17T12:00:00Z">
         <w:r>
           <w:rPr>
             <w:rFonts w:ascii="Times New Roman" w:hAnsi="Times New Roman"/>
@@ -521,7 +521,7 @@
           <w:delText xml:space="preserve">"</w:delText>
         </w:r>
       </w:del>
-      <w:ins w:id="1155" w:author="А.А. Шевцов" w:date="2026-10-17T12:00:00Z">
+      <w:ins w:id="1161" w:author="А.А. Шевцов" w:date="2026-10-17T12:00:00Z">
         <w:r>
           <w:rPr>
             <w:rFonts w:ascii="Times New Roman" w:hAnsi="Times New Roman"/>
@@ -535,7 +535,7 @@
         </w:rPr>
         <w:t xml:space="preserve">growth machine</w:t>
       </w:r>
-      <w:del w:id="1152" w:author="А.А. Шевцов" w:date="2026-10-17T12:00:00Z">
+      <w:del w:id="1158" w:author="А.А. Шевцов" w:date="2026-10-17T12:00:00Z">
         <w:r>
           <w:rPr>
             <w:rFonts w:ascii="Times New Roman" w:hAnsi="Times New Roman"/>
@@ -543,7 +543,7 @@
           <w:delText xml:space="preserve">"</w:delText>
         </w:r>
       </w:del>
-      <w:ins w:id="1153" w:author="А.А. Шевцов" w:date="2026-10-17T12:00:00Z">
+      <w:ins w:id="1159" w:author="А.А. Шевцов" w:date="2026-10-17T12:00:00Z">
         <w:r>
           <w:rPr>
             <w:rFonts w:ascii="Times New Roman" w:hAnsi="Times New Roman"/>
@@ -835,7 +835,7 @@
         </w:rPr>
         <w:t xml:space="preserve">The territorial growth of Voronezh is understood as the entire set of new built-up areas both on the outskirts of existing development and in the area of the </w:t>
       </w:r>
-      <w:del w:id="1024" w:author="А.А. Шевцов" w:date="2026-10-17T12:00:00Z">
+      <w:del w:id="1030" w:author="А.А. Шевцов" w:date="2026-10-17T12:00:00Z">
         <w:r>
           <w:rPr>
             <w:rFonts w:ascii="Times New Roman" w:hAnsi="Times New Roman"/>
@@ -845,7 +845,7 @@
           <w:delText xml:space="preserve">near</w:delText>
         </w:r>
       </w:del>
-      <w:ins w:id="1025" w:author="А.А. Шевцов" w:date="2026-10-17T12:00:00Z">
+      <w:ins w:id="1031" w:author="А.А. Шевцов" w:date="2026-10-17T12:00:00Z">
         <w:r>
           <w:rPr>
             <w:rFonts w:ascii="Times New Roman" w:hAnsi="Times New Roman"/>
@@ -1632,7 +1632,7 @@
         </w:rPr>
         <w:t xml:space="preserve"> marks a transition to an “entrepreneurial” model of development in urban outskirts and </w:t>
       </w:r>
-      <w:del w:id="1026" w:author="А.А. Шевцов" w:date="2026-10-17T12:00:00Z">
+      <w:del w:id="1032" w:author="А.А. Шевцов" w:date="2026-10-17T12:00:00Z">
         <w:r>
           <w:rPr>
             <w:rFonts w:ascii="Times New Roman" w:hAnsi="Times New Roman"/>
@@ -1642,7 +1642,7 @@
           <w:delText xml:space="preserve">near</w:delText>
         </w:r>
       </w:del>
-      <w:ins w:id="1027" w:author="А.А. Шевцов" w:date="2026-10-17T12:00:00Z">
+      <w:ins w:id="1033" w:author="А.А. Шевцов" w:date="2026-10-17T12:00:00Z">
         <w:r>
           <w:rPr>
             <w:rFonts w:ascii="Times New Roman" w:hAnsi="Times New Roman"/>
@@ -1680,7 +1680,7 @@
         </w:rPr>
         <w:t xml:space="preserve">A systematization of scenarios for the territorial development of Russian cities based on the vector of transformation of their planning structure is presented in the report of the National Research University Higher School of Economics </w:t>
       </w:r>
-      <w:del w:id="1158" w:author="А.А. Шевцов" w:date="2026-10-17T12:00:00Z">
+      <w:del w:id="1164" w:author="А.А. Шевцов" w:date="2026-10-17T12:00:00Z">
         <w:r>
           <w:rPr>
             <w:rFonts w:ascii="Times New Roman" w:hAnsi="Times New Roman"/>
@@ -1690,7 +1690,7 @@
           <w:delText xml:space="preserve">"</w:delText>
         </w:r>
       </w:del>
-      <w:ins w:id="1159" w:author="А.А. Шевцов" w:date="2026-10-17T12:00:00Z">
+      <w:ins w:id="1165" w:author="А.А. Шевцов" w:date="2026-10-17T12:00:00Z">
         <w:r>
           <w:rPr>
             <w:rFonts w:ascii="Times New Roman" w:hAnsi="Times New Roman"/>
@@ -1728,7 +1728,7 @@
           <w:t xml:space="preserve">Sprawl</w:t>
         </w:r>
       </w:ins>
-      <w:del w:id="1156" w:author="А.А. Шевцов" w:date="2026-10-17T12:00:00Z">
+      <w:del w:id="1162" w:author="А.А. Шевцов" w:date="2026-10-17T12:00:00Z">
         <w:r>
           <w:rPr>
             <w:rFonts w:ascii="Times New Roman" w:hAnsi="Times New Roman"/>
@@ -1738,7 +1738,7 @@
           <w:delText xml:space="preserve">"</w:delText>
         </w:r>
       </w:del>
-      <w:ins w:id="1157" w:author="А.А. Шевцов" w:date="2026-10-17T12:00:00Z">
+      <w:ins w:id="1163" w:author="А.А. Шевцов" w:date="2026-10-17T12:00:00Z">
         <w:r>
           <w:rPr>
             <w:rFonts w:ascii="Times New Roman" w:hAnsi="Times New Roman"/>
@@ -1803,7 +1803,7 @@
         </w:rPr>
         <w:t>- </w:t>
       </w:r>
-      <w:del w:id="1162" w:author="А.А. Шевцов" w:date="2026-10-17T12:00:00Z">
+      <w:del w:id="1168" w:author="А.А. Шевцов" w:date="2026-10-17T12:00:00Z">
         <w:r>
           <w:rPr>
             <w:rFonts w:ascii="Times New Roman" w:hAnsi="Times New Roman"/>
@@ -1813,7 +1813,7 @@
           <w:delText xml:space="preserve">"</w:delText>
         </w:r>
       </w:del>
-      <w:ins w:id="1163" w:author="А.А. Шевцов" w:date="2026-10-17T12:00:00Z">
+      <w:ins w:id="1169" w:author="А.А. Шевцов" w:date="2026-10-17T12:00:00Z">
         <w:r>
           <w:rPr>
             <w:rFonts w:ascii="Times New Roman" w:hAnsi="Times New Roman"/>
@@ -1843,7 +1843,7 @@
           <w:t xml:space="preserve">sprawl</w:t>
         </w:r>
       </w:ins>
-      <w:del w:id="1160" w:author="А.А. Шевцов" w:date="2026-10-17T12:00:00Z">
+      <w:del w:id="1166" w:author="А.А. Шевцов" w:date="2026-10-17T12:00:00Z">
         <w:r>
           <w:rPr>
             <w:rFonts w:ascii="Times New Roman" w:hAnsi="Times New Roman"/>
@@ -1853,7 +1853,7 @@
           <w:delText xml:space="preserve">"</w:delText>
         </w:r>
       </w:del>
-      <w:ins w:id="1161" w:author="А.А. Шевцов" w:date="2026-10-17T12:00:00Z">
+      <w:ins w:id="1167" w:author="А.А. Шевцов" w:date="2026-10-17T12:00:00Z">
         <w:r>
           <w:rPr>
             <w:rFonts w:ascii="Times New Roman" w:hAnsi="Times New Roman"/>
@@ -1890,7 +1890,7 @@
         </w:rPr>
         <w:t>- </w:t>
       </w:r>
-      <w:del w:id="1166" w:author="А.А. Шевцов" w:date="2026-10-17T12:00:00Z">
+      <w:del w:id="1172" w:author="А.А. Шевцов" w:date="2026-10-17T12:00:00Z">
         <w:r>
           <w:rPr>
             <w:rFonts w:ascii="Times New Roman" w:hAnsi="Times New Roman"/>
@@ -1900,7 +1900,7 @@
           <w:delText xml:space="preserve">"</w:delText>
         </w:r>
       </w:del>
-      <w:ins w:id="1167" w:author="А.А. Шевцов" w:date="2026-10-17T12:00:00Z">
+      <w:ins w:id="1173" w:author="А.А. Шевцов" w:date="2026-10-17T12:00:00Z">
         <w:r>
           <w:rPr>
             <w:rFonts w:ascii="Times New Roman" w:hAnsi="Times New Roman"/>
@@ -1918,7 +1918,7 @@
         </w:rPr>
         <w:t xml:space="preserve">growth</w:t>
       </w:r>
-      <w:del w:id="1164" w:author="А.А. Шевцов" w:date="2026-10-17T12:00:00Z">
+      <w:del w:id="1170" w:author="А.А. Шевцов" w:date="2026-10-17T12:00:00Z">
         <w:r>
           <w:rPr>
             <w:rFonts w:ascii="Times New Roman" w:hAnsi="Times New Roman"/>
@@ -1928,7 +1928,7 @@
           <w:delText xml:space="preserve">"</w:delText>
         </w:r>
       </w:del>
-      <w:ins w:id="1165" w:author="А.А. Шевцов" w:date="2026-10-17T12:00:00Z">
+      <w:ins w:id="1171" w:author="А.А. Шевцов" w:date="2026-10-17T12:00:00Z">
         <w:r>
           <w:rPr>
             <w:rFonts w:ascii="Times New Roman" w:hAnsi="Times New Roman"/>
@@ -1965,7 +1965,7 @@
         </w:rPr>
         <w:t>- </w:t>
       </w:r>
-      <w:del w:id="1170" w:author="А.А. Шевцов" w:date="2026-10-17T12:00:00Z">
+      <w:del w:id="1176" w:author="А.А. Шевцов" w:date="2026-10-17T12:00:00Z">
         <w:r>
           <w:rPr>
             <w:rFonts w:ascii="Times New Roman" w:hAnsi="Times New Roman"/>
@@ -1975,7 +1975,7 @@
           <w:delText xml:space="preserve">"</w:delText>
         </w:r>
       </w:del>
-      <w:ins w:id="1171" w:author="А.А. Шевцов" w:date="2026-10-17T12:00:00Z">
+      <w:ins w:id="1177" w:author="А.А. Шевцов" w:date="2026-10-17T12:00:00Z">
         <w:r>
           <w:rPr>
             <w:rFonts w:ascii="Times New Roman" w:hAnsi="Times New Roman"/>
@@ -1993,7 +1993,7 @@
         </w:rPr>
         <w:t xml:space="preserve">adaptation</w:t>
       </w:r>
-      <w:del w:id="1168" w:author="А.А. Шевцов" w:date="2026-10-17T12:00:00Z">
+      <w:del w:id="1174" w:author="А.А. Шевцов" w:date="2026-10-17T12:00:00Z">
         <w:r>
           <w:rPr>
             <w:rFonts w:ascii="Times New Roman" w:hAnsi="Times New Roman"/>
@@ -2003,7 +2003,7 @@
           <w:delText xml:space="preserve">"</w:delText>
         </w:r>
       </w:del>
-      <w:ins w:id="1169" w:author="А.А. Шевцов" w:date="2026-10-17T12:00:00Z">
+      <w:ins w:id="1175" w:author="А.А. Шевцов" w:date="2026-10-17T12:00:00Z">
         <w:r>
           <w:rPr>
             <w:rFonts w:ascii="Times New Roman" w:hAnsi="Times New Roman"/>
@@ -2041,7 +2041,7 @@
         </w:rPr>
         <w:t xml:space="preserve">The theoretical significance of this classification lies in identifying the gap between planning principles and actual morphological processes. The authors argue that the majority of Russia's largest centers are characterized by a </w:t>
       </w:r>
-      <w:del w:id="1174" w:author="А.А. Шевцов" w:date="2026-10-17T12:00:00Z">
+      <w:del w:id="1180" w:author="А.А. Шевцов" w:date="2026-10-17T12:00:00Z">
         <w:r>
           <w:rPr>
             <w:rFonts w:ascii="Times New Roman" w:hAnsi="Times New Roman"/>
@@ -2051,7 +2051,7 @@
           <w:delText xml:space="preserve">"</w:delText>
         </w:r>
       </w:del>
-      <w:ins w:id="1175" w:author="А.А. Шевцов" w:date="2026-10-17T12:00:00Z">
+      <w:ins w:id="1181" w:author="А.А. Шевцов" w:date="2026-10-17T12:00:00Z">
         <w:r>
           <w:rPr>
             <w:rFonts w:ascii="Times New Roman" w:hAnsi="Times New Roman"/>
@@ -2081,7 +2081,7 @@
           <w:t xml:space="preserve">sprawl</w:t>
         </w:r>
       </w:ins>
-      <w:del w:id="1172" w:author="А.А. Шевцов" w:date="2026-10-17T12:00:00Z">
+      <w:del w:id="1178" w:author="А.А. Шевцов" w:date="2026-10-17T12:00:00Z">
         <w:r>
           <w:rPr>
             <w:rFonts w:ascii="Times New Roman" w:hAnsi="Times New Roman"/>
@@ -2091,7 +2091,7 @@
           <w:delText xml:space="preserve">"</w:delText>
         </w:r>
       </w:del>
-      <w:ins w:id="1173" w:author="А.А. Шевцов" w:date="2026-10-17T12:00:00Z">
+      <w:ins w:id="1179" w:author="А.А. Шевцов" w:date="2026-10-17T12:00:00Z">
         <w:r>
           <w:rPr>
             <w:rFonts w:ascii="Times New Roman" w:hAnsi="Times New Roman"/>
@@ -2435,7 +2435,7 @@
         </w:rPr>
         <w:t xml:space="preserve">– open project </w:t>
       </w:r>
-      <w:del w:id="1178" w:author="А.А. Шевцов" w:date="2026-10-17T12:00:00Z">
+      <w:del w:id="1184" w:author="А.А. Шевцов" w:date="2026-10-17T12:00:00Z">
         <w:r>
           <w:rPr>
             <w:rFonts w:ascii="Times New Roman" w:hAnsi="Times New Roman"/>
@@ -2444,7 +2444,7 @@
           <w:delText xml:space="preserve">"</w:delText>
         </w:r>
       </w:del>
-      <w:ins w:id="1179" w:author="А.А. Шевцов" w:date="2026-10-17T12:00:00Z">
+      <w:ins w:id="1185" w:author="А.А. Шевцов" w:date="2026-10-17T12:00:00Z">
         <w:r>
           <w:rPr>
             <w:rFonts w:ascii="Times New Roman" w:hAnsi="Times New Roman"/>
@@ -2460,7 +2460,7 @@
         </w:rPr>
         <w:t xml:space="preserve">How old is this house</w:t>
       </w:r>
-      <w:del w:id="1176" w:author="А.А. Шевцов" w:date="2026-10-17T12:00:00Z">
+      <w:del w:id="1182" w:author="А.А. Шевцов" w:date="2026-10-17T12:00:00Z">
         <w:r>
           <w:rPr>
             <w:rFonts w:ascii="Times New Roman" w:hAnsi="Times New Roman"/>
@@ -2469,7 +2469,7 @@
           <w:delText xml:space="preserve">"</w:delText>
         </w:r>
       </w:del>
-      <w:ins w:id="1177" w:author="А.А. Шевцов" w:date="2026-10-17T12:00:00Z">
+      <w:ins w:id="1183" w:author="А.А. Шевцов" w:date="2026-10-17T12:00:00Z">
         <w:r>
           <w:rPr>
             <w:rFonts w:ascii="Times New Roman" w:hAnsi="Times New Roman"/>
@@ -2985,7 +2985,7 @@
         </w:rPr>
         <w:t xml:space="preserve">– Density of fixed assets of enterprises (rubles/ha) – the total value of fixed assets of companies located in the polygon, calculated per 1 ha. Calculated based on a database of company financial statements aggregated by the </w:t>
       </w:r>
-      <w:del w:id="1182" w:author="А.А. Шевцов" w:date="2026-10-17T12:00:00Z">
+      <w:del w:id="1188" w:author="А.А. Шевцов" w:date="2026-10-17T12:00:00Z">
         <w:r>
           <w:rPr>
             <w:rFonts w:ascii="Times New Roman" w:hAnsi="Times New Roman"/>
@@ -2995,7 +2995,7 @@
           <w:delText xml:space="preserve">"</w:delText>
         </w:r>
       </w:del>
-      <w:ins w:id="1183" w:author="А.А. Шевцов" w:date="2026-10-17T12:00:00Z">
+      <w:ins w:id="1189" w:author="А.А. Шевцов" w:date="2026-10-17T12:00:00Z">
         <w:r>
           <w:rPr>
             <w:rFonts w:ascii="Times New Roman" w:hAnsi="Times New Roman"/>
@@ -3013,7 +3013,7 @@
         </w:rPr>
         <w:t xml:space="preserve">To Be Precise</w:t>
       </w:r>
-      <w:del w:id="1180" w:author="А.А. Шевцов" w:date="2026-10-17T12:00:00Z">
+      <w:del w:id="1186" w:author="А.А. Шевцов" w:date="2026-10-17T12:00:00Z">
         <w:r>
           <w:rPr>
             <w:rFonts w:ascii="Times New Roman" w:hAnsi="Times New Roman"/>
@@ -3023,7 +3023,7 @@
           <w:delText xml:space="preserve">"</w:delText>
         </w:r>
       </w:del>
-      <w:ins w:id="1181" w:author="А.А. Шевцов" w:date="2026-10-17T12:00:00Z">
+      <w:ins w:id="1187" w:author="А.А. Шевцов" w:date="2026-10-17T12:00:00Z">
         <w:r>
           <w:rPr>
             <w:rFonts w:ascii="Times New Roman" w:hAnsi="Times New Roman"/>
@@ -3342,7 +3342,7 @@
         </w:rPr>
         <w:t xml:space="preserve">All spatial operations and calculations of indicators were performed in the QGIS </w:t>
       </w:r>
-      <w:del w:id="1022" w:author="А.А. Шевцов" w:date="2026-10-17T12:00:00Z">
+      <w:del w:id="1028" w:author="А.А. Шевцов" w:date="2026-10-17T12:00:00Z">
         <w:r>
           <w:rPr>
             <w:rFonts w:ascii="Times New Roman" w:hAnsi="Times New Roman"/>
@@ -3352,7 +3352,7 @@
           <w:delText xml:space="preserve">program</w:delText>
         </w:r>
       </w:del>
-      <w:ins w:id="1023" w:author="А.А. Шевцов" w:date="2026-10-17T12:00:00Z">
+      <w:ins w:id="1029" w:author="А.А. Шевцов" w:date="2026-10-17T12:00:00Z">
         <w:r>
           <w:rPr>
             <w:rFonts w:ascii="Times New Roman" w:hAnsi="Times New Roman"/>
@@ -3423,7 +3423,7 @@
         </w:rPr>
         <w:t xml:space="preserve">An analysis of the territorial growth of Voronezh and its suburban area and changes in their morphology for the period 1992–2025 allows us to identify a profound structural reorganization of the spatial system under study. By the beginning of the post-Soviet period, the development retained a compact planning structure: the area of the “physical city” was 28.8 thousand hectares, which was comparable to the total area of suburban settlements (31.2 thousand hectares) with an extremely low proportion of dispersed development (3.5 thousand hectares). By 2025, the situation had radically transformed: while the area of the “physical city” had grown by 42% (to 41.1 thousand hectares), the area of settlements in the </w:t>
       </w:r>
-      <w:del w:id="1028" w:author="А.А. Шевцов" w:date="2026-10-17T12:00:00Z">
+      <w:del w:id="1034" w:author="А.А. Шевцов" w:date="2026-10-17T12:00:00Z">
         <w:r>
           <w:rPr>
             <w:rFonts w:ascii="Times New Roman" w:hAnsi="Times New Roman"/>
@@ -3433,7 +3433,7 @@
           <w:delText xml:space="preserve">near</w:delText>
         </w:r>
       </w:del>
-      <w:ins w:id="1029" w:author="А.А. Шевцов" w:date="2026-10-17T12:00:00Z">
+      <w:ins w:id="1035" w:author="А.А. Шевцов" w:date="2026-10-17T12:00:00Z">
         <w:r>
           <w:rPr>
             <w:rFonts w:ascii="Times New Roman" w:hAnsi="Times New Roman"/>
@@ -3451,7 +3451,7 @@
         </w:rPr>
         <w:t xml:space="preserve"> suburbs had doubled, reaching 62.2 thousand hectares, and the area of dispersed development areas had increased more than 3.5 times (to 12.3 thousand hectares). As a result, the share of the “physical city” in the overall structure of the study area decreased from 45% to 35% </w:t>
       </w:r>
-      <w:del w:id="1034" w:author="А.А. Шевцов" w:date="2026-10-17T12:00:00Z">
+      <w:del w:id="1040" w:author="А.А. Шевцов" w:date="2026-10-17T12:00:00Z">
         <w:r>
           <w:rPr>
             <w:rFonts w:ascii="Times New Roman" w:hAnsi="Times New Roman"/>
@@ -3461,7 +3461,7 @@
           <w:delText xml:space="preserve">due to the accelerated pace</w:delText>
         </w:r>
       </w:del>
-      <w:ins w:id="1035" w:author="А.А. Шевцов" w:date="2026-10-17T12:00:00Z">
+      <w:ins w:id="1041" w:author="А.А. Шевцов" w:date="2026-10-17T12:00:00Z">
         <w:r>
           <w:rPr>
             <w:rFonts w:ascii="Times New Roman" w:hAnsi="Times New Roman"/>
@@ -3499,7 +3499,7 @@
         </w:rPr>
         <w:t xml:space="preserve">This significant structural shift resulted from the prevalence of discrete methods of urban expansion over traditional </w:t>
       </w:r>
-      <w:del w:id="1036" w:author="А.А. Шевцов" w:date="2026-10-17T12:00:00Z">
+      <w:del w:id="1042" w:author="А.А. Шевцов" w:date="2026-10-17T12:00:00Z">
         <w:r>
           <w:rPr>
             <w:rFonts w:ascii="Times New Roman" w:hAnsi="Times New Roman"/>
@@ -3509,7 +3509,7 @@
           <w:delText xml:space="preserve">regional</w:delText>
         </w:r>
       </w:del>
-      <w:ins w:id="1037" w:author="А.А. Шевцов" w:date="2026-10-17T12:00:00Z">
+      <w:ins w:id="1043" w:author="А.А. Шевцов" w:date="2026-10-17T12:00:00Z">
         <w:r>
           <w:rPr>
             <w:rFonts w:ascii="Times New Roman" w:hAnsi="Times New Roman"/>
@@ -3556,7 +3556,7 @@
         </w:rPr>
         <w:t xml:space="preserve">This trend is largely driven by economic incentives. The most expensive land plots for new development with a specific cost of </w:t>
       </w:r>
-      <w:del w:id="1040" w:author="А.А. Шевцов" w:date="2026-10-17T12:00:00Z">
+      <w:del w:id="1046" w:author="А.А. Шевцов" w:date="2026-10-17T12:00:00Z">
         <w:r>
           <w:rPr>
             <w:rFonts w:ascii="Times New Roman" w:hAnsi="Times New Roman"/>
@@ -3566,7 +3566,7 @@
           <w:delText xml:space="preserve">1892 rubles/m</w:delText>
         </w:r>
       </w:del>
-      <w:del w:id="1041" w:author="А.А. Шевцов" w:date="2026-10-17T12:00:00Z">
+      <w:del w:id="1047" w:author="А.А. Шевцов" w:date="2026-10-17T12:00:00Z">
         <w:r>
           <w:rPr>
             <w:rFonts w:ascii="Times New Roman" w:hAnsi="Times New Roman"/>
@@ -3577,7 +3577,7 @@
           <w:delText xml:space="preserve">2</w:delText>
         </w:r>
       </w:del>
-      <w:ins w:id="1042" w:author="А.А. Шевцов" w:date="2026-10-17T12:00:00Z">
+      <w:ins w:id="1048" w:author="А.А. Шевцов" w:date="2026-10-17T12:00:00Z">
         <w:r>
           <w:rPr>
             <w:rFonts w:ascii="Times New Roman" w:hAnsi="Times New Roman"/>
@@ -3595,7 +3595,7 @@
         </w:rPr>
         <w:t xml:space="preserve"> were developed as a result of the </w:t>
       </w:r>
-      <w:del w:id="1038" w:author="А.А. Шевцов" w:date="2026-10-17T12:00:00Z">
+      <w:del w:id="1044" w:author="А.А. Шевцов" w:date="2026-10-17T12:00:00Z">
         <w:r>
           <w:rPr>
             <w:rFonts w:ascii="Times New Roman" w:hAnsi="Times New Roman"/>
@@ -3605,7 +3605,7 @@
           <w:delText xml:space="preserve">regional</w:delText>
         </w:r>
       </w:del>
-      <w:ins w:id="1039" w:author="А.А. Шевцов" w:date="2026-10-17T12:00:00Z">
+      <w:ins w:id="1045" w:author="А.А. Шевцов" w:date="2026-10-17T12:00:00Z">
         <w:r>
           <w:rPr>
             <w:rFonts w:ascii="Times New Roman" w:hAnsi="Times New Roman"/>
@@ -3623,7 +3623,7 @@
         </w:rPr>
         <w:t xml:space="preserve"> growth of the “physical city”. The high cost of land in these areas, due to their proximity to urban utility networks and transport hubs, dictates the need to implement high-density, </w:t>
       </w:r>
-      <w:del w:id="1045" w:author="А.А. Шевцов" w:date="2026-10-17T12:00:00Z">
+      <w:del w:id="1051" w:author="А.А. Шевцов" w:date="2026-10-17T12:00:00Z">
         <w:r>
           <w:rPr>
             <w:rFonts w:ascii="Times New Roman" w:hAnsi="Times New Roman"/>
@@ -3633,7 +3633,7 @@
           <w:delText xml:space="preserve">multi-story</w:delText>
         </w:r>
       </w:del>
-      <w:ins w:id="1046" w:author="А.А. Шевцов" w:date="2026-10-17T12:00:00Z">
+      <w:ins w:id="1052" w:author="А.А. Шевцов" w:date="2026-10-17T12:00:00Z">
         <w:r>
           <w:rPr>
             <w:rFonts w:ascii="Times New Roman" w:hAnsi="Times New Roman"/>
@@ -3651,7 +3651,7 @@
         </w:rPr>
         <w:t xml:space="preserve"> residential development projects. On the contrary, the mechanism of isolated growth, which dominates the growth structure, is realized on land plots remote from the city with an average price of 409 rubles/m². This is due to the phenomenon of the “rent gap” described by N. Smith (1987). The fivefold price disparity between the outskirts of the </w:t>
       </w:r>
-      <w:del w:id="1186" w:author="А.А. Шевцов" w:date="2026-10-17T12:00:00Z">
+      <w:del w:id="1192" w:author="А.А. Шевцов" w:date="2026-10-17T12:00:00Z">
         <w:r>
           <w:rPr>
             <w:rFonts w:ascii="Times New Roman" w:hAnsi="Times New Roman"/>
@@ -3661,7 +3661,7 @@
           <w:delText xml:space="preserve">"</w:delText>
         </w:r>
       </w:del>
-      <w:ins w:id="1187" w:author="А.А. Шевцов" w:date="2026-10-17T12:00:00Z">
+      <w:ins w:id="1193" w:author="А.А. Шевцов" w:date="2026-10-17T12:00:00Z">
         <w:r>
           <w:rPr>
             <w:rFonts w:ascii="Times New Roman" w:hAnsi="Times New Roman"/>
@@ -3679,7 +3679,7 @@
         </w:rPr>
         <w:t xml:space="preserve">physical city</w:t>
       </w:r>
-      <w:del w:id="1184" w:author="А.А. Шевцов" w:date="2026-10-17T12:00:00Z">
+      <w:del w:id="1190" w:author="А.А. Шевцов" w:date="2026-10-17T12:00:00Z">
         <w:r>
           <w:rPr>
             <w:rFonts w:ascii="Times New Roman" w:hAnsi="Times New Roman"/>
@@ -3689,7 +3689,7 @@
           <w:delText xml:space="preserve">"</w:delText>
         </w:r>
       </w:del>
-      <w:ins w:id="1185" w:author="А.А. Шевцов" w:date="2026-10-17T12:00:00Z">
+      <w:ins w:id="1191" w:author="А.А. Шевцов" w:date="2026-10-17T12:00:00Z">
         <w:r>
           <w:rPr>
             <w:rFonts w:ascii="Times New Roman" w:hAnsi="Times New Roman"/>
@@ -3707,7 +3707,7 @@
         </w:rPr>
         <w:t xml:space="preserve"> and remote areas creates conditions for extracting maximum rent with minimal obligations on the part of developers to </w:t>
       </w:r>
-      <w:del w:id="1043" w:author="А.А. Шевцов" w:date="2026-10-17T12:00:00Z">
+      <w:del w:id="1049" w:author="А.А. Шевцов" w:date="2026-10-17T12:00:00Z">
         <w:r>
           <w:rPr>
             <w:rFonts w:ascii="Times New Roman" w:hAnsi="Times New Roman"/>
@@ -3717,7 +3717,7 @@
           <w:delText xml:space="preserve">develop</w:delText>
         </w:r>
       </w:del>
-      <w:ins w:id="1044" w:author="А.А. Шевцов" w:date="2026-10-17T12:00:00Z">
+      <w:ins w:id="1050" w:author="А.А. Шевцов" w:date="2026-10-17T12:00:00Z">
         <w:r>
           <w:rPr>
             <w:rFonts w:ascii="Times New Roman" w:hAnsi="Times New Roman"/>
@@ -3755,7 +3755,7 @@
         </w:rPr>
         <w:t xml:space="preserve">Thus, </w:t>
       </w:r>
-      <w:del w:id="1047" w:author="А.А. Шевцов" w:date="2026-10-17T12:00:00Z">
+      <w:del w:id="1053" w:author="А.А. Шевцов" w:date="2026-10-17T12:00:00Z">
         <w:r>
           <w:rPr>
             <w:rFonts w:ascii="Times New Roman" w:hAnsi="Times New Roman"/>
@@ -3765,7 +3765,7 @@
           <w:delText xml:space="preserve">development</w:delText>
         </w:r>
       </w:del>
-      <w:ins w:id="1048" w:author="А.А. Шевцов" w:date="2026-10-17T12:00:00Z">
+      <w:ins w:id="1054" w:author="А.А. Шевцов" w:date="2026-10-17T12:00:00Z">
         <w:r>
           <w:rPr>
             <w:rFonts w:ascii="Times New Roman" w:hAnsi="Times New Roman"/>
@@ -3783,7 +3783,7 @@
         </w:rPr>
         <w:t xml:space="preserve"> activity is shifting to the area of the cheapest land. A comparison of the current valuation (2025) of plots depending on the time of their development reveals a steady downward trend: the average specific </w:t>
       </w:r>
-      <w:del w:id="1049" w:author="А.А. Шевцов" w:date="2026-10-17T12:00:00Z">
+      <w:del w:id="1055" w:author="А.А. Шевцов" w:date="2026-10-17T12:00:00Z">
         <w:r>
           <w:rPr>
             <w:rFonts w:ascii="Times New Roman" w:hAnsi="Times New Roman"/>
@@ -3793,7 +3793,7 @@
           <w:delText xml:space="preserve">value</w:delText>
         </w:r>
       </w:del>
-      <w:ins w:id="1050" w:author="А.А. Шевцов" w:date="2026-10-17T12:00:00Z">
+      <w:ins w:id="1056" w:author="А.А. Шевцов" w:date="2026-10-17T12:00:00Z">
         <w:r>
           <w:rPr>
             <w:rFonts w:ascii="Times New Roman" w:hAnsi="Times New Roman"/>
@@ -3851,7 +3851,7 @@
         </w:rPr>
         <w:t xml:space="preserve">Low-rise developments were formed primarily in areas that, as of 2025, retain their minimum cadastral value. Although such objects appeared in almost all sectors of the suburban area, their greatest concentration was recorded in the northern and eastern directions. The current price level (an average of 495 rubles/m²) suggests that it was the </w:t>
       </w:r>
-      <w:del w:id="1053" w:author="А.А. Шевцов" w:date="2026-10-17T12:00:00Z">
+      <w:del w:id="1059" w:author="А.А. Шевцов" w:date="2026-10-17T12:00:00Z">
         <w:r>
           <w:rPr>
             <w:rFonts w:ascii="Times New Roman" w:hAnsi="Times New Roman"/>
@@ -3861,7 +3861,7 @@
           <w:delText xml:space="preserve">availability</w:delText>
         </w:r>
       </w:del>
-      <w:ins w:id="1054" w:author="А.А. Шевцов" w:date="2026-10-17T12:00:00Z">
+      <w:ins w:id="1060" w:author="А.А. Шевцов" w:date="2026-10-17T12:00:00Z">
         <w:r>
           <w:rPr>
             <w:rFonts w:ascii="Times New Roman" w:hAnsi="Times New Roman"/>
@@ -3927,7 +3927,7 @@
         </w:rPr>
         <w:t xml:space="preserve">In contrast to the low-rise sector, </w:t>
       </w:r>
-      <w:del w:id="1055" w:author="А.А. Шевцов" w:date="2026-10-17T12:00:00Z">
+      <w:del w:id="1061" w:author="А.А. Шевцов" w:date="2026-10-17T12:00:00Z">
         <w:r>
           <w:rPr>
             <w:rFonts w:ascii="Times New Roman" w:hAnsi="Times New Roman"/>
@@ -3937,7 +3937,7 @@
           <w:delText xml:space="preserve">high-rise</w:delText>
         </w:r>
       </w:del>
-      <w:ins w:id="1056" w:author="А.А. Шевцов" w:date="2026-10-17T12:00:00Z">
+      <w:ins w:id="1062" w:author="А.А. Шевцов" w:date="2026-10-17T12:00:00Z">
         <w:r>
           <w:rPr>
             <w:rFonts w:ascii="Times New Roman" w:hAnsi="Times New Roman"/>
@@ -3955,7 +3955,7 @@
         </w:rPr>
         <w:t xml:space="preserve"> residential development exhibits a high degree of spatial concentration, localizing primarily on the outskirts of Voronezh and the largest suburban settlements. The high cost of such land </w:t>
       </w:r>
-      <w:del w:id="1057" w:author="А.А. Шевцов" w:date="2026-10-17T12:00:00Z">
+      <w:del w:id="1063" w:author="А.А. Шевцов" w:date="2026-10-17T12:00:00Z">
         <w:r>
           <w:rPr>
             <w:rFonts w:ascii="Times New Roman" w:hAnsi="Times New Roman"/>
@@ -3965,7 +3965,7 @@
           <w:delText xml:space="preserve">(RUB 1,638/m²)</w:delText>
         </w:r>
       </w:del>
-      <w:ins w:id="1058" w:author="А.А. Шевцов" w:date="2026-10-17T12:00:00Z">
+      <w:ins w:id="1064" w:author="А.А. Шевцов" w:date="2026-10-17T12:00:00Z">
         <w:r>
           <w:rPr>
             <w:rFonts w:ascii="Times New Roman" w:hAnsi="Times New Roman"/>
@@ -4016,7 +4016,7 @@
         </w:rPr>
         <w:t xml:space="preserve"> – large suburban shopping centers and hypermarkets located on main highways at the entrance to the city. Of the 80.9 hectares of commercial hub territories, 53.9 hectares appeared in the period 2000–2010, 25 hectares in the following decade, and only 2 hectares since 2020. Thus, between 2000 and 2020, a “belt of suburban shopping centers” was formed, closing the exits from Voronezh. The emergence of this framework provided suburban residents with access to modern services and reduced their </w:t>
       </w:r>
-      <w:del w:id="1059" w:author="А.А. Шевцов" w:date="2026-10-17T12:00:00Z">
+      <w:del w:id="1065" w:author="А.А. Шевцов" w:date="2026-10-17T12:00:00Z">
         <w:r>
           <w:rPr>
             <w:rFonts w:ascii="Times New Roman" w:hAnsi="Times New Roman"/>
@@ -4025,7 +4025,7 @@
           <w:delText xml:space="preserve">daily</w:delText>
         </w:r>
       </w:del>
-      <w:ins w:id="1060" w:author="А.А. Шевцов" w:date="2026-10-17T12:00:00Z">
+      <w:ins w:id="1066" w:author="А.А. Шевцов" w:date="2026-10-17T12:00:00Z">
         <w:r>
           <w:rPr>
             <w:rFonts w:ascii="Times New Roman" w:hAnsi="Times New Roman"/>
@@ -4041,7 +4041,7 @@
         </w:rPr>
         <w:t xml:space="preserve"> dependence on the </w:t>
       </w:r>
-      <w:del w:id="1190" w:author="А.А. Шевцов" w:date="2026-10-17T12:00:00Z">
+      <w:del w:id="1196" w:author="А.А. Шевцов" w:date="2026-10-17T12:00:00Z">
         <w:r>
           <w:rPr>
             <w:rFonts w:ascii="Times New Roman" w:hAnsi="Times New Roman"/>
@@ -4050,7 +4050,7 @@
           <w:delText xml:space="preserve">"</w:delText>
         </w:r>
       </w:del>
-      <w:ins w:id="1191" w:author="А.А. Шевцов" w:date="2026-10-17T12:00:00Z">
+      <w:ins w:id="1197" w:author="А.А. Шевцов" w:date="2026-10-17T12:00:00Z">
         <w:r>
           <w:rPr>
             <w:rFonts w:ascii="Times New Roman" w:hAnsi="Times New Roman"/>
@@ -4066,7 +4066,7 @@
         </w:rPr>
         <w:t xml:space="preserve">physical city.</w:t>
       </w:r>
-      <w:del w:id="1188" w:author="А.А. Шевцов" w:date="2026-10-17T12:00:00Z">
+      <w:del w:id="1194" w:author="А.А. Шевцов" w:date="2026-10-17T12:00:00Z">
         <w:r>
           <w:rPr>
             <w:rFonts w:ascii="Times New Roman" w:hAnsi="Times New Roman"/>
@@ -4075,7 +4075,7 @@
           <w:delText xml:space="preserve">"</w:delText>
         </w:r>
       </w:del>
-      <w:ins w:id="1189" w:author="А.А. Шевцов" w:date="2026-10-17T12:00:00Z">
+      <w:ins w:id="1195" w:author="А.А. Шевцов" w:date="2026-10-17T12:00:00Z">
         <w:r>
           <w:rPr>
             <w:rFonts w:ascii="Times New Roman" w:hAnsi="Times New Roman"/>
@@ -4120,7 +4120,7 @@
         <w:lastRenderedPageBreak/>
         <w:t xml:space="preserve">total area of new industrial zones amounted to 977 hectares, with more than half of this volume (566.7 hectares) formed between 2010 and 2020. The largest increase during this decade was recorded in the eastern and northern sectors, as well as on the southeastern periphery. Unlike residential development, this process was supported by the creation of specialized infrastructure sites (in particular, the Maslovsky Industrial Park and the </w:t>
       </w:r>
-      <w:del w:id="1061" w:author="А.А. Шевцов" w:date="2026-10-17T12:00:00Z">
+      <w:del w:id="1067" w:author="А.А. Шевцов" w:date="2026-10-17T12:00:00Z">
         <w:r>
           <w:rPr>
             <w:rFonts w:ascii="Times New Roman" w:hAnsi="Times New Roman"/>
@@ -4130,7 +4130,7 @@
           <w:delText xml:space="preserve">Center Special Economic Zone for Industrial Production</w:delText>
         </w:r>
       </w:del>
-      <w:ins w:id="1062" w:author="А.А. Шевцов" w:date="2026-10-17T12:00:00Z">
+      <w:ins w:id="1068" w:author="А.А. Шевцов" w:date="2026-10-17T12:00:00Z">
         <w:r>
           <w:rPr>
             <w:rFonts w:ascii="Times New Roman" w:hAnsi="Times New Roman"/>
@@ -4245,7 +4245,7 @@
           <w:sz w:val="24"/>
         </w:rPr>
       </w:pPr>
-      <w:del w:id="1063" w:author="А.А. Шевцов" w:date="2026-10-17T12:00:00Z">
+      <w:del w:id="1069" w:author="А.А. Шевцов" w:date="2026-10-17T12:00:00Z">
         <w:r>
           <w:rPr>
             <w:rFonts w:ascii="Times New Roman" w:hAnsi="Times New Roman"/>
@@ -4256,7 +4256,7 @@
           <w:delText xml:space="preserve">First</w:delText>
         </w:r>
       </w:del>
-      <w:ins w:id="1064" w:author="А.А. Шевцов" w:date="2026-10-17T12:00:00Z">
+      <w:ins w:id="1070" w:author="А.А. Шевцов" w:date="2026-10-17T12:00:00Z">
         <w:r>
           <w:rPr>
             <w:rFonts w:ascii="Times New Roman" w:hAnsi="Times New Roman"/>
@@ -4308,7 +4308,7 @@
         </w:rPr>
         <w:t xml:space="preserve"> from the center being approximately 16 km. At the same time, the area of the </w:t>
       </w:r>
-      <w:del w:id="1030" w:author="А.А. Шевцов" w:date="2026-10-17T12:00:00Z">
+      <w:del w:id="1036" w:author="А.А. Шевцов" w:date="2026-10-17T12:00:00Z">
         <w:r>
           <w:rPr>
             <w:rFonts w:ascii="Times New Roman" w:hAnsi="Times New Roman"/>
@@ -4317,7 +4317,7 @@
           <w:delText xml:space="preserve">near</w:delText>
         </w:r>
       </w:del>
-      <w:ins w:id="1031" w:author="А.А. Шевцов" w:date="2026-10-17T12:00:00Z">
+      <w:ins w:id="1037" w:author="А.А. Шевцов" w:date="2026-10-17T12:00:00Z">
         <w:r>
           <w:rPr>
             <w:rFonts w:ascii="Times New Roman" w:hAnsi="Times New Roman"/>
@@ -4333,7 +4333,7 @@
         </w:rPr>
         <w:t xml:space="preserve"> suburbs was transformed primarily due to the chaotic spread of low-rise buildings (dacha communities and gardening non-profit partnerships). The share of new industrial areas in the structure of territorial growth at this stage was only 2% (119 hectares), and no new areas for commercial use were recorded. This is connected both with the crisis phenomena in the Russian economy in the </w:t>
       </w:r>
-      <w:del w:id="1065" w:author="А.А. Шевцов" w:date="2026-10-17T12:00:00Z">
+      <w:del w:id="1071" w:author="А.А. Шевцов" w:date="2026-10-17T12:00:00Z">
         <w:r>
           <w:rPr>
             <w:rFonts w:ascii="Times New Roman" w:hAnsi="Times New Roman"/>
@@ -4342,7 +4342,7 @@
           <w:delText xml:space="preserve">nineties</w:delText>
         </w:r>
       </w:del>
-      <w:ins w:id="1066" w:author="А.А. Шевцов" w:date="2026-10-17T12:00:00Z">
+      <w:ins w:id="1072" w:author="А.А. Шевцов" w:date="2026-10-17T12:00:00Z">
         <w:r>
           <w:rPr>
             <w:rFonts w:ascii="Times New Roman" w:hAnsi="Times New Roman"/>
@@ -4371,7 +4371,7 @@
           <w:highlight w:val="red"/>
         </w:rPr>
       </w:pPr>
-      <w:del w:id="1067" w:author="А.А. Шевцов" w:date="2026-10-17T12:00:00Z">
+      <w:del w:id="1073" w:author="А.А. Шевцов" w:date="2026-10-17T12:00:00Z">
         <w:r>
           <w:rPr>
             <w:rFonts w:ascii="Times New Roman" w:hAnsi="Times New Roman"/>
@@ -4383,7 +4383,7 @@
           <w:delText xml:space="preserve">Second</w:delText>
         </w:r>
       </w:del>
-      <w:ins w:id="1068" w:author="А.А. Шевцов" w:date="2026-10-17T12:00:00Z">
+      <w:ins w:id="1074" w:author="А.А. Шевцов" w:date="2026-10-17T12:00:00Z">
         <w:r>
           <w:rPr>
             <w:rFonts w:ascii="Times New Roman" w:hAnsi="Times New Roman"/>
@@ -4445,7 +4445,7 @@
           <w:sz w:val="24"/>
         </w:rPr>
       </w:pPr>
-      <w:del w:id="1069" w:author="А.А. Шевцов" w:date="2026-10-17T12:00:00Z">
+      <w:del w:id="1075" w:author="А.А. Шевцов" w:date="2026-10-17T12:00:00Z">
         <w:r>
           <w:rPr>
             <w:rFonts w:ascii="Times New Roman" w:hAnsi="Times New Roman"/>
@@ -4457,7 +4457,7 @@
           <w:delText xml:space="preserve">Third</w:delText>
         </w:r>
       </w:del>
-      <w:ins w:id="1070" w:author="А.А. Шевцов" w:date="2026-10-17T12:00:00Z">
+      <w:ins w:id="1076" w:author="А.А. Шевцов" w:date="2026-10-17T12:00:00Z">
         <w:r>
           <w:rPr>
             <w:rFonts w:ascii="Times New Roman" w:hAnsi="Times New Roman"/>
@@ -4487,7 +4487,7 @@
         </w:rPr>
         <w:t xml:space="preserve"> became a phase of “explosive expansion” (720 ha/year). Its beginning was marked by the administrative reform of 2011, as a result of which 22 settlements were included in Voronezh. Despite the fact that the bulk of new territorial reserves was concentrated in the southern sector (the Shilovo, Maslovka, and Nikolskoye microdistricts), </w:t>
       </w:r>
-      <w:del w:id="1071" w:author="А.А. Шевцов" w:date="2026-10-17T12:00:00Z">
+      <w:del w:id="1077" w:author="А.А. Шевцов" w:date="2026-10-17T12:00:00Z">
         <w:r>
           <w:rPr>
             <w:rFonts w:ascii="Times New Roman" w:hAnsi="Times New Roman"/>
@@ -4497,7 +4497,7 @@
           <w:delText xml:space="preserve">real development</w:delText>
         </w:r>
       </w:del>
-      <w:ins w:id="1072" w:author="А.А. Шевцов" w:date="2026-10-17T12:00:00Z">
+      <w:ins w:id="1078" w:author="А.А. Шевцов" w:date="2026-10-17T12:00:00Z">
         <w:r>
           <w:rPr>
             <w:rFonts w:ascii="Times New Roman" w:hAnsi="Times New Roman"/>
@@ -4515,7 +4515,7 @@
         </w:rPr>
         <w:t xml:space="preserve"> activity consolidated the northern and eastern development vectors in the area of Voronezh's </w:t>
       </w:r>
-      <w:del w:id="1032" w:author="А.А. Шевцов" w:date="2026-10-17T12:00:00Z">
+      <w:del w:id="1038" w:author="А.А. Шевцов" w:date="2026-10-17T12:00:00Z">
         <w:r>
           <w:rPr>
             <w:rFonts w:ascii="Times New Roman" w:hAnsi="Times New Roman"/>
@@ -4525,7 +4525,7 @@
           <w:delText xml:space="preserve">near</w:delText>
         </w:r>
       </w:del>
-      <w:ins w:id="1033" w:author="А.А. Шевцов" w:date="2026-10-17T12:00:00Z">
+      <w:ins w:id="1039" w:author="А.А. Шевцов" w:date="2026-10-17T12:00:00Z">
         <w:r>
           <w:rPr>
             <w:rFonts w:ascii="Times New Roman" w:hAnsi="Times New Roman"/>
@@ -4572,7 +4572,7 @@
         <w:lastRenderedPageBreak/>
         <w:t xml:space="preserve">2025, the average specific </w:t>
       </w:r>
-      <w:del w:id="1051" w:author="А.А. Шевцов" w:date="2026-10-17T12:00:00Z">
+      <w:del w:id="1057" w:author="А.А. Шевцов" w:date="2026-10-17T12:00:00Z">
         <w:r>
           <w:rPr>
             <w:rFonts w:ascii="Times New Roman" w:hAnsi="Times New Roman"/>
@@ -4582,7 +4582,7 @@
           <w:delText xml:space="preserve">value</w:delText>
         </w:r>
       </w:del>
-      <w:ins w:id="1052" w:author="А.А. Шевцов" w:date="2026-10-17T12:00:00Z">
+      <w:ins w:id="1058" w:author="А.А. Шевцов" w:date="2026-10-17T12:00:00Z">
         <w:r>
           <w:rPr>
             <w:rFonts w:ascii="Times New Roman" w:hAnsi="Times New Roman"/>
@@ -4631,7 +4631,7 @@
           <w:sz w:val="24"/>
         </w:rPr>
       </w:pPr>
-      <w:del w:id="1073" w:author="А.А. Шевцов" w:date="2026-10-17T12:00:00Z">
+      <w:del w:id="1079" w:author="А.А. Шевцов" w:date="2026-10-17T12:00:00Z">
         <w:r>
           <w:rPr>
             <w:rFonts w:ascii="Times New Roman" w:hAnsi="Times New Roman"/>
@@ -4642,7 +4642,7 @@
           <w:delText xml:space="preserve">Fourth stage (2020–2025)</w:delText>
         </w:r>
       </w:del>
-      <w:ins w:id="1074" w:author="А.А. Шевцов" w:date="2026-10-17T12:00:00Z">
+      <w:ins w:id="1080" w:author="А.А. Шевцов" w:date="2026-10-17T12:00:00Z">
         <w:r>
           <w:rPr>
             <w:rFonts w:ascii="Times New Roman" w:hAnsi="Times New Roman"/>
@@ -4678,7 +4678,7 @@
         </w:rPr>
         <w:t xml:space="preserve">The functional structure of the new development retains the absolute dominance of housing: in total, more than 2,280 hectares are allocated to </w:t>
       </w:r>
-      <w:del w:id="1075" w:author="А.А. Шевцов" w:date="2026-10-17T12:00:00Z">
+      <w:del w:id="1081" w:author="А.А. Шевцов" w:date="2026-10-17T12:00:00Z">
         <w:r>
           <w:rPr>
             <w:rFonts w:ascii="Times New Roman" w:hAnsi="Times New Roman"/>
@@ -4687,7 +4687,7 @@
           <w:delText xml:space="preserve">high-rise</w:delText>
         </w:r>
       </w:del>
-      <w:ins w:id="1076" w:author="А.А. Шевцов" w:date="2026-10-17T12:00:00Z">
+      <w:ins w:id="1082" w:author="А.А. Шевцов" w:date="2026-10-17T12:00:00Z">
         <w:r>
           <w:rPr>
             <w:rFonts w:ascii="Times New Roman" w:hAnsi="Times New Roman"/>
@@ -4721,7 +4721,7 @@
         </w:rPr>
         <w:t xml:space="preserve">The spatial transformation of Voronezh and its immediate surroundings in the post-Soviet period resulted in a large-scale increase in built-up areas, creating a morphologically sparse and functionally disjointed suburban environment. A characteristic feature of this process is the </w:t>
       </w:r>
-      <w:del w:id="1077" w:author="А.А. Шевцов" w:date="2026-10-17T12:00:00Z">
+      <w:del w:id="1083" w:author="А.А. Шевцов" w:date="2026-10-17T12:00:00Z">
         <w:r>
           <w:rPr>
             <w:rFonts w:ascii="Times New Roman" w:hAnsi="Times New Roman"/>
@@ -4730,7 +4730,7 @@
           <w:delText xml:space="preserve">focal</w:delText>
         </w:r>
       </w:del>
-      <w:ins w:id="1078" w:author="А.А. Шевцов" w:date="2026-10-17T12:00:00Z">
+      <w:ins w:id="1084" w:author="А.А. Шевцов" w:date="2026-10-17T12:00:00Z">
         <w:r>
           <w:rPr>
             <w:rFonts w:ascii="Times New Roman" w:hAnsi="Times New Roman"/>
@@ -4746,7 +4746,7 @@
         </w:rPr>
         <w:t xml:space="preserve"> nature of territorial development: new residential areas, large-scale retail and industrial sites are developing as isolated planning units, without forming a coherent urban fabric. The pronounced asymmetry in favor of the northern and eastern sectors (58% </w:t>
       </w:r>
-      <w:ins w:id="1079" w:author="А.А. Шевцов" w:date="2026-10-17T12:00:00Z">
+      <w:ins w:id="1085" w:author="А.А. Шевцов" w:date="2026-10-17T12:00:00Z">
         <w:r>
           <w:rPr>
             <w:rFonts w:ascii="Times New Roman" w:hAnsi="Times New Roman"/>
@@ -4795,7 +4795,7 @@
         </w:rPr>
         <w:t xml:space="preserve">This strategy fits perfectly into the logic of classical rent models, but with important adjustments for modern conditions. Developers maximize profits by developing suburban areas where land has a minimum cadastral value. However, in the case of Voronezh, a qualitative transformation of the traditional factor of remoteness is observed. Thus, if in classical models the increase in transport costs with distance from the center acts as a </w:t>
       </w:r>
-      <w:del w:id="1080" w:author="А.А. Шевцов" w:date="2026-10-17T12:00:00Z">
+      <w:del w:id="1086" w:author="А.А. Шевцов" w:date="2026-10-17T12:00:00Z">
         <w:r>
           <w:rPr>
             <w:rFonts w:ascii="Times New Roman" w:hAnsi="Times New Roman"/>
@@ -4804,7 +4804,7 @@
           <w:delText xml:space="preserve">severe limitation</w:delText>
         </w:r>
       </w:del>
-      <w:ins w:id="1081" w:author="А.А. Шевцов" w:date="2026-10-17T12:00:00Z">
+      <w:ins w:id="1087" w:author="А.А. Шевцов" w:date="2026-10-17T12:00:00Z">
         <w:r>
           <w:rPr>
             <w:rFonts w:ascii="Times New Roman" w:hAnsi="Times New Roman"/>
@@ -4880,7 +4880,7 @@
         </w:rPr>
         <w:t xml:space="preserve">The combination of extensive expansion of boundaries with a sharp decrease in the functional density of the environment confirms the implementation of the </w:t>
       </w:r>
-      <w:del w:id="1082" w:author="А.А. Шевцов" w:date="2026-10-17T12:00:00Z">
+      <w:del w:id="1088" w:author="А.А. Шевцов" w:date="2026-10-17T12:00:00Z">
         <w:r>
           <w:rPr>
             <w:rFonts w:ascii="Times New Roman" w:hAnsi="Times New Roman"/>
@@ -4889,7 +4889,7 @@
           <w:delText xml:space="preserve">“growth”</w:delText>
         </w:r>
       </w:del>
-      <w:ins w:id="1083" w:author="А.А. Шевцов" w:date="2026-10-17T12:00:00Z">
+      <w:ins w:id="1089" w:author="А.А. Шевцов" w:date="2026-10-17T12:00:00Z">
         <w:r>
           <w:rPr>
             <w:rFonts w:ascii="Times New Roman" w:hAnsi="Times New Roman"/>
@@ -4956,7 +4956,7 @@
         </w:rPr>
         <w:t xml:space="preserve">1. The spatial evolution of Voronezh and its suburban area in the period 1992–2025 was expressed in a large-scale increase in built-up areas. This process is characterized by the predominant development of discrete, spatially isolated areas, which has led to significant fragmentation of the morphological structure of the suburbs. The observed dynamics of physical expansion of borders allows us to interpret this process as the implementation of the </w:t>
       </w:r>
-      <w:del w:id="1084" w:author="А.А. Шевцов" w:date="2026-10-17T12:00:00Z">
+      <w:del w:id="1090" w:author="А.А. Шевцов" w:date="2026-10-17T12:00:00Z">
         <w:r>
           <w:rPr>
             <w:rFonts w:ascii="Times New Roman" w:hAnsi="Times New Roman"/>
@@ -4966,7 +4966,7 @@
           <w:delText xml:space="preserve">“growth”</w:delText>
         </w:r>
       </w:del>
-      <w:ins w:id="1085" w:author="А.А. Шевцов" w:date="2026-10-17T12:00:00Z">
+      <w:ins w:id="1091" w:author="А.А. Шевцов" w:date="2026-10-17T12:00:00Z">
         <w:r>
           <w:rPr>
             <w:rFonts w:ascii="Times New Roman" w:hAnsi="Times New Roman"/>
@@ -5004,7 +5004,7 @@
         </w:rPr>
         <w:t xml:space="preserve">2. The dynamics of development of built-up areas in the suburban zone has a pronounced non-linear nature of space development. In the post-Soviet evolution of development, four stages are distinguished, each of which is characterized by a change in the pace and logic of area growth. The transition from the stage of spontaneous development (1992–2000) to the phase of formation of a belt of suburban shopping centers (2000–2010) marked a qualitative shift: the emergence of new infrastructure support at the main entrances to the city. The subsequent phase of “explosive expansion” (2010–2020) was a period of maximum physical expansion of built-up areas, exhausting the potential of the most accessible sites. The current stage (2020–2025) indicates a transition to morphological consolidation of territories. This process is conditioned by the completion of the formation of the functional framework of suburban retail and a change in the structure of development mechanisms: the growth in the share of suburban </w:t>
       </w:r>
-      <w:del w:id="1086" w:author="А.А. Шевцов" w:date="2026-10-17T12:00:00Z">
+      <w:del w:id="1092" w:author="А.А. Шевцов" w:date="2026-10-17T12:00:00Z">
         <w:r>
           <w:rPr>
             <w:rFonts w:ascii="Times New Roman" w:hAnsi="Times New Roman"/>
@@ -5014,7 +5014,7 @@
           <w:delText xml:space="preserve">growth over</w:delText>
         </w:r>
       </w:del>
-      <w:ins w:id="1087" w:author="А.А. Шевцов" w:date="2026-10-17T12:00:00Z">
+      <w:ins w:id="1093" w:author="А.А. Шевцов" w:date="2026-10-17T12:00:00Z">
         <w:r>
           <w:rPr>
             <w:rFonts w:ascii="Times New Roman" w:hAnsi="Times New Roman"/>
@@ -5101,7 +5101,7 @@
         <w:lastRenderedPageBreak/>
         <w:t xml:space="preserve">4. An important economic incentive for the transformation of suburban areas is the mechanism for maximizing land rent. The recorded 5-fold gap between the cadastral value of land plots within the boundaries of continuous development and in areas of new development (as of 2025) confirms the priority of the land price factor when choosing expansion directions. Under these conditions, a deformation of the classical </w:t>
       </w:r>
-      <w:del w:id="1088" w:author="А.А. Шевцов" w:date="2026-10-17T12:00:00Z">
+      <w:del w:id="1094" w:author="А.А. Шевцов" w:date="2026-10-17T12:00:00Z">
         <w:r>
           <w:rPr>
             <w:rFonts w:ascii="Times New Roman" w:hAnsi="Times New Roman"/>
@@ -5111,7 +5111,7 @@
           <w:delText xml:space="preserve">U. model is observed. Alonso: The</w:delText>
         </w:r>
       </w:del>
-      <w:ins w:id="1089" w:author="А.А. Шевцов" w:date="2026-10-17T12:00:00Z">
+      <w:ins w:id="1095" w:author="А.А. Шевцов" w:date="2026-10-17T12:00:00Z">
         <w:r>
           <w:rPr>
             <w:rFonts w:ascii="Times New Roman" w:hAnsi="Times New Roman"/>
@@ -5129,7 +5129,7 @@
         </w:rPr>
         <w:t xml:space="preserve"> factor of transport distance is no longer a </w:t>
       </w:r>
-      <w:del w:id="1092" w:author="А.А. Шевцов" w:date="2026-10-17T12:00:00Z">
+      <w:del w:id="1098" w:author="А.А. Шевцов" w:date="2026-10-17T12:00:00Z">
         <w:r>
           <w:rPr>
             <w:rFonts w:ascii="Times New Roman" w:hAnsi="Times New Roman"/>
@@ -5139,7 +5139,7 @@
           <w:delText xml:space="preserve">strict limitation</w:delText>
         </w:r>
       </w:del>
-      <w:ins w:id="1093" w:author="А.А. Шевцов" w:date="2026-10-17T12:00:00Z">
+      <w:ins w:id="1099" w:author="А.А. Шевцов" w:date="2026-10-17T12:00:00Z">
         <w:r>
           <w:rPr>
             <w:rFonts w:ascii="Times New Roman" w:hAnsi="Times New Roman"/>
@@ -5157,7 +5157,7 @@
         </w:rPr>
         <w:t xml:space="preserve">. This is confirmed by the increase in the average distance of new </w:t>
       </w:r>
-      <w:del w:id="1090" w:author="А.А. Шевцов" w:date="2026-10-17T12:00:00Z">
+      <w:del w:id="1096" w:author="А.А. Шевцов" w:date="2026-10-17T12:00:00Z">
         <w:r>
           <w:rPr>
             <w:rFonts w:ascii="Times New Roman" w:hAnsi="Times New Roman"/>
@@ -5167,7 +5167,7 @@
           <w:delText xml:space="preserve">properties</w:delText>
         </w:r>
       </w:del>
-      <w:ins w:id="1091" w:author="А.А. Шевцов" w:date="2026-10-17T12:00:00Z">
+      <w:ins w:id="1097" w:author="А.А. Шевцов" w:date="2026-10-17T12:00:00Z">
         <w:r>
           <w:rPr>
             <w:rFonts w:ascii="Times New Roman" w:hAnsi="Times New Roman"/>
@@ -5324,7 +5324,7 @@
         </w:rPr>
         <w:t xml:space="preserve">Characteristics of spatial-genetic types (mechanisms) of territorial growth, </w:t>
       </w:r>
-      <w:del w:id="1094" w:author="А.А. Шевцов" w:date="2026-10-17T12:00:00Z">
+      <w:del w:id="1100" w:author="А.А. Шевцов" w:date="2026-10-17T12:00:00Z">
         <w:r>
           <w:rPr>
             <w:rFonts w:ascii="Times New Roman" w:hAnsi="Times New Roman"/>
@@ -5334,7 +5334,7 @@
           <w:delText xml:space="preserve">1992-2025</w:delText>
         </w:r>
       </w:del>
-      <w:ins w:id="1095" w:author="А.А. Шевцов" w:date="2026-10-17T12:00:00Z">
+      <w:ins w:id="1101" w:author="А.А. Шевцов" w:date="2026-10-17T12:00:00Z">
         <w:r>
           <w:rPr>
             <w:rFonts w:ascii="Times New Roman" w:hAnsi="Times New Roman"/>
@@ -5455,7 +5455,7 @@
                 <w:sz w:val="24"/>
               </w:rPr>
             </w:pPr>
-            <w:del w:id="1096" w:author="А.А. Шевцов" w:date="2026-10-17T12:00:00Z">
+            <w:del w:id="1102" w:author="А.А. Шевцов" w:date="2026-10-17T12:00:00Z">
               <w:r>
                 <w:rPr>
                   <w:rFonts w:ascii="Times New Roman" w:hAnsi="Times New Roman"/>
@@ -5463,7 +5463,7 @@
                 <w:delText xml:space="preserve">Regional</w:delText>
               </w:r>
             </w:del>
-            <w:ins w:id="1097" w:author="А.А. Шевцов" w:date="2026-10-17T12:00:00Z">
+            <w:ins w:id="1103" w:author="А.А. Шевцов" w:date="2026-10-17T12:00:00Z">
               <w:r>
                 <w:rPr>
                   <w:rFonts w:ascii="Times New Roman" w:hAnsi="Times New Roman"/>
@@ -5691,95 +5691,58 @@
         </w:rPr>
         <w:t xml:space="preserve"> the </w:t>
       </w:r>
-      <w:del w:id="1106" w:author="А.А. Шевцов" w:date="2026-10-17T12:00:00Z">
+      <w:del w:id="1112" w:author="А.А. Шевцов" w:date="2026-10-17T12:00:00Z">
         <w:r>
           <w:rPr>
             <w:rFonts w:ascii="Times New Roman" w:hAnsi="Times New Roman"/>
             <w:bCs/>
           </w:rPr>
           <w:delText xml:space="preserve">author's calculations based on:</w:delText>
-        </w:r>
-      </w:del>
-      <w:ins w:id="1107" w:author="А.А. Шевцов" w:date="2026-10-17T12:00:00Z">
-        <w:r>
-          <w:rPr>
-            <w:rFonts w:ascii="Times New Roman" w:hAnsi="Times New Roman"/>
-            <w:bCs/>
-          </w:rPr>
-          <w:t xml:space="preserve">author based on own calculations using:</w:t>
-        </w:r>
-      </w:ins>
-      <w:r>
-        <w:rPr>
-          <w:rFonts w:ascii="Times New Roman" w:hAnsi="Times New Roman"/>
-          <w:bCs/>
-        </w:rPr>
-        <w:t xml:space="preserve"> </w:t>
-      </w:r>
-      <w:r>
-        <w:rPr>
-          <w:rFonts w:ascii="Times New Roman" w:hAnsi="Times New Roman"/>
-        </w:rPr>
-        <w:t>Unified State Register of Real Estate (Rosreestr) (</w:t>
-      </w:r>
-      <w:hyperlink r:id="rId9" w:history="1">
-        <w:r>
-          <w:rPr>
-            <w:rStyle w:val="af6"/>
-            <w:rFonts w:ascii="Times New Roman" w:hAnsi="Times New Roman"/>
-          </w:rPr>
-          <w:t>https://nspd.gov.ru</w:t>
-        </w:r>
-      </w:hyperlink>
-      <w:r>
-        <w:rPr>
-          <w:rFonts w:ascii="Times New Roman" w:hAnsi="Times New Roman"/>
-        </w:rPr>
-        <w:t xml:space="preserve">; date of access: </w:t>
-      </w:r>
-      <w:del w:id="1112" w:author="А.А. Шевцов" w:date="2026-10-17T12:00:00Z">
-        <w:r>
-          <w:rPr>
-            <w:rFonts w:ascii="Times New Roman" w:hAnsi="Times New Roman"/>
-          </w:rPr>
-          <w:delText xml:space="preserve">03/02/2026</w:delText>
         </w:r>
       </w:del>
       <w:ins w:id="1113" w:author="А.А. Шевцов" w:date="2026-10-17T12:00:00Z">
         <w:r>
           <w:rPr>
             <w:rFonts w:ascii="Times New Roman" w:hAnsi="Times New Roman"/>
-          </w:rPr>
-          <w:t xml:space="preserve">02.03.2026</w:t>
+            <w:bCs/>
+          </w:rPr>
+          <w:t xml:space="preserve">author based on own calculations using:</w:t>
         </w:r>
       </w:ins>
       <w:r>
         <w:rPr>
           <w:rFonts w:ascii="Times New Roman" w:hAnsi="Times New Roman"/>
-        </w:rPr>
-        <w:t xml:space="preserve">), project “How old is this house” (</w:t>
-      </w:r>
-      <w:hyperlink r:id="rId10" w:history="1">
+          <w:bCs/>
+        </w:rPr>
+        <w:t xml:space="preserve"> </w:t>
+      </w:r>
+      <w:r>
+        <w:rPr>
+          <w:rFonts w:ascii="Times New Roman" w:hAnsi="Times New Roman"/>
+        </w:rPr>
+        <w:t>Unified State Register of Real Estate (Rosreestr) (</w:t>
+      </w:r>
+      <w:hyperlink r:id="rId9" w:history="1">
         <w:r>
           <w:rPr>
             <w:rStyle w:val="af6"/>
             <w:rFonts w:ascii="Times New Roman" w:hAnsi="Times New Roman"/>
           </w:rPr>
-          <w:t>https://kontikimaps.ru/hoith</w:t>
+          <w:t>https://nspd.gov.ru</w:t>
         </w:r>
       </w:hyperlink>
       <w:r>
         <w:rPr>
           <w:rFonts w:ascii="Times New Roman" w:hAnsi="Times New Roman"/>
         </w:rPr>
-        <w:t xml:space="preserve">; date of access: 02.03.2026), OpenStreetMap project (https://www.openstreetmap.org; </w:t>
+        <w:t xml:space="preserve">; date of access: </w:t>
       </w:r>
       <w:del w:id="1118" w:author="А.А. Шевцов" w:date="2026-10-17T12:00:00Z">
         <w:r>
           <w:rPr>
             <w:rFonts w:ascii="Times New Roman" w:hAnsi="Times New Roman"/>
           </w:rPr>
-          <w:delText xml:space="preserve">access date:</w:delText>
+          <w:delText xml:space="preserve">03/02/2026</w:delText>
         </w:r>
       </w:del>
       <w:ins w:id="1119" w:author="А.А. Шевцов" w:date="2026-10-17T12:00:00Z">
@@ -5787,6 +5750,43 @@
           <w:rPr>
             <w:rFonts w:ascii="Times New Roman" w:hAnsi="Times New Roman"/>
           </w:rPr>
+          <w:t xml:space="preserve">02.03.2026</w:t>
+        </w:r>
+      </w:ins>
+      <w:r>
+        <w:rPr>
+          <w:rFonts w:ascii="Times New Roman" w:hAnsi="Times New Roman"/>
+        </w:rPr>
+        <w:t xml:space="preserve">), project “How old is this house” (</w:t>
+      </w:r>
+      <w:hyperlink r:id="rId10" w:history="1">
+        <w:r>
+          <w:rPr>
+            <w:rStyle w:val="af6"/>
+            <w:rFonts w:ascii="Times New Roman" w:hAnsi="Times New Roman"/>
+          </w:rPr>
+          <w:t>https://kontikimaps.ru/hoith</w:t>
+        </w:r>
+      </w:hyperlink>
+      <w:r>
+        <w:rPr>
+          <w:rFonts w:ascii="Times New Roman" w:hAnsi="Times New Roman"/>
+        </w:rPr>
+        <w:t xml:space="preserve">; date of access: 02.03.2026), OpenStreetMap project (https://www.openstreetmap.org; </w:t>
+      </w:r>
+      <w:del w:id="1124" w:author="А.А. Шевцов" w:date="2026-10-17T12:00:00Z">
+        <w:r>
+          <w:rPr>
+            <w:rFonts w:ascii="Times New Roman" w:hAnsi="Times New Roman"/>
+          </w:rPr>
+          <w:delText xml:space="preserve">access date:</w:delText>
+        </w:r>
+      </w:del>
+      <w:ins w:id="1125" w:author="А.А. Шевцов" w:date="2026-10-17T12:00:00Z">
+        <w:r>
+          <w:rPr>
+            <w:rFonts w:ascii="Times New Roman" w:hAnsi="Times New Roman"/>
+          </w:rPr>
           <w:t xml:space="preserve">date of access:</w:t>
         </w:r>
       </w:ins>
@@ -5802,7 +5802,32 @@
             <w:rStyle w:val="af6"/>
             <w:rFonts w:ascii="Times New Roman" w:hAnsi="Times New Roman"/>
           </w:rPr>
-          <w:t>https://earthexplorernasa.gov/</w:t>
+          <w:t xml:space="preserve">https://</w:t>
+        </w:r>
+        <w:del w:id="1022" w:author="А.А. Шевцов" w:date="2026-10-17T12:00:00Z">
+          <w:r>
+            <w:rPr>
+              <w:rStyle w:val="af6"/>
+              <w:rFonts w:ascii="Times New Roman" w:hAnsi="Times New Roman"/>
+            </w:rPr>
+            <w:delText xml:space="preserve">earthexplorernasa.gov</w:delText>
+          </w:r>
+        </w:del>
+        <w:ins w:id="1023" w:author="А.А. Шевцов" w:date="2026-10-17T12:00:00Z">
+          <w:r>
+            <w:rPr>
+              <w:rStyle w:val="af6"/>
+              <w:rFonts w:ascii="Times New Roman" w:hAnsi="Times New Roman"/>
+            </w:rPr>
+            <w:t xml:space="preserve">earthexplorer.usgs.gov</w:t>
+          </w:r>
+        </w:ins>
+        <w:r>
+          <w:rPr>
+            <w:rStyle w:val="af6"/>
+            <w:rFonts w:ascii="Times New Roman" w:hAnsi="Times New Roman"/>
+          </w:rPr>
+          <w:t xml:space="preserve">/</w:t>
         </w:r>
       </w:hyperlink>
       <w:r>
@@ -6150,7 +6175,7 @@
                 <w:szCs w:val="21"/>
               </w:rPr>
             </w:pPr>
-            <w:del w:id="1100" w:author="А.А. Шевцов" w:date="2026-10-17T12:00:00Z">
+            <w:del w:id="1106" w:author="А.А. Шевцов" w:date="2026-10-17T12:00:00Z">
               <w:r>
                 <w:rPr>
                   <w:rFonts w:ascii="Times New Roman" w:hAnsi="Times New Roman"/>
@@ -6160,7 +6185,7 @@
                 <w:delText xml:space="preserve">2 </w:delText>
               </w:r>
             </w:del>
-            <w:ins w:id="1101" w:author="А.А. Шевцов" w:date="2026-10-17T12:00:00Z">
+            <w:ins w:id="1107" w:author="А.А. Шевцов" w:date="2026-10-17T12:00:00Z">
               <w:r>
                 <w:rPr>
                   <w:rFonts w:ascii="Times New Roman" w:hAnsi="Times New Roman"/>
@@ -6383,7 +6408,7 @@
                 <w:szCs w:val="21"/>
               </w:rPr>
             </w:pPr>
-            <w:del w:id="1102" w:author="А.А. Шевцов" w:date="2026-10-17T12:00:00Z">
+            <w:del w:id="1108" w:author="А.А. Шевцов" w:date="2026-10-17T12:00:00Z">
               <w:r>
                 <w:rPr>
                   <w:rFonts w:ascii="Times New Roman" w:hAnsi="Times New Roman"/>
@@ -6393,7 +6418,7 @@
                 <w:delText xml:space="preserve">Multi-storey building</w:delText>
               </w:r>
             </w:del>
-            <w:ins w:id="1103" w:author="А.А. Шевцов" w:date="2026-10-17T12:00:00Z">
+            <w:ins w:id="1109" w:author="А.А. Шевцов" w:date="2026-10-17T12:00:00Z">
               <w:r>
                 <w:rPr>
                   <w:rFonts w:ascii="Times New Roman" w:hAnsi="Times New Roman"/>
@@ -6698,95 +6723,58 @@
         </w:rPr>
         <w:t xml:space="preserve"> the </w:t>
       </w:r>
-      <w:del w:id="1108" w:author="А.А. Шевцов" w:date="2026-10-17T12:00:00Z">
+      <w:del w:id="1114" w:author="А.А. Шевцов" w:date="2026-10-17T12:00:00Z">
         <w:r>
           <w:rPr>
             <w:rFonts w:ascii="Times New Roman" w:hAnsi="Times New Roman"/>
             <w:bCs/>
           </w:rPr>
           <w:delText xml:space="preserve">author's calculations based on:</w:delText>
-        </w:r>
-      </w:del>
-      <w:ins w:id="1109" w:author="А.А. Шевцов" w:date="2026-10-17T12:00:00Z">
-        <w:r>
-          <w:rPr>
-            <w:rFonts w:ascii="Times New Roman" w:hAnsi="Times New Roman"/>
-            <w:bCs/>
-          </w:rPr>
-          <w:t xml:space="preserve">author based on own calculations using:</w:t>
-        </w:r>
-      </w:ins>
-      <w:r>
-        <w:rPr>
-          <w:rFonts w:ascii="Times New Roman" w:hAnsi="Times New Roman"/>
-          <w:bCs/>
-        </w:rPr>
-        <w:t xml:space="preserve"> </w:t>
-      </w:r>
-      <w:r>
-        <w:rPr>
-          <w:rFonts w:ascii="Times New Roman" w:hAnsi="Times New Roman"/>
-        </w:rPr>
-        <w:t>Unified State Register of Real Estate (Rosreestr) (</w:t>
-      </w:r>
-      <w:hyperlink r:id="rId12" w:history="1">
-        <w:r>
-          <w:rPr>
-            <w:rStyle w:val="af6"/>
-            <w:rFonts w:ascii="Times New Roman" w:hAnsi="Times New Roman"/>
-          </w:rPr>
-          <w:t>https://nspd.gov.ru</w:t>
-        </w:r>
-      </w:hyperlink>
-      <w:r>
-        <w:rPr>
-          <w:rFonts w:ascii="Times New Roman" w:hAnsi="Times New Roman"/>
-        </w:rPr>
-        <w:t xml:space="preserve">; date of access: </w:t>
-      </w:r>
-      <w:del w:id="1114" w:author="А.А. Шевцов" w:date="2026-10-17T12:00:00Z">
-        <w:r>
-          <w:rPr>
-            <w:rFonts w:ascii="Times New Roman" w:hAnsi="Times New Roman"/>
-          </w:rPr>
-          <w:delText xml:space="preserve">03/02/2026</w:delText>
         </w:r>
       </w:del>
       <w:ins w:id="1115" w:author="А.А. Шевцов" w:date="2026-10-17T12:00:00Z">
         <w:r>
           <w:rPr>
             <w:rFonts w:ascii="Times New Roman" w:hAnsi="Times New Roman"/>
-          </w:rPr>
-          <w:t xml:space="preserve">02.03.2026</w:t>
+            <w:bCs/>
+          </w:rPr>
+          <w:t xml:space="preserve">author based on own calculations using:</w:t>
         </w:r>
       </w:ins>
       <w:r>
         <w:rPr>
           <w:rFonts w:ascii="Times New Roman" w:hAnsi="Times New Roman"/>
-        </w:rPr>
-        <w:t xml:space="preserve">), project “How old is this house” (</w:t>
-      </w:r>
-      <w:hyperlink r:id="rId13" w:history="1">
+          <w:bCs/>
+        </w:rPr>
+        <w:t xml:space="preserve"> </w:t>
+      </w:r>
+      <w:r>
+        <w:rPr>
+          <w:rFonts w:ascii="Times New Roman" w:hAnsi="Times New Roman"/>
+        </w:rPr>
+        <w:t>Unified State Register of Real Estate (Rosreestr) (</w:t>
+      </w:r>
+      <w:hyperlink r:id="rId12" w:history="1">
         <w:r>
           <w:rPr>
             <w:rStyle w:val="af6"/>
             <w:rFonts w:ascii="Times New Roman" w:hAnsi="Times New Roman"/>
           </w:rPr>
-          <w:t>https://kontikimaps.ru/hoith</w:t>
+          <w:t>https://nspd.gov.ru</w:t>
         </w:r>
       </w:hyperlink>
       <w:r>
         <w:rPr>
           <w:rFonts w:ascii="Times New Roman" w:hAnsi="Times New Roman"/>
         </w:rPr>
-        <w:t xml:space="preserve">; date of access: 02.03.2026), OpenStreetMap project (https://www.openstreetmap.org; </w:t>
+        <w:t xml:space="preserve">; date of access: </w:t>
       </w:r>
       <w:del w:id="1120" w:author="А.А. Шевцов" w:date="2026-10-17T12:00:00Z">
         <w:r>
           <w:rPr>
             <w:rFonts w:ascii="Times New Roman" w:hAnsi="Times New Roman"/>
           </w:rPr>
-          <w:delText xml:space="preserve">access date:</w:delText>
+          <w:delText xml:space="preserve">03/02/2026</w:delText>
         </w:r>
       </w:del>
       <w:ins w:id="1121" w:author="А.А. Шевцов" w:date="2026-10-17T12:00:00Z">
@@ -6794,6 +6782,43 @@
           <w:rPr>
             <w:rFonts w:ascii="Times New Roman" w:hAnsi="Times New Roman"/>
           </w:rPr>
+          <w:t xml:space="preserve">02.03.2026</w:t>
+        </w:r>
+      </w:ins>
+      <w:r>
+        <w:rPr>
+          <w:rFonts w:ascii="Times New Roman" w:hAnsi="Times New Roman"/>
+        </w:rPr>
+        <w:t xml:space="preserve">), project “How old is this house” (</w:t>
+      </w:r>
+      <w:hyperlink r:id="rId13" w:history="1">
+        <w:r>
+          <w:rPr>
+            <w:rStyle w:val="af6"/>
+            <w:rFonts w:ascii="Times New Roman" w:hAnsi="Times New Roman"/>
+          </w:rPr>
+          <w:t>https://kontikimaps.ru/hoith</w:t>
+        </w:r>
+      </w:hyperlink>
+      <w:r>
+        <w:rPr>
+          <w:rFonts w:ascii="Times New Roman" w:hAnsi="Times New Roman"/>
+        </w:rPr>
+        <w:t xml:space="preserve">; date of access: 02.03.2026), OpenStreetMap project (https://www.openstreetmap.org; </w:t>
+      </w:r>
+      <w:del w:id="1126" w:author="А.А. Шевцов" w:date="2026-10-17T12:00:00Z">
+        <w:r>
+          <w:rPr>
+            <w:rFonts w:ascii="Times New Roman" w:hAnsi="Times New Roman"/>
+          </w:rPr>
+          <w:delText xml:space="preserve">access date:</w:delText>
+        </w:r>
+      </w:del>
+      <w:ins w:id="1127" w:author="А.А. Шевцов" w:date="2026-10-17T12:00:00Z">
+        <w:r>
+          <w:rPr>
+            <w:rFonts w:ascii="Times New Roman" w:hAnsi="Times New Roman"/>
+          </w:rPr>
           <w:t xml:space="preserve">date of access:</w:t>
         </w:r>
       </w:ins>
@@ -6809,7 +6834,32 @@
             <w:rStyle w:val="af6"/>
             <w:rFonts w:ascii="Times New Roman" w:hAnsi="Times New Roman"/>
           </w:rPr>
-          <w:t>https://earthexplorernasa.gov/</w:t>
+          <w:t xml:space="preserve">https://</w:t>
+        </w:r>
+        <w:del w:id="1024" w:author="А.А. Шевцов" w:date="2026-10-17T12:00:00Z">
+          <w:r>
+            <w:rPr>
+              <w:rStyle w:val="af6"/>
+              <w:rFonts w:ascii="Times New Roman" w:hAnsi="Times New Roman"/>
+            </w:rPr>
+            <w:delText xml:space="preserve">earthexplorernasa.gov</w:delText>
+          </w:r>
+        </w:del>
+        <w:ins w:id="1025" w:author="А.А. Шевцов" w:date="2026-10-17T12:00:00Z">
+          <w:r>
+            <w:rPr>
+              <w:rStyle w:val="af6"/>
+              <w:rFonts w:ascii="Times New Roman" w:hAnsi="Times New Roman"/>
+            </w:rPr>
+            <w:t xml:space="preserve">earthexplorer.usgs.gov</w:t>
+          </w:r>
+        </w:ins>
+        <w:r>
+          <w:rPr>
+            <w:rStyle w:val="af6"/>
+            <w:rFonts w:ascii="Times New Roman" w:hAnsi="Times New Roman"/>
+          </w:rPr>
+          <w:t xml:space="preserve">/</w:t>
         </w:r>
       </w:hyperlink>
       <w:r>
@@ -7651,95 +7701,58 @@
         </w:rPr>
         <w:t xml:space="preserve"> the </w:t>
       </w:r>
-      <w:del w:id="1110" w:author="А.А. Шевцов" w:date="2026-10-17T12:00:00Z">
+      <w:del w:id="1116" w:author="А.А. Шевцов" w:date="2026-10-17T12:00:00Z">
         <w:r>
           <w:rPr>
             <w:rFonts w:ascii="Times New Roman" w:hAnsi="Times New Roman"/>
             <w:bCs/>
           </w:rPr>
           <w:delText xml:space="preserve">author's calculations based on:</w:delText>
-        </w:r>
-      </w:del>
-      <w:ins w:id="1111" w:author="А.А. Шевцов" w:date="2026-10-17T12:00:00Z">
-        <w:r>
-          <w:rPr>
-            <w:rFonts w:ascii="Times New Roman" w:hAnsi="Times New Roman"/>
-            <w:bCs/>
-          </w:rPr>
-          <w:t xml:space="preserve">author based on own calculations using:</w:t>
-        </w:r>
-      </w:ins>
-      <w:r>
-        <w:rPr>
-          <w:rFonts w:ascii="Times New Roman" w:hAnsi="Times New Roman"/>
-          <w:bCs/>
-        </w:rPr>
-        <w:t xml:space="preserve"> </w:t>
-      </w:r>
-      <w:r>
-        <w:rPr>
-          <w:rFonts w:ascii="Times New Roman" w:hAnsi="Times New Roman"/>
-        </w:rPr>
-        <w:t>Unified State Register of Real Estate (Rosreestr) (</w:t>
-      </w:r>
-      <w:hyperlink r:id="rId16" w:history="1">
-        <w:r>
-          <w:rPr>
-            <w:rStyle w:val="af6"/>
-            <w:rFonts w:ascii="Times New Roman" w:hAnsi="Times New Roman"/>
-          </w:rPr>
-          <w:t>https://nspd.gov.ru</w:t>
-        </w:r>
-      </w:hyperlink>
-      <w:r>
-        <w:rPr>
-          <w:rFonts w:ascii="Times New Roman" w:hAnsi="Times New Roman"/>
-        </w:rPr>
-        <w:t xml:space="preserve">; date of access: </w:t>
-      </w:r>
-      <w:del w:id="1116" w:author="А.А. Шевцов" w:date="2026-10-17T12:00:00Z">
-        <w:r>
-          <w:rPr>
-            <w:rFonts w:ascii="Times New Roman" w:hAnsi="Times New Roman"/>
-          </w:rPr>
-          <w:delText xml:space="preserve">03/02/2026</w:delText>
         </w:r>
       </w:del>
       <w:ins w:id="1117" w:author="А.А. Шевцов" w:date="2026-10-17T12:00:00Z">
         <w:r>
           <w:rPr>
             <w:rFonts w:ascii="Times New Roman" w:hAnsi="Times New Roman"/>
-          </w:rPr>
-          <w:t xml:space="preserve">02.03.2026</w:t>
+            <w:bCs/>
+          </w:rPr>
+          <w:t xml:space="preserve">author based on own calculations using:</w:t>
         </w:r>
       </w:ins>
       <w:r>
         <w:rPr>
           <w:rFonts w:ascii="Times New Roman" w:hAnsi="Times New Roman"/>
-        </w:rPr>
-        <w:t xml:space="preserve">), project “How old is this house” (</w:t>
-      </w:r>
-      <w:hyperlink r:id="rId17" w:history="1">
+          <w:bCs/>
+        </w:rPr>
+        <w:t xml:space="preserve"> </w:t>
+      </w:r>
+      <w:r>
+        <w:rPr>
+          <w:rFonts w:ascii="Times New Roman" w:hAnsi="Times New Roman"/>
+        </w:rPr>
+        <w:t>Unified State Register of Real Estate (Rosreestr) (</w:t>
+      </w:r>
+      <w:hyperlink r:id="rId16" w:history="1">
         <w:r>
           <w:rPr>
             <w:rStyle w:val="af6"/>
             <w:rFonts w:ascii="Times New Roman" w:hAnsi="Times New Roman"/>
           </w:rPr>
-          <w:t>https://kontikimaps.ru/hoith</w:t>
+          <w:t>https://nspd.gov.ru</w:t>
         </w:r>
       </w:hyperlink>
       <w:r>
         <w:rPr>
           <w:rFonts w:ascii="Times New Roman" w:hAnsi="Times New Roman"/>
         </w:rPr>
-        <w:t xml:space="preserve">; date of access: 02.03.2026), OpenStreetMap project (https://www.openstreetmap.org; </w:t>
+        <w:t xml:space="preserve">; date of access: </w:t>
       </w:r>
       <w:del w:id="1122" w:author="А.А. Шевцов" w:date="2026-10-17T12:00:00Z">
         <w:r>
           <w:rPr>
             <w:rFonts w:ascii="Times New Roman" w:hAnsi="Times New Roman"/>
           </w:rPr>
-          <w:delText xml:space="preserve">access date:</w:delText>
+          <w:delText xml:space="preserve">03/02/2026</w:delText>
         </w:r>
       </w:del>
       <w:ins w:id="1123" w:author="А.А. Шевцов" w:date="2026-10-17T12:00:00Z">
@@ -7747,6 +7760,43 @@
           <w:rPr>
             <w:rFonts w:ascii="Times New Roman" w:hAnsi="Times New Roman"/>
           </w:rPr>
+          <w:t xml:space="preserve">02.03.2026</w:t>
+        </w:r>
+      </w:ins>
+      <w:r>
+        <w:rPr>
+          <w:rFonts w:ascii="Times New Roman" w:hAnsi="Times New Roman"/>
+        </w:rPr>
+        <w:t xml:space="preserve">), project “How old is this house” (</w:t>
+      </w:r>
+      <w:hyperlink r:id="rId17" w:history="1">
+        <w:r>
+          <w:rPr>
+            <w:rStyle w:val="af6"/>
+            <w:rFonts w:ascii="Times New Roman" w:hAnsi="Times New Roman"/>
+          </w:rPr>
+          <w:t>https://kontikimaps.ru/hoith</w:t>
+        </w:r>
+      </w:hyperlink>
+      <w:r>
+        <w:rPr>
+          <w:rFonts w:ascii="Times New Roman" w:hAnsi="Times New Roman"/>
+        </w:rPr>
+        <w:t xml:space="preserve">; date of access: 02.03.2026), OpenStreetMap project (https://www.openstreetmap.org; </w:t>
+      </w:r>
+      <w:del w:id="1128" w:author="А.А. Шевцов" w:date="2026-10-17T12:00:00Z">
+        <w:r>
+          <w:rPr>
+            <w:rFonts w:ascii="Times New Roman" w:hAnsi="Times New Roman"/>
+          </w:rPr>
+          <w:delText xml:space="preserve">access date:</w:delText>
+        </w:r>
+      </w:del>
+      <w:ins w:id="1129" w:author="А.А. Шевцов" w:date="2026-10-17T12:00:00Z">
+        <w:r>
+          <w:rPr>
+            <w:rFonts w:ascii="Times New Roman" w:hAnsi="Times New Roman"/>
+          </w:rPr>
           <w:t xml:space="preserve">date of access:</w:t>
         </w:r>
       </w:ins>
@@ -7762,7 +7812,32 @@
             <w:rStyle w:val="af6"/>
             <w:rFonts w:ascii="Times New Roman" w:hAnsi="Times New Roman"/>
           </w:rPr>
-          <w:t>https://earthexplorernasa.gov/</w:t>
+          <w:t xml:space="preserve">https://</w:t>
+        </w:r>
+        <w:del w:id="1026" w:author="А.А. Шевцов" w:date="2026-10-17T12:00:00Z">
+          <w:r>
+            <w:rPr>
+              <w:rStyle w:val="af6"/>
+              <w:rFonts w:ascii="Times New Roman" w:hAnsi="Times New Roman"/>
+            </w:rPr>
+            <w:delText xml:space="preserve">earthexplorernasa.gov</w:delText>
+          </w:r>
+        </w:del>
+        <w:ins w:id="1027" w:author="А.А. Шевцов" w:date="2026-10-17T12:00:00Z">
+          <w:r>
+            <w:rPr>
+              <w:rStyle w:val="af6"/>
+              <w:rFonts w:ascii="Times New Roman" w:hAnsi="Times New Roman"/>
+            </w:rPr>
+            <w:t xml:space="preserve">earthexplorer.usgs.gov</w:t>
+          </w:r>
+        </w:ins>
+        <w:r>
+          <w:rPr>
+            <w:rStyle w:val="af6"/>
+            <w:rFonts w:ascii="Times New Roman" w:hAnsi="Times New Roman"/>
+          </w:rPr>
+          <w:t xml:space="preserve">/</w:t>
         </w:r>
       </w:hyperlink>
       <w:r>
@@ -7929,7 +8004,7 @@
         </w:rPr>
         <w:t xml:space="preserve">Unified State Register of Real Estate (Rosreestr), the </w:t>
       </w:r>
-      <w:del w:id="1194" w:author="А.А. Шевцов" w:date="2026-10-17T12:00:00Z">
+      <w:del w:id="1200" w:author="А.А. Шевцов" w:date="2026-10-17T12:00:00Z">
         <w:r>
           <w:rPr>
             <w:rFonts w:ascii="Times New Roman" w:hAnsi="Times New Roman"/>
@@ -7937,7 +8012,7 @@
           <w:delText xml:space="preserve">"</w:delText>
         </w:r>
       </w:del>
-      <w:ins w:id="1195" w:author="А.А. Шевцов" w:date="2026-10-17T12:00:00Z">
+      <w:ins w:id="1201" w:author="А.А. Шевцов" w:date="2026-10-17T12:00:00Z">
         <w:r>
           <w:rPr>
             <w:rFonts w:ascii="Times New Roman" w:hAnsi="Times New Roman"/>
@@ -7951,7 +8026,7 @@
         </w:rPr>
         <w:t xml:space="preserve">How old is this house</w:t>
       </w:r>
-      <w:del w:id="1192" w:author="А.А. Шевцов" w:date="2026-10-17T12:00:00Z">
+      <w:del w:id="1198" w:author="А.А. Шевцов" w:date="2026-10-17T12:00:00Z">
         <w:r>
           <w:rPr>
             <w:rFonts w:ascii="Times New Roman" w:hAnsi="Times New Roman"/>
@@ -7959,7 +8034,7 @@
           <w:delText xml:space="preserve">"</w:delText>
         </w:r>
       </w:del>
-      <w:ins w:id="1193" w:author="А.А. Шевцов" w:date="2026-10-17T12:00:00Z">
+      <w:ins w:id="1199" w:author="А.А. Шевцов" w:date="2026-10-17T12:00:00Z">
         <w:r>
           <w:rPr>
             <w:rFonts w:ascii="Times New Roman" w:hAnsi="Times New Roman"/>
@@ -8025,7 +8100,7 @@
           <w:rFonts w:ascii="Times New Roman" w:hAnsi="Times New Roman" w:cs="Times New Roman"/>
         </w:rPr>
       </w:pPr>
-      <w:del w:id="1098" w:author="А.А. Шевцов" w:date="2026-10-17T12:00:00Z">
+      <w:del w:id="1104" w:author="А.А. Шевцов" w:date="2026-10-17T12:00:00Z">
         <w:r>
           <w:rPr>
             <w:rFonts w:ascii="Times New Roman" w:hAnsi="Times New Roman"/>
@@ -8033,7 +8108,7 @@
           <w:delText xml:space="preserve">Regional</w:delText>
         </w:r>
       </w:del>
-      <w:ins w:id="1099" w:author="А.А. Шевцов" w:date="2026-10-17T12:00:00Z">
+      <w:ins w:id="1105" w:author="А.А. Шевцов" w:date="2026-10-17T12:00:00Z">
         <w:r>
           <w:rPr>
             <w:rFonts w:ascii="Times New Roman" w:hAnsi="Times New Roman"/>
@@ -8179,7 +8254,7 @@
         </w:rPr>
         <w:t xml:space="preserve">M-4 </w:t>
       </w:r>
-      <w:del w:id="1198" w:author="А.А. Шевцов" w:date="2026-10-17T12:00:00Z">
+      <w:del w:id="1204" w:author="А.А. Шевцов" w:date="2026-10-17T12:00:00Z">
         <w:r>
           <w:rPr>
             <w:rFonts w:ascii="Times New Roman" w:hAnsi="Times New Roman"/>
@@ -8187,7 +8262,7 @@
           <w:delText xml:space="preserve">"</w:delText>
         </w:r>
       </w:del>
-      <w:ins w:id="1199" w:author="А.А. Шевцов" w:date="2026-10-17T12:00:00Z">
+      <w:ins w:id="1205" w:author="А.А. Шевцов" w:date="2026-10-17T12:00:00Z">
         <w:r>
           <w:rPr>
             <w:rFonts w:ascii="Times New Roman" w:hAnsi="Times New Roman"/>
@@ -8201,7 +8276,7 @@
         </w:rPr>
         <w:t xml:space="preserve">Don</w:t>
       </w:r>
-      <w:del w:id="1196" w:author="А.А. Шевцов" w:date="2026-10-17T12:00:00Z">
+      <w:del w:id="1202" w:author="А.А. Шевцов" w:date="2026-10-17T12:00:00Z">
         <w:r>
           <w:rPr>
             <w:rFonts w:ascii="Times New Roman" w:hAnsi="Times New Roman"/>
@@ -8209,7 +8284,7 @@
           <w:delText xml:space="preserve">"</w:delText>
         </w:r>
       </w:del>
-      <w:ins w:id="1197" w:author="А.А. Шевцов" w:date="2026-10-17T12:00:00Z">
+      <w:ins w:id="1203" w:author="А.А. Шевцов" w:date="2026-10-17T12:00:00Z">
         <w:r>
           <w:rPr>
             <w:rFonts w:ascii="Times New Roman" w:hAnsi="Times New Roman"/>
@@ -8301,7 +8376,7 @@
           <w:rFonts w:ascii="Times New Roman" w:hAnsi="Times New Roman" w:cs="Times New Roman"/>
         </w:rPr>
       </w:pPr>
-      <w:del w:id="1128" w:author="А.А. Шевцов" w:date="2026-10-17T12:00:00Z">
+      <w:del w:id="1134" w:author="А.А. Шевцов" w:date="2026-10-17T12:00:00Z">
         <w:r>
           <w:rPr>
             <w:rFonts w:ascii="Times New Roman" w:hAnsi="Times New Roman"/>
@@ -8309,7 +8384,7 @@
           <w:delText xml:space="preserve">C</w:delText>
         </w:r>
       </w:del>
-      <w:ins w:id="1129" w:author="А.А. Шевцов" w:date="2026-10-17T12:00:00Z">
+      <w:ins w:id="1135" w:author="А.А. Шевцов" w:date="2026-10-17T12:00:00Z">
         <w:r>
           <w:rPr>
             <w:rFonts w:ascii="Times New Roman" w:hAnsi="Times New Roman"/>
@@ -8327,7 +8402,7 @@
           <w:rFonts w:ascii="Times New Roman" w:hAnsi="Times New Roman" w:cs="Times New Roman"/>
         </w:rPr>
       </w:pPr>
-      <w:del w:id="1132" w:author="А.А. Шевцов" w:date="2026-10-17T12:00:00Z">
+      <w:del w:id="1138" w:author="А.А. Шевцов" w:date="2026-10-17T12:00:00Z">
         <w:r>
           <w:rPr>
             <w:rFonts w:ascii="Times New Roman" w:hAnsi="Times New Roman"/>
@@ -8335,7 +8410,7 @@
           <w:delText xml:space="preserve">SV</w:delText>
         </w:r>
       </w:del>
-      <w:ins w:id="1133" w:author="А.А. Шевцов" w:date="2026-10-17T12:00:00Z">
+      <w:ins w:id="1139" w:author="А.А. Шевцов" w:date="2026-10-17T12:00:00Z">
         <w:r>
           <w:rPr>
             <w:rFonts w:ascii="Times New Roman" w:hAnsi="Times New Roman"/>
@@ -8353,7 +8428,7 @@
           <w:rFonts w:ascii="Times New Roman" w:hAnsi="Times New Roman" w:cs="Times New Roman"/>
         </w:rPr>
       </w:pPr>
-      <w:del w:id="1136" w:author="А.А. Шевцов" w:date="2026-10-17T12:00:00Z">
+      <w:del w:id="1142" w:author="А.А. Шевцов" w:date="2026-10-17T12:00:00Z">
         <w:r>
           <w:rPr>
             <w:rFonts w:ascii="Times New Roman" w:hAnsi="Times New Roman"/>
@@ -8361,7 +8436,7 @@
           <w:delText xml:space="preserve">B</w:delText>
         </w:r>
       </w:del>
-      <w:ins w:id="1137" w:author="А.А. Шевцов" w:date="2026-10-17T12:00:00Z">
+      <w:ins w:id="1143" w:author="А.А. Шевцов" w:date="2026-10-17T12:00:00Z">
         <w:r>
           <w:rPr>
             <w:rFonts w:ascii="Times New Roman" w:hAnsi="Times New Roman"/>
@@ -8396,7 +8471,7 @@
           <w:rFonts w:ascii="Times New Roman" w:hAnsi="Times New Roman" w:cs="Times New Roman"/>
         </w:rPr>
       </w:pPr>
-      <w:del w:id="1140" w:author="А.А. Шевцов" w:date="2026-10-17T12:00:00Z">
+      <w:del w:id="1146" w:author="А.А. Шевцов" w:date="2026-10-17T12:00:00Z">
         <w:r>
           <w:rPr>
             <w:rFonts w:ascii="Times New Roman" w:hAnsi="Times New Roman"/>
@@ -8404,7 +8479,7 @@
           <w:delText xml:space="preserve">Yu</w:delText>
         </w:r>
       </w:del>
-      <w:ins w:id="1141" w:author="А.А. Шевцов" w:date="2026-10-17T12:00:00Z">
+      <w:ins w:id="1147" w:author="А.А. Шевцов" w:date="2026-10-17T12:00:00Z">
         <w:r>
           <w:rPr>
             <w:rFonts w:ascii="Times New Roman" w:hAnsi="Times New Roman"/>
@@ -8438,7 +8513,7 @@
           <w:rFonts w:ascii="Times New Roman" w:hAnsi="Times New Roman" w:cs="Times New Roman"/>
         </w:rPr>
       </w:pPr>
-      <w:del w:id="1144" w:author="А.А. Шевцов" w:date="2026-10-17T12:00:00Z">
+      <w:del w:id="1150" w:author="А.А. Шевцов" w:date="2026-10-17T12:00:00Z">
         <w:r>
           <w:rPr>
             <w:rFonts w:ascii="Times New Roman" w:hAnsi="Times New Roman"/>
@@ -8446,7 +8521,7 @@
           <w:delText xml:space="preserve">Z</w:delText>
         </w:r>
       </w:del>
-      <w:ins w:id="1145" w:author="А.А. Шевцов" w:date="2026-10-17T12:00:00Z">
+      <w:ins w:id="1151" w:author="А.А. Шевцов" w:date="2026-10-17T12:00:00Z">
         <w:r>
           <w:rPr>
             <w:rFonts w:ascii="Times New Roman" w:hAnsi="Times New Roman"/>
@@ -8464,7 +8539,7 @@
           <w:rFonts w:ascii="Times New Roman" w:hAnsi="Times New Roman" w:cs="Times New Roman"/>
         </w:rPr>
       </w:pPr>
-      <w:del w:id="1148" w:author="А.А. Шевцов" w:date="2026-10-17T12:00:00Z">
+      <w:del w:id="1154" w:author="А.А. Шевцов" w:date="2026-10-17T12:00:00Z">
         <w:r>
           <w:rPr>
             <w:rFonts w:ascii="Times New Roman" w:hAnsi="Times New Roman"/>
@@ -8472,7 +8547,7 @@
           <w:delText xml:space="preserve">SZ</w:delText>
         </w:r>
       </w:del>
-      <w:ins w:id="1149" w:author="А.А. Шевцов" w:date="2026-10-17T12:00:00Z">
+      <w:ins w:id="1155" w:author="А.А. Шевцов" w:date="2026-10-17T12:00:00Z">
         <w:r>
           <w:rPr>
             <w:rFonts w:ascii="Times New Roman" w:hAnsi="Times New Roman"/>
@@ -8505,7 +8580,7 @@
         </w:rPr>
         <w:t xml:space="preserve">Morphotypes of development </w:t>
       </w:r>
-      <w:del w:id="1124" w:author="А.А. Шевцов" w:date="2026-10-17T12:00:00Z">
+      <w:del w:id="1130" w:author="А.А. Шевцов" w:date="2026-10-17T12:00:00Z">
         <w:r>
           <w:rPr>
             <w:rFonts w:ascii="Times New Roman" w:hAnsi="Times New Roman"/>
@@ -8514,7 +8589,7 @@
           <w:delText xml:space="preserve">in the Voronezh region and its</w:delText>
         </w:r>
       </w:del>
-      <w:ins w:id="1125" w:author="А.А. Шевцов" w:date="2026-10-17T12:00:00Z">
+      <w:ins w:id="1131" w:author="А.А. Шевцов" w:date="2026-10-17T12:00:00Z">
         <w:r>
           <w:rPr>
             <w:rFonts w:ascii="Times New Roman" w:hAnsi="Times New Roman"/>
@@ -8577,7 +8652,7 @@
         </w:rPr>
         <w:t xml:space="preserve">Unified State Register of Real Estate (Rosreestr), the </w:t>
       </w:r>
-      <w:del w:id="1202" w:author="А.А. Шевцов" w:date="2026-10-17T12:00:00Z">
+      <w:del w:id="1208" w:author="А.А. Шевцов" w:date="2026-10-17T12:00:00Z">
         <w:r>
           <w:rPr>
             <w:rFonts w:ascii="Times New Roman" w:hAnsi="Times New Roman"/>
@@ -8585,7 +8660,7 @@
           <w:delText xml:space="preserve">"</w:delText>
         </w:r>
       </w:del>
-      <w:ins w:id="1203" w:author="А.А. Шевцов" w:date="2026-10-17T12:00:00Z">
+      <w:ins w:id="1209" w:author="А.А. Шевцов" w:date="2026-10-17T12:00:00Z">
         <w:r>
           <w:rPr>
             <w:rFonts w:ascii="Times New Roman" w:hAnsi="Times New Roman"/>
@@ -8599,7 +8674,7 @@
         </w:rPr>
         <w:t xml:space="preserve">How old is this house</w:t>
       </w:r>
-      <w:del w:id="1200" w:author="А.А. Шевцов" w:date="2026-10-17T12:00:00Z">
+      <w:del w:id="1206" w:author="А.А. Шевцов" w:date="2026-10-17T12:00:00Z">
         <w:r>
           <w:rPr>
             <w:rFonts w:ascii="Times New Roman" w:hAnsi="Times New Roman"/>
@@ -8607,7 +8682,7 @@
           <w:delText xml:space="preserve">"</w:delText>
         </w:r>
       </w:del>
-      <w:ins w:id="1201" w:author="А.А. Шевцов" w:date="2026-10-17T12:00:00Z">
+      <w:ins w:id="1207" w:author="А.А. Шевцов" w:date="2026-10-17T12:00:00Z">
         <w:r>
           <w:rPr>
             <w:rFonts w:ascii="Times New Roman" w:hAnsi="Times New Roman"/>
@@ -8663,7 +8738,7 @@
         </w:rPr>
         <w:t xml:space="preserve">Morphotypes of development </w:t>
       </w:r>
-      <w:del w:id="1126" w:author="А.А. Шевцов" w:date="2026-10-17T12:00:00Z">
+      <w:del w:id="1132" w:author="А.А. Шевцов" w:date="2026-10-17T12:00:00Z">
         <w:r>
           <w:rPr>
             <w:rFonts w:ascii="Times New Roman" w:hAnsi="Times New Roman"/>
@@ -8671,7 +8746,7 @@
           <w:delText xml:space="preserve">1992–2005</w:delText>
         </w:r>
       </w:del>
-      <w:ins w:id="1127" w:author="А.А. Шевцов" w:date="2026-10-17T12:00:00Z">
+      <w:ins w:id="1133" w:author="А.А. Шевцов" w:date="2026-10-17T12:00:00Z">
         <w:r>
           <w:rPr>
             <w:rFonts w:ascii="Times New Roman" w:hAnsi="Times New Roman"/>
@@ -8689,7 +8764,7 @@
           <w:rFonts w:ascii="Times New Roman" w:hAnsi="Times New Roman" w:cs="Times New Roman"/>
         </w:rPr>
       </w:pPr>
-      <w:del w:id="1104" w:author="А.А. Шевцов" w:date="2026-10-17T12:00:00Z">
+      <w:del w:id="1110" w:author="А.А. Шевцов" w:date="2026-10-17T12:00:00Z">
         <w:r>
           <w:rPr>
             <w:rFonts w:ascii="Times New Roman" w:hAnsi="Times New Roman"/>
@@ -8697,7 +8772,7 @@
           <w:delText xml:space="preserve">Multi-storey</w:delText>
         </w:r>
       </w:del>
-      <w:ins w:id="1105" w:author="А.А. Шевцов" w:date="2026-10-17T12:00:00Z">
+      <w:ins w:id="1111" w:author="А.А. Шевцов" w:date="2026-10-17T12:00:00Z">
         <w:r>
           <w:rPr>
             <w:rFonts w:ascii="Times New Roman" w:hAnsi="Times New Roman"/>
@@ -8869,7 +8944,7 @@
         </w:rPr>
         <w:t xml:space="preserve">M-4 </w:t>
       </w:r>
-      <w:del w:id="1206" w:author="А.А. Шевцов" w:date="2026-10-17T12:00:00Z">
+      <w:del w:id="1212" w:author="А.А. Шевцов" w:date="2026-10-17T12:00:00Z">
         <w:r>
           <w:rPr>
             <w:rFonts w:ascii="Times New Roman" w:hAnsi="Times New Roman"/>
@@ -8877,7 +8952,7 @@
           <w:delText xml:space="preserve">"</w:delText>
         </w:r>
       </w:del>
-      <w:ins w:id="1207" w:author="А.А. Шевцов" w:date="2026-10-17T12:00:00Z">
+      <w:ins w:id="1213" w:author="А.А. Шевцов" w:date="2026-10-17T12:00:00Z">
         <w:r>
           <w:rPr>
             <w:rFonts w:ascii="Times New Roman" w:hAnsi="Times New Roman"/>
@@ -8891,7 +8966,7 @@
         </w:rPr>
         <w:t xml:space="preserve">Don</w:t>
       </w:r>
-      <w:del w:id="1204" w:author="А.А. Шевцов" w:date="2026-10-17T12:00:00Z">
+      <w:del w:id="1210" w:author="А.А. Шевцов" w:date="2026-10-17T12:00:00Z">
         <w:r>
           <w:rPr>
             <w:rFonts w:ascii="Times New Roman" w:hAnsi="Times New Roman"/>
@@ -8899,7 +8974,7 @@
           <w:delText xml:space="preserve">"</w:delText>
         </w:r>
       </w:del>
-      <w:ins w:id="1205" w:author="А.А. Шевцов" w:date="2026-10-17T12:00:00Z">
+      <w:ins w:id="1211" w:author="А.А. Шевцов" w:date="2026-10-17T12:00:00Z">
         <w:r>
           <w:rPr>
             <w:rFonts w:ascii="Times New Roman" w:hAnsi="Times New Roman"/>
@@ -8991,7 +9066,7 @@
           <w:rFonts w:ascii="Times New Roman" w:hAnsi="Times New Roman" w:cs="Times New Roman"/>
         </w:rPr>
       </w:pPr>
-      <w:del w:id="1130" w:author="А.А. Шевцов" w:date="2026-10-17T12:00:00Z">
+      <w:del w:id="1136" w:author="А.А. Шевцов" w:date="2026-10-17T12:00:00Z">
         <w:r>
           <w:rPr>
             <w:rFonts w:ascii="Times New Roman" w:hAnsi="Times New Roman"/>
@@ -8999,7 +9074,7 @@
           <w:delText xml:space="preserve">C</w:delText>
         </w:r>
       </w:del>
-      <w:ins w:id="1131" w:author="А.А. Шевцов" w:date="2026-10-17T12:00:00Z">
+      <w:ins w:id="1137" w:author="А.А. Шевцов" w:date="2026-10-17T12:00:00Z">
         <w:r>
           <w:rPr>
             <w:rFonts w:ascii="Times New Roman" w:hAnsi="Times New Roman"/>
@@ -9017,7 +9092,7 @@
           <w:rFonts w:ascii="Times New Roman" w:hAnsi="Times New Roman" w:cs="Times New Roman"/>
         </w:rPr>
       </w:pPr>
-      <w:del w:id="1134" w:author="А.А. Шевцов" w:date="2026-10-17T12:00:00Z">
+      <w:del w:id="1140" w:author="А.А. Шевцов" w:date="2026-10-17T12:00:00Z">
         <w:r>
           <w:rPr>
             <w:rFonts w:ascii="Times New Roman" w:hAnsi="Times New Roman"/>
@@ -9025,7 +9100,7 @@
           <w:delText xml:space="preserve">SV</w:delText>
         </w:r>
       </w:del>
-      <w:ins w:id="1135" w:author="А.А. Шевцов" w:date="2026-10-17T12:00:00Z">
+      <w:ins w:id="1141" w:author="А.А. Шевцов" w:date="2026-10-17T12:00:00Z">
         <w:r>
           <w:rPr>
             <w:rFonts w:ascii="Times New Roman" w:hAnsi="Times New Roman"/>
@@ -9043,7 +9118,7 @@
           <w:rFonts w:ascii="Times New Roman" w:hAnsi="Times New Roman" w:cs="Times New Roman"/>
         </w:rPr>
       </w:pPr>
-      <w:del w:id="1138" w:author="А.А. Шевцов" w:date="2026-10-17T12:00:00Z">
+      <w:del w:id="1144" w:author="А.А. Шевцов" w:date="2026-10-17T12:00:00Z">
         <w:r>
           <w:rPr>
             <w:rFonts w:ascii="Times New Roman" w:hAnsi="Times New Roman"/>
@@ -9051,7 +9126,7 @@
           <w:delText xml:space="preserve">IN</w:delText>
         </w:r>
       </w:del>
-      <w:ins w:id="1139" w:author="А.А. Шевцов" w:date="2026-10-17T12:00:00Z">
+      <w:ins w:id="1145" w:author="А.А. Шевцов" w:date="2026-10-17T12:00:00Z">
         <w:r>
           <w:rPr>
             <w:rFonts w:ascii="Times New Roman" w:hAnsi="Times New Roman"/>
@@ -9085,7 +9160,7 @@
           <w:rFonts w:ascii="Times New Roman" w:hAnsi="Times New Roman" w:cs="Times New Roman"/>
         </w:rPr>
       </w:pPr>
-      <w:del w:id="1142" w:author="А.А. Шевцов" w:date="2026-10-17T12:00:00Z">
+      <w:del w:id="1148" w:author="А.А. Шевцов" w:date="2026-10-17T12:00:00Z">
         <w:r>
           <w:rPr>
             <w:rFonts w:ascii="Times New Roman" w:hAnsi="Times New Roman"/>
@@ -9093,7 +9168,7 @@
           <w:delText xml:space="preserve">Yu</w:delText>
         </w:r>
       </w:del>
-      <w:ins w:id="1143" w:author="А.А. Шевцов" w:date="2026-10-17T12:00:00Z">
+      <w:ins w:id="1149" w:author="А.А. Шевцов" w:date="2026-10-17T12:00:00Z">
         <w:r>
           <w:rPr>
             <w:rFonts w:ascii="Times New Roman" w:hAnsi="Times New Roman"/>
@@ -9127,7 +9202,7 @@
           <w:rFonts w:ascii="Times New Roman" w:hAnsi="Times New Roman" w:cs="Times New Roman"/>
         </w:rPr>
       </w:pPr>
-      <w:del w:id="1146" w:author="А.А. Шевцов" w:date="2026-10-17T12:00:00Z">
+      <w:del w:id="1152" w:author="А.А. Шевцов" w:date="2026-10-17T12:00:00Z">
         <w:r>
           <w:rPr>
             <w:rFonts w:ascii="Times New Roman" w:hAnsi="Times New Roman"/>
@@ -9135,7 +9210,7 @@
           <w:delText xml:space="preserve">Z</w:delText>
         </w:r>
       </w:del>
-      <w:ins w:id="1147" w:author="А.А. Шевцов" w:date="2026-10-17T12:00:00Z">
+      <w:ins w:id="1153" w:author="А.А. Шевцов" w:date="2026-10-17T12:00:00Z">
         <w:r>
           <w:rPr>
             <w:rFonts w:ascii="Times New Roman" w:hAnsi="Times New Roman"/>
@@ -9153,7 +9228,7 @@
           <w:rFonts w:ascii="Times New Roman" w:hAnsi="Times New Roman" w:cs="Times New Roman"/>
         </w:rPr>
       </w:pPr>
-      <w:del w:id="1150" w:author="А.А. Шевцов" w:date="2026-10-17T12:00:00Z">
+      <w:del w:id="1156" w:author="А.А. Шевцов" w:date="2026-10-17T12:00:00Z">
         <w:r>
           <w:rPr>
             <w:rFonts w:ascii="Times New Roman" w:hAnsi="Times New Roman"/>
@@ -9161,7 +9236,7 @@
           <w:delText xml:space="preserve">SZ</w:delText>
         </w:r>
       </w:del>
-      <w:ins w:id="1151" w:author="А.А. Шевцов" w:date="2026-10-17T12:00:00Z">
+      <w:ins w:id="1157" w:author="А.А. Шевцов" w:date="2026-10-17T12:00:00Z">
         <w:r>
           <w:rPr>
             <w:rFonts w:ascii="Times New Roman" w:hAnsi="Times New Roman"/>
@@ -9223,7 +9298,7 @@
         </w:rPr>
         <w:t xml:space="preserve">Unified State Register of Real Estate (Rosreestr), the </w:t>
       </w:r>
-      <w:del w:id="1210" w:author="А.А. Шевцов" w:date="2026-10-17T12:00:00Z">
+      <w:del w:id="1216" w:author="А.А. Шевцов" w:date="2026-10-17T12:00:00Z">
         <w:r>
           <w:rPr>
             <w:rFonts w:ascii="Times New Roman" w:hAnsi="Times New Roman"/>
@@ -9231,7 +9306,7 @@
           <w:delText xml:space="preserve">"</w:delText>
         </w:r>
       </w:del>
-      <w:ins w:id="1211" w:author="А.А. Шевцов" w:date="2026-10-17T12:00:00Z">
+      <w:ins w:id="1217" w:author="А.А. Шевцов" w:date="2026-10-17T12:00:00Z">
         <w:r>
           <w:rPr>
             <w:rFonts w:ascii="Times New Roman" w:hAnsi="Times New Roman"/>
@@ -9245,7 +9320,7 @@
         </w:rPr>
         <w:t xml:space="preserve">How old is this house</w:t>
       </w:r>
-      <w:del w:id="1208" w:author="А.А. Шевцов" w:date="2026-10-17T12:00:00Z">
+      <w:del w:id="1214" w:author="А.А. Шевцов" w:date="2026-10-17T12:00:00Z">
         <w:r>
           <w:rPr>
             <w:rFonts w:ascii="Times New Roman" w:hAnsi="Times New Roman"/>
@@ -9253,7 +9328,7 @@
           <w:delText xml:space="preserve">"</w:delText>
         </w:r>
       </w:del>
-      <w:ins w:id="1209" w:author="А.А. Шевцов" w:date="2026-10-17T12:00:00Z">
+      <w:ins w:id="1215" w:author="А.А. Шевцов" w:date="2026-10-17T12:00:00Z">
         <w:r>
           <w:rPr>
             <w:rFonts w:ascii="Times New Roman" w:hAnsi="Times New Roman"/>
@@ -9325,7 +9400,7 @@
         </w:rPr>
         <w:t xml:space="preserve">incl. </w:t>
       </w:r>
-      <w:del w:id="1214" w:author="А.А. Шевцов" w:date="2026-10-17T12:00:00Z">
+      <w:del w:id="1220" w:author="А.А. Шевцов" w:date="2026-10-17T12:00:00Z">
         <w:r>
           <w:rPr>
             <w:rFonts w:ascii="Times New Roman" w:hAnsi="Times New Roman"/>
@@ -9333,7 +9408,7 @@
           <w:delText xml:space="preserve">"</w:delText>
         </w:r>
       </w:del>
-      <w:ins w:id="1215" w:author="А.А. Шевцов" w:date="2026-10-17T12:00:00Z">
+      <w:ins w:id="1221" w:author="А.А. Шевцов" w:date="2026-10-17T12:00:00Z">
         <w:r>
           <w:rPr>
             <w:rFonts w:ascii="Times New Roman" w:hAnsi="Times New Roman"/>
@@ -9347,7 +9422,7 @@
         </w:rPr>
         <w:t xml:space="preserve">physical city</w:t>
       </w:r>
-      <w:del w:id="1212" w:author="А.А. Шевцов" w:date="2026-10-17T12:00:00Z">
+      <w:del w:id="1218" w:author="А.А. Шевцов" w:date="2026-10-17T12:00:00Z">
         <w:r>
           <w:rPr>
             <w:rFonts w:ascii="Times New Roman" w:hAnsi="Times New Roman"/>
@@ -9355,7 +9430,7 @@
           <w:delText xml:space="preserve">"</w:delText>
         </w:r>
       </w:del>
-      <w:ins w:id="1213" w:author="А.А. Шевцов" w:date="2026-10-17T12:00:00Z">
+      <w:ins w:id="1219" w:author="А.А. Шевцов" w:date="2026-10-17T12:00:00Z">
         <w:r>
           <w:rPr>
             <w:rFonts w:ascii="Times New Roman" w:hAnsi="Times New Roman"/>
@@ -9503,7 +9578,7 @@
         </w:rPr>
         <w:t xml:space="preserve"> Spatial data portal National Spatial Data System. https://nspd.gov.ru (date </w:t>
       </w:r>
-      <w:del w:id="904" w:author="А.А. Шевцов" w:date="2026-10-17T12:00:00Z">
+      <w:del w:id="906" w:author="А.А. Шевцов" w:date="2026-10-17T12:00:00Z">
         <w:r>
           <w:rPr>
             <w:rFonts w:ascii="Times New Roman" w:hAnsi="Times New Roman"/>
@@ -9511,7 +9586,7 @@
           <w:delText xml:space="preserve">accessed:</w:delText>
         </w:r>
       </w:del>
-      <w:ins w:id="905" w:author="А.А. Шевцов" w:date="2026-10-17T12:00:00Z">
+      <w:ins w:id="907" w:author="А.А. Шевцов" w:date="2026-10-17T12:00:00Z">
         <w:r>
           <w:rPr>
             <w:rFonts w:ascii="Times New Roman" w:hAnsi="Times New Roman"/>
@@ -9549,6 +9624,28 @@
         </w:rPr>
         <w:t xml:space="preserve">Kontikimaps. </w:t>
       </w:r>
+      <w:del w:id="920" w:author="А.А. Шевцов" w:date="2026-10-17T12:00:00Z">
+        <w:r>
+          <w:rPr>
+            <w:rFonts w:ascii="Times New Roman" w:hAnsi="Times New Roman"/>
+          </w:rPr>
+          <w:delText xml:space="preserve">"</w:delText>
+        </w:r>
+      </w:del>
+      <w:ins w:id="921" w:author="А.А. Шевцов" w:date="2026-10-17T12:00:00Z">
+        <w:r>
+          <w:rPr>
+            <w:rFonts w:ascii="Times New Roman" w:hAnsi="Times New Roman"/>
+          </w:rPr>
+          <w:t xml:space="preserve">“</w:t>
+        </w:r>
+      </w:ins>
+      <w:r>
+        <w:rPr>
+          <w:rFonts w:ascii="Times New Roman" w:hAnsi="Times New Roman"/>
+        </w:rPr>
+        <w:t xml:space="preserve">How Old is This House.</w:t>
+      </w:r>
       <w:del w:id="918" w:author="А.А. Шевцов" w:date="2026-10-17T12:00:00Z">
         <w:r>
           <w:rPr>
@@ -9562,46 +9659,24 @@
           <w:rPr>
             <w:rFonts w:ascii="Times New Roman" w:hAnsi="Times New Roman"/>
           </w:rPr>
-          <w:t xml:space="preserve">“</w:t>
+          <w:t xml:space="preserve">”</w:t>
         </w:r>
       </w:ins>
       <w:r>
         <w:rPr>
           <w:rFonts w:ascii="Times New Roman" w:hAnsi="Times New Roman"/>
         </w:rPr>
-        <w:t xml:space="preserve">How Old is This House.</w:t>
-      </w:r>
-      <w:del w:id="916" w:author="А.А. Шевцов" w:date="2026-10-17T12:00:00Z">
-        <w:r>
-          <w:rPr>
-            <w:rFonts w:ascii="Times New Roman" w:hAnsi="Times New Roman"/>
-          </w:rPr>
-          <w:delText xml:space="preserve">"</w:delText>
+        <w:t xml:space="preserve"> https://kontikimaps.ru/hoith </w:t>
+      </w:r>
+      <w:del w:id="910" w:author="А.А. Шевцов" w:date="2026-10-17T12:00:00Z">
+        <w:r>
+          <w:rPr>
+            <w:rFonts w:ascii="Times New Roman" w:hAnsi="Times New Roman"/>
+          </w:rPr>
+          <w:delText xml:space="preserve">(accessed:</w:delText>
         </w:r>
       </w:del>
-      <w:ins w:id="917" w:author="А.А. Шевцов" w:date="2026-10-17T12:00:00Z">
-        <w:r>
-          <w:rPr>
-            <w:rFonts w:ascii="Times New Roman" w:hAnsi="Times New Roman"/>
-          </w:rPr>
-          <w:t xml:space="preserve">”</w:t>
-        </w:r>
-      </w:ins>
-      <w:r>
-        <w:rPr>
-          <w:rFonts w:ascii="Times New Roman" w:hAnsi="Times New Roman"/>
-        </w:rPr>
-        <w:t xml:space="preserve"> https://kontikimaps.ru/hoith </w:t>
-      </w:r>
-      <w:del w:id="908" w:author="А.А. Шевцов" w:date="2026-10-17T12:00:00Z">
-        <w:r>
-          <w:rPr>
-            <w:rFonts w:ascii="Times New Roman" w:hAnsi="Times New Roman"/>
-          </w:rPr>
-          <w:delText xml:space="preserve">(accessed:</w:delText>
-        </w:r>
-      </w:del>
-      <w:ins w:id="909" w:author="А.А. Шевцов" w:date="2026-10-17T12:00:00Z">
+      <w:ins w:id="911" w:author="А.А. Шевцов" w:date="2026-10-17T12:00:00Z">
         <w:r>
           <w:rPr>
             <w:rFonts w:ascii="Times New Roman" w:hAnsi="Times New Roman"/>
@@ -9639,7 +9714,7 @@
         </w:rPr>
         <w:t xml:space="preserve">OpenStreetMap. https://www.openstreetmap.org (date </w:t>
       </w:r>
-      <w:del w:id="906" w:author="А.А. Шевцов" w:date="2026-10-17T12:00:00Z">
+      <w:del w:id="908" w:author="А.А. Шевцов" w:date="2026-10-17T12:00:00Z">
         <w:r>
           <w:rPr>
             <w:rFonts w:ascii="Times New Roman" w:hAnsi="Times New Roman"/>
@@ -9647,7 +9722,7 @@
           <w:delText xml:space="preserve">accessed:</w:delText>
         </w:r>
       </w:del>
-      <w:ins w:id="907" w:author="А.А. Шевцов" w:date="2026-10-17T12:00:00Z">
+      <w:ins w:id="909" w:author="А.А. Шевцов" w:date="2026-10-17T12:00:00Z">
         <w:r>
           <w:rPr>
             <w:rFonts w:ascii="Times New Roman" w:hAnsi="Times New Roman"/>
@@ -9683,9 +9758,31 @@
         <w:rPr>
           <w:rFonts w:ascii="Times New Roman" w:hAnsi="Times New Roman"/>
         </w:rPr>
-        <w:t xml:space="preserve">Earth Explorer. https://earthexplorernasa.gov/ </w:t>
-      </w:r>
-      <w:del w:id="910" w:author="А.А. Шевцов" w:date="2026-10-17T12:00:00Z">
+        <w:t xml:space="preserve">Earth Explorer. https://</w:t>
+      </w:r>
+      <w:del w:id="904" w:author="А.А. Шевцов" w:date="2026-10-17T12:00:00Z">
+        <w:r>
+          <w:rPr>
+            <w:rFonts w:ascii="Times New Roman" w:hAnsi="Times New Roman"/>
+          </w:rPr>
+          <w:delText xml:space="preserve">earthexplorernasa.gov</w:delText>
+        </w:r>
+      </w:del>
+      <w:ins w:id="905" w:author="А.А. Шевцов" w:date="2026-10-17T12:00:00Z">
+        <w:r>
+          <w:rPr>
+            <w:rFonts w:ascii="Times New Roman" w:hAnsi="Times New Roman"/>
+          </w:rPr>
+          <w:t xml:space="preserve">earthexplorer.usgs.gov</w:t>
+        </w:r>
+      </w:ins>
+      <w:r>
+        <w:rPr>
+          <w:rFonts w:ascii="Times New Roman" w:hAnsi="Times New Roman"/>
+        </w:rPr>
+        <w:t xml:space="preserve">/ </w:t>
+      </w:r>
+      <w:del w:id="912" w:author="А.А. Шевцов" w:date="2026-10-17T12:00:00Z">
         <w:r>
           <w:rPr>
             <w:rFonts w:ascii="Times New Roman" w:hAnsi="Times New Roman"/>
@@ -9693,7 +9790,7 @@
           <w:delText xml:space="preserve">(accessed:</w:delText>
         </w:r>
       </w:del>
-      <w:ins w:id="911" w:author="А.А. Шевцов" w:date="2026-10-17T12:00:00Z">
+      <w:ins w:id="913" w:author="А.А. Шевцов" w:date="2026-10-17T12:00:00Z">
         <w:r>
           <w:rPr>
             <w:rFonts w:ascii="Times New Roman" w:hAnsi="Times New Roman"/>
@@ -9769,6 +9866,50 @@
         </w:rPr>
         <w:t xml:space="preserve"> </w:t>
       </w:r>
+      <w:del w:id="924" w:author="А.А. Шевцов" w:date="2026-10-17T12:00:00Z">
+        <w:r>
+          <w:rPr>
+            <w:rFonts w:ascii="Times New Roman" w:hAnsi="Times New Roman"/>
+          </w:rPr>
+          <w:delText xml:space="preserve">"</w:delText>
+        </w:r>
+      </w:del>
+      <w:ins w:id="925" w:author="А.А. Шевцов" w:date="2026-10-17T12:00:00Z">
+        <w:r>
+          <w:rPr>
+            <w:rFonts w:ascii="Times New Roman" w:hAnsi="Times New Roman"/>
+          </w:rPr>
+          <w:t xml:space="preserve">“</w:t>
+        </w:r>
+      </w:ins>
+      <w:r>
+        <w:rPr>
+          <w:rFonts w:ascii="Times New Roman" w:hAnsi="Times New Roman"/>
+        </w:rPr>
+        <w:t xml:space="preserve">To </w:t>
+      </w:r>
+      <w:del w:id="916" w:author="А.А. Шевцов" w:date="2026-10-17T12:00:00Z">
+        <w:r>
+          <w:rPr>
+            <w:rFonts w:ascii="Times New Roman" w:hAnsi="Times New Roman"/>
+          </w:rPr>
+          <w:delText xml:space="preserve">be precise</w:delText>
+        </w:r>
+      </w:del>
+      <w:ins w:id="917" w:author="А.А. Шевцов" w:date="2026-10-17T12:00:00Z">
+        <w:r>
+          <w:rPr>
+            <w:rFonts w:ascii="Times New Roman" w:hAnsi="Times New Roman"/>
+          </w:rPr>
+          <w:t xml:space="preserve">Be Precise</w:t>
+        </w:r>
+      </w:ins>
+      <w:r>
+        <w:rPr>
+          <w:rFonts w:ascii="Times New Roman" w:hAnsi="Times New Roman"/>
+        </w:rPr>
+        <w:t xml:space="preserve">.</w:t>
+      </w:r>
       <w:del w:id="922" w:author="А.А. Шевцов" w:date="2026-10-17T12:00:00Z">
         <w:r>
           <w:rPr>
@@ -9782,71 +9923,27 @@
           <w:rPr>
             <w:rFonts w:ascii="Times New Roman" w:hAnsi="Times New Roman"/>
           </w:rPr>
-          <w:t xml:space="preserve">“</w:t>
+          <w:t xml:space="preserve">”</w:t>
         </w:r>
       </w:ins>
       <w:r>
-        <w:rPr>
-          <w:rFonts w:ascii="Times New Roman" w:hAnsi="Times New Roman"/>
-        </w:rPr>
-        <w:t xml:space="preserve">To </w:t>
+        <w:t xml:space="preserve"> </w:t>
+      </w:r>
+      <w:r>
+        <w:rPr>
+          <w:rFonts w:ascii="Times New Roman" w:hAnsi="Times New Roman"/>
+        </w:rPr>
+        <w:t xml:space="preserve">Russian Financial Reporting Database. https://tochno.st/datasets/rfsd </w:t>
       </w:r>
       <w:del w:id="914" w:author="А.А. Шевцов" w:date="2026-10-17T12:00:00Z">
         <w:r>
           <w:rPr>
             <w:rFonts w:ascii="Times New Roman" w:hAnsi="Times New Roman"/>
           </w:rPr>
-          <w:delText xml:space="preserve">be precise</w:delText>
+          <w:delText xml:space="preserve">(accessed:</w:delText>
         </w:r>
       </w:del>
       <w:ins w:id="915" w:author="А.А. Шевцов" w:date="2026-10-17T12:00:00Z">
-        <w:r>
-          <w:rPr>
-            <w:rFonts w:ascii="Times New Roman" w:hAnsi="Times New Roman"/>
-          </w:rPr>
-          <w:t xml:space="preserve">Be Precise</w:t>
-        </w:r>
-      </w:ins>
-      <w:r>
-        <w:rPr>
-          <w:rFonts w:ascii="Times New Roman" w:hAnsi="Times New Roman"/>
-        </w:rPr>
-        <w:t xml:space="preserve">.</w:t>
-      </w:r>
-      <w:del w:id="920" w:author="А.А. Шевцов" w:date="2026-10-17T12:00:00Z">
-        <w:r>
-          <w:rPr>
-            <w:rFonts w:ascii="Times New Roman" w:hAnsi="Times New Roman"/>
-          </w:rPr>
-          <w:delText xml:space="preserve">"</w:delText>
-        </w:r>
-      </w:del>
-      <w:ins w:id="921" w:author="А.А. Шевцов" w:date="2026-10-17T12:00:00Z">
-        <w:r>
-          <w:rPr>
-            <w:rFonts w:ascii="Times New Roman" w:hAnsi="Times New Roman"/>
-          </w:rPr>
-          <w:t xml:space="preserve">”</w:t>
-        </w:r>
-      </w:ins>
-      <w:r>
-        <w:t xml:space="preserve"> </w:t>
-      </w:r>
-      <w:r>
-        <w:rPr>
-          <w:rFonts w:ascii="Times New Roman" w:hAnsi="Times New Roman"/>
-        </w:rPr>
-        <w:t xml:space="preserve">Russian Financial Reporting Database. https://tochno.st/datasets/rfsd </w:t>
-      </w:r>
-      <w:del w:id="912" w:author="А.А. Шевцов" w:date="2026-10-17T12:00:00Z">
-        <w:r>
-          <w:rPr>
-            <w:rFonts w:ascii="Times New Roman" w:hAnsi="Times New Roman"/>
-          </w:rPr>
-          <w:delText xml:space="preserve">(accessed:</w:delText>
-        </w:r>
-      </w:del>
-      <w:ins w:id="913" w:author="А.А. Шевцов" w:date="2026-10-17T12:00:00Z">
         <w:r>
           <w:rPr>
             <w:rFonts w:ascii="Times New Roman" w:hAnsi="Times New Roman"/>

</xml_diff>

<commit_message>
Align title and abstract with published version; revert Hansen wording
Co-Authored-By: Claude Sonnet 5.5 <noreply@anthropic.com>
Claude-Session: https://claude.ai/code/session_01UR1NZjK59cEf7XcfQ71PDe
</commit_message>
<xml_diff>
--- a/RegRes2670014Shevtsov_reviewed.docx
+++ b/RegRes2670014Shevtsov_reviewed.docx
@@ -47,7 +47,7 @@
           <w:szCs w:val="26"/>
         </w:rPr>
       </w:pPr>
-      <w:del w:id="902" w:author="А.А. Шевцов" w:date="2026-10-17T12:00:00Z">
+      <w:del w:id="1026" w:author="А.А. Шевцов" w:date="2026-10-17T12:00:00Z">
         <w:r>
           <w:rPr>
             <w:rFonts w:ascii="Times New Roman" w:hAnsi="Times New Roman"/>
@@ -59,7 +59,7 @@
           <w:delText xml:space="preserve">Spatial Development of Voronezh and its Near Suburban Areas in the Post-Soviet Period</w:delText>
         </w:r>
       </w:del>
-      <w:ins w:id="903" w:author="А.А. Шевцов" w:date="2026-10-17T12:00:00Z">
+      <w:ins w:id="1027" w:author="А.А. Шевцов" w:date="2026-10-17T12:00:00Z">
         <w:r>
           <w:rPr>
             <w:rFonts w:ascii="Times New Roman" w:hAnsi="Times New Roman"/>
@@ -68,7 +68,7 @@
             <w:sz w:val="26"/>
             <w:szCs w:val="26"/>
           </w:rPr>
-          <w:t xml:space="preserve">Post-Soviet Evolution of Territorial Growth of Voronezh and Its Immediate Suburbs</w:t>
+          <w:t xml:space="preserve">Post-Soviet spatial development of Voronezh and its nearby suburbs</w:t>
         </w:r>
       </w:ins>
     </w:p>
@@ -185,7 +185,7 @@
         </w:rPr>
         <w:t>a</w:t>
       </w:r>
-      <w:del w:id="904" w:author="А.А. Шевцов" w:date="2026-10-17T12:00:00Z">
+      <w:del w:id="1028" w:author="А.А. Шевцов" w:date="2026-10-17T12:00:00Z">
         <w:r>
           <w:rPr>
             <w:rFonts w:ascii="Times New Roman" w:hAnsi="Times New Roman"/>
@@ -349,18 +349,1368 @@
           <w:rFonts w:ascii="Times New Roman" w:hAnsi="Times New Roman" w:cs="Times New Roman"/>
         </w:rPr>
       </w:pPr>
-      <w:r>
-        <w:rPr>
-          <w:rFonts w:ascii="Times New Roman" w:hAnsi="Times New Roman"/>
-        </w:rPr>
-        <w:t xml:space="preserve">This article examines the spatial transformation of Voronezh and its suburbs from 1992 to 2025. The aim of the work is to identify spatial and temporal patterns in the transformation of built-up areas in the context of the transition to a market-based development model. The methodology is based on combining the analysis of the dynamics of the physical boundaries of development with localized economic indicators: the cadastral value of land and the density of consumer activity (based on data from the Federal Tax Service). The nonlinear nature of the expansion has been established, in which four stages are distinguished: from the transition period of spontaneous growth (1992–2000) to the phase of slowing expansion and the formation of a framework of suburban shopping centers (2000–2010), followed by a stage of “explosive expansion” in the context of increasing availability of credit (2010–2020) and the current stage of stabilization of growth rates and morphological consolidation (2020–2025). A persistent spatial asymmetry was identified: more than 58% of the total increase was recorded in the northern and eastern sectors. It has been established that the development of the </w:t>
+      <w:del w:id="1024" w:author="А.А. Шевцов" w:date="2026-10-17T12:00:00Z">
+        <w:r>
+          <w:rPr>
+            <w:rFonts w:ascii="Times New Roman" w:hAnsi="Times New Roman"/>
+          </w:rPr>
+          <w:delText xml:space="preserve">This</w:delText>
+        </w:r>
+      </w:del>
+      <w:ins w:id="1025" w:author="А.А. Шевцов" w:date="2026-10-17T12:00:00Z">
+        <w:r>
+          <w:rPr>
+            <w:rFonts w:ascii="Times New Roman" w:hAnsi="Times New Roman"/>
+          </w:rPr>
+          <w:t xml:space="preserve">The</w:t>
+        </w:r>
+      </w:ins>
+      <w:r>
+        <w:rPr>
+          <w:rFonts w:ascii="Times New Roman" w:hAnsi="Times New Roman"/>
+        </w:rPr>
+        <w:t xml:space="preserve"> article examines the spatial transformation of Voronezh and its </w:t>
+      </w:r>
+      <w:del w:id="1022" w:author="А.А. Шевцов" w:date="2026-10-17T12:00:00Z">
+        <w:r>
+          <w:rPr>
+            <w:rFonts w:ascii="Times New Roman" w:hAnsi="Times New Roman"/>
+          </w:rPr>
+          <w:delText xml:space="preserve">suburbs</w:delText>
+        </w:r>
+      </w:del>
+      <w:ins w:id="1023" w:author="А.А. Шевцов" w:date="2026-10-17T12:00:00Z">
+        <w:r>
+          <w:rPr>
+            <w:rFonts w:ascii="Times New Roman" w:hAnsi="Times New Roman"/>
+          </w:rPr>
+          <w:t xml:space="preserve">immediate suburban zone</w:t>
+        </w:r>
+      </w:ins>
+      <w:r>
+        <w:rPr>
+          <w:rFonts w:ascii="Times New Roman" w:hAnsi="Times New Roman"/>
+        </w:rPr>
+        <w:t xml:space="preserve"> from 1992 to 2025. The </w:t>
+      </w:r>
+      <w:del w:id="1020" w:author="А.А. Шевцов" w:date="2026-10-17T12:00:00Z">
+        <w:r>
+          <w:rPr>
+            <w:rFonts w:ascii="Times New Roman" w:hAnsi="Times New Roman"/>
+          </w:rPr>
+          <w:delText xml:space="preserve">aim</w:delText>
+        </w:r>
+      </w:del>
+      <w:ins w:id="1021" w:author="А.А. Шевцов" w:date="2026-10-17T12:00:00Z">
+        <w:r>
+          <w:rPr>
+            <w:rFonts w:ascii="Times New Roman" w:hAnsi="Times New Roman"/>
+          </w:rPr>
+          <w:t xml:space="preserve">study</w:t>
+        </w:r>
+      </w:ins>
+      <w:r>
+        <w:rPr>
+          <w:rFonts w:ascii="Times New Roman" w:hAnsi="Times New Roman"/>
+        </w:rPr>
+        <w:t xml:space="preserve"> </w:t>
+      </w:r>
+      <w:del w:id="1018" w:author="А.А. Шевцов" w:date="2026-10-17T12:00:00Z">
+        <w:r>
+          <w:rPr>
+            <w:rFonts w:ascii="Times New Roman" w:hAnsi="Times New Roman"/>
+          </w:rPr>
+          <w:delText xml:space="preserve">of the work is</w:delText>
+        </w:r>
+      </w:del>
+      <w:ins w:id="1019" w:author="А.А. Шевцов" w:date="2026-10-17T12:00:00Z">
+        <w:r>
+          <w:rPr>
+            <w:rFonts w:ascii="Times New Roman" w:hAnsi="Times New Roman"/>
+          </w:rPr>
+          <w:t xml:space="preserve">aims</w:t>
+        </w:r>
+      </w:ins>
+      <w:r>
+        <w:rPr>
+          <w:rFonts w:ascii="Times New Roman" w:hAnsi="Times New Roman"/>
+        </w:rPr>
+        <w:t xml:space="preserve"> to identify </w:t>
+      </w:r>
+      <w:del w:id="1016" w:author="А.А. Шевцов" w:date="2026-10-17T12:00:00Z">
+        <w:r>
+          <w:rPr>
+            <w:rFonts w:ascii="Times New Roman" w:hAnsi="Times New Roman"/>
+          </w:rPr>
+          <w:delText xml:space="preserve">spatial and </w:delText>
+        </w:r>
+      </w:del>
+      <w:ins w:id="1017" w:author="А.А. Шевцов" w:date="2026-10-17T12:00:00Z">
+        <w:r>
+          <w:rPr>
+            <w:rFonts w:ascii="Times New Roman" w:hAnsi="Times New Roman"/>
+          </w:rPr>
+          <w:t xml:space="preserve">spatio-</w:t>
+        </w:r>
+      </w:ins>
+      <w:r>
+        <w:rPr>
+          <w:rFonts w:ascii="Times New Roman" w:hAnsi="Times New Roman"/>
+        </w:rPr>
+        <w:t xml:space="preserve">temporal patterns</w:t>
+      </w:r>
+      <w:del w:id="1015" w:author="А.А. Шевцов" w:date="2026-10-17T12:00:00Z">
+        <w:r>
+          <w:rPr>
+            <w:rFonts w:ascii="Times New Roman" w:hAnsi="Times New Roman"/>
+          </w:rPr>
+          <w:delText xml:space="preserve"> in the transformation</w:delText>
+        </w:r>
+      </w:del>
+      <w:r>
+        <w:rPr>
+          <w:rFonts w:ascii="Times New Roman" w:hAnsi="Times New Roman"/>
+        </w:rPr>
+        <w:t xml:space="preserve"> of built-up </w:t>
+      </w:r>
+      <w:del w:id="1013" w:author="А.А. Шевцов" w:date="2026-10-17T12:00:00Z">
+        <w:r>
+          <w:rPr>
+            <w:rFonts w:ascii="Times New Roman" w:hAnsi="Times New Roman"/>
+          </w:rPr>
+          <w:delText xml:space="preserve">areas</w:delText>
+        </w:r>
+      </w:del>
+      <w:ins w:id="1014" w:author="А.А. Шевцов" w:date="2026-10-17T12:00:00Z">
+        <w:r>
+          <w:rPr>
+            <w:rFonts w:ascii="Times New Roman" w:hAnsi="Times New Roman"/>
+          </w:rPr>
+          <w:t xml:space="preserve">area transformation</w:t>
+        </w:r>
+      </w:ins>
+      <w:r>
+        <w:rPr>
+          <w:rFonts w:ascii="Times New Roman" w:hAnsi="Times New Roman"/>
+        </w:rPr>
+        <w:t xml:space="preserve"> in the context of the transition to a market-based development model. The methodology is based on combining the analysis of </w:t>
+      </w:r>
+      <w:del w:id="1011" w:author="А.А. Шевцов" w:date="2026-10-17T12:00:00Z">
+        <w:r>
+          <w:rPr>
+            <w:rFonts w:ascii="Times New Roman" w:hAnsi="Times New Roman"/>
+          </w:rPr>
+          <w:delText xml:space="preserve">the</w:delText>
+        </w:r>
+      </w:del>
+      <w:ins w:id="1012" w:author="А.А. Шевцов" w:date="2026-10-17T12:00:00Z">
+        <w:r>
+          <w:rPr>
+            <w:rFonts w:ascii="Times New Roman" w:hAnsi="Times New Roman"/>
+          </w:rPr>
+          <w:t xml:space="preserve">physical urban boundary</w:t>
+        </w:r>
+      </w:ins>
+      <w:r>
+        <w:rPr>
+          <w:rFonts w:ascii="Times New Roman" w:hAnsi="Times New Roman"/>
+        </w:rPr>
+        <w:t xml:space="preserve"> dynamics</w:t>
+      </w:r>
+      <w:del w:id="1010" w:author="А.А. Шевцов" w:date="2026-10-17T12:00:00Z">
+        <w:r>
+          <w:rPr>
+            <w:rFonts w:ascii="Times New Roman" w:hAnsi="Times New Roman"/>
+          </w:rPr>
+          <w:delText xml:space="preserve"> of the physical boundaries of development</w:delText>
+        </w:r>
+      </w:del>
+      <w:r>
+        <w:rPr>
+          <w:rFonts w:ascii="Times New Roman" w:hAnsi="Times New Roman"/>
+        </w:rPr>
+        <w:t xml:space="preserve"> with localized economic indicators: </w:t>
+      </w:r>
+      <w:del w:id="1009" w:author="А.А. Шевцов" w:date="2026-10-17T12:00:00Z">
+        <w:r>
+          <w:rPr>
+            <w:rFonts w:ascii="Times New Roman" w:hAnsi="Times New Roman"/>
+          </w:rPr>
+          <w:delText xml:space="preserve">the </w:delText>
+        </w:r>
+      </w:del>
+      <w:r>
+        <w:rPr>
+          <w:rFonts w:ascii="Times New Roman" w:hAnsi="Times New Roman"/>
+        </w:rPr>
+        <w:t xml:space="preserve">cadastral</w:t>
+      </w:r>
+      <w:del w:id="1008" w:author="А.А. Шевцов" w:date="2026-10-17T12:00:00Z">
+        <w:r>
+          <w:rPr>
+            <w:rFonts w:ascii="Times New Roman" w:hAnsi="Times New Roman"/>
+          </w:rPr>
+          <w:delText xml:space="preserve"> value of</w:delText>
+        </w:r>
+      </w:del>
+      <w:r>
+        <w:rPr>
+          <w:rFonts w:ascii="Times New Roman" w:hAnsi="Times New Roman"/>
+        </w:rPr>
+        <w:t xml:space="preserve"> land </w:t>
+      </w:r>
+      <w:ins w:id="1007" w:author="А.А. Шевцов" w:date="2026-10-17T12:00:00Z">
+        <w:r>
+          <w:rPr>
+            <w:rFonts w:ascii="Times New Roman" w:hAnsi="Times New Roman"/>
+          </w:rPr>
+          <w:t xml:space="preserve">values </w:t>
+        </w:r>
+      </w:ins>
+      <w:r>
+        <w:rPr>
+          <w:rFonts w:ascii="Times New Roman" w:hAnsi="Times New Roman"/>
+        </w:rPr>
+        <w:t xml:space="preserve">and</w:t>
+      </w:r>
+      <w:del w:id="1006" w:author="А.А. Шевцов" w:date="2026-10-17T12:00:00Z">
+        <w:r>
+          <w:rPr>
+            <w:rFonts w:ascii="Times New Roman" w:hAnsi="Times New Roman"/>
+          </w:rPr>
+          <w:delText xml:space="preserve"> the density of</w:delText>
+        </w:r>
+      </w:del>
+      <w:r>
+        <w:rPr>
+          <w:rFonts w:ascii="Times New Roman" w:hAnsi="Times New Roman"/>
+        </w:rPr>
+        <w:t xml:space="preserve"> consumer activity</w:t>
+      </w:r>
+      <w:ins w:id="1005" w:author="А.А. Шевцов" w:date="2026-10-17T12:00:00Z">
+        <w:r>
+          <w:rPr>
+            <w:rFonts w:ascii="Times New Roman" w:hAnsi="Times New Roman"/>
+          </w:rPr>
+          <w:t xml:space="preserve"> density</w:t>
+        </w:r>
+      </w:ins>
+      <w:r>
+        <w:rPr>
+          <w:rFonts w:ascii="Times New Roman" w:hAnsi="Times New Roman"/>
+        </w:rPr>
+        <w:t xml:space="preserve"> (based on </w:t>
+      </w:r>
+      <w:del w:id="1004" w:author="А.А. Шевцов" w:date="2026-10-17T12:00:00Z">
+        <w:r>
+          <w:rPr>
+            <w:rFonts w:ascii="Times New Roman" w:hAnsi="Times New Roman"/>
+          </w:rPr>
+          <w:delText xml:space="preserve">data from the </w:delText>
+        </w:r>
+      </w:del>
+      <w:r>
+        <w:rPr>
+          <w:rFonts w:ascii="Times New Roman" w:hAnsi="Times New Roman"/>
+        </w:rPr>
+        <w:t xml:space="preserve">Federal Tax Service</w:t>
+      </w:r>
+      <w:ins w:id="1003" w:author="А.А. Шевцов" w:date="2026-10-17T12:00:00Z">
+        <w:r>
+          <w:rPr>
+            <w:rFonts w:ascii="Times New Roman" w:hAnsi="Times New Roman"/>
+          </w:rPr>
+          <w:t xml:space="preserve"> data</w:t>
+        </w:r>
+      </w:ins>
+      <w:r>
+        <w:rPr>
+          <w:rFonts w:ascii="Times New Roman" w:hAnsi="Times New Roman"/>
+        </w:rPr>
+        <w:t xml:space="preserve">). </w:t>
+      </w:r>
+      <w:del w:id="1001" w:author="А.А. Шевцов" w:date="2026-10-17T12:00:00Z">
+        <w:r>
+          <w:rPr>
+            <w:rFonts w:ascii="Times New Roman" w:hAnsi="Times New Roman"/>
+          </w:rPr>
+          <w:delText xml:space="preserve">The</w:delText>
+        </w:r>
+      </w:del>
+      <w:ins w:id="1002" w:author="А.А. Шевцов" w:date="2026-10-17T12:00:00Z">
+        <w:r>
+          <w:rPr>
+            <w:rFonts w:ascii="Times New Roman" w:hAnsi="Times New Roman"/>
+          </w:rPr>
+          <w:t xml:space="preserve">A</w:t>
+        </w:r>
+      </w:ins>
+      <w:r>
+        <w:rPr>
+          <w:rFonts w:ascii="Times New Roman" w:hAnsi="Times New Roman"/>
+        </w:rPr>
+        <w:t xml:space="preserve"> </w:t>
+      </w:r>
+      <w:del w:id="999" w:author="А.А. Шевцов" w:date="2026-10-17T12:00:00Z">
+        <w:r>
+          <w:rPr>
+            <w:rFonts w:ascii="Times New Roman" w:hAnsi="Times New Roman"/>
+          </w:rPr>
+          <w:delText xml:space="preserve">nonlinear</w:delText>
+        </w:r>
+      </w:del>
+      <w:ins w:id="1000" w:author="А.А. Шевцов" w:date="2026-10-17T12:00:00Z">
+        <w:r>
+          <w:rPr>
+            <w:rFonts w:ascii="Times New Roman" w:hAnsi="Times New Roman"/>
+          </w:rPr>
+          <w:t xml:space="preserve">non-linear</w:t>
+        </w:r>
+      </w:ins>
+      <w:r>
+        <w:rPr>
+          <w:rFonts w:ascii="Times New Roman" w:hAnsi="Times New Roman"/>
+        </w:rPr>
+        <w:t xml:space="preserve"> nature of </w:t>
+      </w:r>
+      <w:del w:id="998" w:author="А.А. Шевцов" w:date="2026-10-17T12:00:00Z">
+        <w:r>
+          <w:rPr>
+            <w:rFonts w:ascii="Times New Roman" w:hAnsi="Times New Roman"/>
+          </w:rPr>
+          <w:delText xml:space="preserve">the </w:delText>
+        </w:r>
+      </w:del>
+      <w:r>
+        <w:rPr>
+          <w:rFonts w:ascii="Times New Roman" w:hAnsi="Times New Roman"/>
+        </w:rPr>
+        <w:t xml:space="preserve">expansion </w:t>
+      </w:r>
+      <w:del w:id="996" w:author="А.А. Шевцов" w:date="2026-10-17T12:00:00Z">
+        <w:r>
+          <w:rPr>
+            <w:rFonts w:ascii="Times New Roman" w:hAnsi="Times New Roman"/>
+          </w:rPr>
+          <w:delText xml:space="preserve">has been</w:delText>
+        </w:r>
+      </w:del>
+      <w:ins w:id="997" w:author="А.А. Шевцов" w:date="2026-10-17T12:00:00Z">
+        <w:r>
+          <w:rPr>
+            <w:rFonts w:ascii="Times New Roman" w:hAnsi="Times New Roman"/>
+          </w:rPr>
+          <w:t xml:space="preserve">was</w:t>
+        </w:r>
+      </w:ins>
+      <w:r>
+        <w:rPr>
+          <w:rFonts w:ascii="Times New Roman" w:hAnsi="Times New Roman"/>
+        </w:rPr>
+        <w:t xml:space="preserve"> established, </w:t>
+      </w:r>
+      <w:del w:id="994" w:author="А.А. Шевцов" w:date="2026-10-17T12:00:00Z">
+        <w:r>
+          <w:rPr>
+            <w:rFonts w:ascii="Times New Roman" w:hAnsi="Times New Roman"/>
+          </w:rPr>
+          <w:delText xml:space="preserve">in</w:delText>
+        </w:r>
+      </w:del>
+      <w:ins w:id="995" w:author="А.А. Шевцов" w:date="2026-10-17T12:00:00Z">
+        <w:r>
+          <w:rPr>
+            <w:rFonts w:ascii="Times New Roman" w:hAnsi="Times New Roman"/>
+          </w:rPr>
+          <w:t xml:space="preserve">progressing</w:t>
+        </w:r>
+      </w:ins>
+      <w:r>
+        <w:rPr>
+          <w:rFonts w:ascii="Times New Roman" w:hAnsi="Times New Roman"/>
+        </w:rPr>
+        <w:t xml:space="preserve"> </w:t>
+      </w:r>
+      <w:del w:id="992" w:author="А.А. Шевцов" w:date="2026-10-17T12:00:00Z">
+        <w:r>
+          <w:rPr>
+            <w:rFonts w:ascii="Times New Roman" w:hAnsi="Times New Roman"/>
+          </w:rPr>
+          <w:delText xml:space="preserve">which</w:delText>
+        </w:r>
+      </w:del>
+      <w:ins w:id="993" w:author="А.А. Шевцов" w:date="2026-10-17T12:00:00Z">
+        <w:r>
+          <w:rPr>
+            <w:rFonts w:ascii="Times New Roman" w:hAnsi="Times New Roman"/>
+          </w:rPr>
+          <w:t xml:space="preserve">through</w:t>
+        </w:r>
+      </w:ins>
+      <w:r>
+        <w:rPr>
+          <w:rFonts w:ascii="Times New Roman" w:hAnsi="Times New Roman"/>
+        </w:rPr>
+        <w:t xml:space="preserve"> four stages</w:t>
+      </w:r>
+      <w:del w:id="991" w:author="А.А. Шевцов" w:date="2026-10-17T12:00:00Z">
+        <w:r>
+          <w:rPr>
+            <w:rFonts w:ascii="Times New Roman" w:hAnsi="Times New Roman"/>
+          </w:rPr>
+          <w:delText xml:space="preserve"> are distinguished</w:delText>
+        </w:r>
+      </w:del>
+      <w:r>
+        <w:rPr>
+          <w:rFonts w:ascii="Times New Roman" w:hAnsi="Times New Roman"/>
+        </w:rPr>
+        <w:t xml:space="preserve">: from </w:t>
+      </w:r>
+      <w:del w:id="989" w:author="А.А. Шевцов" w:date="2026-10-17T12:00:00Z">
+        <w:r>
+          <w:rPr>
+            <w:rFonts w:ascii="Times New Roman" w:hAnsi="Times New Roman"/>
+          </w:rPr>
+          <w:delText xml:space="preserve">the</w:delText>
+        </w:r>
+      </w:del>
+      <w:ins w:id="990" w:author="А.А. Шевцов" w:date="2026-10-17T12:00:00Z">
+        <w:r>
+          <w:rPr>
+            <w:rFonts w:ascii="Times New Roman" w:hAnsi="Times New Roman"/>
+          </w:rPr>
+          <w:t xml:space="preserve">a</w:t>
+        </w:r>
+      </w:ins>
+      <w:r>
+        <w:rPr>
+          <w:rFonts w:ascii="Times New Roman" w:hAnsi="Times New Roman"/>
+        </w:rPr>
+        <w:t xml:space="preserve"> </w:t>
+      </w:r>
+      <w:del w:id="987" w:author="А.А. Шевцов" w:date="2026-10-17T12:00:00Z">
+        <w:r>
+          <w:rPr>
+            <w:rFonts w:ascii="Times New Roman" w:hAnsi="Times New Roman"/>
+          </w:rPr>
+          <w:delText xml:space="preserve">transition</w:delText>
+        </w:r>
+      </w:del>
+      <w:ins w:id="988" w:author="А.А. Шевцов" w:date="2026-10-17T12:00:00Z">
+        <w:r>
+          <w:rPr>
+            <w:rFonts w:ascii="Times New Roman" w:hAnsi="Times New Roman"/>
+          </w:rPr>
+          <w:t xml:space="preserve">transitional</w:t>
+        </w:r>
+      </w:ins>
+      <w:r>
+        <w:rPr>
+          <w:rFonts w:ascii="Times New Roman" w:hAnsi="Times New Roman"/>
+        </w:rPr>
+        <w:t xml:space="preserve"> period of spontaneous growth (1992–2000) to </w:t>
+      </w:r>
+      <w:del w:id="985" w:author="А.А. Шевцов" w:date="2026-10-17T12:00:00Z">
+        <w:r>
+          <w:rPr>
+            <w:rFonts w:ascii="Times New Roman" w:hAnsi="Times New Roman"/>
+          </w:rPr>
+          <w:delText xml:space="preserve">the</w:delText>
+        </w:r>
+      </w:del>
+      <w:ins w:id="986" w:author="А.А. Шевцов" w:date="2026-10-17T12:00:00Z">
+        <w:r>
+          <w:rPr>
+            <w:rFonts w:ascii="Times New Roman" w:hAnsi="Times New Roman"/>
+          </w:rPr>
+          <w:t xml:space="preserve">a</w:t>
+        </w:r>
+      </w:ins>
+      <w:r>
+        <w:rPr>
+          <w:rFonts w:ascii="Times New Roman" w:hAnsi="Times New Roman"/>
+        </w:rPr>
+        <w:t xml:space="preserve"> phase of </w:t>
+      </w:r>
+      <w:del w:id="983" w:author="А.А. Шевцов" w:date="2026-10-17T12:00:00Z">
+        <w:r>
+          <w:rPr>
+            <w:rFonts w:ascii="Times New Roman" w:hAnsi="Times New Roman"/>
+          </w:rPr>
+          <w:delText xml:space="preserve">slowing</w:delText>
+        </w:r>
+      </w:del>
+      <w:ins w:id="984" w:author="А.А. Шевцов" w:date="2026-10-17T12:00:00Z">
+        <w:r>
+          <w:rPr>
+            <w:rFonts w:ascii="Times New Roman" w:hAnsi="Times New Roman"/>
+          </w:rPr>
+          <w:t xml:space="preserve">decelerating</w:t>
+        </w:r>
+      </w:ins>
+      <w:r>
+        <w:rPr>
+          <w:rFonts w:ascii="Times New Roman" w:hAnsi="Times New Roman"/>
+        </w:rPr>
+        <w:t xml:space="preserve"> expansion and the formation of a </w:t>
+      </w:r>
+      <w:del w:id="982" w:author="А.А. Шевцов" w:date="2026-10-17T12:00:00Z">
+        <w:r>
+          <w:rPr>
+            <w:rFonts w:ascii="Times New Roman" w:hAnsi="Times New Roman"/>
+          </w:rPr>
+          <w:delText xml:space="preserve">framework of </w:delText>
+        </w:r>
+      </w:del>
+      <w:r>
+        <w:rPr>
+          <w:rFonts w:ascii="Times New Roman" w:hAnsi="Times New Roman"/>
+        </w:rPr>
+        <w:t xml:space="preserve">suburban shopping </w:t>
+      </w:r>
+      <w:del w:id="980" w:author="А.А. Шевцов" w:date="2026-10-17T12:00:00Z">
+        <w:r>
+          <w:rPr>
+            <w:rFonts w:ascii="Times New Roman" w:hAnsi="Times New Roman"/>
+          </w:rPr>
+          <w:delText xml:space="preserve">centers</w:delText>
+        </w:r>
+      </w:del>
+      <w:ins w:id="981" w:author="А.А. Шевцов" w:date="2026-10-17T12:00:00Z">
+        <w:r>
+          <w:rPr>
+            <w:rFonts w:ascii="Times New Roman" w:hAnsi="Times New Roman"/>
+          </w:rPr>
+          <w:t xml:space="preserve">center framework</w:t>
+        </w:r>
+      </w:ins>
+      <w:r>
+        <w:rPr>
+          <w:rFonts w:ascii="Times New Roman" w:hAnsi="Times New Roman"/>
+        </w:rPr>
+        <w:t xml:space="preserve"> (2000–2010), followed by a stage of “explosive expansion” </w:t>
+      </w:r>
+      <w:del w:id="978" w:author="А.А. Шевцов" w:date="2026-10-17T12:00:00Z">
+        <w:r>
+          <w:rPr>
+            <w:rFonts w:ascii="Times New Roman" w:hAnsi="Times New Roman"/>
+          </w:rPr>
+          <w:delText xml:space="preserve">in</w:delText>
+        </w:r>
+      </w:del>
+      <w:ins w:id="979" w:author="А.А. Шевцов" w:date="2026-10-17T12:00:00Z">
+        <w:r>
+          <w:rPr>
+            <w:rFonts w:ascii="Times New Roman" w:hAnsi="Times New Roman"/>
+          </w:rPr>
+          <w:t xml:space="preserve">driven</w:t>
+        </w:r>
+      </w:ins>
+      <w:r>
+        <w:rPr>
+          <w:rFonts w:ascii="Times New Roman" w:hAnsi="Times New Roman"/>
+        </w:rPr>
+        <w:t xml:space="preserve"> </w:t>
+      </w:r>
+      <w:del w:id="976" w:author="А.А. Шевцов" w:date="2026-10-17T12:00:00Z">
+        <w:r>
+          <w:rPr>
+            <w:rFonts w:ascii="Times New Roman" w:hAnsi="Times New Roman"/>
+          </w:rPr>
+          <w:delText xml:space="preserve">the</w:delText>
+        </w:r>
+      </w:del>
+      <w:ins w:id="977" w:author="А.А. Шевцов" w:date="2026-10-17T12:00:00Z">
+        <w:r>
+          <w:rPr>
+            <w:rFonts w:ascii="Times New Roman" w:hAnsi="Times New Roman"/>
+          </w:rPr>
+          <w:t xml:space="preserve">by</w:t>
+        </w:r>
+      </w:ins>
+      <w:r>
+        <w:rPr>
+          <w:rFonts w:ascii="Times New Roman" w:hAnsi="Times New Roman"/>
+        </w:rPr>
+        <w:t xml:space="preserve"> </w:t>
+      </w:r>
+      <w:del w:id="974" w:author="А.А. Шевцов" w:date="2026-10-17T12:00:00Z">
+        <w:r>
+          <w:rPr>
+            <w:rFonts w:ascii="Times New Roman" w:hAnsi="Times New Roman"/>
+          </w:rPr>
+          <w:delText xml:space="preserve">context</w:delText>
+        </w:r>
+      </w:del>
+      <w:ins w:id="975" w:author="А.А. Шевцов" w:date="2026-10-17T12:00:00Z">
+        <w:r>
+          <w:rPr>
+            <w:rFonts w:ascii="Times New Roman" w:hAnsi="Times New Roman"/>
+          </w:rPr>
+          <w:t xml:space="preserve">increased</w:t>
+        </w:r>
+      </w:ins>
+      <w:r>
+        <w:rPr>
+          <w:rFonts w:ascii="Times New Roman" w:hAnsi="Times New Roman"/>
+        </w:rPr>
+        <w:t xml:space="preserve"> </w:t>
+      </w:r>
+      <w:del w:id="972" w:author="А.А. Шевцов" w:date="2026-10-17T12:00:00Z">
+        <w:r>
+          <w:rPr>
+            <w:rFonts w:ascii="Times New Roman" w:hAnsi="Times New Roman"/>
+          </w:rPr>
+          <w:delText xml:space="preserve">of</w:delText>
+        </w:r>
+      </w:del>
+      <w:ins w:id="973" w:author="А.А. Шевцов" w:date="2026-10-17T12:00:00Z">
+        <w:r>
+          <w:rPr>
+            <w:rFonts w:ascii="Times New Roman" w:hAnsi="Times New Roman"/>
+          </w:rPr>
+          <w:t xml:space="preserve">access</w:t>
+        </w:r>
+      </w:ins>
+      <w:r>
+        <w:rPr>
+          <w:rFonts w:ascii="Times New Roman" w:hAnsi="Times New Roman"/>
+        </w:rPr>
+        <w:t xml:space="preserve"> </w:t>
+      </w:r>
+      <w:del w:id="970" w:author="А.А. Шевцов" w:date="2026-10-17T12:00:00Z">
+        <w:r>
+          <w:rPr>
+            <w:rFonts w:ascii="Times New Roman" w:hAnsi="Times New Roman"/>
+          </w:rPr>
+          <w:delText xml:space="preserve">increasing availability of</w:delText>
+        </w:r>
+      </w:del>
+      <w:ins w:id="971" w:author="А.А. Шевцов" w:date="2026-10-17T12:00:00Z">
+        <w:r>
+          <w:rPr>
+            <w:rFonts w:ascii="Times New Roman" w:hAnsi="Times New Roman"/>
+          </w:rPr>
+          <w:t xml:space="preserve">to</w:t>
+        </w:r>
+      </w:ins>
+      <w:r>
+        <w:rPr>
+          <w:rFonts w:ascii="Times New Roman" w:hAnsi="Times New Roman"/>
+        </w:rPr>
+        <w:t xml:space="preserve"> credit (2010–2020)</w:t>
+      </w:r>
+      <w:ins w:id="969" w:author="А.А. Шевцов" w:date="2026-10-17T12:00:00Z">
+        <w:r>
+          <w:rPr>
+            <w:rFonts w:ascii="Times New Roman" w:hAnsi="Times New Roman"/>
+          </w:rPr>
+          <w:t xml:space="preserve">,</w:t>
+        </w:r>
+      </w:ins>
+      <w:r>
+        <w:rPr>
+          <w:rFonts w:ascii="Times New Roman" w:hAnsi="Times New Roman"/>
+        </w:rPr>
+        <w:t xml:space="preserve"> and </w:t>
+      </w:r>
+      <w:del w:id="967" w:author="А.А. Шевцов" w:date="2026-10-17T12:00:00Z">
+        <w:r>
+          <w:rPr>
+            <w:rFonts w:ascii="Times New Roman" w:hAnsi="Times New Roman"/>
+          </w:rPr>
+          <w:delText xml:space="preserve">the</w:delText>
+        </w:r>
+      </w:del>
+      <w:ins w:id="968" w:author="А.А. Шевцов" w:date="2026-10-17T12:00:00Z">
+        <w:r>
+          <w:rPr>
+            <w:rFonts w:ascii="Times New Roman" w:hAnsi="Times New Roman"/>
+          </w:rPr>
+          <w:t xml:space="preserve">a</w:t>
+        </w:r>
+      </w:ins>
+      <w:r>
+        <w:rPr>
+          <w:rFonts w:ascii="Times New Roman" w:hAnsi="Times New Roman"/>
+        </w:rPr>
+        <w:t xml:space="preserve"> current stage of </w:t>
+      </w:r>
+      <w:del w:id="966" w:author="А.А. Шевцов" w:date="2026-10-17T12:00:00Z">
+        <w:r>
+          <w:rPr>
+            <w:rFonts w:ascii="Times New Roman" w:hAnsi="Times New Roman"/>
+          </w:rPr>
+          <w:delText xml:space="preserve">stabilization of </w:delText>
+        </w:r>
+      </w:del>
+      <w:r>
+        <w:rPr>
+          <w:rFonts w:ascii="Times New Roman" w:hAnsi="Times New Roman"/>
+        </w:rPr>
+        <w:t xml:space="preserve">growth </w:t>
+      </w:r>
+      <w:del w:id="964" w:author="А.А. Шевцов" w:date="2026-10-17T12:00:00Z">
+        <w:r>
+          <w:rPr>
+            <w:rFonts w:ascii="Times New Roman" w:hAnsi="Times New Roman"/>
+          </w:rPr>
+          <w:delText xml:space="preserve">rates</w:delText>
+        </w:r>
+      </w:del>
+      <w:ins w:id="965" w:author="А.А. Шевцов" w:date="2026-10-17T12:00:00Z">
+        <w:r>
+          <w:rPr>
+            <w:rFonts w:ascii="Times New Roman" w:hAnsi="Times New Roman"/>
+          </w:rPr>
+          <w:t xml:space="preserve">rate stabilization</w:t>
+        </w:r>
+      </w:ins>
+      <w:r>
+        <w:rPr>
+          <w:rFonts w:ascii="Times New Roman" w:hAnsi="Times New Roman"/>
+        </w:rPr>
+        <w:t xml:space="preserve"> and morphological consolidation (2020–2025). A </w:t>
+      </w:r>
+      <w:del w:id="962" w:author="А.А. Шевцов" w:date="2026-10-17T12:00:00Z">
+        <w:r>
+          <w:rPr>
+            <w:rFonts w:ascii="Times New Roman" w:hAnsi="Times New Roman"/>
+          </w:rPr>
+          <w:delText xml:space="preserve">persistent</w:delText>
+        </w:r>
+      </w:del>
+      <w:ins w:id="963" w:author="А.А. Шевцов" w:date="2026-10-17T12:00:00Z">
+        <w:r>
+          <w:rPr>
+            <w:rFonts w:ascii="Times New Roman" w:hAnsi="Times New Roman"/>
+          </w:rPr>
+          <w:t xml:space="preserve">stable</w:t>
+        </w:r>
+      </w:ins>
+      <w:r>
+        <w:rPr>
+          <w:rFonts w:ascii="Times New Roman" w:hAnsi="Times New Roman"/>
+        </w:rPr>
+        <w:t xml:space="preserve"> spatial asymmetry was </w:t>
+      </w:r>
+      <w:del w:id="960" w:author="А.А. Шевцов" w:date="2026-10-17T12:00:00Z">
+        <w:r>
+          <w:rPr>
+            <w:rFonts w:ascii="Times New Roman" w:hAnsi="Times New Roman"/>
+          </w:rPr>
+          <w:delText xml:space="preserve">identified</w:delText>
+        </w:r>
+      </w:del>
+      <w:ins w:id="961" w:author="А.А. Шевцов" w:date="2026-10-17T12:00:00Z">
+        <w:r>
+          <w:rPr>
+            <w:rFonts w:ascii="Times New Roman" w:hAnsi="Times New Roman"/>
+          </w:rPr>
+          <w:t xml:space="preserve">revealed</w:t>
+        </w:r>
+      </w:ins>
+      <w:r>
+        <w:rPr>
+          <w:rFonts w:ascii="Times New Roman" w:hAnsi="Times New Roman"/>
+        </w:rPr>
+        <w:t xml:space="preserve">: </w:t>
+      </w:r>
+      <w:del w:id="958" w:author="А.А. Шевцов" w:date="2026-10-17T12:00:00Z">
+        <w:r>
+          <w:rPr>
+            <w:rFonts w:ascii="Times New Roman" w:hAnsi="Times New Roman"/>
+          </w:rPr>
+          <w:delText xml:space="preserve">more than</w:delText>
+        </w:r>
+      </w:del>
+      <w:ins w:id="959" w:author="А.А. Шевцов" w:date="2026-10-17T12:00:00Z">
+        <w:r>
+          <w:rPr>
+            <w:rFonts w:ascii="Times New Roman" w:hAnsi="Times New Roman"/>
+          </w:rPr>
+          <w:t xml:space="preserve">over</w:t>
+        </w:r>
+      </w:ins>
+      <w:r>
+        <w:rPr>
+          <w:rFonts w:ascii="Times New Roman" w:hAnsi="Times New Roman"/>
+        </w:rPr>
+        <w:t xml:space="preserve"> 58% of the total </w:t>
+      </w:r>
+      <w:del w:id="956" w:author="А.А. Шевцов" w:date="2026-10-17T12:00:00Z">
+        <w:r>
+          <w:rPr>
+            <w:rFonts w:ascii="Times New Roman" w:hAnsi="Times New Roman"/>
+          </w:rPr>
+          <w:delText xml:space="preserve">increase</w:delText>
+        </w:r>
+      </w:del>
+      <w:ins w:id="957" w:author="А.А. Шевцов" w:date="2026-10-17T12:00:00Z">
+        <w:r>
+          <w:rPr>
+            <w:rFonts w:ascii="Times New Roman" w:hAnsi="Times New Roman"/>
+          </w:rPr>
+          <w:t xml:space="preserve">growth</w:t>
+        </w:r>
+      </w:ins>
+      <w:r>
+        <w:rPr>
+          <w:rFonts w:ascii="Times New Roman" w:hAnsi="Times New Roman"/>
+        </w:rPr>
+        <w:t xml:space="preserve"> </w:t>
+      </w:r>
+      <w:del w:id="954" w:author="А.А. Шевцов" w:date="2026-10-17T12:00:00Z">
+        <w:r>
+          <w:rPr>
+            <w:rFonts w:ascii="Times New Roman" w:hAnsi="Times New Roman"/>
+          </w:rPr>
+          <w:delText xml:space="preserve">was</w:delText>
+        </w:r>
+      </w:del>
+      <w:ins w:id="955" w:author="А.А. Шевцов" w:date="2026-10-17T12:00:00Z">
+        <w:r>
+          <w:rPr>
+            <w:rFonts w:ascii="Times New Roman" w:hAnsi="Times New Roman"/>
+          </w:rPr>
+          <w:t xml:space="preserve">is</w:t>
+        </w:r>
+      </w:ins>
+      <w:r>
+        <w:rPr>
+          <w:rFonts w:ascii="Times New Roman" w:hAnsi="Times New Roman"/>
+        </w:rPr>
+        <w:t xml:space="preserve"> </w:t>
+      </w:r>
+      <w:del w:id="952" w:author="А.А. Шевцов" w:date="2026-10-17T12:00:00Z">
+        <w:r>
+          <w:rPr>
+            <w:rFonts w:ascii="Times New Roman" w:hAnsi="Times New Roman"/>
+          </w:rPr>
+          <w:delText xml:space="preserve">recorded</w:delText>
+        </w:r>
+      </w:del>
+      <w:ins w:id="953" w:author="А.А. Шевцов" w:date="2026-10-17T12:00:00Z">
+        <w:r>
+          <w:rPr>
+            <w:rFonts w:ascii="Times New Roman" w:hAnsi="Times New Roman"/>
+          </w:rPr>
+          <w:t xml:space="preserve">concentrated</w:t>
+        </w:r>
+      </w:ins>
+      <w:r>
+        <w:rPr>
+          <w:rFonts w:ascii="Times New Roman" w:hAnsi="Times New Roman"/>
+        </w:rPr>
+        <w:t xml:space="preserve"> in the northern and eastern sectors. It </w:t>
+      </w:r>
+      <w:del w:id="950" w:author="А.А. Шевцов" w:date="2026-10-17T12:00:00Z">
+        <w:r>
+          <w:rPr>
+            <w:rFonts w:ascii="Times New Roman" w:hAnsi="Times New Roman"/>
+          </w:rPr>
+          <w:delText xml:space="preserve">has</w:delText>
+        </w:r>
+      </w:del>
+      <w:ins w:id="951" w:author="А.А. Шевцов" w:date="2026-10-17T12:00:00Z">
+        <w:r>
+          <w:rPr>
+            <w:rFonts w:ascii="Times New Roman" w:hAnsi="Times New Roman"/>
+          </w:rPr>
+          <w:t xml:space="preserve">was</w:t>
+        </w:r>
+      </w:ins>
+      <w:r>
+        <w:rPr>
+          <w:rFonts w:ascii="Times New Roman" w:hAnsi="Times New Roman"/>
+        </w:rPr>
+        <w:t xml:space="preserve"> </w:t>
+      </w:r>
+      <w:del w:id="948" w:author="А.А. Шевцов" w:date="2026-10-17T12:00:00Z">
+        <w:r>
+          <w:rPr>
+            <w:rFonts w:ascii="Times New Roman" w:hAnsi="Times New Roman"/>
+          </w:rPr>
+          <w:delText xml:space="preserve">been established</w:delText>
+        </w:r>
+      </w:del>
+      <w:ins w:id="949" w:author="А.А. Шевцов" w:date="2026-10-17T12:00:00Z">
+        <w:r>
+          <w:rPr>
+            <w:rFonts w:ascii="Times New Roman" w:hAnsi="Times New Roman"/>
+          </w:rPr>
+          <w:t xml:space="preserve">found</w:t>
+        </w:r>
+      </w:ins>
+      <w:r>
+        <w:rPr>
+          <w:rFonts w:ascii="Times New Roman" w:hAnsi="Times New Roman"/>
+        </w:rPr>
+        <w:t xml:space="preserve"> that the development of </w:t>
+      </w:r>
+      <w:del w:id="946" w:author="А.А. Шевцов" w:date="2026-10-17T12:00:00Z">
+        <w:r>
+          <w:rPr>
+            <w:rFonts w:ascii="Times New Roman" w:hAnsi="Times New Roman"/>
+          </w:rPr>
+          <w:delText xml:space="preserve">the</w:delText>
+        </w:r>
+      </w:del>
+      <w:ins w:id="947" w:author="А.А. Шевцов" w:date="2026-10-17T12:00:00Z">
+        <w:r>
+          <w:rPr>
+            <w:rFonts w:ascii="Times New Roman" w:hAnsi="Times New Roman"/>
+          </w:rPr>
+          <w:t xml:space="preserve">immediate</w:t>
+        </w:r>
+      </w:ins>
+      <w:r>
+        <w:rPr>
+          <w:rFonts w:ascii="Times New Roman" w:hAnsi="Times New Roman"/>
+        </w:rPr>
+        <w:t xml:space="preserve"> </w:t>
+      </w:r>
+      <w:del w:id="944" w:author="А.А. Шевцов" w:date="2026-10-17T12:00:00Z">
+        <w:r>
+          <w:rPr>
+            <w:rFonts w:ascii="Times New Roman" w:hAnsi="Times New Roman"/>
+          </w:rPr>
+          <w:delText xml:space="preserve">suburban area</w:delText>
+        </w:r>
+      </w:del>
+      <w:ins w:id="945" w:author="А.А. Шевцов" w:date="2026-10-17T12:00:00Z">
+        <w:r>
+          <w:rPr>
+            <w:rFonts w:ascii="Times New Roman" w:hAnsi="Times New Roman"/>
+          </w:rPr>
+          <w:t xml:space="preserve">suburbs</w:t>
+        </w:r>
+      </w:ins>
+      <w:r>
+        <w:rPr>
+          <w:rFonts w:ascii="Times New Roman" w:hAnsi="Times New Roman"/>
+        </w:rPr>
+        <w:t xml:space="preserve"> is driven by the </w:t>
+      </w:r>
+      <w:del w:id="942" w:author="А.А. Шевцов" w:date="2026-10-17T12:00:00Z">
+        <w:r>
+          <w:rPr>
+            <w:rFonts w:ascii="Times New Roman" w:hAnsi="Times New Roman"/>
+          </w:rPr>
+          <w:delText xml:space="preserve">"</w:delText>
+        </w:r>
+      </w:del>
+      <w:ins w:id="943" w:author="А.А. Шевцов" w:date="2026-10-17T12:00:00Z">
+        <w:r>
+          <w:rPr>
+            <w:rFonts w:ascii="Times New Roman" w:hAnsi="Times New Roman"/>
+          </w:rPr>
+          <w:t xml:space="preserve">“</w:t>
+        </w:r>
+      </w:ins>
+      <w:r>
+        <w:rPr>
+          <w:rFonts w:ascii="Times New Roman" w:hAnsi="Times New Roman"/>
+        </w:rPr>
+        <w:t xml:space="preserve">growth machine</w:t>
+      </w:r>
+      <w:ins w:id="941" w:author="А.А. Шевцов" w:date="2026-10-17T12:00:00Z">
+        <w:r>
+          <w:rPr>
+            <w:rFonts w:ascii="Times New Roman" w:hAnsi="Times New Roman"/>
+          </w:rPr>
+          <w:t xml:space="preserve">” mechanism</w:t>
+        </w:r>
+      </w:ins>
+      <w:r>
+        <w:rPr>
+          <w:rFonts w:ascii="Times New Roman" w:hAnsi="Times New Roman"/>
+        </w:rPr>
+        <w:t xml:space="preserve">,</w:t>
+      </w:r>
+      <w:del w:id="940" w:author="А.А. Шевцов" w:date="2026-10-17T12:00:00Z">
+        <w:r>
+          <w:rPr>
+            <w:rFonts w:ascii="Times New Roman" w:hAnsi="Times New Roman"/>
+          </w:rPr>
+          <w:delText xml:space="preserve">"</w:delText>
+        </w:r>
+      </w:del>
+      <w:r>
+        <w:rPr>
+          <w:rFonts w:ascii="Times New Roman" w:hAnsi="Times New Roman"/>
+        </w:rPr>
+        <w:t xml:space="preserve"> </w:t>
+      </w:r>
+      <w:del w:id="938" w:author="А.А. Шевцов" w:date="2026-10-17T12:00:00Z">
+        <w:r>
+          <w:rPr>
+            <w:rFonts w:ascii="Times New Roman" w:hAnsi="Times New Roman"/>
+          </w:rPr>
+          <w:delText xml:space="preserve">driven</w:delText>
+        </w:r>
+      </w:del>
+      <w:ins w:id="939" w:author="А.А. Шевцов" w:date="2026-10-17T12:00:00Z">
+        <w:r>
+          <w:rPr>
+            <w:rFonts w:ascii="Times New Roman" w:hAnsi="Times New Roman"/>
+          </w:rPr>
+          <w:t xml:space="preserve">powered</w:t>
+        </w:r>
+      </w:ins>
+      <w:r>
+        <w:rPr>
+          <w:rFonts w:ascii="Times New Roman" w:hAnsi="Times New Roman"/>
+        </w:rPr>
+        <w:t xml:space="preserve"> by a fivefold difference in land </w:t>
+      </w:r>
+      <w:del w:id="936" w:author="А.А. Шевцов" w:date="2026-10-17T12:00:00Z">
+        <w:r>
+          <w:rPr>
+            <w:rFonts w:ascii="Times New Roman" w:hAnsi="Times New Roman"/>
+          </w:rPr>
+          <w:delText xml:space="preserve">prices</w:delText>
+        </w:r>
+      </w:del>
+      <w:ins w:id="937" w:author="А.А. Шевцов" w:date="2026-10-17T12:00:00Z">
+        <w:r>
+          <w:rPr>
+            <w:rFonts w:ascii="Times New Roman" w:hAnsi="Times New Roman"/>
+          </w:rPr>
+          <w:t xml:space="preserve">values</w:t>
+        </w:r>
+      </w:ins>
+      <w:r>
+        <w:rPr>
+          <w:rFonts w:ascii="Times New Roman" w:hAnsi="Times New Roman"/>
+        </w:rPr>
+        <w:t xml:space="preserve"> between the city</w:t>
+      </w:r>
+      <w:del w:id="935" w:author="А.А. Шевцов" w:date="2026-10-17T12:00:00Z">
+        <w:r>
+          <w:rPr>
+            <w:rFonts w:ascii="Times New Roman" w:hAnsi="Times New Roman"/>
+          </w:rPr>
+          <w:delText xml:space="preserve">'s</w:delText>
+        </w:r>
+      </w:del>
+      <w:r>
+        <w:rPr>
+          <w:rFonts w:ascii="Times New Roman" w:hAnsi="Times New Roman"/>
+        </w:rPr>
+        <w:t xml:space="preserve"> outskirts and the suburban </w:t>
+      </w:r>
+      <w:del w:id="933" w:author="А.А. Шевцов" w:date="2026-10-17T12:00:00Z">
+        <w:r>
+          <w:rPr>
+            <w:rFonts w:ascii="Times New Roman" w:hAnsi="Times New Roman"/>
+          </w:rPr>
+          <w:delText xml:space="preserve">area</w:delText>
+        </w:r>
+      </w:del>
+      <w:ins w:id="934" w:author="А.А. Шевцов" w:date="2026-10-17T12:00:00Z">
+        <w:r>
+          <w:rPr>
+            <w:rFonts w:ascii="Times New Roman" w:hAnsi="Times New Roman"/>
+          </w:rPr>
+          <w:t xml:space="preserve">zone</w:t>
+        </w:r>
+      </w:ins>
+      <w:r>
+        <w:rPr>
+          <w:rFonts w:ascii="Times New Roman" w:hAnsi="Times New Roman"/>
+        </w:rPr>
+        <w:t xml:space="preserve">. This</w:t>
+      </w:r>
+      <w:ins w:id="932" w:author="А.А. Шевцов" w:date="2026-10-17T12:00:00Z">
+        <w:r>
+          <w:rPr>
+            <w:rFonts w:ascii="Times New Roman" w:hAnsi="Times New Roman"/>
+          </w:rPr>
+          <w:t xml:space="preserve"> has</w:t>
+        </w:r>
+      </w:ins>
+      <w:r>
+        <w:rPr>
+          <w:rFonts w:ascii="Times New Roman" w:hAnsi="Times New Roman"/>
+        </w:rPr>
+        <w:t xml:space="preserve"> led to spatial fragmentation and the formation of a functionally </w:t>
+      </w:r>
+      <w:del w:id="930" w:author="А.А. Шевцов" w:date="2026-10-17T12:00:00Z">
+        <w:r>
+          <w:rPr>
+            <w:rFonts w:ascii="Times New Roman" w:hAnsi="Times New Roman"/>
+          </w:rPr>
+          <w:delText xml:space="preserve">disunited</w:delText>
+        </w:r>
+      </w:del>
+      <w:ins w:id="931" w:author="А.А. Шевцов" w:date="2026-10-17T12:00:00Z">
+        <w:r>
+          <w:rPr>
+            <w:rFonts w:ascii="Times New Roman" w:hAnsi="Times New Roman"/>
+          </w:rPr>
+          <w:t xml:space="preserve">disjointed</w:t>
+        </w:r>
+      </w:ins>
+      <w:r>
+        <w:rPr>
+          <w:rFonts w:ascii="Times New Roman" w:hAnsi="Times New Roman"/>
+        </w:rPr>
+        <w:t xml:space="preserve"> spatial structure, </w:t>
+      </w:r>
+      <w:del w:id="928" w:author="А.А. Шевцов" w:date="2026-10-17T12:00:00Z">
+        <w:r>
+          <w:rPr>
+            <w:rFonts w:ascii="Times New Roman" w:hAnsi="Times New Roman"/>
+          </w:rPr>
+          <w:delText xml:space="preserve">which is confirmed</w:delText>
+        </w:r>
+      </w:del>
+      <w:ins w:id="929" w:author="А.А. Шевцов" w:date="2026-10-17T12:00:00Z">
+        <w:r>
+          <w:rPr>
+            <w:rFonts w:ascii="Times New Roman" w:hAnsi="Times New Roman"/>
+          </w:rPr>
+          <w:t xml:space="preserve">evidenced</w:t>
+        </w:r>
+      </w:ins>
+      <w:r>
+        <w:rPr>
+          <w:rFonts w:ascii="Times New Roman" w:hAnsi="Times New Roman"/>
+        </w:rPr>
+        <w:t xml:space="preserve"> by a twofold </w:t>
+      </w:r>
+      <w:del w:id="926" w:author="А.А. Шевцов" w:date="2026-10-17T12:00:00Z">
+        <w:r>
+          <w:rPr>
+            <w:rFonts w:ascii="Times New Roman" w:hAnsi="Times New Roman"/>
+          </w:rPr>
+          <w:delText xml:space="preserve">drop</w:delText>
+        </w:r>
+      </w:del>
+      <w:ins w:id="927" w:author="А.А. Шевцов" w:date="2026-10-17T12:00:00Z">
+        <w:r>
+          <w:rPr>
+            <w:rFonts w:ascii="Times New Roman" w:hAnsi="Times New Roman"/>
+          </w:rPr>
+          <w:t xml:space="preserve">decrease</w:t>
+        </w:r>
+      </w:ins>
+      <w:r>
+        <w:rPr>
+          <w:rFonts w:ascii="Times New Roman" w:hAnsi="Times New Roman"/>
+        </w:rPr>
+        <w:t xml:space="preserve"> in</w:t>
+      </w:r>
+      <w:del w:id="925" w:author="А.А. Шевцов" w:date="2026-10-17T12:00:00Z">
+        <w:r>
+          <w:rPr>
+            <w:rFonts w:ascii="Times New Roman" w:hAnsi="Times New Roman"/>
+          </w:rPr>
+          <w:delText xml:space="preserve"> the density of</w:delText>
+        </w:r>
+      </w:del>
+      <w:r>
+        <w:rPr>
+          <w:rFonts w:ascii="Times New Roman" w:hAnsi="Times New Roman"/>
+        </w:rPr>
+        <w:t xml:space="preserve"> consumer activity </w:t>
+      </w:r>
+      <w:ins w:id="924" w:author="А.А. Шевцов" w:date="2026-10-17T12:00:00Z">
+        <w:r>
+          <w:rPr>
+            <w:rFonts w:ascii="Times New Roman" w:hAnsi="Times New Roman"/>
+          </w:rPr>
+          <w:t xml:space="preserve">density </w:t>
+        </w:r>
+      </w:ins>
+      <w:r>
+        <w:rPr>
+          <w:rFonts w:ascii="Times New Roman" w:hAnsi="Times New Roman"/>
+        </w:rPr>
+        <w:t xml:space="preserve">in </w:t>
+      </w:r>
+      <w:del w:id="922" w:author="А.А. Шевцов" w:date="2026-10-17T12:00:00Z">
+        <w:r>
+          <w:rPr>
+            <w:rFonts w:ascii="Times New Roman" w:hAnsi="Times New Roman"/>
+          </w:rPr>
+          <w:delText xml:space="preserve">new</w:delText>
+        </w:r>
+      </w:del>
+      <w:ins w:id="923" w:author="А.А. Шевцов" w:date="2026-10-17T12:00:00Z">
+        <w:r>
+          <w:rPr>
+            <w:rFonts w:ascii="Times New Roman" w:hAnsi="Times New Roman"/>
+          </w:rPr>
+          <w:t xml:space="preserve">newly</w:t>
+        </w:r>
+      </w:ins>
+      <w:r>
+        <w:rPr>
+          <w:rFonts w:ascii="Times New Roman" w:hAnsi="Times New Roman"/>
+        </w:rPr>
+        <w:t xml:space="preserve"> </w:t>
+      </w:r>
+      <w:del w:id="920" w:author="А.А. Шевцов" w:date="2026-10-17T12:00:00Z">
+        <w:r>
+          <w:rPr>
+            <w:rFonts w:ascii="Times New Roman" w:hAnsi="Times New Roman"/>
+          </w:rPr>
+          <w:delText xml:space="preserve">development</w:delText>
+        </w:r>
+      </w:del>
+      <w:ins w:id="921" w:author="А.А. Шевцов" w:date="2026-10-17T12:00:00Z">
+        <w:r>
+          <w:rPr>
+            <w:rFonts w:ascii="Times New Roman" w:hAnsi="Times New Roman"/>
+          </w:rPr>
+          <w:t xml:space="preserve">developed</w:t>
+        </w:r>
+      </w:ins>
+      <w:r>
+        <w:rPr>
+          <w:rFonts w:ascii="Times New Roman" w:hAnsi="Times New Roman"/>
+        </w:rPr>
+        <w:t xml:space="preserve"> </w:t>
+      </w:r>
+      <w:del w:id="918" w:author="А.А. Шевцов" w:date="2026-10-17T12:00:00Z">
+        <w:r>
+          <w:rPr>
+            <w:rFonts w:ascii="Times New Roman" w:hAnsi="Times New Roman"/>
+          </w:rPr>
+          <w:delText xml:space="preserve">zones</w:delText>
+        </w:r>
+      </w:del>
+      <w:ins w:id="919" w:author="А.А. Шевцов" w:date="2026-10-17T12:00:00Z">
+        <w:r>
+          <w:rPr>
+            <w:rFonts w:ascii="Times New Roman" w:hAnsi="Times New Roman"/>
+          </w:rPr>
+          <w:t xml:space="preserve">areas</w:t>
+        </w:r>
+      </w:ins>
+      <w:r>
+        <w:rPr>
+          <w:rFonts w:ascii="Times New Roman" w:hAnsi="Times New Roman"/>
+        </w:rPr>
+        <w:t xml:space="preserve">. The </w:t>
+      </w:r>
+      <w:ins w:id="917" w:author="А.А. Шевцов" w:date="2026-10-17T12:00:00Z">
+        <w:r>
+          <w:rPr>
+            <w:rFonts w:ascii="Times New Roman" w:hAnsi="Times New Roman"/>
+          </w:rPr>
+          <w:t xml:space="preserve">research </w:t>
+        </w:r>
+      </w:ins>
+      <w:r>
+        <w:rPr>
+          <w:rFonts w:ascii="Times New Roman" w:hAnsi="Times New Roman"/>
+        </w:rPr>
+        <w:t xml:space="preserve">results</w:t>
+      </w:r>
+      <w:del w:id="916" w:author="А.А. Шевцов" w:date="2026-10-17T12:00:00Z">
+        <w:r>
+          <w:rPr>
+            <w:rFonts w:ascii="Times New Roman" w:hAnsi="Times New Roman"/>
+          </w:rPr>
+          <w:delText xml:space="preserve"> of the study</w:delText>
+        </w:r>
+      </w:del>
+      <w:r>
+        <w:rPr>
+          <w:rFonts w:ascii="Times New Roman" w:hAnsi="Times New Roman"/>
+        </w:rPr>
+        <w:t xml:space="preserve"> indicate a deformation of the </w:t>
+      </w:r>
+      <w:del w:id="914" w:author="А.А. Шевцов" w:date="2026-10-17T12:00:00Z">
+        <w:r>
+          <w:rPr>
+            <w:rFonts w:ascii="Times New Roman" w:hAnsi="Times New Roman"/>
+          </w:rPr>
+          <w:delText xml:space="preserve">classical model of</w:delText>
+        </w:r>
+      </w:del>
+      <w:ins w:id="915" w:author="А.А. Шевцов" w:date="2026-10-17T12:00:00Z">
+        <w:r>
+          <w:rPr>
+            <w:rFonts w:ascii="Times New Roman" w:hAnsi="Times New Roman"/>
+          </w:rPr>
+          <w:t xml:space="preserve">classic</w:t>
+        </w:r>
+      </w:ins>
+      <w:r>
+        <w:rPr>
+          <w:rFonts w:ascii="Times New Roman" w:hAnsi="Times New Roman"/>
+        </w:rPr>
+        <w:t xml:space="preserve"> W.</w:t>
+      </w:r>
+      <w:del w:id="912" w:author="А.А. Шевцов" w:date="2026-10-17T12:00:00Z">
+        <w:r>
+          <w:rPr>
+            <w:rFonts w:ascii="Times New Roman" w:hAnsi="Times New Roman"/>
+          </w:rPr>
+          <w:delText xml:space="preserve"> </w:delText>
+        </w:r>
+      </w:del>
+      <w:ins w:id="913" w:author="А.А. Шевцов" w:date="2026-10-17T12:00:00Z">
+        <w:r>
+          <w:rPr>
+            <w:rFonts w:ascii="Times New Roman" w:hAnsi="Times New Roman"/>
+          </w:rPr>
+          <w:t xml:space="preserve"> </w:t>
+        </w:r>
+      </w:ins>
+      <w:r>
+        <w:rPr>
+          <w:rFonts w:ascii="Times New Roman" w:hAnsi="Times New Roman"/>
+        </w:rPr>
+        <w:t xml:space="preserve">Alonso</w:t>
+      </w:r>
+      <w:ins w:id="911" w:author="А.А. Шевцов" w:date="2026-10-17T12:00:00Z">
+        <w:r>
+          <w:rPr>
+            <w:rFonts w:ascii="Times New Roman" w:hAnsi="Times New Roman"/>
+          </w:rPr>
+          <w:t xml:space="preserve"> model</w:t>
+        </w:r>
+      </w:ins>
+      <w:r>
+        <w:rPr>
+          <w:rFonts w:ascii="Times New Roman" w:hAnsi="Times New Roman"/>
+        </w:rPr>
+        <w:t xml:space="preserve">: </w:t>
+      </w:r>
+      <w:del w:id="909" w:author="А.А. Шевцов" w:date="2026-10-17T12:00:00Z">
+        <w:r>
+          <w:rPr>
+            <w:rFonts w:ascii="Times New Roman" w:hAnsi="Times New Roman"/>
+          </w:rPr>
+          <w:delText xml:space="preserve">The</w:delText>
+        </w:r>
+      </w:del>
+      <w:ins w:id="910" w:author="А.А. Шевцов" w:date="2026-10-17T12:00:00Z">
+        <w:r>
+          <w:rPr>
+            <w:rFonts w:ascii="Times New Roman" w:hAnsi="Times New Roman"/>
+          </w:rPr>
+          <w:t xml:space="preserve">the</w:t>
+        </w:r>
+      </w:ins>
+      <w:r>
+        <w:rPr>
+          <w:rFonts w:ascii="Times New Roman" w:hAnsi="Times New Roman"/>
+        </w:rPr>
+        <w:t xml:space="preserve"> factor of transport distance has lost its barrier function </w:t>
       </w:r>
       <w:del w:id="907" w:author="А.А. Шевцов" w:date="2026-10-17T12:00:00Z">
         <w:r>
           <w:rPr>
             <w:rFonts w:ascii="Times New Roman" w:hAnsi="Times New Roman"/>
           </w:rPr>
-          <w:delText xml:space="preserve">suburban area</w:delText>
+          <w:delText xml:space="preserve">in</w:delText>
         </w:r>
       </w:del>
       <w:ins w:id="908" w:author="А.А. Шевцов" w:date="2026-10-17T12:00:00Z">
@@ -368,21 +1718,21 @@
           <w:rPr>
             <w:rFonts w:ascii="Times New Roman" w:hAnsi="Times New Roman"/>
           </w:rPr>
-          <w:t xml:space="preserve">immediate suburbs</w:t>
+          <w:t xml:space="preserve">due</w:t>
         </w:r>
       </w:ins>
       <w:r>
         <w:rPr>
           <w:rFonts w:ascii="Times New Roman" w:hAnsi="Times New Roman"/>
         </w:rPr>
-        <w:t xml:space="preserve"> is driven by the </w:t>
+        <w:t xml:space="preserve"> </w:t>
       </w:r>
       <w:del w:id="905" w:author="А.А. Шевцов" w:date="2026-10-17T12:00:00Z">
         <w:r>
           <w:rPr>
             <w:rFonts w:ascii="Times New Roman" w:hAnsi="Times New Roman"/>
           </w:rPr>
-          <w:delText xml:space="preserve">"growth machine," driven</w:delText>
+          <w:delText xml:space="preserve">the context of</w:delText>
         </w:r>
       </w:del>
       <w:ins w:id="906" w:author="А.А. Шевцов" w:date="2026-10-17T12:00:00Z">
@@ -390,81 +1740,51 @@
           <w:rPr>
             <w:rFonts w:ascii="Times New Roman" w:hAnsi="Times New Roman"/>
           </w:rPr>
-          <w:t xml:space="preserve">“growth machine” mechanism, powered</w:t>
+          <w:t xml:space="preserve">to</w:t>
         </w:r>
       </w:ins>
       <w:r>
         <w:rPr>
           <w:rFonts w:ascii="Times New Roman" w:hAnsi="Times New Roman"/>
         </w:rPr>
-        <w:t xml:space="preserve"> by a fivefold difference in land prices between the </w:t>
-      </w:r>
-      <w:del w:id="909" w:author="А.А. Шевцов" w:date="2026-10-17T12:00:00Z">
-        <w:r>
-          <w:rPr>
-            <w:rFonts w:ascii="Times New Roman" w:hAnsi="Times New Roman"/>
-          </w:rPr>
-          <w:delText xml:space="preserve">city's outskirts and the suburban area.</w:delText>
+        <w:t xml:space="preserve"> increased </w:t>
+      </w:r>
+      <w:ins w:id="904" w:author="А.А. Шевцов" w:date="2026-10-17T12:00:00Z">
+        <w:r>
+          <w:rPr>
+            <w:rFonts w:ascii="Times New Roman" w:hAnsi="Times New Roman"/>
+          </w:rPr>
+          <w:t xml:space="preserve">retail </w:t>
+        </w:r>
+      </w:ins>
+      <w:r>
+        <w:rPr>
+          <w:rFonts w:ascii="Times New Roman" w:hAnsi="Times New Roman"/>
+        </w:rPr>
+        <w:t xml:space="preserve">accessibility</w:t>
+      </w:r>
+      <w:del w:id="903" w:author="А.А. Шевцов" w:date="2026-10-17T12:00:00Z">
+        <w:r>
+          <w:rPr>
+            <w:rFonts w:ascii="Times New Roman" w:hAnsi="Times New Roman"/>
+          </w:rPr>
+          <w:delText xml:space="preserve"> of retail</w:delText>
         </w:r>
       </w:del>
-      <w:ins w:id="910" w:author="А.А. Шевцов" w:date="2026-10-17T12:00:00Z">
-        <w:r>
-          <w:rPr>
-            <w:rFonts w:ascii="Times New Roman" w:hAnsi="Times New Roman"/>
-          </w:rPr>
-          <w:t xml:space="preserve">city outskirts and the immediate suburban zone.</w:t>
-        </w:r>
-      </w:ins>
-      <w:r>
-        <w:rPr>
-          <w:rFonts w:ascii="Times New Roman" w:hAnsi="Times New Roman"/>
-        </w:rPr>
-        <w:t xml:space="preserve"> This led to spatial fragmentation and the formation of a functionally </w:t>
-      </w:r>
-      <w:del w:id="911" w:author="А.А. Шевцов" w:date="2026-10-17T12:00:00Z">
-        <w:r>
-          <w:rPr>
-            <w:rFonts w:ascii="Times New Roman" w:hAnsi="Times New Roman"/>
-          </w:rPr>
-          <w:delText xml:space="preserve">disunited</w:delText>
+      <w:r>
+        <w:rPr>
+          <w:rFonts w:ascii="Times New Roman" w:hAnsi="Times New Roman"/>
+        </w:rPr>
+        <w:t xml:space="preserve"> and the development of e-commerce.</w:t>
+      </w:r>
+      <w:del w:id="902" w:author="А.А. Шевцов" w:date="2026-10-17T12:00:00Z">
+        <w:r>
+          <w:rPr>
+            <w:rFonts w:ascii="Times New Roman" w:hAnsi="Times New Roman"/>
+          </w:rPr>
+          <w:delText xml:space="preserve"> </w:delText>
         </w:r>
       </w:del>
-      <w:ins w:id="912" w:author="А.А. Шевцов" w:date="2026-10-17T12:00:00Z">
-        <w:r>
-          <w:rPr>
-            <w:rFonts w:ascii="Times New Roman" w:hAnsi="Times New Roman"/>
-          </w:rPr>
-          <w:t xml:space="preserve">disjointed</w:t>
-        </w:r>
-      </w:ins>
-      <w:r>
-        <w:rPr>
-          <w:rFonts w:ascii="Times New Roman" w:hAnsi="Times New Roman"/>
-        </w:rPr>
-        <w:t xml:space="preserve"> spatial structure, which is confirmed by a twofold drop in the density of consumer activity in new development zones. The results of the study indicate a deformation of the classical model of W. Alonso: </w:t>
-      </w:r>
-      <w:del w:id="915" w:author="А.А. Шевцов" w:date="2026-10-17T12:00:00Z">
-        <w:r>
-          <w:rPr>
-            <w:rFonts w:ascii="Times New Roman" w:hAnsi="Times New Roman"/>
-          </w:rPr>
-          <w:delText xml:space="preserve">The</w:delText>
-        </w:r>
-      </w:del>
-      <w:ins w:id="916" w:author="А.А. Шевцов" w:date="2026-10-17T12:00:00Z">
-        <w:r>
-          <w:rPr>
-            <w:rFonts w:ascii="Times New Roman" w:hAnsi="Times New Roman"/>
-          </w:rPr>
-          <w:t xml:space="preserve">the</w:t>
-        </w:r>
-      </w:ins>
-      <w:r>
-        <w:rPr>
-          <w:rFonts w:ascii="Times New Roman" w:hAnsi="Times New Roman"/>
-        </w:rPr>
-        <w:t xml:space="preserve"> factor of transport distance has lost its barrier function in the context of increased accessibility of retail and the development of e-commerce. </w:t>
-      </w:r>
     </w:p>
     <w:p>
       <w:pPr>
@@ -499,7 +1819,7 @@
         </w:rPr>
         <w:t xml:space="preserve"> Post-Soviet urban transformation, </w:t>
       </w:r>
-      <w:ins w:id="917" w:author="А.А. Шевцов" w:date="2026-10-17T12:00:00Z">
+      <w:ins w:id="1031" w:author="А.А. Шевцов" w:date="2026-10-17T12:00:00Z">
         <w:r>
           <w:rPr>
             <w:rFonts w:ascii="Times New Roman" w:hAnsi="Times New Roman"/>
@@ -513,7 +1833,7 @@
         </w:rPr>
         <w:t xml:space="preserve">development, </w:t>
       </w:r>
-      <w:del w:id="1180" w:author="А.А. Шевцов" w:date="2026-10-17T12:00:00Z">
+      <w:del w:id="1292" w:author="А.А. Шевцов" w:date="2026-10-17T12:00:00Z">
         <w:r>
           <w:rPr>
             <w:rFonts w:ascii="Times New Roman" w:hAnsi="Times New Roman"/>
@@ -521,7 +1841,7 @@
           <w:delText xml:space="preserve">"</w:delText>
         </w:r>
       </w:del>
-      <w:ins w:id="1181" w:author="А.А. Шевцов" w:date="2026-10-17T12:00:00Z">
+      <w:ins w:id="1293" w:author="А.А. Шевцов" w:date="2026-10-17T12:00:00Z">
         <w:r>
           <w:rPr>
             <w:rFonts w:ascii="Times New Roman" w:hAnsi="Times New Roman"/>
@@ -535,7 +1855,7 @@
         </w:rPr>
         <w:t xml:space="preserve">growth machine</w:t>
       </w:r>
-      <w:del w:id="1178" w:author="А.А. Шевцов" w:date="2026-10-17T12:00:00Z">
+      <w:del w:id="1290" w:author="А.А. Шевцов" w:date="2026-10-17T12:00:00Z">
         <w:r>
           <w:rPr>
             <w:rFonts w:ascii="Times New Roman" w:hAnsi="Times New Roman"/>
@@ -543,7 +1863,7 @@
           <w:delText xml:space="preserve">"</w:delText>
         </w:r>
       </w:del>
-      <w:ins w:id="1179" w:author="А.А. Шевцов" w:date="2026-10-17T12:00:00Z">
+      <w:ins w:id="1291" w:author="А.А. Шевцов" w:date="2026-10-17T12:00:00Z">
         <w:r>
           <w:rPr>
             <w:rFonts w:ascii="Times New Roman" w:hAnsi="Times New Roman"/>
@@ -557,7 +1877,7 @@
         </w:rPr>
         <w:t xml:space="preserve">, suburban </w:t>
       </w:r>
-      <w:del w:id="918" w:author="А.А. Шевцов" w:date="2026-10-17T12:00:00Z">
+      <w:del w:id="1032" w:author="А.А. Шевцов" w:date="2026-10-17T12:00:00Z">
         <w:r>
           <w:rPr>
             <w:rFonts w:ascii="Times New Roman" w:hAnsi="Times New Roman"/>
@@ -565,7 +1885,7 @@
           <w:delText xml:space="preserve">area, urban morphology,</w:delText>
         </w:r>
       </w:del>
-      <w:ins w:id="919" w:author="А.А. Шевцов" w:date="2026-10-17T12:00:00Z">
+      <w:ins w:id="1033" w:author="А.А. Шевцов" w:date="2026-10-17T12:00:00Z">
         <w:r>
           <w:rPr>
             <w:rFonts w:ascii="Times New Roman" w:hAnsi="Times New Roman"/>
@@ -638,7 +1958,7 @@
         </w:rPr>
         <w:t xml:space="preserve">In recent decades, the spatial development of Russia's largest cities has been closely linked to the development of the real estate market and the transformation of land and property relations. The extensive growth of </w:t>
       </w:r>
-      <w:del w:id="920" w:author="А.А. Шевцов" w:date="2026-10-17T12:00:00Z">
+      <w:del w:id="1034" w:author="А.А. Шевцов" w:date="2026-10-17T12:00:00Z">
         <w:r>
           <w:rPr>
             <w:rFonts w:ascii="Times New Roman" w:hAnsi="Times New Roman"/>
@@ -647,7 +1967,7 @@
           <w:delText xml:space="preserve">development in suburban areas</w:delText>
         </w:r>
       </w:del>
-      <w:ins w:id="921" w:author="А.А. Шевцов" w:date="2026-10-17T12:00:00Z">
+      <w:ins w:id="1035" w:author="А.А. Шевцов" w:date="2026-10-17T12:00:00Z">
         <w:r>
           <w:rPr>
             <w:rFonts w:ascii="Times New Roman" w:hAnsi="Times New Roman"/>
@@ -663,7 +1983,7 @@
         </w:rPr>
         <w:t xml:space="preserve"> is largely becoming a spatial reflection of developers' investment strategies and changing consumer preferences. In this regard, the study of territorial expansion requires a shift from simply </w:t>
       </w:r>
-      <w:del w:id="922" w:author="А.А. Шевцов" w:date="2026-10-17T12:00:00Z">
+      <w:del w:id="1036" w:author="А.А. Шевцов" w:date="2026-10-17T12:00:00Z">
         <w:r>
           <w:rPr>
             <w:rFonts w:ascii="Times New Roman" w:hAnsi="Times New Roman"/>
@@ -672,7 +1992,7 @@
           <w:delText xml:space="preserve">fixing</w:delText>
         </w:r>
       </w:del>
-      <w:ins w:id="923" w:author="А.А. Шевцов" w:date="2026-10-17T12:00:00Z">
+      <w:ins w:id="1037" w:author="А.А. Шевцов" w:date="2026-10-17T12:00:00Z">
         <w:r>
           <w:rPr>
             <w:rFonts w:ascii="Times New Roman" w:hAnsi="Times New Roman"/>
@@ -706,7 +2026,7 @@
         </w:rPr>
         <w:t xml:space="preserve">For modern science, identifying the factors that determine the spatial unevenness of the development of urban systems remains a pressing problem. Traditional concepts of urban economics are confronting new realities: the development of suburban commercial infrastructure and the digitalization of the service sector, which are </w:t>
       </w:r>
-      <w:del w:id="924" w:author="А.А. Шевцов" w:date="2026-10-17T12:00:00Z">
+      <w:del w:id="1038" w:author="А.А. Шевцов" w:date="2026-10-17T12:00:00Z">
         <w:r>
           <w:rPr>
             <w:rFonts w:ascii="Times New Roman" w:hAnsi="Times New Roman"/>
@@ -715,7 +2035,7 @@
           <w:delText xml:space="preserve">offsetting</w:delText>
         </w:r>
       </w:del>
-      <w:ins w:id="925" w:author="А.А. Шевцов" w:date="2026-10-17T12:00:00Z">
+      <w:ins w:id="1039" w:author="А.А. Шевцов" w:date="2026-10-17T12:00:00Z">
         <w:r>
           <w:rPr>
             <w:rFonts w:ascii="Times New Roman" w:hAnsi="Times New Roman"/>
@@ -765,7 +2085,7 @@
         </w:rPr>
         <w:t xml:space="preserve"> a combination of active physical growth of </w:t>
       </w:r>
-      <w:del w:id="926" w:author="А.А. Шевцов" w:date="2026-10-17T12:00:00Z">
+      <w:del w:id="1040" w:author="А.А. Шевцов" w:date="2026-10-17T12:00:00Z">
         <w:r>
           <w:rPr>
             <w:rFonts w:ascii="Times New Roman" w:hAnsi="Times New Roman"/>
@@ -774,7 +2094,7 @@
           <w:delText xml:space="preserve">development</w:delText>
         </w:r>
       </w:del>
-      <w:ins w:id="927" w:author="А.А. Шевцов" w:date="2026-10-17T12:00:00Z">
+      <w:ins w:id="1041" w:author="А.А. Шевцов" w:date="2026-10-17T12:00:00Z">
         <w:r>
           <w:rPr>
             <w:rFonts w:ascii="Times New Roman" w:hAnsi="Times New Roman"/>
@@ -790,7 +2110,7 @@
         </w:rPr>
         <w:t xml:space="preserve"> over the past three decades and the change in the legal boundaries of the city in 2011. This allows us to trace how administrative decisions </w:t>
       </w:r>
-      <w:del w:id="928" w:author="А.А. Шевцов" w:date="2026-10-17T12:00:00Z">
+      <w:del w:id="1042" w:author="А.А. Шевцов" w:date="2026-10-17T12:00:00Z">
         <w:r>
           <w:rPr>
             <w:rFonts w:ascii="Times New Roman" w:hAnsi="Times New Roman"/>
@@ -799,7 +2119,7 @@
           <w:delText xml:space="preserve">overlap with</w:delText>
         </w:r>
       </w:del>
-      <w:ins w:id="929" w:author="А.А. Шевцов" w:date="2026-10-17T12:00:00Z">
+      <w:ins w:id="1043" w:author="А.А. Шевцов" w:date="2026-10-17T12:00:00Z">
         <w:r>
           <w:rPr>
             <w:rFonts w:ascii="Times New Roman" w:hAnsi="Times New Roman"/>
@@ -835,7 +2155,7 @@
         </w:rPr>
         <w:t xml:space="preserve">The territorial growth of Voronezh is understood as the entire set of new built-up areas both on the outskirts of existing development and in the area of the </w:t>
       </w:r>
-      <w:del w:id="1050" w:author="А.А. Шевцов" w:date="2026-10-17T12:00:00Z">
+      <w:del w:id="1162" w:author="А.А. Шевцов" w:date="2026-10-17T12:00:00Z">
         <w:r>
           <w:rPr>
             <w:rFonts w:ascii="Times New Roman" w:hAnsi="Times New Roman"/>
@@ -845,7 +2165,7 @@
           <w:delText xml:space="preserve">near</w:delText>
         </w:r>
       </w:del>
-      <w:ins w:id="1051" w:author="А.А. Шевцов" w:date="2026-10-17T12:00:00Z">
+      <w:ins w:id="1163" w:author="А.А. Шевцов" w:date="2026-10-17T12:00:00Z">
         <w:r>
           <w:rPr>
             <w:rFonts w:ascii="Times New Roman" w:hAnsi="Times New Roman"/>
@@ -962,7 +2282,7 @@
         </w:rPr>
         <w:t xml:space="preserve">The theoretical basis for studying the territorial growth of cities is laid in classical models of urban morphology and land use economics. </w:t>
       </w:r>
-      <w:del w:id="930" w:author="А.А. Шевцов" w:date="2026-10-17T12:00:00Z">
+      <w:del w:id="1044" w:author="А.А. Шевцов" w:date="2026-10-17T12:00:00Z">
         <w:r>
           <w:rPr>
             <w:rFonts w:ascii="Times New Roman" w:hAnsi="Times New Roman"/>
@@ -972,7 +2292,7 @@
           <w:delText xml:space="preserve">E. Burgess (1925), using the fundamental model of concentric zones, first described</w:delText>
         </w:r>
       </w:del>
-      <w:ins w:id="931" w:author="А.А. Шевцов" w:date="2026-10-17T12:00:00Z">
+      <w:ins w:id="1045" w:author="А.А. Шевцов" w:date="2026-10-17T12:00:00Z">
         <w:r>
           <w:rPr>
             <w:rFonts w:ascii="Times New Roman" w:hAnsi="Times New Roman"/>
@@ -990,7 +2310,7 @@
         </w:rPr>
         <w:t xml:space="preserve"> the process of centrifugal expansion as a successive displacement of functions from the city core to its periphery. The mathematical confirmation of these patterns was the model proposed by C. Clark (1951), which explains the exponential decrease in population density with distance from the </w:t>
       </w:r>
-      <w:del w:id="932" w:author="А.А. Шевцов" w:date="2026-10-17T12:00:00Z">
+      <w:del w:id="1046" w:author="А.А. Шевцов" w:date="2026-10-17T12:00:00Z">
         <w:r>
           <w:rPr>
             <w:rFonts w:ascii="Times New Roman" w:hAnsi="Times New Roman"/>
@@ -1000,7 +2320,7 @@
           <w:delText xml:space="preserve">center, which</w:delText>
         </w:r>
       </w:del>
-      <w:ins w:id="933" w:author="А.А. Шевцов" w:date="2026-10-17T12:00:00Z">
+      <w:ins w:id="1047" w:author="А.А. Шевцов" w:date="2026-10-17T12:00:00Z">
         <w:r>
           <w:rPr>
             <w:rFonts w:ascii="Times New Roman" w:hAnsi="Times New Roman"/>
@@ -1038,7 +2358,7 @@
         </w:rPr>
         <w:t xml:space="preserve">As transportation systems became more complex, the logic for accommodating new growth required clarification. W. </w:t>
       </w:r>
-      <w:del w:id="934" w:author="А.А. Шевцов" w:date="2026-10-17T12:00:00Z">
+      <w:del w:id="1048" w:author="А.А. Шевцов" w:date="2026-10-17T12:00:00Z">
         <w:r>
           <w:rPr>
             <w:rFonts w:ascii="Times New Roman" w:hAnsi="Times New Roman"/>
@@ -1054,26 +2374,26 @@
           <w:bCs/>
           <w:sz w:val="24"/>
         </w:rPr>
-        <w:t xml:space="preserve">Hansen (1959) supplemented these ideas with the concept of the “development potential” of a territory, </w:t>
-      </w:r>
-      <w:del w:id="935" w:author="А.А. Шевцов" w:date="2026-10-17T12:00:00Z">
+        <w:t xml:space="preserve">Hansen (1959) supplemented these ideas with the concept of the “development potential” of a territory, believing that the localization of new development is determined not so much by proximity to the geometric center as by the level of transport accessibility. The economic justification for this process was given in the theory of land rent by W. Alonso, who postulates a trade-off between land value and transport costs </w:t>
+      </w:r>
+      <w:del w:id="1049" w:author="А.А. Шевцов" w:date="2026-10-17T12:00:00Z">
         <w:r>
           <w:rPr>
             <w:rFonts w:ascii="Times New Roman" w:hAnsi="Times New Roman"/>
             <w:bCs/>
             <w:sz w:val="24"/>
           </w:rPr>
-          <w:delText xml:space="preserve">believing</w:delText>
+          <w:delText xml:space="preserve">(Angel et al., 2012)</w:delText>
         </w:r>
       </w:del>
-      <w:ins w:id="936" w:author="А.А. Шевцов" w:date="2026-10-17T12:00:00Z">
+      <w:ins w:id="1050" w:author="А.А. Шевцов" w:date="2026-10-17T12:00:00Z">
         <w:r>
           <w:rPr>
             <w:rFonts w:ascii="Times New Roman" w:hAnsi="Times New Roman"/>
             <w:bCs/>
             <w:sz w:val="24"/>
           </w:rPr>
-          <w:t xml:space="preserve">postulating</w:t>
+          <w:t xml:space="preserve">(Alonso, 1964)</w:t>
         </w:r>
       </w:ins>
       <w:r>
@@ -1082,47 +2402,19 @@
           <w:bCs/>
           <w:sz w:val="24"/>
         </w:rPr>
-        <w:t xml:space="preserve"> that the localization of new development is determined not so much by proximity to the geometric center as by the level of transport accessibility. The economic justification for this process was given in the theory of land rent by W. Alonso, who postulates a trade-off between land value and transport costs </w:t>
-      </w:r>
-      <w:del w:id="937" w:author="А.А. Шевцов" w:date="2026-10-17T12:00:00Z">
+        <w:t xml:space="preserve">. The development of this approach was the theory of the “rent gap” of N. Smith, according to which the driver of territorial development is the disparity between the current capitalized rent of land and its potential price at its most efficient use (Smith, 1987). It is this gap in asset values on the periphery of the city that creates the economic incentive for </w:t>
+      </w:r>
+      <w:del w:id="1051" w:author="А.А. Шевцов" w:date="2026-10-17T12:00:00Z">
         <w:r>
           <w:rPr>
             <w:rFonts w:ascii="Times New Roman" w:hAnsi="Times New Roman"/>
             <w:bCs/>
             <w:sz w:val="24"/>
           </w:rPr>
-          <w:delText xml:space="preserve">(Angel et al., 2012)</w:delText>
+          <w:delText xml:space="preserve">capital to expand out of</w:delText>
         </w:r>
       </w:del>
-      <w:ins w:id="938" w:author="А.А. Шевцов" w:date="2026-10-17T12:00:00Z">
-        <w:r>
-          <w:rPr>
-            <w:rFonts w:ascii="Times New Roman" w:hAnsi="Times New Roman"/>
-            <w:bCs/>
-            <w:sz w:val="24"/>
-          </w:rPr>
-          <w:t xml:space="preserve">(Alonso, 1964)</w:t>
-        </w:r>
-      </w:ins>
-      <w:r>
-        <w:rPr>
-          <w:rFonts w:ascii="Times New Roman" w:hAnsi="Times New Roman"/>
-          <w:bCs/>
-          <w:sz w:val="24"/>
-        </w:rPr>
-        <w:t xml:space="preserve">. The development of this approach was the theory of the “rent gap” of N. Smith, according to which the driver of territorial development is the disparity between the current capitalized rent of land and its potential price at its most efficient use (Smith, 1987). It is this gap in asset values on the periphery of the city that creates the economic incentive for </w:t>
-      </w:r>
-      <w:del w:id="939" w:author="А.А. Шевцов" w:date="2026-10-17T12:00:00Z">
-        <w:r>
-          <w:rPr>
-            <w:rFonts w:ascii="Times New Roman" w:hAnsi="Times New Roman"/>
-            <w:bCs/>
-            <w:sz w:val="24"/>
-          </w:rPr>
-          <w:delText xml:space="preserve">capital to expand out of</w:delText>
-        </w:r>
-      </w:del>
-      <w:ins w:id="940" w:author="А.А. Шевцов" w:date="2026-10-17T12:00:00Z">
+      <w:ins w:id="1052" w:author="А.А. Шевцов" w:date="2026-10-17T12:00:00Z">
         <w:r>
           <w:rPr>
             <w:rFonts w:ascii="Times New Roman" w:hAnsi="Times New Roman"/>
@@ -1160,7 +2452,7 @@
         </w:rPr>
         <w:t xml:space="preserve">The spatial logic of location selection is directly embodied in the specific mechanisms of urban expansion. Angel et al. (2012) identified three basic types of territorial growth: infilling, edge growth, and </w:t>
       </w:r>
-      <w:del w:id="941" w:author="А.А. Шевцов" w:date="2026-10-17T12:00:00Z">
+      <w:del w:id="1053" w:author="А.А. Шевцов" w:date="2026-10-17T12:00:00Z">
         <w:r>
           <w:rPr>
             <w:rFonts w:ascii="Times New Roman" w:hAnsi="Times New Roman"/>
@@ -1170,7 +2462,7 @@
           <w:delText xml:space="preserve">leaffrog</w:delText>
         </w:r>
       </w:del>
-      <w:ins w:id="942" w:author="А.А. Шевцов" w:date="2026-10-17T12:00:00Z">
+      <w:ins w:id="1054" w:author="А.А. Шевцов" w:date="2026-10-17T12:00:00Z">
         <w:r>
           <w:rPr>
             <w:rFonts w:ascii="Times New Roman" w:hAnsi="Times New Roman"/>
@@ -1188,7 +2480,7 @@
         </w:rPr>
         <w:t xml:space="preserve"> development. Camagni et al. (2002) added linear development along transport routes and large-scale </w:t>
       </w:r>
-      <w:del w:id="943" w:author="А.А. Шевцов" w:date="2026-10-17T12:00:00Z">
+      <w:del w:id="1055" w:author="А.А. Шевцов" w:date="2026-10-17T12:00:00Z">
         <w:r>
           <w:rPr>
             <w:rFonts w:ascii="Times New Roman" w:hAnsi="Times New Roman"/>
@@ -1198,7 +2490,7 @@
           <w:delText xml:space="preserve">development</w:delText>
         </w:r>
       </w:del>
-      <w:ins w:id="944" w:author="А.А. Шевцов" w:date="2026-10-17T12:00:00Z">
+      <w:ins w:id="1056" w:author="А.А. Шевцов" w:date="2026-10-17T12:00:00Z">
         <w:r>
           <w:rPr>
             <w:rFonts w:ascii="Times New Roman" w:hAnsi="Times New Roman"/>
@@ -1216,7 +2508,7 @@
         </w:rPr>
         <w:t xml:space="preserve"> to this list. These mechanisms allow us to determine the nature of the physical growth of the city: if </w:t>
       </w:r>
-      <w:del w:id="945" w:author="А.А. Шевцов" w:date="2026-10-17T12:00:00Z">
+      <w:del w:id="1057" w:author="А.А. Шевцов" w:date="2026-10-17T12:00:00Z">
         <w:r>
           <w:rPr>
             <w:rFonts w:ascii="Times New Roman" w:hAnsi="Times New Roman"/>
@@ -1226,7 +2518,7 @@
           <w:delText xml:space="preserve">marginal</w:delText>
         </w:r>
       </w:del>
-      <w:ins w:id="946" w:author="А.А. Шевцов" w:date="2026-10-17T12:00:00Z">
+      <w:ins w:id="1058" w:author="А.А. Шевцов" w:date="2026-10-17T12:00:00Z">
         <w:r>
           <w:rPr>
             <w:rFonts w:ascii="Times New Roman" w:hAnsi="Times New Roman"/>
@@ -1244,7 +2536,7 @@
         </w:rPr>
         <w:t xml:space="preserve"> growth indicates the expansion (spread of territory) of the city, then </w:t>
       </w:r>
-      <w:del w:id="947" w:author="А.А. Шевцов" w:date="2026-10-17T12:00:00Z">
+      <w:del w:id="1059" w:author="А.А. Шевцов" w:date="2026-10-17T12:00:00Z">
         <w:r>
           <w:rPr>
             <w:rFonts w:ascii="Times New Roman" w:hAnsi="Times New Roman"/>
@@ -1254,7 +2546,7 @@
           <w:delText xml:space="preserve">spasmodic</w:delText>
         </w:r>
       </w:del>
-      <w:ins w:id="948" w:author="А.А. Шевцов" w:date="2026-10-17T12:00:00Z">
+      <w:ins w:id="1060" w:author="А.А. Шевцов" w:date="2026-10-17T12:00:00Z">
         <w:r>
           <w:rPr>
             <w:rFonts w:ascii="Times New Roman" w:hAnsi="Times New Roman"/>
@@ -1292,7 +2584,7 @@
         </w:rPr>
         <w:t xml:space="preserve">A qualitative shift in the understanding of growth mechanisms occurred with the emergence of the “urban growth machine” theory of H. Molotch and J. Logan (Logan and Molotch, 1987; Molotch, 1976). The authors proposed to consider the city not as a passive arena for the implementation of market forces, but as the result of the activities of a coalition of elites interested in intensifying land development. In this concept, the key conflict is between the “use value” of a territory as a living environment and its “exchange value” as a resource for profit-making. In this logic, the growth of development acts as a tool for the capitalization of land assets, where the </w:t>
       </w:r>
-      <w:del w:id="1044" w:author="А.А. Шевцов" w:date="2026-10-17T12:00:00Z">
+      <w:del w:id="1156" w:author="А.А. Шевцов" w:date="2026-10-17T12:00:00Z">
         <w:r>
           <w:rPr>
             <w:rFonts w:ascii="Times New Roman" w:hAnsi="Times New Roman"/>
@@ -1302,7 +2594,7 @@
           <w:delText xml:space="preserve">interests of capitalizing</w:delText>
         </w:r>
       </w:del>
-      <w:ins w:id="1045" w:author="А.А. Шевцов" w:date="2026-10-17T12:00:00Z">
+      <w:ins w:id="1157" w:author="А.А. Шевцов" w:date="2026-10-17T12:00:00Z">
         <w:r>
           <w:rPr>
             <w:rFonts w:ascii="Times New Roman" w:hAnsi="Times New Roman"/>
@@ -1329,7 +2621,7 @@
         <w:lastRenderedPageBreak/>
         <w:t xml:space="preserve">the urban environment. In Russian geography, the conceptualization of these processes is presented in the works of A.G. Makhrova and O.Yu. </w:t>
       </w:r>
-      <w:del w:id="949" w:author="А.А. Шевцов" w:date="2026-10-17T12:00:00Z">
+      <w:del w:id="1061" w:author="А.А. Шевцов" w:date="2026-10-17T12:00:00Z">
         <w:r>
           <w:rPr>
             <w:rFonts w:ascii="Times New Roman" w:hAnsi="Times New Roman"/>
@@ -1339,7 +2631,7 @@
           <w:delText xml:space="preserve">Golubchikova</w:delText>
         </w:r>
       </w:del>
-      <w:ins w:id="950" w:author="А.А. Шевцов" w:date="2026-10-17T12:00:00Z">
+      <w:ins w:id="1062" w:author="А.А. Шевцов" w:date="2026-10-17T12:00:00Z">
         <w:r>
           <w:rPr>
             <w:rFonts w:ascii="Times New Roman" w:hAnsi="Times New Roman"/>
@@ -1377,7 +2669,7 @@
         </w:rPr>
         <w:t xml:space="preserve">The applicability of these models to the analysis of Russian space requires taking into account the specifics of the post-socialist transition, during which market incentives were superimposed on a unique planning legacy. A fundamental contribution to the understanding of this process was made by the works of T.G. Nefedova, A.I. </w:t>
       </w:r>
-      <w:del w:id="951" w:author="А.А. Шевцов" w:date="2026-10-17T12:00:00Z">
+      <w:del w:id="1063" w:author="А.А. Шевцов" w:date="2026-10-17T12:00:00Z">
         <w:r>
           <w:rPr>
             <w:rFonts w:ascii="Times New Roman" w:hAnsi="Times New Roman"/>
@@ -1387,7 +2679,7 @@
           <w:delText xml:space="preserve">Treyvisha</w:delText>
         </w:r>
       </w:del>
-      <w:ins w:id="952" w:author="А.А. Шевцов" w:date="2026-10-17T12:00:00Z">
+      <w:ins w:id="1064" w:author="А.А. Шевцов" w:date="2026-10-17T12:00:00Z">
         <w:r>
           <w:rPr>
             <w:rFonts w:ascii="Times New Roman" w:hAnsi="Times New Roman"/>
@@ -1405,7 +2697,7 @@
         </w:rPr>
         <w:t xml:space="preserve"> and A.G. Makhrova (</w:t>
       </w:r>
-      <w:del w:id="953" w:author="А.А. Шевцов" w:date="2026-10-17T12:00:00Z">
+      <w:del w:id="1065" w:author="А.А. Шевцов" w:date="2026-10-17T12:00:00Z">
         <w:r>
           <w:rPr>
             <w:rFonts w:ascii="Times New Roman" w:hAnsi="Times New Roman"/>
@@ -1415,7 +2707,7 @@
           <w:delText xml:space="preserve">Mahrova</w:delText>
         </w:r>
       </w:del>
-      <w:ins w:id="954" w:author="А.А. Шевцов" w:date="2026-10-17T12:00:00Z">
+      <w:ins w:id="1066" w:author="А.А. Шевцов" w:date="2026-10-17T12:00:00Z">
         <w:r>
           <w:rPr>
             <w:rFonts w:ascii="Times New Roman" w:hAnsi="Times New Roman"/>
@@ -1453,7 +2745,7 @@
         </w:rPr>
         <w:t xml:space="preserve">A </w:t>
       </w:r>
-      <w:del w:id="959" w:author="А.А. Шевцов" w:date="2026-10-17T12:00:00Z">
+      <w:del w:id="1071" w:author="А.А. Шевцов" w:date="2026-10-17T12:00:00Z">
         <w:r>
           <w:rPr>
             <w:rFonts w:ascii="Times New Roman" w:hAnsi="Times New Roman"/>
@@ -1463,7 +2755,7 @@
           <w:delText xml:space="preserve">generalisation</w:delText>
         </w:r>
       </w:del>
-      <w:ins w:id="960" w:author="А.А. Шевцов" w:date="2026-10-17T12:00:00Z">
+      <w:ins w:id="1072" w:author="А.А. Шевцов" w:date="2026-10-17T12:00:00Z">
         <w:r>
           <w:rPr>
             <w:rFonts w:ascii="Times New Roman" w:hAnsi="Times New Roman"/>
@@ -1481,7 +2773,7 @@
         </w:rPr>
         <w:t xml:space="preserve"> of the post-socialist experience shows that, unlike Western countries, where </w:t>
       </w:r>
-      <w:del w:id="961" w:author="А.А. Шевцов" w:date="2026-10-17T12:00:00Z">
+      <w:del w:id="1073" w:author="А.А. Шевцов" w:date="2026-10-17T12:00:00Z">
         <w:r>
           <w:rPr>
             <w:rFonts w:ascii="Times New Roman" w:hAnsi="Times New Roman"/>
@@ -1491,7 +2783,7 @@
           <w:delText xml:space="preserve">expansion</w:delText>
         </w:r>
       </w:del>
-      <w:ins w:id="962" w:author="А.А. Шевцов" w:date="2026-10-17T12:00:00Z">
+      <w:ins w:id="1074" w:author="А.А. Шевцов" w:date="2026-10-17T12:00:00Z">
         <w:r>
           <w:rPr>
             <w:rFonts w:ascii="Times New Roman" w:hAnsi="Times New Roman"/>
@@ -1509,7 +2801,7 @@
         </w:rPr>
         <w:t xml:space="preserve"> is often constrained by institutional frameworks, in Russia and other Eastern European countries it has taken the form of “catch-up </w:t>
       </w:r>
-      <w:del w:id="963" w:author="А.А. Шевцов" w:date="2026-10-17T12:00:00Z">
+      <w:del w:id="1075" w:author="А.А. Шевцов" w:date="2026-10-17T12:00:00Z">
         <w:r>
           <w:rPr>
             <w:rFonts w:ascii="Times New Roman" w:hAnsi="Times New Roman"/>
@@ -1519,7 +2811,7 @@
           <w:delText xml:space="preserve">suburbanisation</w:delText>
         </w:r>
       </w:del>
-      <w:ins w:id="964" w:author="А.А. Шевцов" w:date="2026-10-17T12:00:00Z">
+      <w:ins w:id="1076" w:author="А.А. Шевцов" w:date="2026-10-17T12:00:00Z">
         <w:r>
           <w:rPr>
             <w:rFonts w:ascii="Times New Roman" w:hAnsi="Times New Roman"/>
@@ -1537,7 +2829,7 @@
         </w:rPr>
         <w:t xml:space="preserve">” with pronounced fragmentation of the environment (Gerten et al., 2022). Recent studies highlight that the characteristics of the territorial growth of Russian cities </w:t>
       </w:r>
-      <w:del w:id="965" w:author="А.А. Шевцов" w:date="2026-10-17T12:00:00Z">
+      <w:del w:id="1077" w:author="А.А. Шевцов" w:date="2026-10-17T12:00:00Z">
         <w:r>
           <w:rPr>
             <w:rFonts w:ascii="Times New Roman" w:hAnsi="Times New Roman"/>
@@ -1547,7 +2839,7 @@
           <w:delText xml:space="preserve">are</w:delText>
         </w:r>
       </w:del>
-      <w:ins w:id="966" w:author="А.А. Шевцов" w:date="2026-10-17T12:00:00Z">
+      <w:ins w:id="1078" w:author="А.А. Шевцов" w:date="2026-10-17T12:00:00Z">
         <w:r>
           <w:rPr>
             <w:rFonts w:ascii="Times New Roman" w:hAnsi="Times New Roman"/>
@@ -1585,7 +2877,7 @@
         </w:rPr>
         <w:t xml:space="preserve">The current stage of this transformation is characterized by a qualitative shift in the logic of suburban development: spontaneous dacha development is being replaced by the targeted expansion of developers, forming new development morphotypes. In </w:t>
       </w:r>
-      <w:del w:id="967" w:author="А.А. Шевцов" w:date="2026-10-17T12:00:00Z">
+      <w:del w:id="1079" w:author="А.А. Шевцов" w:date="2026-10-17T12:00:00Z">
         <w:r>
           <w:rPr>
             <w:rFonts w:ascii="Times New Roman" w:hAnsi="Times New Roman"/>
@@ -1595,7 +2887,7 @@
           <w:delText xml:space="preserve">progress </w:delText>
         </w:r>
       </w:del>
-      <w:del w:id="968" w:author="А.А. Шевцов" w:date="2026-10-17T12:00:00Z">
+      <w:del w:id="1080" w:author="А.А. Шевцов" w:date="2026-10-17T12:00:00Z">
         <w:r>
           <w:rPr>
             <w:rFonts w:ascii="Times New Roman" w:hAnsi="Times New Roman"/>
@@ -1604,7 +2896,7 @@
           <w:delText xml:space="preserve">R.A. Dokhova and N.A. Sinitsyna (2020) </w:delText>
         </w:r>
       </w:del>
-      <w:del w:id="969" w:author="А.А. Шевцов" w:date="2026-10-17T12:00:00Z">
+      <w:del w:id="1081" w:author="А.А. Шевцов" w:date="2026-10-17T12:00:00Z">
         <w:r>
           <w:rPr>
             <w:rFonts w:ascii="Times New Roman" w:hAnsi="Times New Roman"/>
@@ -1614,7 +2906,7 @@
           <w:delText xml:space="preserve">Using Belgorod as an example, it is shown</w:delText>
         </w:r>
       </w:del>
-      <w:ins w:id="970" w:author="А.А. Шевцов" w:date="2026-10-17T12:00:00Z">
+      <w:ins w:id="1082" w:author="А.А. Шевцов" w:date="2026-10-17T12:00:00Z">
         <w:r>
           <w:rPr>
             <w:rFonts w:ascii="Times New Roman" w:hAnsi="Times New Roman"/>
@@ -1632,7 +2924,7 @@
         </w:rPr>
         <w:t xml:space="preserve"> that under conditions of land capitalization, new development morphotypes are being formed that differ from traditional dacha communities. The authors argue that the configuration of these areas is directly dependent on the institutional conditions and strategies of local developers, which </w:t>
       </w:r>
-      <w:del w:id="971" w:author="А.А. Шевцов" w:date="2026-10-17T12:00:00Z">
+      <w:del w:id="1083" w:author="А.А. Шевцов" w:date="2026-10-17T12:00:00Z">
         <w:r>
           <w:rPr>
             <w:rFonts w:ascii="Times New Roman" w:hAnsi="Times New Roman"/>
@@ -1642,7 +2934,7 @@
           <w:delText xml:space="preserve">effectively</w:delText>
         </w:r>
       </w:del>
-      <w:ins w:id="972" w:author="А.А. Шевцов" w:date="2026-10-17T12:00:00Z">
+      <w:ins w:id="1084" w:author="А.А. Шевцов" w:date="2026-10-17T12:00:00Z">
         <w:r>
           <w:rPr>
             <w:rFonts w:ascii="Times New Roman" w:hAnsi="Times New Roman"/>
@@ -1660,7 +2952,7 @@
         </w:rPr>
         <w:t xml:space="preserve"> marks a transition to an “entrepreneurial” model of development in urban outskirts and </w:t>
       </w:r>
-      <w:del w:id="1052" w:author="А.А. Шевцов" w:date="2026-10-17T12:00:00Z">
+      <w:del w:id="1164" w:author="А.А. Шевцов" w:date="2026-10-17T12:00:00Z">
         <w:r>
           <w:rPr>
             <w:rFonts w:ascii="Times New Roman" w:hAnsi="Times New Roman"/>
@@ -1670,7 +2962,7 @@
           <w:delText xml:space="preserve">near</w:delText>
         </w:r>
       </w:del>
-      <w:ins w:id="1053" w:author="А.А. Шевцов" w:date="2026-10-17T12:00:00Z">
+      <w:ins w:id="1165" w:author="А.А. Шевцов" w:date="2026-10-17T12:00:00Z">
         <w:r>
           <w:rPr>
             <w:rFonts w:ascii="Times New Roman" w:hAnsi="Times New Roman"/>
@@ -1708,7 +3000,7 @@
         </w:rPr>
         <w:t xml:space="preserve">A systematization of scenarios for the territorial development of Russian cities based on the vector of transformation of their planning structure is presented in the report of the National Research University Higher School of Economics </w:t>
       </w:r>
-      <w:del w:id="1184" w:author="А.А. Шевцов" w:date="2026-10-17T12:00:00Z">
+      <w:del w:id="1296" w:author="А.А. Шевцов" w:date="2026-10-17T12:00:00Z">
         <w:r>
           <w:rPr>
             <w:rFonts w:ascii="Times New Roman" w:hAnsi="Times New Roman"/>
@@ -1718,7 +3010,7 @@
           <w:delText xml:space="preserve">"</w:delText>
         </w:r>
       </w:del>
-      <w:ins w:id="1185" w:author="А.А. Шевцов" w:date="2026-10-17T12:00:00Z">
+      <w:ins w:id="1297" w:author="А.А. Шевцов" w:date="2026-10-17T12:00:00Z">
         <w:r>
           <w:rPr>
             <w:rFonts w:ascii="Times New Roman" w:hAnsi="Times New Roman"/>
@@ -1736,7 +3028,7 @@
         </w:rPr>
         <w:t xml:space="preserve">Planning </w:t>
       </w:r>
-      <w:del w:id="973" w:author="А.А. Шевцов" w:date="2026-10-17T12:00:00Z">
+      <w:del w:id="1085" w:author="А.А. Шевцов" w:date="2026-10-17T12:00:00Z">
         <w:r>
           <w:rPr>
             <w:rFonts w:ascii="Times New Roman" w:hAnsi="Times New Roman"/>
@@ -1746,7 +3038,7 @@
           <w:delText xml:space="preserve">for Expansion</w:delText>
         </w:r>
       </w:del>
-      <w:ins w:id="974" w:author="А.А. Шевцов" w:date="2026-10-17T12:00:00Z">
+      <w:ins w:id="1086" w:author="А.А. Шевцов" w:date="2026-10-17T12:00:00Z">
         <w:r>
           <w:rPr>
             <w:rFonts w:ascii="Times New Roman" w:hAnsi="Times New Roman"/>
@@ -1756,7 +3048,7 @@
           <w:t xml:space="preserve">Sprawl</w:t>
         </w:r>
       </w:ins>
-      <w:del w:id="1182" w:author="А.А. Шевцов" w:date="2026-10-17T12:00:00Z">
+      <w:del w:id="1294" w:author="А.А. Шевцов" w:date="2026-10-17T12:00:00Z">
         <w:r>
           <w:rPr>
             <w:rFonts w:ascii="Times New Roman" w:hAnsi="Times New Roman"/>
@@ -1766,7 +3058,7 @@
           <w:delText xml:space="preserve">"</w:delText>
         </w:r>
       </w:del>
-      <w:ins w:id="1183" w:author="А.А. Шевцов" w:date="2026-10-17T12:00:00Z">
+      <w:ins w:id="1295" w:author="А.А. Шевцов" w:date="2026-10-17T12:00:00Z">
         <w:r>
           <w:rPr>
             <w:rFonts w:ascii="Times New Roman" w:hAnsi="Times New Roman"/>
@@ -1784,7 +3076,7 @@
         </w:rPr>
         <w:t xml:space="preserve"> (Golovin et al., 2021). Based on </w:t>
       </w:r>
-      <w:del w:id="975" w:author="А.А. Шевцов" w:date="2026-10-17T12:00:00Z">
+      <w:del w:id="1087" w:author="А.А. Шевцов" w:date="2026-10-17T12:00:00Z">
         <w:r>
           <w:rPr>
             <w:rFonts w:ascii="Times New Roman" w:hAnsi="Times New Roman"/>
@@ -1794,7 +3086,7 @@
           <w:delText xml:space="preserve">the mathematical model of density gradients K. Clark,</w:delText>
         </w:r>
       </w:del>
-      <w:ins w:id="976" w:author="А.А. Шевцов" w:date="2026-10-17T12:00:00Z">
+      <w:ins w:id="1088" w:author="А.А. Шевцов" w:date="2026-10-17T12:00:00Z">
         <w:r>
           <w:rPr>
             <w:rFonts w:ascii="Times New Roman" w:hAnsi="Times New Roman"/>
@@ -1831,7 +3123,7 @@
         </w:rPr>
         <w:t>- </w:t>
       </w:r>
-      <w:del w:id="1188" w:author="А.А. Шевцов" w:date="2026-10-17T12:00:00Z">
+      <w:del w:id="1300" w:author="А.А. Шевцов" w:date="2026-10-17T12:00:00Z">
         <w:r>
           <w:rPr>
             <w:rFonts w:ascii="Times New Roman" w:hAnsi="Times New Roman"/>
@@ -1841,7 +3133,7 @@
           <w:delText xml:space="preserve">"</w:delText>
         </w:r>
       </w:del>
-      <w:ins w:id="1189" w:author="А.А. Шевцов" w:date="2026-10-17T12:00:00Z">
+      <w:ins w:id="1301" w:author="А.А. Шевцов" w:date="2026-10-17T12:00:00Z">
         <w:r>
           <w:rPr>
             <w:rFonts w:ascii="Times New Roman" w:hAnsi="Times New Roman"/>
@@ -1851,7 +3143,7 @@
           <w:t xml:space="preserve">“</w:t>
         </w:r>
       </w:ins>
-      <w:del w:id="977" w:author="А.А. Шевцов" w:date="2026-10-17T12:00:00Z">
+      <w:del w:id="1089" w:author="А.А. Шевцов" w:date="2026-10-17T12:00:00Z">
         <w:r>
           <w:rPr>
             <w:rFonts w:ascii="Times New Roman" w:hAnsi="Times New Roman"/>
@@ -1861,7 +3153,7 @@
           <w:delText xml:space="preserve">sprouting</w:delText>
         </w:r>
       </w:del>
-      <w:ins w:id="978" w:author="А.А. Шевцов" w:date="2026-10-17T12:00:00Z">
+      <w:ins w:id="1090" w:author="А.А. Шевцов" w:date="2026-10-17T12:00:00Z">
         <w:r>
           <w:rPr>
             <w:rFonts w:ascii="Times New Roman" w:hAnsi="Times New Roman"/>
@@ -1871,7 +3163,7 @@
           <w:t xml:space="preserve">sprawl</w:t>
         </w:r>
       </w:ins>
-      <w:del w:id="1186" w:author="А.А. Шевцов" w:date="2026-10-17T12:00:00Z">
+      <w:del w:id="1298" w:author="А.А. Шевцов" w:date="2026-10-17T12:00:00Z">
         <w:r>
           <w:rPr>
             <w:rFonts w:ascii="Times New Roman" w:hAnsi="Times New Roman"/>
@@ -1881,7 +3173,7 @@
           <w:delText xml:space="preserve">"</w:delText>
         </w:r>
       </w:del>
-      <w:ins w:id="1187" w:author="А.А. Шевцов" w:date="2026-10-17T12:00:00Z">
+      <w:ins w:id="1299" w:author="А.А. Шевцов" w:date="2026-10-17T12:00:00Z">
         <w:r>
           <w:rPr>
             <w:rFonts w:ascii="Times New Roman" w:hAnsi="Times New Roman"/>
@@ -1918,7 +3210,7 @@
         </w:rPr>
         <w:t>- </w:t>
       </w:r>
-      <w:del w:id="1192" w:author="А.А. Шевцов" w:date="2026-10-17T12:00:00Z">
+      <w:del w:id="1304" w:author="А.А. Шевцов" w:date="2026-10-17T12:00:00Z">
         <w:r>
           <w:rPr>
             <w:rFonts w:ascii="Times New Roman" w:hAnsi="Times New Roman"/>
@@ -1928,7 +3220,7 @@
           <w:delText xml:space="preserve">"</w:delText>
         </w:r>
       </w:del>
-      <w:ins w:id="1193" w:author="А.А. Шевцов" w:date="2026-10-17T12:00:00Z">
+      <w:ins w:id="1305" w:author="А.А. Шевцов" w:date="2026-10-17T12:00:00Z">
         <w:r>
           <w:rPr>
             <w:rFonts w:ascii="Times New Roman" w:hAnsi="Times New Roman"/>
@@ -1946,7 +3238,7 @@
         </w:rPr>
         <w:t xml:space="preserve">growth</w:t>
       </w:r>
-      <w:del w:id="1190" w:author="А.А. Шевцов" w:date="2026-10-17T12:00:00Z">
+      <w:del w:id="1302" w:author="А.А. Шевцов" w:date="2026-10-17T12:00:00Z">
         <w:r>
           <w:rPr>
             <w:rFonts w:ascii="Times New Roman" w:hAnsi="Times New Roman"/>
@@ -1956,7 +3248,7 @@
           <w:delText xml:space="preserve">"</w:delText>
         </w:r>
       </w:del>
-      <w:ins w:id="1191" w:author="А.А. Шевцов" w:date="2026-10-17T12:00:00Z">
+      <w:ins w:id="1303" w:author="А.А. Шевцов" w:date="2026-10-17T12:00:00Z">
         <w:r>
           <w:rPr>
             <w:rFonts w:ascii="Times New Roman" w:hAnsi="Times New Roman"/>
@@ -1993,7 +3285,7 @@
         </w:rPr>
         <w:t>- </w:t>
       </w:r>
-      <w:del w:id="1196" w:author="А.А. Шевцов" w:date="2026-10-17T12:00:00Z">
+      <w:del w:id="1308" w:author="А.А. Шевцов" w:date="2026-10-17T12:00:00Z">
         <w:r>
           <w:rPr>
             <w:rFonts w:ascii="Times New Roman" w:hAnsi="Times New Roman"/>
@@ -2003,7 +3295,7 @@
           <w:delText xml:space="preserve">"</w:delText>
         </w:r>
       </w:del>
-      <w:ins w:id="1197" w:author="А.А. Шевцов" w:date="2026-10-17T12:00:00Z">
+      <w:ins w:id="1309" w:author="А.А. Шевцов" w:date="2026-10-17T12:00:00Z">
         <w:r>
           <w:rPr>
             <w:rFonts w:ascii="Times New Roman" w:hAnsi="Times New Roman"/>
@@ -2021,7 +3313,7 @@
         </w:rPr>
         <w:t xml:space="preserve">adaptation</w:t>
       </w:r>
-      <w:del w:id="1194" w:author="А.А. Шевцов" w:date="2026-10-17T12:00:00Z">
+      <w:del w:id="1306" w:author="А.А. Шевцов" w:date="2026-10-17T12:00:00Z">
         <w:r>
           <w:rPr>
             <w:rFonts w:ascii="Times New Roman" w:hAnsi="Times New Roman"/>
@@ -2031,7 +3323,7 @@
           <w:delText xml:space="preserve">"</w:delText>
         </w:r>
       </w:del>
-      <w:ins w:id="1195" w:author="А.А. Шевцов" w:date="2026-10-17T12:00:00Z">
+      <w:ins w:id="1307" w:author="А.А. Шевцов" w:date="2026-10-17T12:00:00Z">
         <w:r>
           <w:rPr>
             <w:rFonts w:ascii="Times New Roman" w:hAnsi="Times New Roman"/>
@@ -2069,7 +3361,7 @@
         </w:rPr>
         <w:t xml:space="preserve">The theoretical significance of this classification lies in identifying the gap between planning principles and actual morphological processes. The authors argue that the majority of Russia's largest centers are characterized by a </w:t>
       </w:r>
-      <w:del w:id="1200" w:author="А.А. Шевцов" w:date="2026-10-17T12:00:00Z">
+      <w:del w:id="1312" w:author="А.А. Шевцов" w:date="2026-10-17T12:00:00Z">
         <w:r>
           <w:rPr>
             <w:rFonts w:ascii="Times New Roman" w:hAnsi="Times New Roman"/>
@@ -2079,7 +3371,7 @@
           <w:delText xml:space="preserve">"</w:delText>
         </w:r>
       </w:del>
-      <w:ins w:id="1201" w:author="А.А. Шевцов" w:date="2026-10-17T12:00:00Z">
+      <w:ins w:id="1313" w:author="А.А. Шевцов" w:date="2026-10-17T12:00:00Z">
         <w:r>
           <w:rPr>
             <w:rFonts w:ascii="Times New Roman" w:hAnsi="Times New Roman"/>
@@ -2089,7 +3381,7 @@
           <w:t xml:space="preserve">“</w:t>
         </w:r>
       </w:ins>
-      <w:del w:id="979" w:author="А.А. Шевцов" w:date="2026-10-17T12:00:00Z">
+      <w:del w:id="1091" w:author="А.А. Шевцов" w:date="2026-10-17T12:00:00Z">
         <w:r>
           <w:rPr>
             <w:rFonts w:ascii="Times New Roman" w:hAnsi="Times New Roman"/>
@@ -2099,7 +3391,7 @@
           <w:delText xml:space="preserve">sprouting</w:delText>
         </w:r>
       </w:del>
-      <w:ins w:id="980" w:author="А.А. Шевцов" w:date="2026-10-17T12:00:00Z">
+      <w:ins w:id="1092" w:author="А.А. Шевцов" w:date="2026-10-17T12:00:00Z">
         <w:r>
           <w:rPr>
             <w:rFonts w:ascii="Times New Roman" w:hAnsi="Times New Roman"/>
@@ -2109,7 +3401,7 @@
           <w:t xml:space="preserve">sprawl</w:t>
         </w:r>
       </w:ins>
-      <w:del w:id="1198" w:author="А.А. Шевцов" w:date="2026-10-17T12:00:00Z">
+      <w:del w:id="1310" w:author="А.А. Шевцов" w:date="2026-10-17T12:00:00Z">
         <w:r>
           <w:rPr>
             <w:rFonts w:ascii="Times New Roman" w:hAnsi="Times New Roman"/>
@@ -2119,7 +3411,7 @@
           <w:delText xml:space="preserve">"</w:delText>
         </w:r>
       </w:del>
-      <w:ins w:id="1199" w:author="А.А. Шевцов" w:date="2026-10-17T12:00:00Z">
+      <w:ins w:id="1311" w:author="А.А. Шевцов" w:date="2026-10-17T12:00:00Z">
         <w:r>
           <w:rPr>
             <w:rFonts w:ascii="Times New Roman" w:hAnsi="Times New Roman"/>
@@ -2157,7 +3449,7 @@
         </w:rPr>
         <w:t xml:space="preserve">A quantitative assessment of the scale of territorial expansion of Russian cities is widely presented in modern empirical works (in particular, in the studies of I.P. </w:t>
       </w:r>
-      <w:del w:id="981" w:author="А.А. Шевцов" w:date="2026-10-17T12:00:00Z">
+      <w:del w:id="1093" w:author="А.А. Шевцов" w:date="2026-10-17T12:00:00Z">
         <w:r>
           <w:rPr>
             <w:rFonts w:ascii="Times New Roman" w:hAnsi="Times New Roman"/>
@@ -2167,7 +3459,7 @@
           <w:delText xml:space="preserve">Smirnova and P.S. Lebedeva</w:delText>
         </w:r>
       </w:del>
-      <w:ins w:id="982" w:author="А.А. Шевцов" w:date="2026-10-17T12:00:00Z">
+      <w:ins w:id="1094" w:author="А.А. Шевцов" w:date="2026-10-17T12:00:00Z">
         <w:r>
           <w:rPr>
             <w:rFonts w:ascii="Times New Roman" w:hAnsi="Times New Roman"/>
@@ -2185,7 +3477,7 @@
         </w:rPr>
         <w:t xml:space="preserve"> (2023), as well as S.S. </w:t>
       </w:r>
-      <w:del w:id="983" w:author="А.А. Шевцов" w:date="2026-10-17T12:00:00Z">
+      <w:del w:id="1095" w:author="А.А. Шевцов" w:date="2026-10-17T12:00:00Z">
         <w:r>
           <w:rPr>
             <w:rFonts w:ascii="Times New Roman" w:hAnsi="Times New Roman"/>
@@ -2195,7 +3487,7 @@
           <w:delText xml:space="preserve">Lachininsky and others.</w:delText>
         </w:r>
       </w:del>
-      <w:ins w:id="984" w:author="А.А. Шевцов" w:date="2026-10-17T12:00:00Z">
+      <w:ins w:id="1096" w:author="А.А. Шевцов" w:date="2026-10-17T12:00:00Z">
         <w:r>
           <w:rPr>
             <w:rFonts w:ascii="Times New Roman" w:hAnsi="Times New Roman"/>
@@ -2213,7 +3505,7 @@
         </w:rPr>
         <w:t xml:space="preserve"> (2023)). However, by focusing primarily on the spatial parameters of growth and the fixation of physical boundaries of development, such approaches leave the economic drivers of these processes </w:t>
       </w:r>
-      <w:del w:id="985" w:author="А.А. Шевцов" w:date="2026-10-17T12:00:00Z">
+      <w:del w:id="1097" w:author="А.А. Шевцов" w:date="2026-10-17T12:00:00Z">
         <w:r>
           <w:rPr>
             <w:rFonts w:ascii="Times New Roman" w:hAnsi="Times New Roman"/>
@@ -2223,7 +3515,7 @@
           <w:delText xml:space="preserve">undisclosed</w:delText>
         </w:r>
       </w:del>
-      <w:ins w:id="986" w:author="А.А. Шевцов" w:date="2026-10-17T12:00:00Z">
+      <w:ins w:id="1098" w:author="А.А. Шевцов" w:date="2026-10-17T12:00:00Z">
         <w:r>
           <w:rPr>
             <w:rFonts w:ascii="Times New Roman" w:hAnsi="Times New Roman"/>
@@ -2292,7 +3584,7 @@
         </w:rPr>
         <w:t xml:space="preserve">The work is based on the combination of an analysis of the spatial dynamics of the built-up area of Voronezh and its suburbs with an assessment of the socio-economic characteristics of newly developed territories. The work algorithm included three stages: 1) retrospective reconstruction of the physical boundaries of the built-up area for </w:t>
       </w:r>
-      <w:del w:id="987" w:author="А.А. Шевцов" w:date="2026-10-17T12:00:00Z">
+      <w:del w:id="1099" w:author="А.А. Шевцов" w:date="2026-10-17T12:00:00Z">
         <w:r>
           <w:rPr>
             <w:rFonts w:ascii="Times New Roman" w:hAnsi="Times New Roman"/>
@@ -2301,7 +3593,7 @@
           <w:delText xml:space="preserve">individual specified</w:delText>
         </w:r>
       </w:del>
-      <w:ins w:id="988" w:author="А.А. Шевцов" w:date="2026-10-17T12:00:00Z">
+      <w:ins w:id="1100" w:author="А.А. Шевцов" w:date="2026-10-17T12:00:00Z">
         <w:r>
           <w:rPr>
             <w:rFonts w:ascii="Times New Roman" w:hAnsi="Times New Roman"/>
@@ -2335,7 +3627,7 @@
         </w:rPr>
         <w:t xml:space="preserve">The spatial scope of the study is limited to a radius of 30 km from the city center. This scale makes it possible to fully include the zone of the most intensive morphological and functional transformations in the suburban belt. The timeframe of the work covers the period 1992–2025. To identify spatial and temporal patterns, development dynamics were recorded at </w:t>
       </w:r>
-      <w:del w:id="991" w:author="А.А. Шевцов" w:date="2026-10-17T12:00:00Z">
+      <w:del w:id="1103" w:author="А.А. Шевцов" w:date="2026-10-17T12:00:00Z">
         <w:r>
           <w:rPr>
             <w:rFonts w:ascii="Times New Roman" w:hAnsi="Times New Roman"/>
@@ -2344,7 +3636,7 @@
           <w:delText xml:space="preserve">reference points</w:delText>
         </w:r>
       </w:del>
-      <w:ins w:id="992" w:author="А.А. Шевцов" w:date="2026-10-17T12:00:00Z">
+      <w:ins w:id="1104" w:author="А.А. Шевцов" w:date="2026-10-17T12:00:00Z">
         <w:r>
           <w:rPr>
             <w:rFonts w:ascii="Times New Roman" w:hAnsi="Times New Roman"/>
@@ -2360,7 +3652,7 @@
         </w:rPr>
         <w:t xml:space="preserve"> (1992, 2000, 2010, 2020). The use of </w:t>
       </w:r>
-      <w:del w:id="989" w:author="А.А. Шевцов" w:date="2026-10-17T12:00:00Z">
+      <w:del w:id="1101" w:author="А.А. Шевцов" w:date="2026-10-17T12:00:00Z">
         <w:r>
           <w:rPr>
             <w:rFonts w:ascii="Times New Roman" w:hAnsi="Times New Roman"/>
@@ -2369,7 +3661,7 @@
           <w:delText xml:space="preserve">ten-day</w:delText>
         </w:r>
       </w:del>
-      <w:ins w:id="990" w:author="А.А. Шевцов" w:date="2026-10-17T12:00:00Z">
+      <w:ins w:id="1102" w:author="А.А. Шевцов" w:date="2026-10-17T12:00:00Z">
         <w:r>
           <w:rPr>
             <w:rFonts w:ascii="Times New Roman" w:hAnsi="Times New Roman"/>
@@ -2463,7 +3755,7 @@
         </w:rPr>
         <w:t xml:space="preserve">– open project </w:t>
       </w:r>
-      <w:del w:id="1204" w:author="А.А. Шевцов" w:date="2026-10-17T12:00:00Z">
+      <w:del w:id="1316" w:author="А.А. Шевцов" w:date="2026-10-17T12:00:00Z">
         <w:r>
           <w:rPr>
             <w:rFonts w:ascii="Times New Roman" w:hAnsi="Times New Roman"/>
@@ -2472,7 +3764,7 @@
           <w:delText xml:space="preserve">"</w:delText>
         </w:r>
       </w:del>
-      <w:ins w:id="1205" w:author="А.А. Шевцов" w:date="2026-10-17T12:00:00Z">
+      <w:ins w:id="1317" w:author="А.А. Шевцов" w:date="2026-10-17T12:00:00Z">
         <w:r>
           <w:rPr>
             <w:rFonts w:ascii="Times New Roman" w:hAnsi="Times New Roman"/>
@@ -2488,7 +3780,7 @@
         </w:rPr>
         <w:t xml:space="preserve">How old is this house</w:t>
       </w:r>
-      <w:del w:id="1202" w:author="А.А. Шевцов" w:date="2026-10-17T12:00:00Z">
+      <w:del w:id="1314" w:author="А.А. Шевцов" w:date="2026-10-17T12:00:00Z">
         <w:r>
           <w:rPr>
             <w:rFonts w:ascii="Times New Roman" w:hAnsi="Times New Roman"/>
@@ -2497,7 +3789,7 @@
           <w:delText xml:space="preserve">"</w:delText>
         </w:r>
       </w:del>
-      <w:ins w:id="1203" w:author="А.А. Шевцов" w:date="2026-10-17T12:00:00Z">
+      <w:ins w:id="1315" w:author="А.А. Шевцов" w:date="2026-10-17T12:00:00Z">
         <w:r>
           <w:rPr>
             <w:rFonts w:ascii="Times New Roman" w:hAnsi="Times New Roman"/>
@@ -2554,7 +3846,7 @@
         </w:rPr>
         <w:t xml:space="preserve"> – development </w:t>
       </w:r>
-      <w:del w:id="995" w:author="А.А. Шевцов" w:date="2026-10-17T12:00:00Z">
+      <w:del w:id="1107" w:author="А.А. Шевцов" w:date="2026-10-17T12:00:00Z">
         <w:r>
           <w:rPr>
             <w:rFonts w:ascii="Times New Roman" w:hAnsi="Times New Roman"/>
@@ -2563,7 +3855,7 @@
           <w:delText xml:space="preserve">sites not covered by</w:delText>
         </w:r>
       </w:del>
-      <w:ins w:id="996" w:author="А.А. Шевцов" w:date="2026-10-17T12:00:00Z">
+      <w:ins w:id="1108" w:author="А.А. Шевцов" w:date="2026-10-17T12:00:00Z">
         <w:r>
           <w:rPr>
             <w:rFonts w:ascii="Times New Roman" w:hAnsi="Times New Roman"/>
@@ -2631,7 +3923,7 @@
         </w:rPr>
         <w:t xml:space="preserve">The sources were prioritized based on their degree of reliability: the highest priority is given to data from the Unified State Register of Real Estate </w:t>
       </w:r>
-      <w:del w:id="993" w:author="А.А. Шевцов" w:date="2026-10-17T12:00:00Z">
+      <w:del w:id="1105" w:author="А.А. Шевцов" w:date="2026-10-17T12:00:00Z">
         <w:r>
           <w:rPr>
             <w:rFonts w:ascii="Times New Roman" w:hAnsi="Times New Roman"/>
@@ -2640,7 +3932,7 @@
           <w:delText xml:space="preserve">(EGRN)</w:delText>
         </w:r>
       </w:del>
-      <w:ins w:id="994" w:author="А.А. Шевцов" w:date="2026-10-17T12:00:00Z">
+      <w:ins w:id="1106" w:author="А.А. Шевцов" w:date="2026-10-17T12:00:00Z">
         <w:r>
           <w:rPr>
             <w:rFonts w:ascii="Times New Roman" w:hAnsi="Times New Roman"/>
@@ -2684,7 +3976,7 @@
         </w:rPr>
         <w:t xml:space="preserve">The process of transition from individual buildings to continuous development areas involved a number of operations. A 200-meter </w:t>
       </w:r>
-      <w:del w:id="997" w:author="А.А. Шевцов" w:date="2026-10-17T12:00:00Z">
+      <w:del w:id="1109" w:author="А.А. Шевцов" w:date="2026-10-17T12:00:00Z">
         <w:r>
           <w:rPr>
             <w:rFonts w:ascii="Times New Roman" w:hAnsi="Times New Roman"/>
@@ -2694,7 +3986,7 @@
           <w:delText xml:space="preserve">coverage zone</w:delText>
         </w:r>
       </w:del>
-      <w:ins w:id="998" w:author="А.А. Шевцов" w:date="2026-10-17T12:00:00Z">
+      <w:ins w:id="1110" w:author="А.А. Шевцов" w:date="2026-10-17T12:00:00Z">
         <w:r>
           <w:rPr>
             <w:rFonts w:ascii="Times New Roman" w:hAnsi="Times New Roman"/>
@@ -2712,7 +4004,7 @@
         </w:rPr>
         <w:t xml:space="preserve"> was created around each building. When such </w:t>
       </w:r>
-      <w:del w:id="999" w:author="А.А. Шевцов" w:date="2026-10-17T12:00:00Z">
+      <w:del w:id="1111" w:author="А.А. Шевцов" w:date="2026-10-17T12:00:00Z">
         <w:r>
           <w:rPr>
             <w:rFonts w:ascii="Times New Roman" w:hAnsi="Times New Roman"/>
@@ -2722,7 +4014,7 @@
           <w:delText xml:space="preserve">zones</w:delText>
         </w:r>
       </w:del>
-      <w:ins w:id="1000" w:author="А.А. Шевцов" w:date="2026-10-17T12:00:00Z">
+      <w:ins w:id="1112" w:author="А.А. Шевцов" w:date="2026-10-17T12:00:00Z">
         <w:r>
           <w:rPr>
             <w:rFonts w:ascii="Times New Roman" w:hAnsi="Times New Roman"/>
@@ -2740,7 +4032,7 @@
         </w:rPr>
         <w:t xml:space="preserve"> intersected, the buildings were grouped into single large areas. The chosen distance made it possible to include sparse development within the boundaries of the areas, while avoiding the false merging of territories that are distant from each other. </w:t>
       </w:r>
-      <w:del w:id="1001" w:author="А.А. Шевцов" w:date="2026-10-17T12:00:00Z">
+      <w:del w:id="1113" w:author="А.А. Шевцов" w:date="2026-10-17T12:00:00Z">
         <w:r>
           <w:rPr>
             <w:rFonts w:ascii="Times New Roman" w:hAnsi="Times New Roman"/>
@@ -2750,7 +4042,7 @@
           <w:delText xml:space="preserve">Empty spaces</w:delText>
         </w:r>
       </w:del>
-      <w:ins w:id="1002" w:author="А.А. Шевцов" w:date="2026-10-17T12:00:00Z">
+      <w:ins w:id="1114" w:author="А.А. Шевцов" w:date="2026-10-17T12:00:00Z">
         <w:r>
           <w:rPr>
             <w:rFonts w:ascii="Times New Roman" w:hAnsi="Times New Roman"/>
@@ -2800,7 +4092,7 @@
           <w:sz w:val="24"/>
         </w:rPr>
       </w:pPr>
-      <w:del w:id="1028" w:author="А.А. Шевцов" w:date="2026-10-17T12:00:00Z">
+      <w:del w:id="1140" w:author="А.А. Шевцов" w:date="2026-10-17T12:00:00Z">
         <w:r>
           <w:rPr>
             <w:rFonts w:ascii="Times New Roman" w:hAnsi="Times New Roman"/>
@@ -2811,7 +4103,7 @@
           <w:delText xml:space="preserve">For highlighting</w:delText>
         </w:r>
       </w:del>
-      <w:ins w:id="1029" w:author="А.А. Шевцов" w:date="2026-10-17T12:00:00Z">
+      <w:ins w:id="1141" w:author="А.А. Шевцов" w:date="2026-10-17T12:00:00Z">
         <w:r>
           <w:rPr>
             <w:rFonts w:ascii="Times New Roman" w:hAnsi="Times New Roman"/>
@@ -2840,7 +4132,7 @@
         </w:rPr>
         <w:t xml:space="preserve">development </w:t>
       </w:r>
-      <w:del w:id="1030" w:author="А.А. Шевцов" w:date="2026-10-17T12:00:00Z">
+      <w:del w:id="1142" w:author="А.А. Шевцов" w:date="2026-10-17T12:00:00Z">
         <w:r>
           <w:rPr>
             <w:rFonts w:ascii="Times New Roman" w:hAnsi="Times New Roman"/>
@@ -2851,7 +4143,7 @@
           <w:delText xml:space="preserve">morphotypes</w:delText>
         </w:r>
       </w:del>
-      <w:ins w:id="1031" w:author="А.А. Шевцов" w:date="2026-10-17T12:00:00Z">
+      <w:ins w:id="1143" w:author="А.А. Шевцов" w:date="2026-10-17T12:00:00Z">
         <w:r>
           <w:rPr>
             <w:rFonts w:ascii="Times New Roman" w:hAnsi="Times New Roman"/>
@@ -2918,7 +4210,7 @@
         <w:lastRenderedPageBreak/>
         <w:t xml:space="preserve">– Compactness index </w:t>
       </w:r>
-      <w:del w:id="1032" w:author="А.А. Шевцов" w:date="2026-10-17T12:00:00Z">
+      <w:del w:id="1144" w:author="А.А. Шевцов" w:date="2026-10-17T12:00:00Z">
         <w:r>
           <w:rPr>
             <w:rFonts w:ascii="Times New Roman" w:hAnsi="Times New Roman"/>
@@ -2928,7 +4220,7 @@
           <w:delText xml:space="preserve">(m</w:delText>
         </w:r>
       </w:del>
-      <w:del w:id="1033" w:author="А.А. Шевцов" w:date="2026-10-17T12:00:00Z">
+      <w:del w:id="1145" w:author="А.А. Шевцов" w:date="2026-10-17T12:00:00Z">
         <w:r>
           <w:rPr>
             <w:rFonts w:ascii="Times New Roman" w:hAnsi="Times New Roman"/>
@@ -2939,7 +4231,7 @@
           <w:delText xml:space="preserve">2</w:delText>
         </w:r>
       </w:del>
-      <w:del w:id="1034" w:author="А.А. Шевцов" w:date="2026-10-17T12:00:00Z">
+      <w:del w:id="1146" w:author="А.А. Шевцов" w:date="2026-10-17T12:00:00Z">
         <w:r>
           <w:rPr>
             <w:rFonts w:ascii="Times New Roman" w:hAnsi="Times New Roman"/>
@@ -2949,7 +4241,7 @@
           <w:delText xml:space="preserve">/ha)</w:delText>
         </w:r>
       </w:del>
-      <w:ins w:id="1035" w:author="А.А. Шевцов" w:date="2026-10-17T12:00:00Z">
+      <w:ins w:id="1147" w:author="А.А. Шевцов" w:date="2026-10-17T12:00:00Z">
         <w:r>
           <w:rPr>
             <w:rFonts w:ascii="Times New Roman" w:hAnsi="Times New Roman"/>
@@ -2987,7 +4279,7 @@
         </w:rPr>
         <w:t xml:space="preserve">– Average surface area of the building </w:t>
       </w:r>
-      <w:del w:id="1036" w:author="А.А. Шевцов" w:date="2026-10-17T12:00:00Z">
+      <w:del w:id="1148" w:author="А.А. Шевцов" w:date="2026-10-17T12:00:00Z">
         <w:r>
           <w:rPr>
             <w:rFonts w:ascii="Times New Roman" w:hAnsi="Times New Roman"/>
@@ -2997,7 +4289,7 @@
           <w:delText xml:space="preserve">(m</w:delText>
         </w:r>
       </w:del>
-      <w:del w:id="1037" w:author="А.А. Шевцов" w:date="2026-10-17T12:00:00Z">
+      <w:del w:id="1149" w:author="А.А. Шевцов" w:date="2026-10-17T12:00:00Z">
         <w:r>
           <w:rPr>
             <w:rFonts w:ascii="Times New Roman" w:hAnsi="Times New Roman"/>
@@ -3008,7 +4300,7 @@
           <w:delText xml:space="preserve">2</w:delText>
         </w:r>
       </w:del>
-      <w:del w:id="1038" w:author="А.А. Шевцов" w:date="2026-10-17T12:00:00Z">
+      <w:del w:id="1150" w:author="А.А. Шевцов" w:date="2026-10-17T12:00:00Z">
         <w:r>
           <w:rPr>
             <w:rFonts w:ascii="Times New Roman" w:hAnsi="Times New Roman"/>
@@ -3018,7 +4310,7 @@
           <w:delText xml:space="preserve">)</w:delText>
         </w:r>
       </w:del>
-      <w:ins w:id="1039" w:author="А.А. Шевцов" w:date="2026-10-17T12:00:00Z">
+      <w:ins w:id="1151" w:author="А.А. Шевцов" w:date="2026-10-17T12:00:00Z">
         <w:r>
           <w:rPr>
             <w:rFonts w:ascii="Times New Roman" w:hAnsi="Times New Roman"/>
@@ -3056,7 +4348,7 @@
         </w:rPr>
         <w:t xml:space="preserve">– Density of consumer activity (relative units/ha) – the “density” of revenue processed through cash register equipment located on the territory, calculated per 1 ha. Calculated using the areal interpolation method based on data from the </w:t>
       </w:r>
-      <w:del w:id="1003" w:author="А.А. Шевцов" w:date="2026-10-17T12:00:00Z">
+      <w:del w:id="1115" w:author="А.А. Шевцов" w:date="2026-10-17T12:00:00Z">
         <w:r>
           <w:rPr>
             <w:rFonts w:ascii="Times New Roman" w:hAnsi="Times New Roman"/>
@@ -3066,7 +4358,7 @@
           <w:delText xml:space="preserve">Geocheki</w:delText>
         </w:r>
       </w:del>
-      <w:ins w:id="1004" w:author="А.А. Шевцов" w:date="2026-10-17T12:00:00Z">
+      <w:ins w:id="1116" w:author="А.А. Шевцов" w:date="2026-10-17T12:00:00Z">
         <w:r>
           <w:rPr>
             <w:rFonts w:ascii="Times New Roman" w:hAnsi="Times New Roman"/>
@@ -3121,7 +4413,7 @@
         </w:rPr>
         <w:t xml:space="preserve">– Density of fixed assets of enterprises (rubles/ha) – the total value of fixed assets of companies located in the polygon, calculated per 1 ha. Calculated based on a database of company financial statements aggregated by the </w:t>
       </w:r>
-      <w:del w:id="1208" w:author="А.А. Шевцов" w:date="2026-10-17T12:00:00Z">
+      <w:del w:id="1320" w:author="А.А. Шевцов" w:date="2026-10-17T12:00:00Z">
         <w:r>
           <w:rPr>
             <w:rFonts w:ascii="Times New Roman" w:hAnsi="Times New Roman"/>
@@ -3131,7 +4423,7 @@
           <w:delText xml:space="preserve">"</w:delText>
         </w:r>
       </w:del>
-      <w:ins w:id="1209" w:author="А.А. Шевцов" w:date="2026-10-17T12:00:00Z">
+      <w:ins w:id="1321" w:author="А.А. Шевцов" w:date="2026-10-17T12:00:00Z">
         <w:r>
           <w:rPr>
             <w:rFonts w:ascii="Times New Roman" w:hAnsi="Times New Roman"/>
@@ -3149,7 +4441,7 @@
         </w:rPr>
         <w:t xml:space="preserve">To Be Precise</w:t>
       </w:r>
-      <w:del w:id="1206" w:author="А.А. Шевцов" w:date="2026-10-17T12:00:00Z">
+      <w:del w:id="1318" w:author="А.А. Шевцов" w:date="2026-10-17T12:00:00Z">
         <w:r>
           <w:rPr>
             <w:rFonts w:ascii="Times New Roman" w:hAnsi="Times New Roman"/>
@@ -3159,7 +4451,7 @@
           <w:delText xml:space="preserve">"</w:delText>
         </w:r>
       </w:del>
-      <w:ins w:id="1207" w:author="А.А. Шевцов" w:date="2026-10-17T12:00:00Z">
+      <w:ins w:id="1319" w:author="А.А. Шевцов" w:date="2026-10-17T12:00:00Z">
         <w:r>
           <w:rPr>
             <w:rFonts w:ascii="Times New Roman" w:hAnsi="Times New Roman"/>
@@ -3257,7 +4549,7 @@
         </w:rPr>
         <w:t xml:space="preserve">– Distance from the center of Voronezh: calculation of the average distance from the city center to the centers of new </w:t>
       </w:r>
-      <w:del w:id="1009" w:author="А.А. Шевцов" w:date="2026-10-17T12:00:00Z">
+      <w:del w:id="1121" w:author="А.А. Шевцов" w:date="2026-10-17T12:00:00Z">
         <w:r>
           <w:rPr>
             <w:rFonts w:ascii="Times New Roman" w:hAnsi="Times New Roman"/>
@@ -3267,7 +4559,7 @@
           <w:delText xml:space="preserve">landfills</w:delText>
         </w:r>
       </w:del>
-      <w:ins w:id="1010" w:author="А.А. Шевцов" w:date="2026-10-17T12:00:00Z">
+      <w:ins w:id="1122" w:author="А.А. Шевцов" w:date="2026-10-17T12:00:00Z">
         <w:r>
           <w:rPr>
             <w:rFonts w:ascii="Times New Roman" w:hAnsi="Times New Roman"/>
@@ -3306,7 +4598,7 @@
         </w:rPr>
         <w:t xml:space="preserve">– Specific cadastral value of land plots located in the polygon (rubles/m²): based on Rosreestr data (2025) to measure the </w:t>
       </w:r>
-      <w:ins w:id="1013" w:author="А.А. Шевцов" w:date="2026-10-17T12:00:00Z">
+      <w:ins w:id="1125" w:author="А.А. Шевцов" w:date="2026-10-17T12:00:00Z">
         <w:r>
           <w:rPr>
             <w:rFonts w:ascii="Times New Roman" w:hAnsi="Times New Roman"/>
@@ -3345,7 +4637,7 @@
         </w:rPr>
         <w:t xml:space="preserve">A significant limitation of the proposed approach is the need to operate with the indicator of the surface area of buildings, which is significantly inferior in morphological significance to the number of </w:t>
       </w:r>
-      <w:del w:id="1016" w:author="А.А. Шевцов" w:date="2026-10-17T12:00:00Z">
+      <w:del w:id="1128" w:author="А.А. Шевцов" w:date="2026-10-17T12:00:00Z">
         <w:r>
           <w:rPr>
             <w:rFonts w:ascii="Times New Roman" w:hAnsi="Times New Roman"/>
@@ -3355,7 +4647,7 @@
           <w:delText xml:space="preserve">storeys</w:delText>
         </w:r>
       </w:del>
-      <w:ins w:id="1017" w:author="А.А. Шевцов" w:date="2026-10-17T12:00:00Z">
+      <w:ins w:id="1129" w:author="А.А. Шевцов" w:date="2026-10-17T12:00:00Z">
         <w:r>
           <w:rPr>
             <w:rFonts w:ascii="Times New Roman" w:hAnsi="Times New Roman"/>
@@ -3373,7 +4665,7 @@
         </w:rPr>
         <w:t xml:space="preserve"> and the </w:t>
       </w:r>
-      <w:del w:id="1014" w:author="А.А. Шевцов" w:date="2026-10-17T12:00:00Z">
+      <w:del w:id="1126" w:author="А.А. Шевцов" w:date="2026-10-17T12:00:00Z">
         <w:r>
           <w:rPr>
             <w:rFonts w:ascii="Times New Roman" w:hAnsi="Times New Roman"/>
@@ -3383,7 +4675,7 @@
           <w:delText xml:space="preserve">development coefficient</w:delText>
         </w:r>
       </w:del>
-      <w:ins w:id="1015" w:author="А.А. Шевцов" w:date="2026-10-17T12:00:00Z">
+      <w:ins w:id="1127" w:author="А.А. Шевцов" w:date="2026-10-17T12:00:00Z">
         <w:r>
           <w:rPr>
             <w:rFonts w:ascii="Times New Roman" w:hAnsi="Times New Roman"/>
@@ -3401,7 +4693,7 @@
         </w:rPr>
         <w:t xml:space="preserve">. Data on the number of floors </w:t>
       </w:r>
-      <w:del w:id="1018" w:author="А.А. Шевцов" w:date="2026-10-17T12:00:00Z">
+      <w:del w:id="1130" w:author="А.А. Шевцов" w:date="2026-10-17T12:00:00Z">
         <w:r>
           <w:rPr>
             <w:rFonts w:ascii="Times New Roman" w:hAnsi="Times New Roman"/>
@@ -3411,7 +4703,7 @@
           <w:delText xml:space="preserve">is</w:delText>
         </w:r>
       </w:del>
-      <w:ins w:id="1019" w:author="А.А. Шевцов" w:date="2026-10-17T12:00:00Z">
+      <w:ins w:id="1131" w:author="А.А. Шевцов" w:date="2026-10-17T12:00:00Z">
         <w:r>
           <w:rPr>
             <w:rFonts w:ascii="Times New Roman" w:hAnsi="Times New Roman"/>
@@ -3429,7 +4721,7 @@
         </w:rPr>
         <w:t xml:space="preserve"> often not publicly available and </w:t>
       </w:r>
-      <w:del w:id="1020" w:author="А.А. Шевцов" w:date="2026-10-17T12:00:00Z">
+      <w:del w:id="1132" w:author="А.А. Шевцов" w:date="2026-10-17T12:00:00Z">
         <w:r>
           <w:rPr>
             <w:rFonts w:ascii="Times New Roman" w:hAnsi="Times New Roman"/>
@@ -3439,7 +4731,7 @@
           <w:delText xml:space="preserve">is</w:delText>
         </w:r>
       </w:del>
-      <w:ins w:id="1021" w:author="А.А. Шевцов" w:date="2026-10-17T12:00:00Z">
+      <w:ins w:id="1133" w:author="А.А. Шевцов" w:date="2026-10-17T12:00:00Z">
         <w:r>
           <w:rPr>
             <w:rFonts w:ascii="Times New Roman" w:hAnsi="Times New Roman"/>
@@ -3478,7 +4770,7 @@
         </w:rPr>
         <w:t xml:space="preserve">All spatial operations and calculations of indicators were performed in the QGIS </w:t>
       </w:r>
-      <w:del w:id="1048" w:author="А.А. Шевцов" w:date="2026-10-17T12:00:00Z">
+      <w:del w:id="1160" w:author="А.А. Шевцов" w:date="2026-10-17T12:00:00Z">
         <w:r>
           <w:rPr>
             <w:rFonts w:ascii="Times New Roman" w:hAnsi="Times New Roman"/>
@@ -3488,7 +4780,7 @@
           <w:delText xml:space="preserve">program</w:delText>
         </w:r>
       </w:del>
-      <w:ins w:id="1049" w:author="А.А. Шевцов" w:date="2026-10-17T12:00:00Z">
+      <w:ins w:id="1161" w:author="А.А. Шевцов" w:date="2026-10-17T12:00:00Z">
         <w:r>
           <w:rPr>
             <w:rFonts w:ascii="Times New Roman" w:hAnsi="Times New Roman"/>
@@ -3559,7 +4851,7 @@
         </w:rPr>
         <w:t xml:space="preserve">An analysis of the territorial growth of Voronezh and its suburban area and changes in their morphology for the period 1992–2025 allows us to identify a profound structural reorganization of the spatial system under study. By the beginning of the post-Soviet period, the development retained a compact planning structure: the area of the “physical city” was 28.8 thousand hectares, which was comparable to the total area of suburban settlements (31.2 thousand hectares) with an extremely low proportion of dispersed development (3.5 thousand hectares). By 2025, the situation had radically transformed: while the area of the “physical city” had grown by 42% (to 41.1 thousand hectares), the area of settlements in the </w:t>
       </w:r>
-      <w:del w:id="1054" w:author="А.А. Шевцов" w:date="2026-10-17T12:00:00Z">
+      <w:del w:id="1166" w:author="А.А. Шевцов" w:date="2026-10-17T12:00:00Z">
         <w:r>
           <w:rPr>
             <w:rFonts w:ascii="Times New Roman" w:hAnsi="Times New Roman"/>
@@ -3569,7 +4861,7 @@
           <w:delText xml:space="preserve">near</w:delText>
         </w:r>
       </w:del>
-      <w:ins w:id="1055" w:author="А.А. Шевцов" w:date="2026-10-17T12:00:00Z">
+      <w:ins w:id="1167" w:author="А.А. Шевцов" w:date="2026-10-17T12:00:00Z">
         <w:r>
           <w:rPr>
             <w:rFonts w:ascii="Times New Roman" w:hAnsi="Times New Roman"/>
@@ -3587,7 +4879,7 @@
         </w:rPr>
         <w:t xml:space="preserve"> suburbs had doubled, reaching 62.2 thousand hectares, and the area of dispersed development areas had increased more than 3.5 times (to 12.3 thousand hectares). As a result, the share of the “physical city” in the overall structure of the study area decreased from 45% to 35% </w:t>
       </w:r>
-      <w:del w:id="1060" w:author="А.А. Шевцов" w:date="2026-10-17T12:00:00Z">
+      <w:del w:id="1172" w:author="А.А. Шевцов" w:date="2026-10-17T12:00:00Z">
         <w:r>
           <w:rPr>
             <w:rFonts w:ascii="Times New Roman" w:hAnsi="Times New Roman"/>
@@ -3597,7 +4889,7 @@
           <w:delText xml:space="preserve">due to the accelerated pace</w:delText>
         </w:r>
       </w:del>
-      <w:ins w:id="1061" w:author="А.А. Шевцов" w:date="2026-10-17T12:00:00Z">
+      <w:ins w:id="1173" w:author="А.А. Шевцов" w:date="2026-10-17T12:00:00Z">
         <w:r>
           <w:rPr>
             <w:rFonts w:ascii="Times New Roman" w:hAnsi="Times New Roman"/>
@@ -3635,7 +4927,7 @@
         </w:rPr>
         <w:t xml:space="preserve">This significant structural shift resulted from the prevalence of discrete methods of urban expansion over traditional </w:t>
       </w:r>
-      <w:del w:id="1062" w:author="А.А. Шевцов" w:date="2026-10-17T12:00:00Z">
+      <w:del w:id="1174" w:author="А.А. Шевцов" w:date="2026-10-17T12:00:00Z">
         <w:r>
           <w:rPr>
             <w:rFonts w:ascii="Times New Roman" w:hAnsi="Times New Roman"/>
@@ -3645,7 +4937,7 @@
           <w:delText xml:space="preserve">regional</w:delText>
         </w:r>
       </w:del>
-      <w:ins w:id="1063" w:author="А.А. Шевцов" w:date="2026-10-17T12:00:00Z">
+      <w:ins w:id="1175" w:author="А.А. Шевцов" w:date="2026-10-17T12:00:00Z">
         <w:r>
           <w:rPr>
             <w:rFonts w:ascii="Times New Roman" w:hAnsi="Times New Roman"/>
@@ -3692,7 +4984,7 @@
         </w:rPr>
         <w:t xml:space="preserve">This trend is largely driven by economic incentives. The most expensive land plots for new development with a specific cost of </w:t>
       </w:r>
-      <w:del w:id="1066" w:author="А.А. Шевцов" w:date="2026-10-17T12:00:00Z">
+      <w:del w:id="1178" w:author="А.А. Шевцов" w:date="2026-10-17T12:00:00Z">
         <w:r>
           <w:rPr>
             <w:rFonts w:ascii="Times New Roman" w:hAnsi="Times New Roman"/>
@@ -3702,7 +4994,7 @@
           <w:delText xml:space="preserve">1892 rubles/m</w:delText>
         </w:r>
       </w:del>
-      <w:del w:id="1067" w:author="А.А. Шевцов" w:date="2026-10-17T12:00:00Z">
+      <w:del w:id="1179" w:author="А.А. Шевцов" w:date="2026-10-17T12:00:00Z">
         <w:r>
           <w:rPr>
             <w:rFonts w:ascii="Times New Roman" w:hAnsi="Times New Roman"/>
@@ -3713,7 +5005,7 @@
           <w:delText xml:space="preserve">2</w:delText>
         </w:r>
       </w:del>
-      <w:ins w:id="1068" w:author="А.А. Шевцов" w:date="2026-10-17T12:00:00Z">
+      <w:ins w:id="1180" w:author="А.А. Шевцов" w:date="2026-10-17T12:00:00Z">
         <w:r>
           <w:rPr>
             <w:rFonts w:ascii="Times New Roman" w:hAnsi="Times New Roman"/>
@@ -3731,7 +5023,7 @@
         </w:rPr>
         <w:t xml:space="preserve"> were developed as a result of the </w:t>
       </w:r>
-      <w:del w:id="1064" w:author="А.А. Шевцов" w:date="2026-10-17T12:00:00Z">
+      <w:del w:id="1176" w:author="А.А. Шевцов" w:date="2026-10-17T12:00:00Z">
         <w:r>
           <w:rPr>
             <w:rFonts w:ascii="Times New Roman" w:hAnsi="Times New Roman"/>
@@ -3741,7 +5033,7 @@
           <w:delText xml:space="preserve">regional</w:delText>
         </w:r>
       </w:del>
-      <w:ins w:id="1065" w:author="А.А. Шевцов" w:date="2026-10-17T12:00:00Z">
+      <w:ins w:id="1177" w:author="А.А. Шевцов" w:date="2026-10-17T12:00:00Z">
         <w:r>
           <w:rPr>
             <w:rFonts w:ascii="Times New Roman" w:hAnsi="Times New Roman"/>
@@ -3759,7 +5051,7 @@
         </w:rPr>
         <w:t xml:space="preserve"> growth of the “physical city”. The high cost of land in these areas, due to their proximity to urban utility networks and transport hubs, dictates the need to implement high-density, </w:t>
       </w:r>
-      <w:del w:id="1071" w:author="А.А. Шевцов" w:date="2026-10-17T12:00:00Z">
+      <w:del w:id="1183" w:author="А.А. Шевцов" w:date="2026-10-17T12:00:00Z">
         <w:r>
           <w:rPr>
             <w:rFonts w:ascii="Times New Roman" w:hAnsi="Times New Roman"/>
@@ -3769,7 +5061,7 @@
           <w:delText xml:space="preserve">multi-story</w:delText>
         </w:r>
       </w:del>
-      <w:ins w:id="1072" w:author="А.А. Шевцов" w:date="2026-10-17T12:00:00Z">
+      <w:ins w:id="1184" w:author="А.А. Шевцов" w:date="2026-10-17T12:00:00Z">
         <w:r>
           <w:rPr>
             <w:rFonts w:ascii="Times New Roman" w:hAnsi="Times New Roman"/>
@@ -3787,7 +5079,7 @@
         </w:rPr>
         <w:t xml:space="preserve"> residential development projects. On the contrary, the mechanism of isolated growth, which dominates the growth structure, is realized on land plots remote from the city with an average price of 409 rubles/m². This is due to the phenomenon of the “rent gap” described by N. Smith (1987). The fivefold price disparity between the outskirts of the </w:t>
       </w:r>
-      <w:del w:id="1212" w:author="А.А. Шевцов" w:date="2026-10-17T12:00:00Z">
+      <w:del w:id="1324" w:author="А.А. Шевцов" w:date="2026-10-17T12:00:00Z">
         <w:r>
           <w:rPr>
             <w:rFonts w:ascii="Times New Roman" w:hAnsi="Times New Roman"/>
@@ -3797,7 +5089,7 @@
           <w:delText xml:space="preserve">"</w:delText>
         </w:r>
       </w:del>
-      <w:ins w:id="1213" w:author="А.А. Шевцов" w:date="2026-10-17T12:00:00Z">
+      <w:ins w:id="1325" w:author="А.А. Шевцов" w:date="2026-10-17T12:00:00Z">
         <w:r>
           <w:rPr>
             <w:rFonts w:ascii="Times New Roman" w:hAnsi="Times New Roman"/>
@@ -3815,7 +5107,7 @@
         </w:rPr>
         <w:t xml:space="preserve">physical city</w:t>
       </w:r>
-      <w:del w:id="1210" w:author="А.А. Шевцов" w:date="2026-10-17T12:00:00Z">
+      <w:del w:id="1322" w:author="А.А. Шевцов" w:date="2026-10-17T12:00:00Z">
         <w:r>
           <w:rPr>
             <w:rFonts w:ascii="Times New Roman" w:hAnsi="Times New Roman"/>
@@ -3825,7 +5117,7 @@
           <w:delText xml:space="preserve">"</w:delText>
         </w:r>
       </w:del>
-      <w:ins w:id="1211" w:author="А.А. Шевцов" w:date="2026-10-17T12:00:00Z">
+      <w:ins w:id="1323" w:author="А.А. Шевцов" w:date="2026-10-17T12:00:00Z">
         <w:r>
           <w:rPr>
             <w:rFonts w:ascii="Times New Roman" w:hAnsi="Times New Roman"/>
@@ -3843,7 +5135,7 @@
         </w:rPr>
         <w:t xml:space="preserve"> and remote areas creates conditions for extracting maximum rent with minimal obligations on the part of developers to </w:t>
       </w:r>
-      <w:del w:id="1069" w:author="А.А. Шевцов" w:date="2026-10-17T12:00:00Z">
+      <w:del w:id="1181" w:author="А.А. Шевцов" w:date="2026-10-17T12:00:00Z">
         <w:r>
           <w:rPr>
             <w:rFonts w:ascii="Times New Roman" w:hAnsi="Times New Roman"/>
@@ -3853,7 +5145,7 @@
           <w:delText xml:space="preserve">develop</w:delText>
         </w:r>
       </w:del>
-      <w:ins w:id="1070" w:author="А.А. Шевцов" w:date="2026-10-17T12:00:00Z">
+      <w:ins w:id="1182" w:author="А.А. Шевцов" w:date="2026-10-17T12:00:00Z">
         <w:r>
           <w:rPr>
             <w:rFonts w:ascii="Times New Roman" w:hAnsi="Times New Roman"/>
@@ -3891,7 +5183,7 @@
         </w:rPr>
         <w:t xml:space="preserve">Thus, </w:t>
       </w:r>
-      <w:del w:id="1073" w:author="А.А. Шевцов" w:date="2026-10-17T12:00:00Z">
+      <w:del w:id="1185" w:author="А.А. Шевцов" w:date="2026-10-17T12:00:00Z">
         <w:r>
           <w:rPr>
             <w:rFonts w:ascii="Times New Roman" w:hAnsi="Times New Roman"/>
@@ -3901,7 +5193,7 @@
           <w:delText xml:space="preserve">development</w:delText>
         </w:r>
       </w:del>
-      <w:ins w:id="1074" w:author="А.А. Шевцов" w:date="2026-10-17T12:00:00Z">
+      <w:ins w:id="1186" w:author="А.А. Шевцов" w:date="2026-10-17T12:00:00Z">
         <w:r>
           <w:rPr>
             <w:rFonts w:ascii="Times New Roman" w:hAnsi="Times New Roman"/>
@@ -3919,7 +5211,7 @@
         </w:rPr>
         <w:t xml:space="preserve"> activity is shifting to the area of the cheapest land. A comparison of the current valuation (2025) of plots depending on the time of their development reveals a steady downward trend: the average specific </w:t>
       </w:r>
-      <w:del w:id="1075" w:author="А.А. Шевцов" w:date="2026-10-17T12:00:00Z">
+      <w:del w:id="1187" w:author="А.А. Шевцов" w:date="2026-10-17T12:00:00Z">
         <w:r>
           <w:rPr>
             <w:rFonts w:ascii="Times New Roman" w:hAnsi="Times New Roman"/>
@@ -3929,7 +5221,7 @@
           <w:delText xml:space="preserve">value</w:delText>
         </w:r>
       </w:del>
-      <w:ins w:id="1076" w:author="А.А. Шевцов" w:date="2026-10-17T12:00:00Z">
+      <w:ins w:id="1188" w:author="А.А. Шевцов" w:date="2026-10-17T12:00:00Z">
         <w:r>
           <w:rPr>
             <w:rFonts w:ascii="Times New Roman" w:hAnsi="Times New Roman"/>
@@ -3987,7 +5279,7 @@
         </w:rPr>
         <w:t xml:space="preserve">Low-rise developments were formed primarily in areas that, as of 2025, retain their minimum cadastral value. Although such objects appeared in almost all sectors of the suburban area, their greatest concentration was recorded in the northern and eastern directions. The current price level (an average of 495 rubles/m²) suggests that it was the </w:t>
       </w:r>
-      <w:del w:id="1079" w:author="А.А. Шевцов" w:date="2026-10-17T12:00:00Z">
+      <w:del w:id="1191" w:author="А.А. Шевцов" w:date="2026-10-17T12:00:00Z">
         <w:r>
           <w:rPr>
             <w:rFonts w:ascii="Times New Roman" w:hAnsi="Times New Roman"/>
@@ -3997,7 +5289,7 @@
           <w:delText xml:space="preserve">availability</w:delText>
         </w:r>
       </w:del>
-      <w:ins w:id="1080" w:author="А.А. Шевцов" w:date="2026-10-17T12:00:00Z">
+      <w:ins w:id="1192" w:author="А.А. Шевцов" w:date="2026-10-17T12:00:00Z">
         <w:r>
           <w:rPr>
             <w:rFonts w:ascii="Times New Roman" w:hAnsi="Times New Roman"/>
@@ -4015,7 +5307,7 @@
         </w:rPr>
         <w:t xml:space="preserve"> of land assets that was the leading incentive for their development. According to this logic, transport distance from the center of Voronezh did not become an obstacle to construction, which was in apparent contradiction with classical models: the price factor turned out to be more significant than the distance factor. The leading motive for the development of such territories remained the population’s desire for suburbanization (</w:t>
       </w:r>
-      <w:del w:id="955" w:author="А.А. Шевцов" w:date="2026-10-17T12:00:00Z">
+      <w:del w:id="1067" w:author="А.А. Шевцов" w:date="2026-10-17T12:00:00Z">
         <w:r>
           <w:rPr>
             <w:rFonts w:ascii="Times New Roman" w:hAnsi="Times New Roman"/>
@@ -4025,7 +5317,7 @@
           <w:delText xml:space="preserve">Mahrova</w:delText>
         </w:r>
       </w:del>
-      <w:ins w:id="956" w:author="А.А. Шевцов" w:date="2026-10-17T12:00:00Z">
+      <w:ins w:id="1068" w:author="А.А. Шевцов" w:date="2026-10-17T12:00:00Z">
         <w:r>
           <w:rPr>
             <w:rFonts w:ascii="Times New Roman" w:hAnsi="Times New Roman"/>
@@ -4063,7 +5355,7 @@
         </w:rPr>
         <w:t xml:space="preserve">In contrast to the low-rise sector, </w:t>
       </w:r>
-      <w:del w:id="1081" w:author="А.А. Шевцов" w:date="2026-10-17T12:00:00Z">
+      <w:del w:id="1193" w:author="А.А. Шевцов" w:date="2026-10-17T12:00:00Z">
         <w:r>
           <w:rPr>
             <w:rFonts w:ascii="Times New Roman" w:hAnsi="Times New Roman"/>
@@ -4073,7 +5365,7 @@
           <w:delText xml:space="preserve">high-rise</w:delText>
         </w:r>
       </w:del>
-      <w:ins w:id="1082" w:author="А.А. Шевцов" w:date="2026-10-17T12:00:00Z">
+      <w:ins w:id="1194" w:author="А.А. Шевцов" w:date="2026-10-17T12:00:00Z">
         <w:r>
           <w:rPr>
             <w:rFonts w:ascii="Times New Roman" w:hAnsi="Times New Roman"/>
@@ -4091,7 +5383,7 @@
         </w:rPr>
         <w:t xml:space="preserve"> residential development exhibits a high degree of spatial concentration, localizing primarily on the outskirts of Voronezh and the largest suburban settlements. The high cost of such land </w:t>
       </w:r>
-      <w:del w:id="1083" w:author="А.А. Шевцов" w:date="2026-10-17T12:00:00Z">
+      <w:del w:id="1195" w:author="А.А. Шевцов" w:date="2026-10-17T12:00:00Z">
         <w:r>
           <w:rPr>
             <w:rFonts w:ascii="Times New Roman" w:hAnsi="Times New Roman"/>
@@ -4101,7 +5393,7 @@
           <w:delText xml:space="preserve">(RUB 1,638/m²)</w:delText>
         </w:r>
       </w:del>
-      <w:ins w:id="1084" w:author="А.А. Шевцов" w:date="2026-10-17T12:00:00Z">
+      <w:ins w:id="1196" w:author="А.А. Шевцов" w:date="2026-10-17T12:00:00Z">
         <w:r>
           <w:rPr>
             <w:rFonts w:ascii="Times New Roman" w:hAnsi="Times New Roman"/>
@@ -4152,7 +5444,7 @@
         </w:rPr>
         <w:t xml:space="preserve"> – large suburban shopping centers and hypermarkets located on main highways at the entrance to the city. Of the 80.9 hectares of commercial hub territories, 53.9 hectares appeared in the period 2000–2010, 25 hectares in the following decade, and only 2 hectares since 2020. Thus, between 2000 and 2020, a “belt of suburban shopping centers” was formed, closing the exits from Voronezh. The emergence of this framework provided suburban residents with access to modern services and reduced their </w:t>
       </w:r>
-      <w:del w:id="1085" w:author="А.А. Шевцов" w:date="2026-10-17T12:00:00Z">
+      <w:del w:id="1197" w:author="А.А. Шевцов" w:date="2026-10-17T12:00:00Z">
         <w:r>
           <w:rPr>
             <w:rFonts w:ascii="Times New Roman" w:hAnsi="Times New Roman"/>
@@ -4161,7 +5453,7 @@
           <w:delText xml:space="preserve">daily</w:delText>
         </w:r>
       </w:del>
-      <w:ins w:id="1086" w:author="А.А. Шевцов" w:date="2026-10-17T12:00:00Z">
+      <w:ins w:id="1198" w:author="А.А. Шевцов" w:date="2026-10-17T12:00:00Z">
         <w:r>
           <w:rPr>
             <w:rFonts w:ascii="Times New Roman" w:hAnsi="Times New Roman"/>
@@ -4177,7 +5469,7 @@
         </w:rPr>
         <w:t xml:space="preserve"> dependence on the </w:t>
       </w:r>
-      <w:del w:id="1216" w:author="А.А. Шевцов" w:date="2026-10-17T12:00:00Z">
+      <w:del w:id="1328" w:author="А.А. Шевцов" w:date="2026-10-17T12:00:00Z">
         <w:r>
           <w:rPr>
             <w:rFonts w:ascii="Times New Roman" w:hAnsi="Times New Roman"/>
@@ -4186,7 +5478,7 @@
           <w:delText xml:space="preserve">"</w:delText>
         </w:r>
       </w:del>
-      <w:ins w:id="1217" w:author="А.А. Шевцов" w:date="2026-10-17T12:00:00Z">
+      <w:ins w:id="1329" w:author="А.А. Шевцов" w:date="2026-10-17T12:00:00Z">
         <w:r>
           <w:rPr>
             <w:rFonts w:ascii="Times New Roman" w:hAnsi="Times New Roman"/>
@@ -4202,7 +5494,7 @@
         </w:rPr>
         <w:t xml:space="preserve">physical city.</w:t>
       </w:r>
-      <w:del w:id="1214" w:author="А.А. Шевцов" w:date="2026-10-17T12:00:00Z">
+      <w:del w:id="1326" w:author="А.А. Шевцов" w:date="2026-10-17T12:00:00Z">
         <w:r>
           <w:rPr>
             <w:rFonts w:ascii="Times New Roman" w:hAnsi="Times New Roman"/>
@@ -4211,7 +5503,7 @@
           <w:delText xml:space="preserve">"</w:delText>
         </w:r>
       </w:del>
-      <w:ins w:id="1215" w:author="А.А. Шевцов" w:date="2026-10-17T12:00:00Z">
+      <w:ins w:id="1327" w:author="А.А. Шевцов" w:date="2026-10-17T12:00:00Z">
         <w:r>
           <w:rPr>
             <w:rFonts w:ascii="Times New Roman" w:hAnsi="Times New Roman"/>
@@ -4256,7 +5548,7 @@
         <w:lastRenderedPageBreak/>
         <w:t xml:space="preserve">total area of new industrial zones amounted to 977 hectares, with more than half of this volume (566.7 hectares) formed between 2010 and 2020. The largest increase during this decade was recorded in the eastern and northern sectors, as well as on the southeastern periphery. Unlike residential development, this process was supported by the creation of specialized infrastructure sites (in particular, the Maslovsky Industrial Park and the </w:t>
       </w:r>
-      <w:del w:id="1087" w:author="А.А. Шевцов" w:date="2026-10-17T12:00:00Z">
+      <w:del w:id="1199" w:author="А.А. Шевцов" w:date="2026-10-17T12:00:00Z">
         <w:r>
           <w:rPr>
             <w:rFonts w:ascii="Times New Roman" w:hAnsi="Times New Roman"/>
@@ -4266,7 +5558,7 @@
           <w:delText xml:space="preserve">Center Special Economic Zone for Industrial Production</w:delText>
         </w:r>
       </w:del>
-      <w:ins w:id="1088" w:author="А.А. Шевцов" w:date="2026-10-17T12:00:00Z">
+      <w:ins w:id="1200" w:author="А.А. Шевцов" w:date="2026-10-17T12:00:00Z">
         <w:r>
           <w:rPr>
             <w:rFonts w:ascii="Times New Roman" w:hAnsi="Times New Roman"/>
@@ -4324,7 +5616,7 @@
         </w:rPr>
         <w:t xml:space="preserve">The combination of these factors shows that territorial growth is determined primarily by the economic benefits of land development. This transformation corresponds to the logic of “urban entrepreneurship” (</w:t>
       </w:r>
-      <w:del w:id="957" w:author="А.А. Шевцов" w:date="2026-10-17T12:00:00Z">
+      <w:del w:id="1069" w:author="А.А. Шевцов" w:date="2026-10-17T12:00:00Z">
         <w:r>
           <w:rPr>
             <w:rFonts w:ascii="Times New Roman" w:hAnsi="Times New Roman"/>
@@ -4334,7 +5626,7 @@
           <w:delText xml:space="preserve">Mahrova</w:delText>
         </w:r>
       </w:del>
-      <w:ins w:id="958" w:author="А.А. Шевцов" w:date="2026-10-17T12:00:00Z">
+      <w:ins w:id="1070" w:author="А.А. Шевцов" w:date="2026-10-17T12:00:00Z">
         <w:r>
           <w:rPr>
             <w:rFonts w:ascii="Times New Roman" w:hAnsi="Times New Roman"/>
@@ -4381,7 +5673,7 @@
           <w:sz w:val="24"/>
         </w:rPr>
       </w:pPr>
-      <w:del w:id="1089" w:author="А.А. Шевцов" w:date="2026-10-17T12:00:00Z">
+      <w:del w:id="1201" w:author="А.А. Шевцов" w:date="2026-10-17T12:00:00Z">
         <w:r>
           <w:rPr>
             <w:rFonts w:ascii="Times New Roman" w:hAnsi="Times New Roman"/>
@@ -4392,7 +5684,7 @@
           <w:delText xml:space="preserve">First</w:delText>
         </w:r>
       </w:del>
-      <w:ins w:id="1090" w:author="А.А. Шевцов" w:date="2026-10-17T12:00:00Z">
+      <w:ins w:id="1202" w:author="А.А. Шевцов" w:date="2026-10-17T12:00:00Z">
         <w:r>
           <w:rPr>
             <w:rFonts w:ascii="Times New Roman" w:hAnsi="Times New Roman"/>
@@ -4419,7 +5711,7 @@
         </w:rPr>
         <w:t xml:space="preserve"> was of a transitional nature, when spatial development was determined by spontaneous market processes, which manifested itself in the absence of a dominant vector of development, when growth was distributed relatively evenly, without being concentrated in certain sectors. The rate of physical growth of the territory was 588 hectares/year. The expansion of development was carried out almost exclusively for the residential function, with the average distance of new </w:t>
       </w:r>
-      <w:del w:id="1011" w:author="А.А. Шевцов" w:date="2026-10-17T12:00:00Z">
+      <w:del w:id="1123" w:author="А.А. Шевцов" w:date="2026-10-17T12:00:00Z">
         <w:r>
           <w:rPr>
             <w:rFonts w:ascii="Times New Roman" w:hAnsi="Times New Roman"/>
@@ -4428,7 +5720,7 @@
           <w:delText xml:space="preserve">landfills</w:delText>
         </w:r>
       </w:del>
-      <w:ins w:id="1012" w:author="А.А. Шевцов" w:date="2026-10-17T12:00:00Z">
+      <w:ins w:id="1124" w:author="А.А. Шевцов" w:date="2026-10-17T12:00:00Z">
         <w:r>
           <w:rPr>
             <w:rFonts w:ascii="Times New Roman" w:hAnsi="Times New Roman"/>
@@ -4444,7 +5736,7 @@
         </w:rPr>
         <w:t xml:space="preserve"> from the center being approximately 16 km. At the same time, the area of the </w:t>
       </w:r>
-      <w:del w:id="1056" w:author="А.А. Шевцов" w:date="2026-10-17T12:00:00Z">
+      <w:del w:id="1168" w:author="А.А. Шевцов" w:date="2026-10-17T12:00:00Z">
         <w:r>
           <w:rPr>
             <w:rFonts w:ascii="Times New Roman" w:hAnsi="Times New Roman"/>
@@ -4453,7 +5745,7 @@
           <w:delText xml:space="preserve">near</w:delText>
         </w:r>
       </w:del>
-      <w:ins w:id="1057" w:author="А.А. Шевцов" w:date="2026-10-17T12:00:00Z">
+      <w:ins w:id="1169" w:author="А.А. Шевцов" w:date="2026-10-17T12:00:00Z">
         <w:r>
           <w:rPr>
             <w:rFonts w:ascii="Times New Roman" w:hAnsi="Times New Roman"/>
@@ -4469,7 +5761,7 @@
         </w:rPr>
         <w:t xml:space="preserve"> suburbs was transformed primarily due to the chaotic spread of low-rise buildings (dacha communities and </w:t>
       </w:r>
-      <w:del w:id="1040" w:author="А.А. Шевцов" w:date="2026-10-17T12:00:00Z">
+      <w:del w:id="1152" w:author="А.А. Шевцов" w:date="2026-10-17T12:00:00Z">
         <w:r>
           <w:rPr>
             <w:rFonts w:ascii="Times New Roman" w:hAnsi="Times New Roman"/>
@@ -4478,7 +5770,7 @@
           <w:delText xml:space="preserve">gardening</w:delText>
         </w:r>
       </w:del>
-      <w:ins w:id="1041" w:author="А.А. Шевцов" w:date="2026-10-17T12:00:00Z">
+      <w:ins w:id="1153" w:author="А.А. Шевцов" w:date="2026-10-17T12:00:00Z">
         <w:r>
           <w:rPr>
             <w:rFonts w:ascii="Times New Roman" w:hAnsi="Times New Roman"/>
@@ -4494,7 +5786,7 @@
         </w:rPr>
         <w:t xml:space="preserve"> non-profit partnerships). The share of new industrial areas in the structure of territorial growth at this stage was only 2% (119 hectares), and no new areas for commercial use were recorded. This is connected both with the crisis phenomena in the Russian economy in the </w:t>
       </w:r>
-      <w:del w:id="1091" w:author="А.А. Шевцов" w:date="2026-10-17T12:00:00Z">
+      <w:del w:id="1203" w:author="А.А. Шевцов" w:date="2026-10-17T12:00:00Z">
         <w:r>
           <w:rPr>
             <w:rFonts w:ascii="Times New Roman" w:hAnsi="Times New Roman"/>
@@ -4503,7 +5795,7 @@
           <w:delText xml:space="preserve">nineties</w:delText>
         </w:r>
       </w:del>
-      <w:ins w:id="1092" w:author="А.А. Шевцов" w:date="2026-10-17T12:00:00Z">
+      <w:ins w:id="1204" w:author="А.А. Шевцов" w:date="2026-10-17T12:00:00Z">
         <w:r>
           <w:rPr>
             <w:rFonts w:ascii="Times New Roman" w:hAnsi="Times New Roman"/>
@@ -4532,7 +5824,7 @@
           <w:highlight w:val="red"/>
         </w:rPr>
       </w:pPr>
-      <w:del w:id="1093" w:author="А.А. Шевцов" w:date="2026-10-17T12:00:00Z">
+      <w:del w:id="1205" w:author="А.А. Шевцов" w:date="2026-10-17T12:00:00Z">
         <w:r>
           <w:rPr>
             <w:rFonts w:ascii="Times New Roman" w:hAnsi="Times New Roman"/>
@@ -4544,7 +5836,7 @@
           <w:delText xml:space="preserve">Second</w:delText>
         </w:r>
       </w:del>
-      <w:ins w:id="1094" w:author="А.А. Шевцов" w:date="2026-10-17T12:00:00Z">
+      <w:ins w:id="1206" w:author="А.А. Шевцов" w:date="2026-10-17T12:00:00Z">
         <w:r>
           <w:rPr>
             <w:rFonts w:ascii="Times New Roman" w:hAnsi="Times New Roman"/>
@@ -4606,7 +5898,7 @@
           <w:sz w:val="24"/>
         </w:rPr>
       </w:pPr>
-      <w:del w:id="1095" w:author="А.А. Шевцов" w:date="2026-10-17T12:00:00Z">
+      <w:del w:id="1207" w:author="А.А. Шевцов" w:date="2026-10-17T12:00:00Z">
         <w:r>
           <w:rPr>
             <w:rFonts w:ascii="Times New Roman" w:hAnsi="Times New Roman"/>
@@ -4618,7 +5910,7 @@
           <w:delText xml:space="preserve">Third</w:delText>
         </w:r>
       </w:del>
-      <w:ins w:id="1096" w:author="А.А. Шевцов" w:date="2026-10-17T12:00:00Z">
+      <w:ins w:id="1208" w:author="А.А. Шевцов" w:date="2026-10-17T12:00:00Z">
         <w:r>
           <w:rPr>
             <w:rFonts w:ascii="Times New Roman" w:hAnsi="Times New Roman"/>
@@ -4648,7 +5940,7 @@
         </w:rPr>
         <w:t xml:space="preserve"> became a phase of “explosive expansion” (720 ha/year). Its beginning was marked by the administrative reform of 2011, as a result of which 22 settlements were included in Voronezh. Despite the fact that the bulk of new territorial reserves was concentrated in the southern sector (the Shilovo, Maslovka, and Nikolskoye microdistricts), </w:t>
       </w:r>
-      <w:del w:id="1097" w:author="А.А. Шевцов" w:date="2026-10-17T12:00:00Z">
+      <w:del w:id="1209" w:author="А.А. Шевцов" w:date="2026-10-17T12:00:00Z">
         <w:r>
           <w:rPr>
             <w:rFonts w:ascii="Times New Roman" w:hAnsi="Times New Roman"/>
@@ -4658,7 +5950,7 @@
           <w:delText xml:space="preserve">real development</w:delText>
         </w:r>
       </w:del>
-      <w:ins w:id="1098" w:author="А.А. Шевцов" w:date="2026-10-17T12:00:00Z">
+      <w:ins w:id="1210" w:author="А.А. Шевцов" w:date="2026-10-17T12:00:00Z">
         <w:r>
           <w:rPr>
             <w:rFonts w:ascii="Times New Roman" w:hAnsi="Times New Roman"/>
@@ -4676,7 +5968,7 @@
         </w:rPr>
         <w:t xml:space="preserve"> activity consolidated the northern and eastern development vectors in the area of Voronezh's </w:t>
       </w:r>
-      <w:del w:id="1058" w:author="А.А. Шевцов" w:date="2026-10-17T12:00:00Z">
+      <w:del w:id="1170" w:author="А.А. Шевцов" w:date="2026-10-17T12:00:00Z">
         <w:r>
           <w:rPr>
             <w:rFonts w:ascii="Times New Roman" w:hAnsi="Times New Roman"/>
@@ -4686,7 +5978,7 @@
           <w:delText xml:space="preserve">near</w:delText>
         </w:r>
       </w:del>
-      <w:ins w:id="1059" w:author="А.А. Шевцов" w:date="2026-10-17T12:00:00Z">
+      <w:ins w:id="1171" w:author="А.А. Шевцов" w:date="2026-10-17T12:00:00Z">
         <w:r>
           <w:rPr>
             <w:rFonts w:ascii="Times New Roman" w:hAnsi="Times New Roman"/>
@@ -4733,7 +6025,7 @@
         <w:lastRenderedPageBreak/>
         <w:t xml:space="preserve">2025, the average specific </w:t>
       </w:r>
-      <w:del w:id="1077" w:author="А.А. Шевцов" w:date="2026-10-17T12:00:00Z">
+      <w:del w:id="1189" w:author="А.А. Шевцов" w:date="2026-10-17T12:00:00Z">
         <w:r>
           <w:rPr>
             <w:rFonts w:ascii="Times New Roman" w:hAnsi="Times New Roman"/>
@@ -4743,7 +6035,7 @@
           <w:delText xml:space="preserve">value</w:delText>
         </w:r>
       </w:del>
-      <w:ins w:id="1078" w:author="А.А. Шевцов" w:date="2026-10-17T12:00:00Z">
+      <w:ins w:id="1190" w:author="А.А. Шевцов" w:date="2026-10-17T12:00:00Z">
         <w:r>
           <w:rPr>
             <w:rFonts w:ascii="Times New Roman" w:hAnsi="Times New Roman"/>
@@ -4792,7 +6084,7 @@
           <w:sz w:val="24"/>
         </w:rPr>
       </w:pPr>
-      <w:del w:id="1099" w:author="А.А. Шевцов" w:date="2026-10-17T12:00:00Z">
+      <w:del w:id="1211" w:author="А.А. Шевцов" w:date="2026-10-17T12:00:00Z">
         <w:r>
           <w:rPr>
             <w:rFonts w:ascii="Times New Roman" w:hAnsi="Times New Roman"/>
@@ -4803,7 +6095,7 @@
           <w:delText xml:space="preserve">Fourth stage (2020–2025)</w:delText>
         </w:r>
       </w:del>
-      <w:ins w:id="1100" w:author="А.А. Шевцов" w:date="2026-10-17T12:00:00Z">
+      <w:ins w:id="1212" w:author="А.А. Шевцов" w:date="2026-10-17T12:00:00Z">
         <w:r>
           <w:rPr>
             <w:rFonts w:ascii="Times New Roman" w:hAnsi="Times New Roman"/>
@@ -4839,7 +6131,7 @@
         </w:rPr>
         <w:t xml:space="preserve">The functional structure of the new development retains the absolute dominance of housing: in total, more than 2,280 hectares are allocated to </w:t>
       </w:r>
-      <w:del w:id="1101" w:author="А.А. Шевцов" w:date="2026-10-17T12:00:00Z">
+      <w:del w:id="1213" w:author="А.А. Шевцов" w:date="2026-10-17T12:00:00Z">
         <w:r>
           <w:rPr>
             <w:rFonts w:ascii="Times New Roman" w:hAnsi="Times New Roman"/>
@@ -4848,7 +6140,7 @@
           <w:delText xml:space="preserve">high-rise</w:delText>
         </w:r>
       </w:del>
-      <w:ins w:id="1102" w:author="А.А. Шевцов" w:date="2026-10-17T12:00:00Z">
+      <w:ins w:id="1214" w:author="А.А. Шевцов" w:date="2026-10-17T12:00:00Z">
         <w:r>
           <w:rPr>
             <w:rFonts w:ascii="Times New Roman" w:hAnsi="Times New Roman"/>
@@ -4882,7 +6174,7 @@
         </w:rPr>
         <w:t xml:space="preserve">The spatial transformation of Voronezh and its immediate surroundings in the post-Soviet period resulted in a large-scale increase in built-up areas, creating a morphologically sparse and functionally disjointed suburban environment. A characteristic feature of this process is the </w:t>
       </w:r>
-      <w:del w:id="1103" w:author="А.А. Шевцов" w:date="2026-10-17T12:00:00Z">
+      <w:del w:id="1215" w:author="А.А. Шевцов" w:date="2026-10-17T12:00:00Z">
         <w:r>
           <w:rPr>
             <w:rFonts w:ascii="Times New Roman" w:hAnsi="Times New Roman"/>
@@ -4891,7 +6183,7 @@
           <w:delText xml:space="preserve">focal</w:delText>
         </w:r>
       </w:del>
-      <w:ins w:id="1104" w:author="А.А. Шевцов" w:date="2026-10-17T12:00:00Z">
+      <w:ins w:id="1216" w:author="А.А. Шевцов" w:date="2026-10-17T12:00:00Z">
         <w:r>
           <w:rPr>
             <w:rFonts w:ascii="Times New Roman" w:hAnsi="Times New Roman"/>
@@ -4907,7 +6199,7 @@
         </w:rPr>
         <w:t xml:space="preserve"> nature of territorial development: new residential areas, large-scale retail and industrial sites are developing as isolated planning units, without forming a coherent urban fabric. The pronounced asymmetry in favor of the northern and eastern sectors (58% </w:t>
       </w:r>
-      <w:ins w:id="1105" w:author="А.А. Шевцов" w:date="2026-10-17T12:00:00Z">
+      <w:ins w:id="1217" w:author="А.А. Шевцов" w:date="2026-10-17T12:00:00Z">
         <w:r>
           <w:rPr>
             <w:rFonts w:ascii="Times New Roman" w:hAnsi="Times New Roman"/>
@@ -4956,7 +6248,7 @@
         </w:rPr>
         <w:t xml:space="preserve">This strategy fits perfectly into the logic of classical rent models, but with important adjustments for modern conditions. Developers maximize profits by developing suburban areas where land has a minimum cadastral value. However, in the case of Voronezh, a qualitative transformation of the traditional factor of remoteness is observed. Thus, if in classical models the increase in transport costs with distance from the center acts as a </w:t>
       </w:r>
-      <w:del w:id="1106" w:author="А.А. Шевцов" w:date="2026-10-17T12:00:00Z">
+      <w:del w:id="1218" w:author="А.А. Шевцов" w:date="2026-10-17T12:00:00Z">
         <w:r>
           <w:rPr>
             <w:rFonts w:ascii="Times New Roman" w:hAnsi="Times New Roman"/>
@@ -4965,7 +6257,7 @@
           <w:delText xml:space="preserve">severe limitation</w:delText>
         </w:r>
       </w:del>
-      <w:ins w:id="1107" w:author="А.А. Шевцов" w:date="2026-10-17T12:00:00Z">
+      <w:ins w:id="1219" w:author="А.А. Шевцов" w:date="2026-10-17T12:00:00Z">
         <w:r>
           <w:rPr>
             <w:rFonts w:ascii="Times New Roman" w:hAnsi="Times New Roman"/>
@@ -5041,7 +6333,7 @@
         </w:rPr>
         <w:t xml:space="preserve">The combination of extensive expansion of boundaries with a sharp decrease in the functional density of the environment confirms the implementation of the </w:t>
       </w:r>
-      <w:del w:id="1108" w:author="А.А. Шевцов" w:date="2026-10-17T12:00:00Z">
+      <w:del w:id="1220" w:author="А.А. Шевцов" w:date="2026-10-17T12:00:00Z">
         <w:r>
           <w:rPr>
             <w:rFonts w:ascii="Times New Roman" w:hAnsi="Times New Roman"/>
@@ -5050,7 +6342,7 @@
           <w:delText xml:space="preserve">“growth”</w:delText>
         </w:r>
       </w:del>
-      <w:ins w:id="1109" w:author="А.А. Шевцов" w:date="2026-10-17T12:00:00Z">
+      <w:ins w:id="1221" w:author="А.А. Шевцов" w:date="2026-10-17T12:00:00Z">
         <w:r>
           <w:rPr>
             <w:rFonts w:ascii="Times New Roman" w:hAnsi="Times New Roman"/>
@@ -5117,7 +6409,7 @@
         </w:rPr>
         <w:t xml:space="preserve">1. The spatial evolution of Voronezh and its suburban area in the period 1992–2025 was expressed in a large-scale increase in built-up areas. This process is characterized by the predominant development of discrete, spatially isolated areas, which has led to significant fragmentation of the morphological structure of the suburbs. The observed dynamics of physical expansion of borders allows us to interpret this process as the implementation of the </w:t>
       </w:r>
-      <w:del w:id="1110" w:author="А.А. Шевцов" w:date="2026-10-17T12:00:00Z">
+      <w:del w:id="1222" w:author="А.А. Шевцов" w:date="2026-10-17T12:00:00Z">
         <w:r>
           <w:rPr>
             <w:rFonts w:ascii="Times New Roman" w:hAnsi="Times New Roman"/>
@@ -5127,7 +6419,7 @@
           <w:delText xml:space="preserve">“growth”</w:delText>
         </w:r>
       </w:del>
-      <w:ins w:id="1111" w:author="А.А. Шевцов" w:date="2026-10-17T12:00:00Z">
+      <w:ins w:id="1223" w:author="А.А. Шевцов" w:date="2026-10-17T12:00:00Z">
         <w:r>
           <w:rPr>
             <w:rFonts w:ascii="Times New Roman" w:hAnsi="Times New Roman"/>
@@ -5165,7 +6457,7 @@
         </w:rPr>
         <w:t xml:space="preserve">2. The dynamics of development of built-up areas in the suburban zone has a pronounced non-linear nature of space development. In the post-Soviet evolution of development, four stages are distinguished, each of which is characterized by a change in the pace and logic of area growth. The transition from the stage of spontaneous development (1992–2000) to the phase of formation of a belt of suburban shopping centers (2000–2010) marked a qualitative shift: the emergence of new infrastructure support at the main entrances to the city. The subsequent phase of “explosive expansion” (2010–2020) was a period of maximum physical expansion of built-up areas, exhausting the potential of the most accessible sites. The current stage (2020–2025) indicates a transition to morphological consolidation of territories. This process is conditioned by the completion of the formation of the functional framework of suburban retail and a change in the structure of development mechanisms: the growth in the share of suburban </w:t>
       </w:r>
-      <w:del w:id="1112" w:author="А.А. Шевцов" w:date="2026-10-17T12:00:00Z">
+      <w:del w:id="1224" w:author="А.А. Шевцов" w:date="2026-10-17T12:00:00Z">
         <w:r>
           <w:rPr>
             <w:rFonts w:ascii="Times New Roman" w:hAnsi="Times New Roman"/>
@@ -5175,7 +6467,7 @@
           <w:delText xml:space="preserve">growth over</w:delText>
         </w:r>
       </w:del>
-      <w:ins w:id="1113" w:author="А.А. Шевцов" w:date="2026-10-17T12:00:00Z">
+      <w:ins w:id="1225" w:author="А.А. Шевцов" w:date="2026-10-17T12:00:00Z">
         <w:r>
           <w:rPr>
             <w:rFonts w:ascii="Times New Roman" w:hAnsi="Times New Roman"/>
@@ -5213,7 +6505,7 @@
         </w:rPr>
         <w:t xml:space="preserve">3. Physical expansion of territories is realized primarily through decentralized mechanisms: isolated growth and expansion of suburban settlements account for a total of 88% of the total area of new development. The functional structure of this increase is absolutely dominated by low-rise residential buildings (about 80% of the area). At the same time, multi-apartment complexes, large retail facilities, and industrial and logistics zones are developing as local, spatially isolated sites. This isolated nature of the emergence of commercial and industrial facilities hinders their morphological integration with residential development and leads to the formation of a functionally </w:t>
       </w:r>
-      <w:del w:id="913" w:author="А.А. Шевцов" w:date="2026-10-17T12:00:00Z">
+      <w:del w:id="1029" w:author="А.А. Шевцов" w:date="2026-10-17T12:00:00Z">
         <w:r>
           <w:rPr>
             <w:rFonts w:ascii="Times New Roman" w:hAnsi="Times New Roman"/>
@@ -5223,7 +6515,7 @@
           <w:delText xml:space="preserve">disunited</w:delText>
         </w:r>
       </w:del>
-      <w:ins w:id="914" w:author="А.А. Шевцов" w:date="2026-10-17T12:00:00Z">
+      <w:ins w:id="1030" w:author="А.А. Шевцов" w:date="2026-10-17T12:00:00Z">
         <w:r>
           <w:rPr>
             <w:rFonts w:ascii="Times New Roman" w:hAnsi="Times New Roman"/>
@@ -5262,7 +6554,7 @@
         <w:lastRenderedPageBreak/>
         <w:t xml:space="preserve">4. An important economic incentive for the transformation of suburban areas is the mechanism for maximizing land rent. The recorded </w:t>
       </w:r>
-      <w:del w:id="1042" w:author="А.А. Шевцов" w:date="2026-10-17T12:00:00Z">
+      <w:del w:id="1154" w:author="А.А. Шевцов" w:date="2026-10-17T12:00:00Z">
         <w:r>
           <w:rPr>
             <w:rFonts w:ascii="Times New Roman" w:hAnsi="Times New Roman"/>
@@ -5272,7 +6564,7 @@
           <w:delText xml:space="preserve">5-fold</w:delText>
         </w:r>
       </w:del>
-      <w:ins w:id="1043" w:author="А.А. Шевцов" w:date="2026-10-17T12:00:00Z">
+      <w:ins w:id="1155" w:author="А.А. Шевцов" w:date="2026-10-17T12:00:00Z">
         <w:r>
           <w:rPr>
             <w:rFonts w:ascii="Times New Roman" w:hAnsi="Times New Roman"/>
@@ -5290,7 +6582,7 @@
         </w:rPr>
         <w:t xml:space="preserve"> gap between the cadastral value of land plots within the boundaries of continuous development and in areas of new development (as of 2025) confirms the priority of the land price factor when choosing expansion directions. Under these conditions, a deformation of the classical </w:t>
       </w:r>
-      <w:del w:id="1114" w:author="А.А. Шевцов" w:date="2026-10-17T12:00:00Z">
+      <w:del w:id="1226" w:author="А.А. Шевцов" w:date="2026-10-17T12:00:00Z">
         <w:r>
           <w:rPr>
             <w:rFonts w:ascii="Times New Roman" w:hAnsi="Times New Roman"/>
@@ -5300,7 +6592,7 @@
           <w:delText xml:space="preserve">U. model is observed. Alonso: The</w:delText>
         </w:r>
       </w:del>
-      <w:ins w:id="1115" w:author="А.А. Шевцов" w:date="2026-10-17T12:00:00Z">
+      <w:ins w:id="1227" w:author="А.А. Шевцов" w:date="2026-10-17T12:00:00Z">
         <w:r>
           <w:rPr>
             <w:rFonts w:ascii="Times New Roman" w:hAnsi="Times New Roman"/>
@@ -5318,7 +6610,7 @@
         </w:rPr>
         <w:t xml:space="preserve"> factor of transport distance is no longer a </w:t>
       </w:r>
-      <w:del w:id="1118" w:author="А.А. Шевцов" w:date="2026-10-17T12:00:00Z">
+      <w:del w:id="1230" w:author="А.А. Шевцов" w:date="2026-10-17T12:00:00Z">
         <w:r>
           <w:rPr>
             <w:rFonts w:ascii="Times New Roman" w:hAnsi="Times New Roman"/>
@@ -5328,7 +6620,7 @@
           <w:delText xml:space="preserve">strict limitation</w:delText>
         </w:r>
       </w:del>
-      <w:ins w:id="1119" w:author="А.А. Шевцов" w:date="2026-10-17T12:00:00Z">
+      <w:ins w:id="1231" w:author="А.А. Шевцов" w:date="2026-10-17T12:00:00Z">
         <w:r>
           <w:rPr>
             <w:rFonts w:ascii="Times New Roman" w:hAnsi="Times New Roman"/>
@@ -5346,7 +6638,7 @@
         </w:rPr>
         <w:t xml:space="preserve">. This is confirmed by the increase in the average distance of new </w:t>
       </w:r>
-      <w:del w:id="1116" w:author="А.А. Шевцов" w:date="2026-10-17T12:00:00Z">
+      <w:del w:id="1228" w:author="А.А. Шевцов" w:date="2026-10-17T12:00:00Z">
         <w:r>
           <w:rPr>
             <w:rFonts w:ascii="Times New Roman" w:hAnsi="Times New Roman"/>
@@ -5356,7 +6648,7 @@
           <w:delText xml:space="preserve">properties</w:delText>
         </w:r>
       </w:del>
-      <w:ins w:id="1117" w:author="А.А. Шевцов" w:date="2026-10-17T12:00:00Z">
+      <w:ins w:id="1229" w:author="А.А. Шевцов" w:date="2026-10-17T12:00:00Z">
         <w:r>
           <w:rPr>
             <w:rFonts w:ascii="Times New Roman" w:hAnsi="Times New Roman"/>
@@ -5513,7 +6805,7 @@
         </w:rPr>
         <w:t xml:space="preserve">Characteristics of spatial-genetic types (mechanisms) of territorial growth, </w:t>
       </w:r>
-      <w:del w:id="1120" w:author="А.А. Шевцов" w:date="2026-10-17T12:00:00Z">
+      <w:del w:id="1232" w:author="А.А. Шевцов" w:date="2026-10-17T12:00:00Z">
         <w:r>
           <w:rPr>
             <w:rFonts w:ascii="Times New Roman" w:hAnsi="Times New Roman"/>
@@ -5523,7 +6815,7 @@
           <w:delText xml:space="preserve">1992-2025</w:delText>
         </w:r>
       </w:del>
-      <w:ins w:id="1121" w:author="А.А. Шевцов" w:date="2026-10-17T12:00:00Z">
+      <w:ins w:id="1233" w:author="А.А. Шевцов" w:date="2026-10-17T12:00:00Z">
         <w:r>
           <w:rPr>
             <w:rFonts w:ascii="Times New Roman" w:hAnsi="Times New Roman"/>
@@ -5644,7 +6936,7 @@
                 <w:sz w:val="24"/>
               </w:rPr>
             </w:pPr>
-            <w:del w:id="1122" w:author="А.А. Шевцов" w:date="2026-10-17T12:00:00Z">
+            <w:del w:id="1234" w:author="А.А. Шевцов" w:date="2026-10-17T12:00:00Z">
               <w:r>
                 <w:rPr>
                   <w:rFonts w:ascii="Times New Roman" w:hAnsi="Times New Roman"/>
@@ -5652,7 +6944,7 @@
                 <w:delText xml:space="preserve">Regional</w:delText>
               </w:r>
             </w:del>
-            <w:ins w:id="1123" w:author="А.А. Шевцов" w:date="2026-10-17T12:00:00Z">
+            <w:ins w:id="1235" w:author="А.А. Шевцов" w:date="2026-10-17T12:00:00Z">
               <w:r>
                 <w:rPr>
                   <w:rFonts w:ascii="Times New Roman" w:hAnsi="Times New Roman"/>
@@ -5880,7 +7172,7 @@
         </w:rPr>
         <w:t xml:space="preserve"> the </w:t>
       </w:r>
-      <w:del w:id="1132" w:author="А.А. Шевцов" w:date="2026-10-17T12:00:00Z">
+      <w:del w:id="1244" w:author="А.А. Шевцов" w:date="2026-10-17T12:00:00Z">
         <w:r>
           <w:rPr>
             <w:rFonts w:ascii="Times New Roman" w:hAnsi="Times New Roman"/>
@@ -5889,7 +7181,7 @@
           <w:delText xml:space="preserve">author's calculations based on:</w:delText>
         </w:r>
       </w:del>
-      <w:ins w:id="1133" w:author="А.А. Шевцов" w:date="2026-10-17T12:00:00Z">
+      <w:ins w:id="1245" w:author="А.А. Шевцов" w:date="2026-10-17T12:00:00Z">
         <w:r>
           <w:rPr>
             <w:rFonts w:ascii="Times New Roman" w:hAnsi="Times New Roman"/>
@@ -5926,7 +7218,7 @@
         </w:rPr>
         <w:t xml:space="preserve">; date of access: </w:t>
       </w:r>
-      <w:del w:id="1138" w:author="А.А. Шевцов" w:date="2026-10-17T12:00:00Z">
+      <w:del w:id="1250" w:author="А.А. Шевцов" w:date="2026-10-17T12:00:00Z">
         <w:r>
           <w:rPr>
             <w:rFonts w:ascii="Times New Roman" w:hAnsi="Times New Roman"/>
@@ -5934,7 +7226,7 @@
           <w:delText xml:space="preserve">03/02/2026</w:delText>
         </w:r>
       </w:del>
-      <w:ins w:id="1139" w:author="А.А. Шевцов" w:date="2026-10-17T12:00:00Z">
+      <w:ins w:id="1251" w:author="А.А. Шевцов" w:date="2026-10-17T12:00:00Z">
         <w:r>
           <w:rPr>
             <w:rFonts w:ascii="Times New Roman" w:hAnsi="Times New Roman"/>
@@ -5963,7 +7255,7 @@
         </w:rPr>
         <w:t xml:space="preserve">; date of access: 02.03.2026), OpenStreetMap project (https://www.openstreetmap.org; </w:t>
       </w:r>
-      <w:del w:id="1144" w:author="А.А. Шевцов" w:date="2026-10-17T12:00:00Z">
+      <w:del w:id="1256" w:author="А.А. Шевцов" w:date="2026-10-17T12:00:00Z">
         <w:r>
           <w:rPr>
             <w:rFonts w:ascii="Times New Roman" w:hAnsi="Times New Roman"/>
@@ -5971,7 +7263,7 @@
           <w:delText xml:space="preserve">access date:</w:delText>
         </w:r>
       </w:del>
-      <w:ins w:id="1145" w:author="А.А. Шевцов" w:date="2026-10-17T12:00:00Z">
+      <w:ins w:id="1257" w:author="А.А. Шевцов" w:date="2026-10-17T12:00:00Z">
         <w:r>
           <w:rPr>
             <w:rFonts w:ascii="Times New Roman" w:hAnsi="Times New Roman"/>
@@ -5993,7 +7285,7 @@
           </w:rPr>
           <w:t xml:space="preserve">https://</w:t>
         </w:r>
-        <w:del w:id="1022" w:author="А.А. Шевцов" w:date="2026-10-17T12:00:00Z">
+        <w:del w:id="1134" w:author="А.А. Шевцов" w:date="2026-10-17T12:00:00Z">
           <w:r>
             <w:rPr>
               <w:rStyle w:val="af6"/>
@@ -6002,7 +7294,7 @@
             <w:delText xml:space="preserve">earthexplorernasa.gov</w:delText>
           </w:r>
         </w:del>
-        <w:ins w:id="1023" w:author="А.А. Шевцов" w:date="2026-10-17T12:00:00Z">
+        <w:ins w:id="1135" w:author="А.А. Шевцов" w:date="2026-10-17T12:00:00Z">
           <w:r>
             <w:rPr>
               <w:rStyle w:val="af6"/>
@@ -6155,7 +7447,7 @@
               </w:rPr>
               <w:t xml:space="preserve">Share </w:t>
             </w:r>
-            <w:del w:id="1046" w:author="А.А. Шевцов" w:date="2026-10-17T12:00:00Z">
+            <w:del w:id="1158" w:author="А.А. Шевцов" w:date="2026-10-17T12:00:00Z">
               <w:r>
                 <w:rPr>
                   <w:rFonts w:ascii="Times New Roman" w:hAnsi="Times New Roman"/>
@@ -6165,7 +7457,7 @@
                 <w:delText xml:space="preserve">in area of growth</w:delText>
               </w:r>
             </w:del>
-            <w:ins w:id="1047" w:author="А.А. Шевцов" w:date="2026-10-17T12:00:00Z">
+            <w:ins w:id="1159" w:author="А.А. Шевцов" w:date="2026-10-17T12:00:00Z">
               <w:r>
                 <w:rPr>
                   <w:rFonts w:ascii="Times New Roman" w:hAnsi="Times New Roman"/>
@@ -6384,7 +7676,7 @@
                 <w:szCs w:val="21"/>
               </w:rPr>
             </w:pPr>
-            <w:del w:id="1126" w:author="А.А. Шевцов" w:date="2026-10-17T12:00:00Z">
+            <w:del w:id="1238" w:author="А.А. Шевцов" w:date="2026-10-17T12:00:00Z">
               <w:r>
                 <w:rPr>
                   <w:rFonts w:ascii="Times New Roman" w:hAnsi="Times New Roman"/>
@@ -6394,7 +7686,7 @@
                 <w:delText xml:space="preserve">2 </w:delText>
               </w:r>
             </w:del>
-            <w:ins w:id="1127" w:author="А.А. Шевцов" w:date="2026-10-17T12:00:00Z">
+            <w:ins w:id="1239" w:author="А.А. Шевцов" w:date="2026-10-17T12:00:00Z">
               <w:r>
                 <w:rPr>
                   <w:rFonts w:ascii="Times New Roman" w:hAnsi="Times New Roman"/>
@@ -6617,7 +7909,7 @@
                 <w:szCs w:val="21"/>
               </w:rPr>
             </w:pPr>
-            <w:del w:id="1128" w:author="А.А. Шевцов" w:date="2026-10-17T12:00:00Z">
+            <w:del w:id="1240" w:author="А.А. Шевцов" w:date="2026-10-17T12:00:00Z">
               <w:r>
                 <w:rPr>
                   <w:rFonts w:ascii="Times New Roman" w:hAnsi="Times New Roman"/>
@@ -6627,7 +7919,7 @@
                 <w:delText xml:space="preserve">Multi-storey building</w:delText>
               </w:r>
             </w:del>
-            <w:ins w:id="1129" w:author="А.А. Шевцов" w:date="2026-10-17T12:00:00Z">
+            <w:ins w:id="1241" w:author="А.А. Шевцов" w:date="2026-10-17T12:00:00Z">
               <w:r>
                 <w:rPr>
                   <w:rFonts w:ascii="Times New Roman" w:hAnsi="Times New Roman"/>
@@ -6932,7 +8224,7 @@
         </w:rPr>
         <w:t xml:space="preserve"> the </w:t>
       </w:r>
-      <w:del w:id="1134" w:author="А.А. Шевцов" w:date="2026-10-17T12:00:00Z">
+      <w:del w:id="1246" w:author="А.А. Шевцов" w:date="2026-10-17T12:00:00Z">
         <w:r>
           <w:rPr>
             <w:rFonts w:ascii="Times New Roman" w:hAnsi="Times New Roman"/>
@@ -6941,7 +8233,7 @@
           <w:delText xml:space="preserve">author's calculations based on:</w:delText>
         </w:r>
       </w:del>
-      <w:ins w:id="1135" w:author="А.А. Шевцов" w:date="2026-10-17T12:00:00Z">
+      <w:ins w:id="1247" w:author="А.А. Шевцов" w:date="2026-10-17T12:00:00Z">
         <w:r>
           <w:rPr>
             <w:rFonts w:ascii="Times New Roman" w:hAnsi="Times New Roman"/>
@@ -6978,7 +8270,7 @@
         </w:rPr>
         <w:t xml:space="preserve">; date of access: </w:t>
       </w:r>
-      <w:del w:id="1140" w:author="А.А. Шевцов" w:date="2026-10-17T12:00:00Z">
+      <w:del w:id="1252" w:author="А.А. Шевцов" w:date="2026-10-17T12:00:00Z">
         <w:r>
           <w:rPr>
             <w:rFonts w:ascii="Times New Roman" w:hAnsi="Times New Roman"/>
@@ -6986,7 +8278,7 @@
           <w:delText xml:space="preserve">03/02/2026</w:delText>
         </w:r>
       </w:del>
-      <w:ins w:id="1141" w:author="А.А. Шевцов" w:date="2026-10-17T12:00:00Z">
+      <w:ins w:id="1253" w:author="А.А. Шевцов" w:date="2026-10-17T12:00:00Z">
         <w:r>
           <w:rPr>
             <w:rFonts w:ascii="Times New Roman" w:hAnsi="Times New Roman"/>
@@ -7015,7 +8307,7 @@
         </w:rPr>
         <w:t xml:space="preserve">; date of access: 02.03.2026), OpenStreetMap project (https://www.openstreetmap.org; </w:t>
       </w:r>
-      <w:del w:id="1146" w:author="А.А. Шевцов" w:date="2026-10-17T12:00:00Z">
+      <w:del w:id="1258" w:author="А.А. Шевцов" w:date="2026-10-17T12:00:00Z">
         <w:r>
           <w:rPr>
             <w:rFonts w:ascii="Times New Roman" w:hAnsi="Times New Roman"/>
@@ -7023,7 +8315,7 @@
           <w:delText xml:space="preserve">access date:</w:delText>
         </w:r>
       </w:del>
-      <w:ins w:id="1147" w:author="А.А. Шевцов" w:date="2026-10-17T12:00:00Z">
+      <w:ins w:id="1259" w:author="А.А. Шевцов" w:date="2026-10-17T12:00:00Z">
         <w:r>
           <w:rPr>
             <w:rFonts w:ascii="Times New Roman" w:hAnsi="Times New Roman"/>
@@ -7045,7 +8337,7 @@
           </w:rPr>
           <w:t xml:space="preserve">https://</w:t>
         </w:r>
-        <w:del w:id="1024" w:author="А.А. Шевцов" w:date="2026-10-17T12:00:00Z">
+        <w:del w:id="1136" w:author="А.А. Шевцов" w:date="2026-10-17T12:00:00Z">
           <w:r>
             <w:rPr>
               <w:rStyle w:val="af6"/>
@@ -7054,7 +8346,7 @@
             <w:delText xml:space="preserve">earthexplorernasa.gov</w:delText>
           </w:r>
         </w:del>
-        <w:ins w:id="1025" w:author="А.А. Шевцов" w:date="2026-10-17T12:00:00Z">
+        <w:ins w:id="1137" w:author="А.А. Шевцов" w:date="2026-10-17T12:00:00Z">
           <w:r>
             <w:rPr>
               <w:rStyle w:val="af6"/>
@@ -7077,7 +8369,7 @@
         </w:rPr>
         <w:t xml:space="preserve">; date of access: 02.03.2026), the </w:t>
       </w:r>
-      <w:del w:id="1005" w:author="А.А. Шевцов" w:date="2026-10-17T12:00:00Z">
+      <w:del w:id="1117" w:author="А.А. Шевцов" w:date="2026-10-17T12:00:00Z">
         <w:r>
           <w:rPr>
             <w:rFonts w:ascii="Times New Roman" w:hAnsi="Times New Roman"/>
@@ -7085,7 +8377,7 @@
           <w:delText xml:space="preserve">Geocheque</w:delText>
         </w:r>
       </w:del>
-      <w:ins w:id="1006" w:author="А.А. Шевцов" w:date="2026-10-17T12:00:00Z">
+      <w:ins w:id="1118" w:author="А.А. Шевцов" w:date="2026-10-17T12:00:00Z">
         <w:r>
           <w:rPr>
             <w:rFonts w:ascii="Times New Roman" w:hAnsi="Times New Roman"/>
@@ -7910,7 +9202,7 @@
         </w:rPr>
         <w:t xml:space="preserve"> the </w:t>
       </w:r>
-      <w:del w:id="1136" w:author="А.А. Шевцов" w:date="2026-10-17T12:00:00Z">
+      <w:del w:id="1248" w:author="А.А. Шевцов" w:date="2026-10-17T12:00:00Z">
         <w:r>
           <w:rPr>
             <w:rFonts w:ascii="Times New Roman" w:hAnsi="Times New Roman"/>
@@ -7919,7 +9211,7 @@
           <w:delText xml:space="preserve">author's calculations based on:</w:delText>
         </w:r>
       </w:del>
-      <w:ins w:id="1137" w:author="А.А. Шевцов" w:date="2026-10-17T12:00:00Z">
+      <w:ins w:id="1249" w:author="А.А. Шевцов" w:date="2026-10-17T12:00:00Z">
         <w:r>
           <w:rPr>
             <w:rFonts w:ascii="Times New Roman" w:hAnsi="Times New Roman"/>
@@ -7956,7 +9248,7 @@
         </w:rPr>
         <w:t xml:space="preserve">; date of access: </w:t>
       </w:r>
-      <w:del w:id="1142" w:author="А.А. Шевцов" w:date="2026-10-17T12:00:00Z">
+      <w:del w:id="1254" w:author="А.А. Шевцов" w:date="2026-10-17T12:00:00Z">
         <w:r>
           <w:rPr>
             <w:rFonts w:ascii="Times New Roman" w:hAnsi="Times New Roman"/>
@@ -7964,7 +9256,7 @@
           <w:delText xml:space="preserve">03/02/2026</w:delText>
         </w:r>
       </w:del>
-      <w:ins w:id="1143" w:author="А.А. Шевцов" w:date="2026-10-17T12:00:00Z">
+      <w:ins w:id="1255" w:author="А.А. Шевцов" w:date="2026-10-17T12:00:00Z">
         <w:r>
           <w:rPr>
             <w:rFonts w:ascii="Times New Roman" w:hAnsi="Times New Roman"/>
@@ -7993,7 +9285,7 @@
         </w:rPr>
         <w:t xml:space="preserve">; date of access: 02.03.2026), OpenStreetMap project (https://www.openstreetmap.org; </w:t>
       </w:r>
-      <w:del w:id="1148" w:author="А.А. Шевцов" w:date="2026-10-17T12:00:00Z">
+      <w:del w:id="1260" w:author="А.А. Шевцов" w:date="2026-10-17T12:00:00Z">
         <w:r>
           <w:rPr>
             <w:rFonts w:ascii="Times New Roman" w:hAnsi="Times New Roman"/>
@@ -8001,7 +9293,7 @@
           <w:delText xml:space="preserve">access date:</w:delText>
         </w:r>
       </w:del>
-      <w:ins w:id="1149" w:author="А.А. Шевцов" w:date="2026-10-17T12:00:00Z">
+      <w:ins w:id="1261" w:author="А.А. Шевцов" w:date="2026-10-17T12:00:00Z">
         <w:r>
           <w:rPr>
             <w:rFonts w:ascii="Times New Roman" w:hAnsi="Times New Roman"/>
@@ -8023,7 +9315,7 @@
           </w:rPr>
           <w:t xml:space="preserve">https://</w:t>
         </w:r>
-        <w:del w:id="1026" w:author="А.А. Шевцов" w:date="2026-10-17T12:00:00Z">
+        <w:del w:id="1138" w:author="А.А. Шевцов" w:date="2026-10-17T12:00:00Z">
           <w:r>
             <w:rPr>
               <w:rStyle w:val="af6"/>
@@ -8032,7 +9324,7 @@
             <w:delText xml:space="preserve">earthexplorernasa.gov</w:delText>
           </w:r>
         </w:del>
-        <w:ins w:id="1027" w:author="А.А. Шевцов" w:date="2026-10-17T12:00:00Z">
+        <w:ins w:id="1139" w:author="А.А. Шевцов" w:date="2026-10-17T12:00:00Z">
           <w:r>
             <w:rPr>
               <w:rStyle w:val="af6"/>
@@ -8055,7 +9347,7 @@
         </w:rPr>
         <w:t xml:space="preserve">; date of access: 02.03.2026), the </w:t>
       </w:r>
-      <w:del w:id="1007" w:author="А.А. Шевцов" w:date="2026-10-17T12:00:00Z">
+      <w:del w:id="1119" w:author="А.А. Шевцов" w:date="2026-10-17T12:00:00Z">
         <w:r>
           <w:rPr>
             <w:rFonts w:ascii="Times New Roman" w:hAnsi="Times New Roman"/>
@@ -8063,7 +9355,7 @@
           <w:delText xml:space="preserve">Geocheque</w:delText>
         </w:r>
       </w:del>
-      <w:ins w:id="1008" w:author="А.А. Шевцов" w:date="2026-10-17T12:00:00Z">
+      <w:ins w:id="1120" w:author="А.А. Шевцов" w:date="2026-10-17T12:00:00Z">
         <w:r>
           <w:rPr>
             <w:rFonts w:ascii="Times New Roman" w:hAnsi="Times New Roman"/>
@@ -8213,7 +9505,7 @@
         </w:rPr>
         <w:t xml:space="preserve">Unified State Register of Real Estate (Rosreestr), the </w:t>
       </w:r>
-      <w:del w:id="1220" w:author="А.А. Шевцов" w:date="2026-10-17T12:00:00Z">
+      <w:del w:id="1332" w:author="А.А. Шевцов" w:date="2026-10-17T12:00:00Z">
         <w:r>
           <w:rPr>
             <w:rFonts w:ascii="Times New Roman" w:hAnsi="Times New Roman"/>
@@ -8221,7 +9513,7 @@
           <w:delText xml:space="preserve">"</w:delText>
         </w:r>
       </w:del>
-      <w:ins w:id="1221" w:author="А.А. Шевцов" w:date="2026-10-17T12:00:00Z">
+      <w:ins w:id="1333" w:author="А.А. Шевцов" w:date="2026-10-17T12:00:00Z">
         <w:r>
           <w:rPr>
             <w:rFonts w:ascii="Times New Roman" w:hAnsi="Times New Roman"/>
@@ -8235,7 +9527,7 @@
         </w:rPr>
         <w:t xml:space="preserve">How old is this house</w:t>
       </w:r>
-      <w:del w:id="1218" w:author="А.А. Шевцов" w:date="2026-10-17T12:00:00Z">
+      <w:del w:id="1330" w:author="А.А. Шевцов" w:date="2026-10-17T12:00:00Z">
         <w:r>
           <w:rPr>
             <w:rFonts w:ascii="Times New Roman" w:hAnsi="Times New Roman"/>
@@ -8243,7 +9535,7 @@
           <w:delText xml:space="preserve">"</w:delText>
         </w:r>
       </w:del>
-      <w:ins w:id="1219" w:author="А.А. Шевцов" w:date="2026-10-17T12:00:00Z">
+      <w:ins w:id="1331" w:author="А.А. Шевцов" w:date="2026-10-17T12:00:00Z">
         <w:r>
           <w:rPr>
             <w:rFonts w:ascii="Times New Roman" w:hAnsi="Times New Roman"/>
@@ -8309,7 +9601,7 @@
           <w:rFonts w:ascii="Times New Roman" w:hAnsi="Times New Roman" w:cs="Times New Roman"/>
         </w:rPr>
       </w:pPr>
-      <w:del w:id="1124" w:author="А.А. Шевцов" w:date="2026-10-17T12:00:00Z">
+      <w:del w:id="1236" w:author="А.А. Шевцов" w:date="2026-10-17T12:00:00Z">
         <w:r>
           <w:rPr>
             <w:rFonts w:ascii="Times New Roman" w:hAnsi="Times New Roman"/>
@@ -8317,7 +9609,7 @@
           <w:delText xml:space="preserve">Regional</w:delText>
         </w:r>
       </w:del>
-      <w:ins w:id="1125" w:author="А.А. Шевцов" w:date="2026-10-17T12:00:00Z">
+      <w:ins w:id="1237" w:author="А.А. Шевцов" w:date="2026-10-17T12:00:00Z">
         <w:r>
           <w:rPr>
             <w:rFonts w:ascii="Times New Roman" w:hAnsi="Times New Roman"/>
@@ -8463,7 +9755,7 @@
         </w:rPr>
         <w:t xml:space="preserve">M-4 </w:t>
       </w:r>
-      <w:del w:id="1224" w:author="А.А. Шевцов" w:date="2026-10-17T12:00:00Z">
+      <w:del w:id="1336" w:author="А.А. Шевцов" w:date="2026-10-17T12:00:00Z">
         <w:r>
           <w:rPr>
             <w:rFonts w:ascii="Times New Roman" w:hAnsi="Times New Roman"/>
@@ -8471,7 +9763,7 @@
           <w:delText xml:space="preserve">"</w:delText>
         </w:r>
       </w:del>
-      <w:ins w:id="1225" w:author="А.А. Шевцов" w:date="2026-10-17T12:00:00Z">
+      <w:ins w:id="1337" w:author="А.А. Шевцов" w:date="2026-10-17T12:00:00Z">
         <w:r>
           <w:rPr>
             <w:rFonts w:ascii="Times New Roman" w:hAnsi="Times New Roman"/>
@@ -8485,7 +9777,7 @@
         </w:rPr>
         <w:t xml:space="preserve">Don</w:t>
       </w:r>
-      <w:del w:id="1222" w:author="А.А. Шевцов" w:date="2026-10-17T12:00:00Z">
+      <w:del w:id="1334" w:author="А.А. Шевцов" w:date="2026-10-17T12:00:00Z">
         <w:r>
           <w:rPr>
             <w:rFonts w:ascii="Times New Roman" w:hAnsi="Times New Roman"/>
@@ -8493,7 +9785,7 @@
           <w:delText xml:space="preserve">"</w:delText>
         </w:r>
       </w:del>
-      <w:ins w:id="1223" w:author="А.А. Шевцов" w:date="2026-10-17T12:00:00Z">
+      <w:ins w:id="1335" w:author="А.А. Шевцов" w:date="2026-10-17T12:00:00Z">
         <w:r>
           <w:rPr>
             <w:rFonts w:ascii="Times New Roman" w:hAnsi="Times New Roman"/>
@@ -8585,7 +9877,7 @@
           <w:rFonts w:ascii="Times New Roman" w:hAnsi="Times New Roman" w:cs="Times New Roman"/>
         </w:rPr>
       </w:pPr>
-      <w:del w:id="1154" w:author="А.А. Шевцов" w:date="2026-10-17T12:00:00Z">
+      <w:del w:id="1266" w:author="А.А. Шевцов" w:date="2026-10-17T12:00:00Z">
         <w:r>
           <w:rPr>
             <w:rFonts w:ascii="Times New Roman" w:hAnsi="Times New Roman"/>
@@ -8593,7 +9885,7 @@
           <w:delText xml:space="preserve">C</w:delText>
         </w:r>
       </w:del>
-      <w:ins w:id="1155" w:author="А.А. Шевцов" w:date="2026-10-17T12:00:00Z">
+      <w:ins w:id="1267" w:author="А.А. Шевцов" w:date="2026-10-17T12:00:00Z">
         <w:r>
           <w:rPr>
             <w:rFonts w:ascii="Times New Roman" w:hAnsi="Times New Roman"/>
@@ -8611,7 +9903,7 @@
           <w:rFonts w:ascii="Times New Roman" w:hAnsi="Times New Roman" w:cs="Times New Roman"/>
         </w:rPr>
       </w:pPr>
-      <w:del w:id="1158" w:author="А.А. Шевцов" w:date="2026-10-17T12:00:00Z">
+      <w:del w:id="1270" w:author="А.А. Шевцов" w:date="2026-10-17T12:00:00Z">
         <w:r>
           <w:rPr>
             <w:rFonts w:ascii="Times New Roman" w:hAnsi="Times New Roman"/>
@@ -8619,7 +9911,7 @@
           <w:delText xml:space="preserve">SV</w:delText>
         </w:r>
       </w:del>
-      <w:ins w:id="1159" w:author="А.А. Шевцов" w:date="2026-10-17T12:00:00Z">
+      <w:ins w:id="1271" w:author="А.А. Шевцов" w:date="2026-10-17T12:00:00Z">
         <w:r>
           <w:rPr>
             <w:rFonts w:ascii="Times New Roman" w:hAnsi="Times New Roman"/>
@@ -8637,7 +9929,7 @@
           <w:rFonts w:ascii="Times New Roman" w:hAnsi="Times New Roman" w:cs="Times New Roman"/>
         </w:rPr>
       </w:pPr>
-      <w:del w:id="1162" w:author="А.А. Шевцов" w:date="2026-10-17T12:00:00Z">
+      <w:del w:id="1274" w:author="А.А. Шевцов" w:date="2026-10-17T12:00:00Z">
         <w:r>
           <w:rPr>
             <w:rFonts w:ascii="Times New Roman" w:hAnsi="Times New Roman"/>
@@ -8645,7 +9937,7 @@
           <w:delText xml:space="preserve">B</w:delText>
         </w:r>
       </w:del>
-      <w:ins w:id="1163" w:author="А.А. Шевцов" w:date="2026-10-17T12:00:00Z">
+      <w:ins w:id="1275" w:author="А.А. Шевцов" w:date="2026-10-17T12:00:00Z">
         <w:r>
           <w:rPr>
             <w:rFonts w:ascii="Times New Roman" w:hAnsi="Times New Roman"/>
@@ -8680,7 +9972,7 @@
           <w:rFonts w:ascii="Times New Roman" w:hAnsi="Times New Roman" w:cs="Times New Roman"/>
         </w:rPr>
       </w:pPr>
-      <w:del w:id="1166" w:author="А.А. Шевцов" w:date="2026-10-17T12:00:00Z">
+      <w:del w:id="1278" w:author="А.А. Шевцов" w:date="2026-10-17T12:00:00Z">
         <w:r>
           <w:rPr>
             <w:rFonts w:ascii="Times New Roman" w:hAnsi="Times New Roman"/>
@@ -8688,7 +9980,7 @@
           <w:delText xml:space="preserve">Yu</w:delText>
         </w:r>
       </w:del>
-      <w:ins w:id="1167" w:author="А.А. Шевцов" w:date="2026-10-17T12:00:00Z">
+      <w:ins w:id="1279" w:author="А.А. Шевцов" w:date="2026-10-17T12:00:00Z">
         <w:r>
           <w:rPr>
             <w:rFonts w:ascii="Times New Roman" w:hAnsi="Times New Roman"/>
@@ -8722,7 +10014,7 @@
           <w:rFonts w:ascii="Times New Roman" w:hAnsi="Times New Roman" w:cs="Times New Roman"/>
         </w:rPr>
       </w:pPr>
-      <w:del w:id="1170" w:author="А.А. Шевцов" w:date="2026-10-17T12:00:00Z">
+      <w:del w:id="1282" w:author="А.А. Шевцов" w:date="2026-10-17T12:00:00Z">
         <w:r>
           <w:rPr>
             <w:rFonts w:ascii="Times New Roman" w:hAnsi="Times New Roman"/>
@@ -8730,7 +10022,7 @@
           <w:delText xml:space="preserve">Z</w:delText>
         </w:r>
       </w:del>
-      <w:ins w:id="1171" w:author="А.А. Шевцов" w:date="2026-10-17T12:00:00Z">
+      <w:ins w:id="1283" w:author="А.А. Шевцов" w:date="2026-10-17T12:00:00Z">
         <w:r>
           <w:rPr>
             <w:rFonts w:ascii="Times New Roman" w:hAnsi="Times New Roman"/>
@@ -8748,7 +10040,7 @@
           <w:rFonts w:ascii="Times New Roman" w:hAnsi="Times New Roman" w:cs="Times New Roman"/>
         </w:rPr>
       </w:pPr>
-      <w:del w:id="1174" w:author="А.А. Шевцов" w:date="2026-10-17T12:00:00Z">
+      <w:del w:id="1286" w:author="А.А. Шевцов" w:date="2026-10-17T12:00:00Z">
         <w:r>
           <w:rPr>
             <w:rFonts w:ascii="Times New Roman" w:hAnsi="Times New Roman"/>
@@ -8756,7 +10048,7 @@
           <w:delText xml:space="preserve">SZ</w:delText>
         </w:r>
       </w:del>
-      <w:ins w:id="1175" w:author="А.А. Шевцов" w:date="2026-10-17T12:00:00Z">
+      <w:ins w:id="1287" w:author="А.А. Шевцов" w:date="2026-10-17T12:00:00Z">
         <w:r>
           <w:rPr>
             <w:rFonts w:ascii="Times New Roman" w:hAnsi="Times New Roman"/>
@@ -8789,7 +10081,7 @@
         </w:rPr>
         <w:t xml:space="preserve">Morphotypes of development </w:t>
       </w:r>
-      <w:del w:id="1150" w:author="А.А. Шевцов" w:date="2026-10-17T12:00:00Z">
+      <w:del w:id="1262" w:author="А.А. Шевцов" w:date="2026-10-17T12:00:00Z">
         <w:r>
           <w:rPr>
             <w:rFonts w:ascii="Times New Roman" w:hAnsi="Times New Roman"/>
@@ -8798,7 +10090,7 @@
           <w:delText xml:space="preserve">in the Voronezh region and its</w:delText>
         </w:r>
       </w:del>
-      <w:ins w:id="1151" w:author="А.А. Шевцов" w:date="2026-10-17T12:00:00Z">
+      <w:ins w:id="1263" w:author="А.А. Шевцов" w:date="2026-10-17T12:00:00Z">
         <w:r>
           <w:rPr>
             <w:rFonts w:ascii="Times New Roman" w:hAnsi="Times New Roman"/>
@@ -8861,7 +10153,7 @@
         </w:rPr>
         <w:t xml:space="preserve">Unified State Register of Real Estate (Rosreestr), the </w:t>
       </w:r>
-      <w:del w:id="1228" w:author="А.А. Шевцов" w:date="2026-10-17T12:00:00Z">
+      <w:del w:id="1340" w:author="А.А. Шевцов" w:date="2026-10-17T12:00:00Z">
         <w:r>
           <w:rPr>
             <w:rFonts w:ascii="Times New Roman" w:hAnsi="Times New Roman"/>
@@ -8869,7 +10161,7 @@
           <w:delText xml:space="preserve">"</w:delText>
         </w:r>
       </w:del>
-      <w:ins w:id="1229" w:author="А.А. Шевцов" w:date="2026-10-17T12:00:00Z">
+      <w:ins w:id="1341" w:author="А.А. Шевцов" w:date="2026-10-17T12:00:00Z">
         <w:r>
           <w:rPr>
             <w:rFonts w:ascii="Times New Roman" w:hAnsi="Times New Roman"/>
@@ -8883,7 +10175,7 @@
         </w:rPr>
         <w:t xml:space="preserve">How old is this house</w:t>
       </w:r>
-      <w:del w:id="1226" w:author="А.А. Шевцов" w:date="2026-10-17T12:00:00Z">
+      <w:del w:id="1338" w:author="А.А. Шевцов" w:date="2026-10-17T12:00:00Z">
         <w:r>
           <w:rPr>
             <w:rFonts w:ascii="Times New Roman" w:hAnsi="Times New Roman"/>
@@ -8891,7 +10183,7 @@
           <w:delText xml:space="preserve">"</w:delText>
         </w:r>
       </w:del>
-      <w:ins w:id="1227" w:author="А.А. Шевцов" w:date="2026-10-17T12:00:00Z">
+      <w:ins w:id="1339" w:author="А.А. Шевцов" w:date="2026-10-17T12:00:00Z">
         <w:r>
           <w:rPr>
             <w:rFonts w:ascii="Times New Roman" w:hAnsi="Times New Roman"/>
@@ -8947,7 +10239,7 @@
         </w:rPr>
         <w:t xml:space="preserve">Morphotypes of development </w:t>
       </w:r>
-      <w:del w:id="1152" w:author="А.А. Шевцов" w:date="2026-10-17T12:00:00Z">
+      <w:del w:id="1264" w:author="А.А. Шевцов" w:date="2026-10-17T12:00:00Z">
         <w:r>
           <w:rPr>
             <w:rFonts w:ascii="Times New Roman" w:hAnsi="Times New Roman"/>
@@ -8955,7 +10247,7 @@
           <w:delText xml:space="preserve">1992–2005</w:delText>
         </w:r>
       </w:del>
-      <w:ins w:id="1153" w:author="А.А. Шевцов" w:date="2026-10-17T12:00:00Z">
+      <w:ins w:id="1265" w:author="А.А. Шевцов" w:date="2026-10-17T12:00:00Z">
         <w:r>
           <w:rPr>
             <w:rFonts w:ascii="Times New Roman" w:hAnsi="Times New Roman"/>
@@ -8973,7 +10265,7 @@
           <w:rFonts w:ascii="Times New Roman" w:hAnsi="Times New Roman" w:cs="Times New Roman"/>
         </w:rPr>
       </w:pPr>
-      <w:del w:id="1130" w:author="А.А. Шевцов" w:date="2026-10-17T12:00:00Z">
+      <w:del w:id="1242" w:author="А.А. Шевцов" w:date="2026-10-17T12:00:00Z">
         <w:r>
           <w:rPr>
             <w:rFonts w:ascii="Times New Roman" w:hAnsi="Times New Roman"/>
@@ -8981,7 +10273,7 @@
           <w:delText xml:space="preserve">Multi-storey</w:delText>
         </w:r>
       </w:del>
-      <w:ins w:id="1131" w:author="А.А. Шевцов" w:date="2026-10-17T12:00:00Z">
+      <w:ins w:id="1243" w:author="А.А. Шевцов" w:date="2026-10-17T12:00:00Z">
         <w:r>
           <w:rPr>
             <w:rFonts w:ascii="Times New Roman" w:hAnsi="Times New Roman"/>
@@ -9153,7 +10445,7 @@
         </w:rPr>
         <w:t xml:space="preserve">M-4 </w:t>
       </w:r>
-      <w:del w:id="1232" w:author="А.А. Шевцов" w:date="2026-10-17T12:00:00Z">
+      <w:del w:id="1344" w:author="А.А. Шевцов" w:date="2026-10-17T12:00:00Z">
         <w:r>
           <w:rPr>
             <w:rFonts w:ascii="Times New Roman" w:hAnsi="Times New Roman"/>
@@ -9161,7 +10453,7 @@
           <w:delText xml:space="preserve">"</w:delText>
         </w:r>
       </w:del>
-      <w:ins w:id="1233" w:author="А.А. Шевцов" w:date="2026-10-17T12:00:00Z">
+      <w:ins w:id="1345" w:author="А.А. Шевцов" w:date="2026-10-17T12:00:00Z">
         <w:r>
           <w:rPr>
             <w:rFonts w:ascii="Times New Roman" w:hAnsi="Times New Roman"/>
@@ -9175,7 +10467,7 @@
         </w:rPr>
         <w:t xml:space="preserve">Don</w:t>
       </w:r>
-      <w:del w:id="1230" w:author="А.А. Шевцов" w:date="2026-10-17T12:00:00Z">
+      <w:del w:id="1342" w:author="А.А. Шевцов" w:date="2026-10-17T12:00:00Z">
         <w:r>
           <w:rPr>
             <w:rFonts w:ascii="Times New Roman" w:hAnsi="Times New Roman"/>
@@ -9183,7 +10475,7 @@
           <w:delText xml:space="preserve">"</w:delText>
         </w:r>
       </w:del>
-      <w:ins w:id="1231" w:author="А.А. Шевцов" w:date="2026-10-17T12:00:00Z">
+      <w:ins w:id="1343" w:author="А.А. Шевцов" w:date="2026-10-17T12:00:00Z">
         <w:r>
           <w:rPr>
             <w:rFonts w:ascii="Times New Roman" w:hAnsi="Times New Roman"/>
@@ -9275,7 +10567,7 @@
           <w:rFonts w:ascii="Times New Roman" w:hAnsi="Times New Roman" w:cs="Times New Roman"/>
         </w:rPr>
       </w:pPr>
-      <w:del w:id="1156" w:author="А.А. Шевцов" w:date="2026-10-17T12:00:00Z">
+      <w:del w:id="1268" w:author="А.А. Шевцов" w:date="2026-10-17T12:00:00Z">
         <w:r>
           <w:rPr>
             <w:rFonts w:ascii="Times New Roman" w:hAnsi="Times New Roman"/>
@@ -9283,7 +10575,7 @@
           <w:delText xml:space="preserve">C</w:delText>
         </w:r>
       </w:del>
-      <w:ins w:id="1157" w:author="А.А. Шевцов" w:date="2026-10-17T12:00:00Z">
+      <w:ins w:id="1269" w:author="А.А. Шевцов" w:date="2026-10-17T12:00:00Z">
         <w:r>
           <w:rPr>
             <w:rFonts w:ascii="Times New Roman" w:hAnsi="Times New Roman"/>
@@ -9301,7 +10593,7 @@
           <w:rFonts w:ascii="Times New Roman" w:hAnsi="Times New Roman" w:cs="Times New Roman"/>
         </w:rPr>
       </w:pPr>
-      <w:del w:id="1160" w:author="А.А. Шевцов" w:date="2026-10-17T12:00:00Z">
+      <w:del w:id="1272" w:author="А.А. Шевцов" w:date="2026-10-17T12:00:00Z">
         <w:r>
           <w:rPr>
             <w:rFonts w:ascii="Times New Roman" w:hAnsi="Times New Roman"/>
@@ -9309,7 +10601,7 @@
           <w:delText xml:space="preserve">SV</w:delText>
         </w:r>
       </w:del>
-      <w:ins w:id="1161" w:author="А.А. Шевцов" w:date="2026-10-17T12:00:00Z">
+      <w:ins w:id="1273" w:author="А.А. Шевцов" w:date="2026-10-17T12:00:00Z">
         <w:r>
           <w:rPr>
             <w:rFonts w:ascii="Times New Roman" w:hAnsi="Times New Roman"/>
@@ -9327,7 +10619,7 @@
           <w:rFonts w:ascii="Times New Roman" w:hAnsi="Times New Roman" w:cs="Times New Roman"/>
         </w:rPr>
       </w:pPr>
-      <w:del w:id="1164" w:author="А.А. Шевцов" w:date="2026-10-17T12:00:00Z">
+      <w:del w:id="1276" w:author="А.А. Шевцов" w:date="2026-10-17T12:00:00Z">
         <w:r>
           <w:rPr>
             <w:rFonts w:ascii="Times New Roman" w:hAnsi="Times New Roman"/>
@@ -9335,7 +10627,7 @@
           <w:delText xml:space="preserve">IN</w:delText>
         </w:r>
       </w:del>
-      <w:ins w:id="1165" w:author="А.А. Шевцов" w:date="2026-10-17T12:00:00Z">
+      <w:ins w:id="1277" w:author="А.А. Шевцов" w:date="2026-10-17T12:00:00Z">
         <w:r>
           <w:rPr>
             <w:rFonts w:ascii="Times New Roman" w:hAnsi="Times New Roman"/>
@@ -9369,7 +10661,7 @@
           <w:rFonts w:ascii="Times New Roman" w:hAnsi="Times New Roman" w:cs="Times New Roman"/>
         </w:rPr>
       </w:pPr>
-      <w:del w:id="1168" w:author="А.А. Шевцов" w:date="2026-10-17T12:00:00Z">
+      <w:del w:id="1280" w:author="А.А. Шевцов" w:date="2026-10-17T12:00:00Z">
         <w:r>
           <w:rPr>
             <w:rFonts w:ascii="Times New Roman" w:hAnsi="Times New Roman"/>
@@ -9377,7 +10669,7 @@
           <w:delText xml:space="preserve">Yu</w:delText>
         </w:r>
       </w:del>
-      <w:ins w:id="1169" w:author="А.А. Шевцов" w:date="2026-10-17T12:00:00Z">
+      <w:ins w:id="1281" w:author="А.А. Шевцов" w:date="2026-10-17T12:00:00Z">
         <w:r>
           <w:rPr>
             <w:rFonts w:ascii="Times New Roman" w:hAnsi="Times New Roman"/>
@@ -9411,7 +10703,7 @@
           <w:rFonts w:ascii="Times New Roman" w:hAnsi="Times New Roman" w:cs="Times New Roman"/>
         </w:rPr>
       </w:pPr>
-      <w:del w:id="1172" w:author="А.А. Шевцов" w:date="2026-10-17T12:00:00Z">
+      <w:del w:id="1284" w:author="А.А. Шевцов" w:date="2026-10-17T12:00:00Z">
         <w:r>
           <w:rPr>
             <w:rFonts w:ascii="Times New Roman" w:hAnsi="Times New Roman"/>
@@ -9419,7 +10711,7 @@
           <w:delText xml:space="preserve">Z</w:delText>
         </w:r>
       </w:del>
-      <w:ins w:id="1173" w:author="А.А. Шевцов" w:date="2026-10-17T12:00:00Z">
+      <w:ins w:id="1285" w:author="А.А. Шевцов" w:date="2026-10-17T12:00:00Z">
         <w:r>
           <w:rPr>
             <w:rFonts w:ascii="Times New Roman" w:hAnsi="Times New Roman"/>
@@ -9437,7 +10729,7 @@
           <w:rFonts w:ascii="Times New Roman" w:hAnsi="Times New Roman" w:cs="Times New Roman"/>
         </w:rPr>
       </w:pPr>
-      <w:del w:id="1176" w:author="А.А. Шевцов" w:date="2026-10-17T12:00:00Z">
+      <w:del w:id="1288" w:author="А.А. Шевцов" w:date="2026-10-17T12:00:00Z">
         <w:r>
           <w:rPr>
             <w:rFonts w:ascii="Times New Roman" w:hAnsi="Times New Roman"/>
@@ -9445,7 +10737,7 @@
           <w:delText xml:space="preserve">SZ</w:delText>
         </w:r>
       </w:del>
-      <w:ins w:id="1177" w:author="А.А. Шевцов" w:date="2026-10-17T12:00:00Z">
+      <w:ins w:id="1289" w:author="А.А. Шевцов" w:date="2026-10-17T12:00:00Z">
         <w:r>
           <w:rPr>
             <w:rFonts w:ascii="Times New Roman" w:hAnsi="Times New Roman"/>
@@ -9507,7 +10799,7 @@
         </w:rPr>
         <w:t xml:space="preserve">Unified State Register of Real Estate (Rosreestr), the </w:t>
       </w:r>
-      <w:del w:id="1236" w:author="А.А. Шевцов" w:date="2026-10-17T12:00:00Z">
+      <w:del w:id="1348" w:author="А.А. Шевцов" w:date="2026-10-17T12:00:00Z">
         <w:r>
           <w:rPr>
             <w:rFonts w:ascii="Times New Roman" w:hAnsi="Times New Roman"/>
@@ -9515,7 +10807,7 @@
           <w:delText xml:space="preserve">"</w:delText>
         </w:r>
       </w:del>
-      <w:ins w:id="1237" w:author="А.А. Шевцов" w:date="2026-10-17T12:00:00Z">
+      <w:ins w:id="1349" w:author="А.А. Шевцов" w:date="2026-10-17T12:00:00Z">
         <w:r>
           <w:rPr>
             <w:rFonts w:ascii="Times New Roman" w:hAnsi="Times New Roman"/>
@@ -9529,7 +10821,7 @@
         </w:rPr>
         <w:t xml:space="preserve">How old is this house</w:t>
       </w:r>
-      <w:del w:id="1234" w:author="А.А. Шевцов" w:date="2026-10-17T12:00:00Z">
+      <w:del w:id="1346" w:author="А.А. Шевцов" w:date="2026-10-17T12:00:00Z">
         <w:r>
           <w:rPr>
             <w:rFonts w:ascii="Times New Roman" w:hAnsi="Times New Roman"/>
@@ -9537,7 +10829,7 @@
           <w:delText xml:space="preserve">"</w:delText>
         </w:r>
       </w:del>
-      <w:ins w:id="1235" w:author="А.А. Шевцов" w:date="2026-10-17T12:00:00Z">
+      <w:ins w:id="1347" w:author="А.А. Шевцов" w:date="2026-10-17T12:00:00Z">
         <w:r>
           <w:rPr>
             <w:rFonts w:ascii="Times New Roman" w:hAnsi="Times New Roman"/>
@@ -9609,7 +10901,7 @@
         </w:rPr>
         <w:t xml:space="preserve">incl. </w:t>
       </w:r>
-      <w:del w:id="1240" w:author="А.А. Шевцов" w:date="2026-10-17T12:00:00Z">
+      <w:del w:id="1352" w:author="А.А. Шевцов" w:date="2026-10-17T12:00:00Z">
         <w:r>
           <w:rPr>
             <w:rFonts w:ascii="Times New Roman" w:hAnsi="Times New Roman"/>
@@ -9617,7 +10909,7 @@
           <w:delText xml:space="preserve">"</w:delText>
         </w:r>
       </w:del>
-      <w:ins w:id="1241" w:author="А.А. Шевцов" w:date="2026-10-17T12:00:00Z">
+      <w:ins w:id="1353" w:author="А.А. Шевцов" w:date="2026-10-17T12:00:00Z">
         <w:r>
           <w:rPr>
             <w:rFonts w:ascii="Times New Roman" w:hAnsi="Times New Roman"/>
@@ -9631,7 +10923,7 @@
         </w:rPr>
         <w:t xml:space="preserve">physical city</w:t>
       </w:r>
-      <w:del w:id="1238" w:author="А.А. Шевцов" w:date="2026-10-17T12:00:00Z">
+      <w:del w:id="1350" w:author="А.А. Шевцов" w:date="2026-10-17T12:00:00Z">
         <w:r>
           <w:rPr>
             <w:rFonts w:ascii="Times New Roman" w:hAnsi="Times New Roman"/>
@@ -9639,7 +10931,7 @@
           <w:delText xml:space="preserve">"</w:delText>
         </w:r>
       </w:del>
-      <w:ins w:id="1239" w:author="А.А. Шевцов" w:date="2026-10-17T12:00:00Z">
+      <w:ins w:id="1351" w:author="А.А. Шевцов" w:date="2026-10-17T12:00:00Z">
         <w:r>
           <w:rPr>
             <w:rFonts w:ascii="Times New Roman" w:hAnsi="Times New Roman"/>

</xml_diff>